<commit_message>
Added sphere.h and updated notes
</commit_message>
<xml_diff>
--- a/Notes.docx
+++ b/Notes.docx
@@ -543,6 +543,9 @@
     </w:p>
     <w:p>
       <w:r>
+        <w:rPr>
+          <w:noProof/>
+        </w:rPr>
         <w:drawing>
           <wp:inline distT="0" distB="0" distL="0" distR="0" wp14:anchorId="4DB257E3" wp14:editId="213C193F">
             <wp:extent cx="6645910" cy="4375150"/>
@@ -581,11 +584,6 @@
       </w:r>
     </w:p>
     <w:p>
-      <w:pPr>
-        <w:rPr>
-          <w:rFonts w:hint="eastAsia"/>
-        </w:rPr>
-      </w:pPr>
       <w:r>
         <w:rPr>
           <w:rFonts w:hint="eastAsia"/>
@@ -617,6 +615,9 @@
     </w:p>
     <w:p>
       <w:r>
+        <w:rPr>
+          <w:noProof/>
+        </w:rPr>
         <w:drawing>
           <wp:inline distT="0" distB="0" distL="0" distR="0" wp14:anchorId="64F845BC" wp14:editId="7EA32273">
             <wp:extent cx="5238750" cy="447951"/>
@@ -655,11 +656,6 @@
       </w:r>
     </w:p>
     <w:p>
-      <w:pPr>
-        <w:rPr>
-          <w:rFonts w:hint="eastAsia"/>
-        </w:rPr>
-      </w:pPr>
       <w:r>
         <w:rPr>
           <w:rFonts w:hint="eastAsia"/>
@@ -669,6 +665,9 @@
     </w:p>
     <w:p>
       <w:r>
+        <w:rPr>
+          <w:noProof/>
+        </w:rPr>
         <w:lastRenderedPageBreak/>
         <w:drawing>
           <wp:inline distT="0" distB="0" distL="0" distR="0" wp14:anchorId="09CB2D06" wp14:editId="6EEA4E9A">
@@ -708,11 +707,6 @@
       </w:r>
     </w:p>
     <w:p>
-      <w:pPr>
-        <w:rPr>
-          <w:rFonts w:hint="eastAsia"/>
-        </w:rPr>
-      </w:pPr>
       <w:r>
         <w:rPr>
           <w:rFonts w:hint="eastAsia"/>
@@ -848,6 +842,9 @@
     </w:p>
     <w:p>
       <w:r>
+        <w:rPr>
+          <w:noProof/>
+        </w:rPr>
         <w:drawing>
           <wp:inline distT="0" distB="0" distL="0" distR="0" wp14:anchorId="598A4255" wp14:editId="4B4517C9">
             <wp:extent cx="6645910" cy="2196465"/>
@@ -923,9 +920,6 @@
           <w:ilvl w:val="0"/>
           <w:numId w:val="2"/>
         </w:numPr>
-        <w:rPr>
-          <w:rFonts w:hint="eastAsia"/>
-        </w:rPr>
       </w:pPr>
       <w:r>
         <w:rPr>
@@ -955,20 +949,85 @@
         <w:t xml:space="preserve"> only when sphere is in front of the camera</w:t>
       </w:r>
     </w:p>
-    <w:p>
-      <w:pPr>
-        <w:rPr>
-          <w:rFonts w:hint="eastAsia"/>
-        </w:rPr>
-      </w:pPr>
-    </w:p>
-    <w:p>
-      <w:pPr>
-        <w:rPr>
-          <w:rFonts w:hint="eastAsia"/>
-        </w:rPr>
-      </w:pPr>
-    </w:p>
+    <w:p/>
+    <w:p/>
+    <w:p>
+      <w:pPr>
+        <w:pStyle w:val="2"/>
+        <w:rPr>
+          <w:rFonts w:hint="eastAsia"/>
+        </w:rPr>
+      </w:pPr>
+      <w:r>
+        <w:rPr>
+          <w:rFonts w:hint="eastAsia"/>
+        </w:rPr>
+        <w:t xml:space="preserve">6.4 </w:t>
+      </w:r>
+      <w:r>
+        <w:t>Front Faces Versus Back Faces</w:t>
+      </w:r>
+    </w:p>
+    <w:p>
+      <w:r>
+        <w:drawing>
+          <wp:inline distT="0" distB="0" distL="0" distR="0" wp14:anchorId="4C8CAA6D" wp14:editId="435B5242">
+            <wp:extent cx="6645910" cy="1252855"/>
+            <wp:effectExtent l="0" t="0" r="2540" b="4445"/>
+            <wp:docPr id="1812821408" name="그림 1"/>
+            <wp:cNvGraphicFramePr>
+              <a:graphicFrameLocks xmlns:a="http://schemas.openxmlformats.org/drawingml/2006/main" noChangeAspect="1"/>
+            </wp:cNvGraphicFramePr>
+            <a:graphic xmlns:a="http://schemas.openxmlformats.org/drawingml/2006/main">
+              <a:graphicData uri="http://schemas.openxmlformats.org/drawingml/2006/picture">
+                <pic:pic xmlns:pic="http://schemas.openxmlformats.org/drawingml/2006/picture">
+                  <pic:nvPicPr>
+                    <pic:cNvPr id="1812821408" name=""/>
+                    <pic:cNvPicPr/>
+                  </pic:nvPicPr>
+                  <pic:blipFill>
+                    <a:blip r:embed="rId16"/>
+                    <a:stretch>
+                      <a:fillRect/>
+                    </a:stretch>
+                  </pic:blipFill>
+                  <pic:spPr>
+                    <a:xfrm>
+                      <a:off x="0" y="0"/>
+                      <a:ext cx="6645910" cy="1252855"/>
+                    </a:xfrm>
+                    <a:prstGeom prst="rect">
+                      <a:avLst/>
+                    </a:prstGeom>
+                  </pic:spPr>
+                </pic:pic>
+              </a:graphicData>
+            </a:graphic>
+          </wp:inline>
+        </w:drawing>
+      </w:r>
+    </w:p>
+    <w:p>
+      <w:pPr>
+        <w:rPr>
+          <w:rFonts w:hint="eastAsia"/>
+        </w:rPr>
+      </w:pPr>
+      <w:r>
+        <w:rPr>
+          <w:rFonts w:hint="eastAsia"/>
+        </w:rPr>
+        <w:t>The tricky part is determining whether the normal vector will always point in the opposite direction of the ray, or the same direction. If ray hits the object from the outside, normal will point outward and likely opposite direction of the ray; if the ray hits the object from the inside, the normal will again point outward and align with the direction of the ray.</w:t>
+      </w:r>
+    </w:p>
+    <w:p>
+      <w:pPr>
+        <w:rPr>
+          <w:rFonts w:hint="eastAsia"/>
+        </w:rPr>
+      </w:pPr>
+    </w:p>
+    <w:p/>
     <w:sectPr>
       <w:pgSz w:w="11906" w:h="16838"/>
       <w:pgMar w:top="720" w:right="720" w:bottom="720" w:left="720" w:header="851" w:footer="992" w:gutter="0"/>

</xml_diff>

<commit_message>
Added front- and back-faces implementation
</commit_message>
<xml_diff>
--- a/Notes.docx
+++ b/Notes.docx
@@ -954,9 +954,6 @@
     <w:p>
       <w:pPr>
         <w:pStyle w:val="2"/>
-        <w:rPr>
-          <w:rFonts w:hint="eastAsia"/>
-        </w:rPr>
       </w:pPr>
       <w:r>
         <w:rPr>
@@ -970,6 +967,9 @@
     </w:p>
     <w:p>
       <w:r>
+        <w:rPr>
+          <w:noProof/>
+        </w:rPr>
         <w:drawing>
           <wp:inline distT="0" distB="0" distL="0" distR="0" wp14:anchorId="4C8CAA6D" wp14:editId="435B5242">
             <wp:extent cx="6645910" cy="1252855"/>
@@ -1008,11 +1008,6 @@
       </w:r>
     </w:p>
     <w:p>
-      <w:pPr>
-        <w:rPr>
-          <w:rFonts w:hint="eastAsia"/>
-        </w:rPr>
-      </w:pPr>
       <w:r>
         <w:rPr>
           <w:rFonts w:hint="eastAsia"/>
@@ -1022,10 +1017,108 @@
     </w:p>
     <w:p>
       <w:pPr>
-        <w:rPr>
-          <w:rFonts w:hint="eastAsia"/>
-        </w:rPr>
-      </w:pPr>
+        <w:pStyle w:val="a6"/>
+        <w:numPr>
+          <w:ilvl w:val="0"/>
+          <w:numId w:val="2"/>
+        </w:numPr>
+      </w:pPr>
+      <w:r>
+        <w:rPr>
+          <w:rFonts w:hint="eastAsia"/>
+        </w:rPr>
+        <w:t xml:space="preserve">We want the normal vectors </w:t>
+      </w:r>
+      <w:r>
+        <w:t>pointing</w:t>
+      </w:r>
+      <w:r>
+        <w:rPr>
+          <w:rFonts w:hint="eastAsia"/>
+        </w:rPr>
+        <w:t xml:space="preserve"> </w:t>
+      </w:r>
+      <w:r>
+        <w:t>“</w:t>
+      </w:r>
+      <w:r>
+        <w:rPr>
+          <w:rFonts w:hint="eastAsia"/>
+        </w:rPr>
+        <w:t>outward</w:t>
+      </w:r>
+      <w:r>
+        <w:t>”</w:t>
+      </w:r>
+      <w:r>
+        <w:rPr>
+          <w:rFonts w:hint="eastAsia"/>
+        </w:rPr>
+        <w:t xml:space="preserve"> from the surface, i.e., </w:t>
+      </w:r>
+      <w:r>
+        <w:t>“</w:t>
+      </w:r>
+      <w:r>
+        <w:rPr>
+          <w:rFonts w:hint="eastAsia"/>
+        </w:rPr>
+        <w:t>against the ray</w:t>
+      </w:r>
+      <w:r>
+        <w:t>”</w:t>
+      </w:r>
+      <w:r>
+        <w:rPr>
+          <w:rFonts w:hint="eastAsia"/>
+        </w:rPr>
+        <w:t xml:space="preserve"> at all times, which is determined at the time of geometry intersection</w:t>
+      </w:r>
+    </w:p>
+    <w:p>
+      <w:pPr>
+        <w:pStyle w:val="a6"/>
+        <w:numPr>
+          <w:ilvl w:val="0"/>
+          <w:numId w:val="2"/>
+        </w:numPr>
+        <w:rPr>
+          <w:rFonts w:hint="eastAsia"/>
+        </w:rPr>
+      </w:pPr>
+      <w:r>
+        <w:rPr>
+          <w:rFonts w:hint="eastAsia"/>
+        </w:rPr>
+        <w:t xml:space="preserve">The direction can also be determined at coloring time </w:t>
+      </w:r>
+      <w:r>
+        <w:t>–</w:t>
+      </w:r>
+      <w:r>
+        <w:rPr>
+          <w:rFonts w:hint="eastAsia"/>
+        </w:rPr>
+        <w:t xml:space="preserve"> it</w:t>
+      </w:r>
+      <w:r>
+        <w:t>’</w:t>
+      </w:r>
+      <w:r>
+        <w:rPr>
+          <w:rFonts w:hint="eastAsia"/>
+        </w:rPr>
+        <w:t>s based on preference. However, because there are way more material types than different geometries, it</w:t>
+      </w:r>
+      <w:r>
+        <w:t>’</w:t>
+      </w:r>
+      <w:r>
+        <w:rPr>
+          <w:rFonts w:hint="eastAsia"/>
+        </w:rPr>
+        <w:t>s less work to determine it at geometry intersection time</w:t>
+      </w:r>
     </w:p>
     <w:p/>
     <w:sectPr>

</xml_diff>

<commit_message>
Refactored main.cpp by implementing camera.h
</commit_message>
<xml_diff>
--- a/Notes.docx
+++ b/Notes.docx
@@ -1082,9 +1082,6 @@
           <w:ilvl w:val="0"/>
           <w:numId w:val="2"/>
         </w:numPr>
-        <w:rPr>
-          <w:rFonts w:hint="eastAsia"/>
-        </w:rPr>
       </w:pPr>
       <w:r>
         <w:rPr>
@@ -1121,6 +1118,147 @@
       </w:r>
     </w:p>
     <w:p/>
+    <w:p/>
+    <w:p>
+      <w:pPr>
+        <w:pStyle w:val="2"/>
+        <w:rPr>
+          <w:rFonts w:hint="eastAsia"/>
+        </w:rPr>
+      </w:pPr>
+      <w:r>
+        <w:rPr>
+          <w:rFonts w:hint="eastAsia"/>
+        </w:rPr>
+        <w:t>7</w:t>
+      </w:r>
+      <w:r>
+        <w:rPr>
+          <w:rFonts w:hint="eastAsia"/>
+        </w:rPr>
+        <w:t xml:space="preserve"> </w:t>
+      </w:r>
+      <w:r>
+        <w:t>Moving Camera Code Into Its Own Class</w:t>
+      </w:r>
+    </w:p>
+    <w:p>
+      <w:pPr>
+        <w:rPr>
+          <w:rFonts w:hint="eastAsia"/>
+        </w:rPr>
+      </w:pPr>
+      <w:r>
+        <w:rPr>
+          <w:rFonts w:hint="eastAsia"/>
+        </w:rPr>
+        <w:t xml:space="preserve">After creating </w:t>
+      </w:r>
+      <w:r>
+        <w:t>rtweekend.h</w:t>
+      </w:r>
+      <w:r>
+        <w:rPr>
+          <w:rFonts w:hint="eastAsia"/>
+        </w:rPr>
+        <w:t xml:space="preserve"> to consolidate the headers, it would be wise to consolidate the camera and the scene-render code</w:t>
+      </w:r>
+      <w:r>
+        <w:rPr>
+          <w:rFonts w:hint="eastAsia"/>
+        </w:rPr>
+        <w:t xml:space="preserve"> into</w:t>
+      </w:r>
+      <w:r>
+        <w:rPr>
+          <w:rFonts w:hint="eastAsia"/>
+        </w:rPr>
+        <w:t xml:space="preserve"> </w:t>
+      </w:r>
+      <w:r>
+        <w:rPr>
+          <w:rFonts w:hint="eastAsia"/>
+        </w:rPr>
+        <w:t xml:space="preserve">a </w:t>
+      </w:r>
+      <w:r>
+        <w:rPr>
+          <w:rFonts w:hint="eastAsia"/>
+        </w:rPr>
+        <w:t xml:space="preserve">single </w:t>
+      </w:r>
+      <w:r>
+        <w:rPr>
+          <w:rFonts w:hint="eastAsia"/>
+        </w:rPr>
+        <w:t>camera class</w:t>
+      </w:r>
+      <w:r>
+        <w:rPr>
+          <w:rFonts w:hint="eastAsia"/>
+        </w:rPr>
+        <w:t xml:space="preserve"> that 1) c</w:t>
+      </w:r>
+      <w:r>
+        <w:t>onstruct</w:t>
+      </w:r>
+      <w:r>
+        <w:rPr>
+          <w:rFonts w:hint="eastAsia"/>
+        </w:rPr>
+        <w:t>s</w:t>
+      </w:r>
+      <w:r>
+        <w:t xml:space="preserve"> and dispatch</w:t>
+      </w:r>
+      <w:r>
+        <w:rPr>
+          <w:rFonts w:hint="eastAsia"/>
+        </w:rPr>
+        <w:t>es</w:t>
+      </w:r>
+      <w:r>
+        <w:t xml:space="preserve"> rays into the world</w:t>
+      </w:r>
+      <w:r>
+        <w:rPr>
+          <w:rFonts w:hint="eastAsia"/>
+        </w:rPr>
+        <w:t xml:space="preserve"> and 2) u</w:t>
+      </w:r>
+      <w:r>
+        <w:t>se</w:t>
+      </w:r>
+      <w:r>
+        <w:rPr>
+          <w:rFonts w:hint="eastAsia"/>
+        </w:rPr>
+        <w:t>s</w:t>
+      </w:r>
+      <w:r>
+        <w:t xml:space="preserve"> the results of these rays to construct the rendered image.</w:t>
+      </w:r>
+      <w:r>
+        <w:rPr>
+          <w:rFonts w:hint="eastAsia"/>
+        </w:rPr>
+        <w:t xml:space="preserve"> This refactoring will be done in the simplest manner by defining the camera class with no arguments</w:t>
+      </w:r>
+      <w:r>
+        <w:rPr>
+          <w:rFonts w:hint="eastAsia"/>
+        </w:rPr>
+        <w:t>.</w:t>
+      </w:r>
+    </w:p>
+    <w:p/>
+    <w:p>
+      <w:pPr>
+        <w:rPr>
+          <w:rFonts w:hint="eastAsia"/>
+        </w:rPr>
+      </w:pPr>
+    </w:p>
     <w:sectPr>
       <w:pgSz w:w="11906" w:h="16838"/>
       <w:pgMar w:top="720" w:right="720" w:bottom="720" w:left="720" w:header="851" w:footer="992" w:gutter="0"/>

</xml_diff>

<commit_message>
Added random implementation to rtweekend.h
</commit_message>
<xml_diff>
--- a/Notes.docx
+++ b/Notes.docx
@@ -216,15 +216,61 @@
       <w:r>
         <w:tab/>
       </w:r>
-      <w:r>
-        <w:rPr>
-          <w:rFonts w:hint="eastAsia"/>
-        </w:rPr>
-        <w:t xml:space="preserve">image_height = (image_height &lt; 1) </w:t>
-      </w:r>
-      <w:r>
-        <w:t>? 1 : image_height</w:t>
-      </w:r>
+      <w:proofErr w:type="spellStart"/>
+      <w:r>
+        <w:rPr>
+          <w:rFonts w:hint="eastAsia"/>
+        </w:rPr>
+        <w:t>image_height</w:t>
+      </w:r>
+      <w:proofErr w:type="spellEnd"/>
+      <w:r>
+        <w:rPr>
+          <w:rFonts w:hint="eastAsia"/>
+        </w:rPr>
+        <w:t xml:space="preserve"> = (</w:t>
+      </w:r>
+      <w:proofErr w:type="spellStart"/>
+      <w:r>
+        <w:rPr>
+          <w:rFonts w:hint="eastAsia"/>
+        </w:rPr>
+        <w:t>image_height</w:t>
+      </w:r>
+      <w:proofErr w:type="spellEnd"/>
+      <w:r>
+        <w:rPr>
+          <w:rFonts w:hint="eastAsia"/>
+        </w:rPr>
+        <w:t xml:space="preserve"> &lt; 1</w:t>
+      </w:r>
+      <w:proofErr w:type="gramStart"/>
+      <w:r>
+        <w:rPr>
+          <w:rFonts w:hint="eastAsia"/>
+        </w:rPr>
+        <w:t xml:space="preserve">) </w:t>
+      </w:r>
+      <w:r>
+        <w:t>?</w:t>
+      </w:r>
+      <w:proofErr w:type="gramEnd"/>
+      <w:r>
+        <w:t xml:space="preserve"> </w:t>
+      </w:r>
+      <w:proofErr w:type="gramStart"/>
+      <w:r>
+        <w:t>1 :</w:t>
+      </w:r>
+      <w:proofErr w:type="gramEnd"/>
+      <w:r>
+        <w:t xml:space="preserve"> </w:t>
+      </w:r>
+      <w:proofErr w:type="spellStart"/>
+      <w:r>
+        <w:t>image_height</w:t>
+      </w:r>
+      <w:proofErr w:type="spellEnd"/>
     </w:p>
     <w:p>
       <w:pPr>
@@ -235,11 +281,36 @@
           <w:b/>
           <w:bCs/>
         </w:rPr>
-        <w:t>? 1 : image_height</w:t>
-      </w:r>
-      <w:r>
+        <w:t xml:space="preserve">? </w:t>
+      </w:r>
+      <w:proofErr w:type="gramStart"/>
+      <w:r>
+        <w:rPr>
+          <w:b/>
+          <w:bCs/>
+        </w:rPr>
+        <w:t>1 :</w:t>
+      </w:r>
+      <w:proofErr w:type="gramEnd"/>
+      <w:r>
+        <w:rPr>
+          <w:b/>
+          <w:bCs/>
+        </w:rPr>
         <w:t xml:space="preserve"> </w:t>
       </w:r>
+      <w:proofErr w:type="spellStart"/>
+      <w:r>
+        <w:rPr>
+          <w:b/>
+          <w:bCs/>
+        </w:rPr>
+        <w:t>image_height</w:t>
+      </w:r>
+      <w:proofErr w:type="spellEnd"/>
+      <w:r>
+        <w:t xml:space="preserve"> </w:t>
+      </w:r>
       <w:r>
         <w:rPr>
           <w:rFonts w:hint="eastAsia"/>
@@ -288,8 +359,13 @@
         <w:t>F</w:t>
       </w:r>
       <w:r>
-        <w:t>alse, use image_height</w:t>
-      </w:r>
+        <w:t xml:space="preserve">alse, use </w:t>
+      </w:r>
+      <w:proofErr w:type="spellStart"/>
+      <w:r>
+        <w:t>image_height</w:t>
+      </w:r>
+      <w:proofErr w:type="spellEnd"/>
     </w:p>
     <w:p>
       <w:r>
@@ -467,8 +543,13 @@
         </w:rPr>
         <w:t xml:space="preserve"> a standard equation defined by </w:t>
       </w:r>
-      <w:r>
-        <w:t>lerp(a, b, t) = a * (1 - t) + b * t</w:t>
+      <w:proofErr w:type="gramStart"/>
+      <w:r>
+        <w:t>lerp(</w:t>
+      </w:r>
+      <w:proofErr w:type="gramEnd"/>
+      <w:r>
+        <w:t>a, b, t) = a * (1 - t) + b * t</w:t>
       </w:r>
     </w:p>
     <w:p>
@@ -588,7 +669,21 @@
         <w:rPr>
           <w:rFonts w:hint="eastAsia"/>
         </w:rPr>
-        <w:t>(C-P)*(C-P) is the dot product of the length of the origin-to-center vector. For the equation of that value being equal to r</w:t>
+        <w:t>(C-</w:t>
+      </w:r>
+      <w:proofErr w:type="gramStart"/>
+      <w:r>
+        <w:rPr>
+          <w:rFonts w:hint="eastAsia"/>
+        </w:rPr>
+        <w:t>P)*</w:t>
+      </w:r>
+      <w:proofErr w:type="gramEnd"/>
+      <w:r>
+        <w:rPr>
+          <w:rFonts w:hint="eastAsia"/>
+        </w:rPr>
+        <w:t>(C-P) is the dot product of the length of the origin-to-center vector. For the equation of that value being equal to r</w:t>
       </w:r>
       <w:r>
         <w:rPr>
@@ -601,10 +696,21 @@
         <w:rPr>
           <w:rFonts w:hint="eastAsia"/>
         </w:rPr>
-        <w:t xml:space="preserve">, imagine a sphere of radius r migrated (C-P) distance away from origin (camera lens). The ray, if allowed to permeate through, will intersect these </w:t>
-      </w:r>
-      <w:r>
-        <w:t>selection o</w:t>
+        <w:t xml:space="preserve">, imagine a sphere of radius r migrated (C-P) distance away from origin (camera lens). The ray, if allowed to permeate through, will intersect </w:t>
+      </w:r>
+      <w:proofErr w:type="gramStart"/>
+      <w:r>
+        <w:rPr>
+          <w:rFonts w:hint="eastAsia"/>
+        </w:rPr>
+        <w:t xml:space="preserve">these </w:t>
+      </w:r>
+      <w:r>
+        <w:t>selection</w:t>
+      </w:r>
+      <w:proofErr w:type="gramEnd"/>
+      <w:r>
+        <w:t xml:space="preserve"> o</w:t>
       </w:r>
       <w:r>
         <w:rPr>
@@ -782,8 +888,16 @@
         <w:rPr>
           <w:rFonts w:hint="eastAsia"/>
         </w:rPr>
-        <w:t>6.1 Shading with Surface Normals</w:t>
-      </w:r>
+        <w:t xml:space="preserve">6.1 Shading with Surface </w:t>
+      </w:r>
+      <w:proofErr w:type="spellStart"/>
+      <w:r>
+        <w:rPr>
+          <w:rFonts w:hint="eastAsia"/>
+        </w:rPr>
+        <w:t>Normals</w:t>
+      </w:r>
+      <w:proofErr w:type="spellEnd"/>
     </w:p>
     <w:p>
       <w:r>
@@ -895,7 +1009,43 @@
           <w:rFonts w:hint="eastAsia"/>
         </w:rPr>
         <w:lastRenderedPageBreak/>
-        <w:t>This means that the directional vector (x,y,z) of the unit surface normal is mapped to (R,G,B)</w:t>
+        <w:t>This means that the directional vector (</w:t>
+      </w:r>
+      <w:proofErr w:type="spellStart"/>
+      <w:proofErr w:type="gramStart"/>
+      <w:r>
+        <w:rPr>
+          <w:rFonts w:hint="eastAsia"/>
+        </w:rPr>
+        <w:t>x,y</w:t>
+      </w:r>
+      <w:proofErr w:type="gramEnd"/>
+      <w:r>
+        <w:rPr>
+          <w:rFonts w:hint="eastAsia"/>
+        </w:rPr>
+        <w:t>,z</w:t>
+      </w:r>
+      <w:proofErr w:type="spellEnd"/>
+      <w:r>
+        <w:rPr>
+          <w:rFonts w:hint="eastAsia"/>
+        </w:rPr>
+        <w:t>) of the unit surface normal is mapped to (</w:t>
+      </w:r>
+      <w:proofErr w:type="gramStart"/>
+      <w:r>
+        <w:rPr>
+          <w:rFonts w:hint="eastAsia"/>
+        </w:rPr>
+        <w:t>R,G</w:t>
+      </w:r>
+      <w:proofErr w:type="gramEnd"/>
+      <w:r>
+        <w:rPr>
+          <w:rFonts w:hint="eastAsia"/>
+        </w:rPr>
+        <w:t>,B)</w:t>
       </w:r>
     </w:p>
     <w:p>
@@ -1136,7 +1286,15 @@
         <w:t xml:space="preserve"> </w:t>
       </w:r>
       <w:r>
-        <w:t>Moving Camera Code Into Its Own Class</w:t>
+        <w:t xml:space="preserve">Moving Camera Code </w:t>
+      </w:r>
+      <w:proofErr w:type="gramStart"/>
+      <w:r>
+        <w:t>Into</w:t>
+      </w:r>
+      <w:proofErr w:type="gramEnd"/>
+      <w:r>
+        <w:t xml:space="preserve"> Its Own Class</w:t>
       </w:r>
     </w:p>
     <w:p>
@@ -1146,9 +1304,11 @@
         </w:rPr>
         <w:t xml:space="preserve">After creating </w:t>
       </w:r>
+      <w:proofErr w:type="spellStart"/>
       <w:r>
         <w:t>rtweekend.h</w:t>
       </w:r>
+      <w:proofErr w:type="spellEnd"/>
       <w:r>
         <w:rPr>
           <w:rFonts w:hint="eastAsia"/>
@@ -1370,7 +1530,21 @@
         <w:rPr>
           <w:rFonts w:hint="eastAsia"/>
         </w:rPr>
-        <w:t>. At the current state, if we were to render a 8 x 8 checkerboard far away such that it</w:t>
+        <w:t xml:space="preserve">. At the current state, if we were to render </w:t>
+      </w:r>
+      <w:proofErr w:type="gramStart"/>
+      <w:r>
+        <w:rPr>
+          <w:rFonts w:hint="eastAsia"/>
+        </w:rPr>
+        <w:t>a</w:t>
+      </w:r>
+      <w:proofErr w:type="gramEnd"/>
+      <w:r>
+        <w:rPr>
+          <w:rFonts w:hint="eastAsia"/>
+        </w:rPr>
+        <w:t xml:space="preserve"> 8 x 8 checkerboard far away such that it</w:t>
       </w:r>
       <w:r>
         <w:t>’</w:t>
@@ -1424,7 +1598,45 @@
         <w:rPr>
           <w:rFonts w:hint="eastAsia"/>
         </w:rPr>
-        <w:t>ll sample the light around the pixel and integrate it</w:t>
+        <w:t xml:space="preserve">ll sample the light around the pixel and integrate </w:t>
+      </w:r>
+      <w:r>
+        <w:rPr>
+          <w:rFonts w:hint="eastAsia"/>
+        </w:rPr>
+        <w:t>them to find the true approximate pixel. For our ray tracer, we</w:t>
+      </w:r>
+      <w:r>
+        <w:t>’</w:t>
+      </w:r>
+      <w:r>
+        <w:rPr>
+          <w:rFonts w:hint="eastAsia"/>
+        </w:rPr>
+        <w:t xml:space="preserve">ll sample the </w:t>
+      </w:r>
+      <w:proofErr w:type="gramStart"/>
+      <w:r>
+        <w:rPr>
+          <w:rFonts w:hint="eastAsia"/>
+        </w:rPr>
+        <w:t>four square</w:t>
+      </w:r>
+      <w:proofErr w:type="gramEnd"/>
+      <w:r>
+        <w:rPr>
+          <w:rFonts w:hint="eastAsia"/>
+        </w:rPr>
+        <w:t xml:space="preserve"> regions of a pixel that extends halfway into each of the four neighboring pixels </w:t>
+      </w:r>
+      <w:r>
+        <w:t>–</w:t>
+      </w:r>
+      <w:r>
+        <w:rPr>
+          <w:rFonts w:hint="eastAsia"/>
+        </w:rPr>
+        <w:t xml:space="preserve"> i.e., imagine a pixel that intersects with four pixels equally.</w:t>
       </w:r>
     </w:p>
     <w:p/>

</xml_diff>

<commit_message>
Updated color sampling clamp & Notes
</commit_message>
<xml_diff>
--- a/Notes.docx
+++ b/Notes.docx
@@ -216,61 +216,15 @@
       <w:r>
         <w:tab/>
       </w:r>
-      <w:proofErr w:type="spellStart"/>
-      <w:r>
-        <w:rPr>
-          <w:rFonts w:hint="eastAsia"/>
-        </w:rPr>
-        <w:t>image_height</w:t>
-      </w:r>
-      <w:proofErr w:type="spellEnd"/>
-      <w:r>
-        <w:rPr>
-          <w:rFonts w:hint="eastAsia"/>
-        </w:rPr>
-        <w:t xml:space="preserve"> = (</w:t>
-      </w:r>
-      <w:proofErr w:type="spellStart"/>
-      <w:r>
-        <w:rPr>
-          <w:rFonts w:hint="eastAsia"/>
-        </w:rPr>
-        <w:t>image_height</w:t>
-      </w:r>
-      <w:proofErr w:type="spellEnd"/>
-      <w:r>
-        <w:rPr>
-          <w:rFonts w:hint="eastAsia"/>
-        </w:rPr>
-        <w:t xml:space="preserve"> &lt; 1</w:t>
-      </w:r>
-      <w:proofErr w:type="gramStart"/>
-      <w:r>
-        <w:rPr>
-          <w:rFonts w:hint="eastAsia"/>
-        </w:rPr>
-        <w:t xml:space="preserve">) </w:t>
-      </w:r>
-      <w:r>
-        <w:t>?</w:t>
-      </w:r>
-      <w:proofErr w:type="gramEnd"/>
-      <w:r>
-        <w:t xml:space="preserve"> </w:t>
-      </w:r>
-      <w:proofErr w:type="gramStart"/>
-      <w:r>
-        <w:t>1 :</w:t>
-      </w:r>
-      <w:proofErr w:type="gramEnd"/>
-      <w:r>
-        <w:t xml:space="preserve"> </w:t>
-      </w:r>
-      <w:proofErr w:type="spellStart"/>
-      <w:r>
-        <w:t>image_height</w:t>
-      </w:r>
-      <w:proofErr w:type="spellEnd"/>
+      <w:r>
+        <w:rPr>
+          <w:rFonts w:hint="eastAsia"/>
+        </w:rPr>
+        <w:t xml:space="preserve">image_height = (image_height &lt; 1) </w:t>
+      </w:r>
+      <w:r>
+        <w:t>? 1 : image_height</w:t>
+      </w:r>
     </w:p>
     <w:p>
       <w:pPr>
@@ -281,36 +235,11 @@
           <w:b/>
           <w:bCs/>
         </w:rPr>
-        <w:t xml:space="preserve">? </w:t>
-      </w:r>
-      <w:proofErr w:type="gramStart"/>
-      <w:r>
-        <w:rPr>
-          <w:b/>
-          <w:bCs/>
-        </w:rPr>
-        <w:t>1 :</w:t>
-      </w:r>
-      <w:proofErr w:type="gramEnd"/>
-      <w:r>
-        <w:rPr>
-          <w:b/>
-          <w:bCs/>
-        </w:rPr>
+        <w:t>? 1 : image_height</w:t>
+      </w:r>
+      <w:r>
         <w:t xml:space="preserve"> </w:t>
       </w:r>
-      <w:proofErr w:type="spellStart"/>
-      <w:r>
-        <w:rPr>
-          <w:b/>
-          <w:bCs/>
-        </w:rPr>
-        <w:t>image_height</w:t>
-      </w:r>
-      <w:proofErr w:type="spellEnd"/>
-      <w:r>
-        <w:t xml:space="preserve"> </w:t>
-      </w:r>
       <w:r>
         <w:rPr>
           <w:rFonts w:hint="eastAsia"/>
@@ -359,13 +288,8 @@
         <w:t>F</w:t>
       </w:r>
       <w:r>
-        <w:t xml:space="preserve">alse, use </w:t>
-      </w:r>
-      <w:proofErr w:type="spellStart"/>
-      <w:r>
-        <w:t>image_height</w:t>
-      </w:r>
-      <w:proofErr w:type="spellEnd"/>
+        <w:t>alse, use image_height</w:t>
+      </w:r>
     </w:p>
     <w:p>
       <w:r>
@@ -543,13 +467,8 @@
         </w:rPr>
         <w:t xml:space="preserve"> a standard equation defined by </w:t>
       </w:r>
-      <w:proofErr w:type="gramStart"/>
-      <w:r>
-        <w:t>lerp(</w:t>
-      </w:r>
-      <w:proofErr w:type="gramEnd"/>
-      <w:r>
-        <w:t>a, b, t) = a * (1 - t) + b * t</w:t>
+      <w:r>
+        <w:t>lerp(a, b, t) = a * (1 - t) + b * t</w:t>
       </w:r>
     </w:p>
     <w:p>
@@ -669,21 +588,7 @@
         <w:rPr>
           <w:rFonts w:hint="eastAsia"/>
         </w:rPr>
-        <w:t>(C-</w:t>
-      </w:r>
-      <w:proofErr w:type="gramStart"/>
-      <w:r>
-        <w:rPr>
-          <w:rFonts w:hint="eastAsia"/>
-        </w:rPr>
-        <w:t>P)*</w:t>
-      </w:r>
-      <w:proofErr w:type="gramEnd"/>
-      <w:r>
-        <w:rPr>
-          <w:rFonts w:hint="eastAsia"/>
-        </w:rPr>
-        <w:t>(C-P) is the dot product of the length of the origin-to-center vector. For the equation of that value being equal to r</w:t>
+        <w:t>(C-P)*(C-P) is the dot product of the length of the origin-to-center vector. For the equation of that value being equal to r</w:t>
       </w:r>
       <w:r>
         <w:rPr>
@@ -696,21 +601,10 @@
         <w:rPr>
           <w:rFonts w:hint="eastAsia"/>
         </w:rPr>
-        <w:t xml:space="preserve">, imagine a sphere of radius r migrated (C-P) distance away from origin (camera lens). The ray, if allowed to permeate through, will intersect </w:t>
-      </w:r>
-      <w:proofErr w:type="gramStart"/>
-      <w:r>
-        <w:rPr>
-          <w:rFonts w:hint="eastAsia"/>
-        </w:rPr>
-        <w:t xml:space="preserve">these </w:t>
-      </w:r>
-      <w:r>
-        <w:t>selection</w:t>
-      </w:r>
-      <w:proofErr w:type="gramEnd"/>
-      <w:r>
-        <w:t xml:space="preserve"> o</w:t>
+        <w:t xml:space="preserve">, imagine a sphere of radius r migrated (C-P) distance away from origin (camera lens). The ray, if allowed to permeate through, will intersect these </w:t>
+      </w:r>
+      <w:r>
+        <w:t>selection o</w:t>
       </w:r>
       <w:r>
         <w:rPr>
@@ -888,16 +782,8 @@
         <w:rPr>
           <w:rFonts w:hint="eastAsia"/>
         </w:rPr>
-        <w:t xml:space="preserve">6.1 Shading with Surface </w:t>
-      </w:r>
-      <w:proofErr w:type="spellStart"/>
-      <w:r>
-        <w:rPr>
-          <w:rFonts w:hint="eastAsia"/>
-        </w:rPr>
-        <w:t>Normals</w:t>
-      </w:r>
-      <w:proofErr w:type="spellEnd"/>
+        <w:t>6.1 Shading with Surface Normals</w:t>
+      </w:r>
     </w:p>
     <w:p>
       <w:r>
@@ -1009,43 +895,7 @@
           <w:rFonts w:hint="eastAsia"/>
         </w:rPr>
         <w:lastRenderedPageBreak/>
-        <w:t>This means that the directional vector (</w:t>
-      </w:r>
-      <w:proofErr w:type="spellStart"/>
-      <w:proofErr w:type="gramStart"/>
-      <w:r>
-        <w:rPr>
-          <w:rFonts w:hint="eastAsia"/>
-        </w:rPr>
-        <w:t>x,y</w:t>
-      </w:r>
-      <w:proofErr w:type="gramEnd"/>
-      <w:r>
-        <w:rPr>
-          <w:rFonts w:hint="eastAsia"/>
-        </w:rPr>
-        <w:t>,z</w:t>
-      </w:r>
-      <w:proofErr w:type="spellEnd"/>
-      <w:r>
-        <w:rPr>
-          <w:rFonts w:hint="eastAsia"/>
-        </w:rPr>
-        <w:t>) of the unit surface normal is mapped to (</w:t>
-      </w:r>
-      <w:proofErr w:type="gramStart"/>
-      <w:r>
-        <w:rPr>
-          <w:rFonts w:hint="eastAsia"/>
-        </w:rPr>
-        <w:t>R,G</w:t>
-      </w:r>
-      <w:proofErr w:type="gramEnd"/>
-      <w:r>
-        <w:rPr>
-          <w:rFonts w:hint="eastAsia"/>
-        </w:rPr>
-        <w:t>,B)</w:t>
+        <w:t>This means that the directional vector (x,y,z) of the unit surface normal is mapped to (R,G,B)</w:t>
       </w:r>
     </w:p>
     <w:p>
@@ -1286,15 +1136,7 @@
         <w:t xml:space="preserve"> </w:t>
       </w:r>
       <w:r>
-        <w:t xml:space="preserve">Moving Camera Code </w:t>
-      </w:r>
-      <w:proofErr w:type="gramStart"/>
-      <w:r>
-        <w:t>Into</w:t>
-      </w:r>
-      <w:proofErr w:type="gramEnd"/>
-      <w:r>
-        <w:t xml:space="preserve"> Its Own Class</w:t>
+        <w:t>Moving Camera Code Into Its Own Class</w:t>
       </w:r>
     </w:p>
     <w:p>
@@ -1304,11 +1146,9 @@
         </w:rPr>
         <w:t xml:space="preserve">After creating </w:t>
       </w:r>
-      <w:proofErr w:type="spellStart"/>
       <w:r>
         <w:t>rtweekend.h</w:t>
       </w:r>
-      <w:proofErr w:type="spellEnd"/>
       <w:r>
         <w:rPr>
           <w:rFonts w:hint="eastAsia"/>
@@ -1530,21 +1370,7 @@
         <w:rPr>
           <w:rFonts w:hint="eastAsia"/>
         </w:rPr>
-        <w:t xml:space="preserve">. At the current state, if we were to render </w:t>
-      </w:r>
-      <w:proofErr w:type="gramStart"/>
-      <w:r>
-        <w:rPr>
-          <w:rFonts w:hint="eastAsia"/>
-        </w:rPr>
-        <w:t>a</w:t>
-      </w:r>
-      <w:proofErr w:type="gramEnd"/>
-      <w:r>
-        <w:rPr>
-          <w:rFonts w:hint="eastAsia"/>
-        </w:rPr>
-        <w:t xml:space="preserve"> 8 x 8 checkerboard far away such that it</w:t>
+        <w:t>. At the current state, if we were to render a 8 x 8 checkerboard far away such that it</w:t>
       </w:r>
       <w:r>
         <w:t>’</w:t>
@@ -1613,21 +1439,7 @@
         <w:rPr>
           <w:rFonts w:hint="eastAsia"/>
         </w:rPr>
-        <w:t xml:space="preserve">ll sample the </w:t>
-      </w:r>
-      <w:proofErr w:type="gramStart"/>
-      <w:r>
-        <w:rPr>
-          <w:rFonts w:hint="eastAsia"/>
-        </w:rPr>
-        <w:t>four square</w:t>
-      </w:r>
-      <w:proofErr w:type="gramEnd"/>
-      <w:r>
-        <w:rPr>
-          <w:rFonts w:hint="eastAsia"/>
-        </w:rPr>
-        <w:t xml:space="preserve"> regions of a pixel that extends halfway into each of the four neighboring pixels </w:t>
+        <w:t xml:space="preserve">ll sample the four square regions of a pixel that extends halfway into each of the four neighboring pixels </w:t>
       </w:r>
       <w:r>
         <w:t>–</w:t>
@@ -1641,7 +1453,50 @@
     </w:p>
     <w:p/>
     <w:p/>
-    <w:p/>
+    <w:p>
+      <w:pPr>
+        <w:pStyle w:val="2"/>
+        <w:rPr>
+          <w:rFonts w:hint="eastAsia"/>
+        </w:rPr>
+      </w:pPr>
+      <w:r>
+        <w:rPr>
+          <w:rFonts w:hint="eastAsia"/>
+        </w:rPr>
+        <w:t xml:space="preserve">8.2 </w:t>
+      </w:r>
+      <w:r>
+        <w:t>Generating Pixels with Multiple Samples</w:t>
+      </w:r>
+    </w:p>
+    <w:p>
+      <w:pPr>
+        <w:rPr>
+          <w:rFonts w:hint="eastAsia"/>
+        </w:rPr>
+      </w:pPr>
+      <w:r>
+        <w:rPr>
+          <w:rFonts w:hint="eastAsia"/>
+        </w:rPr>
+        <w:t>For a single pixel composed of multiple samples, the samples from the surrounding area of the pixel will be taken to average the color values.</w:t>
+      </w:r>
+    </w:p>
+    <w:p>
+      <w:pPr>
+        <w:rPr>
+          <w:rFonts w:hint="eastAsia"/>
+        </w:rPr>
+      </w:pPr>
+    </w:p>
+    <w:p>
+      <w:pPr>
+        <w:rPr>
+          <w:rFonts w:hint="eastAsia"/>
+        </w:rPr>
+      </w:pPr>
+    </w:p>
     <w:p/>
     <w:sectPr>
       <w:pgSz w:w="11906" w:h="16838"/>

</xml_diff>

<commit_message>
Added notes on diffuse materials
</commit_message>
<xml_diff>
--- a/Notes.docx
+++ b/Notes.docx
@@ -216,15 +216,61 @@
       <w:r>
         <w:tab/>
       </w:r>
-      <w:r>
-        <w:rPr>
-          <w:rFonts w:hint="eastAsia"/>
-        </w:rPr>
-        <w:t xml:space="preserve">image_height = (image_height &lt; 1) </w:t>
-      </w:r>
-      <w:r>
-        <w:t>? 1 : image_height</w:t>
-      </w:r>
+      <w:proofErr w:type="spellStart"/>
+      <w:r>
+        <w:rPr>
+          <w:rFonts w:hint="eastAsia"/>
+        </w:rPr>
+        <w:t>image_height</w:t>
+      </w:r>
+      <w:proofErr w:type="spellEnd"/>
+      <w:r>
+        <w:rPr>
+          <w:rFonts w:hint="eastAsia"/>
+        </w:rPr>
+        <w:t xml:space="preserve"> = (</w:t>
+      </w:r>
+      <w:proofErr w:type="spellStart"/>
+      <w:r>
+        <w:rPr>
+          <w:rFonts w:hint="eastAsia"/>
+        </w:rPr>
+        <w:t>image_height</w:t>
+      </w:r>
+      <w:proofErr w:type="spellEnd"/>
+      <w:r>
+        <w:rPr>
+          <w:rFonts w:hint="eastAsia"/>
+        </w:rPr>
+        <w:t xml:space="preserve"> &lt; 1</w:t>
+      </w:r>
+      <w:proofErr w:type="gramStart"/>
+      <w:r>
+        <w:rPr>
+          <w:rFonts w:hint="eastAsia"/>
+        </w:rPr>
+        <w:t xml:space="preserve">) </w:t>
+      </w:r>
+      <w:r>
+        <w:t>?</w:t>
+      </w:r>
+      <w:proofErr w:type="gramEnd"/>
+      <w:r>
+        <w:t xml:space="preserve"> </w:t>
+      </w:r>
+      <w:proofErr w:type="gramStart"/>
+      <w:r>
+        <w:t>1 :</w:t>
+      </w:r>
+      <w:proofErr w:type="gramEnd"/>
+      <w:r>
+        <w:t xml:space="preserve"> </w:t>
+      </w:r>
+      <w:proofErr w:type="spellStart"/>
+      <w:r>
+        <w:t>image_height</w:t>
+      </w:r>
+      <w:proofErr w:type="spellEnd"/>
     </w:p>
     <w:p>
       <w:pPr>
@@ -235,11 +281,36 @@
           <w:b/>
           <w:bCs/>
         </w:rPr>
-        <w:t>? 1 : image_height</w:t>
-      </w:r>
-      <w:r>
+        <w:t xml:space="preserve">? </w:t>
+      </w:r>
+      <w:proofErr w:type="gramStart"/>
+      <w:r>
+        <w:rPr>
+          <w:b/>
+          <w:bCs/>
+        </w:rPr>
+        <w:t>1 :</w:t>
+      </w:r>
+      <w:proofErr w:type="gramEnd"/>
+      <w:r>
+        <w:rPr>
+          <w:b/>
+          <w:bCs/>
+        </w:rPr>
         <w:t xml:space="preserve"> </w:t>
       </w:r>
+      <w:proofErr w:type="spellStart"/>
+      <w:r>
+        <w:rPr>
+          <w:b/>
+          <w:bCs/>
+        </w:rPr>
+        <w:t>image_height</w:t>
+      </w:r>
+      <w:proofErr w:type="spellEnd"/>
+      <w:r>
+        <w:t xml:space="preserve"> </w:t>
+      </w:r>
       <w:r>
         <w:rPr>
           <w:rFonts w:hint="eastAsia"/>
@@ -288,8 +359,13 @@
         <w:t>F</w:t>
       </w:r>
       <w:r>
-        <w:t>alse, use image_height</w:t>
-      </w:r>
+        <w:t xml:space="preserve">alse, use </w:t>
+      </w:r>
+      <w:proofErr w:type="spellStart"/>
+      <w:r>
+        <w:t>image_height</w:t>
+      </w:r>
+      <w:proofErr w:type="spellEnd"/>
     </w:p>
     <w:p>
       <w:r>
@@ -467,8 +543,13 @@
         </w:rPr>
         <w:t xml:space="preserve"> a standard equation defined by </w:t>
       </w:r>
-      <w:r>
-        <w:t>lerp(a, b, t) = a * (1 - t) + b * t</w:t>
+      <w:proofErr w:type="gramStart"/>
+      <w:r>
+        <w:t>lerp(</w:t>
+      </w:r>
+      <w:proofErr w:type="gramEnd"/>
+      <w:r>
+        <w:t>a, b, t) = a * (1 - t) + b * t</w:t>
       </w:r>
     </w:p>
     <w:p>
@@ -588,7 +669,21 @@
         <w:rPr>
           <w:rFonts w:hint="eastAsia"/>
         </w:rPr>
-        <w:t>(C-P)*(C-P) is the dot product of the length of the origin-to-center vector. For the equation of that value being equal to r</w:t>
+        <w:t>(C-</w:t>
+      </w:r>
+      <w:proofErr w:type="gramStart"/>
+      <w:r>
+        <w:rPr>
+          <w:rFonts w:hint="eastAsia"/>
+        </w:rPr>
+        <w:t>P)*</w:t>
+      </w:r>
+      <w:proofErr w:type="gramEnd"/>
+      <w:r>
+        <w:rPr>
+          <w:rFonts w:hint="eastAsia"/>
+        </w:rPr>
+        <w:t>(C-P) is the dot product of the length of the origin-to-center vector. For the equation of that value being equal to r</w:t>
       </w:r>
       <w:r>
         <w:rPr>
@@ -601,10 +696,21 @@
         <w:rPr>
           <w:rFonts w:hint="eastAsia"/>
         </w:rPr>
-        <w:t xml:space="preserve">, imagine a sphere of radius r migrated (C-P) distance away from origin (camera lens). The ray, if allowed to permeate through, will intersect these </w:t>
-      </w:r>
-      <w:r>
-        <w:t>selection o</w:t>
+        <w:t xml:space="preserve">, imagine a sphere of radius r migrated (C-P) distance away from origin (camera lens). The ray, if allowed to permeate through, will intersect </w:t>
+      </w:r>
+      <w:proofErr w:type="gramStart"/>
+      <w:r>
+        <w:rPr>
+          <w:rFonts w:hint="eastAsia"/>
+        </w:rPr>
+        <w:t xml:space="preserve">these </w:t>
+      </w:r>
+      <w:r>
+        <w:t>selection</w:t>
+      </w:r>
+      <w:proofErr w:type="gramEnd"/>
+      <w:r>
+        <w:t xml:space="preserve"> o</w:t>
       </w:r>
       <w:r>
         <w:rPr>
@@ -782,8 +888,16 @@
         <w:rPr>
           <w:rFonts w:hint="eastAsia"/>
         </w:rPr>
-        <w:t>6.1 Shading with Surface Normals</w:t>
-      </w:r>
+        <w:t xml:space="preserve">6.1 Shading with Surface </w:t>
+      </w:r>
+      <w:proofErr w:type="spellStart"/>
+      <w:r>
+        <w:rPr>
+          <w:rFonts w:hint="eastAsia"/>
+        </w:rPr>
+        <w:t>Normals</w:t>
+      </w:r>
+      <w:proofErr w:type="spellEnd"/>
     </w:p>
     <w:p>
       <w:r>
@@ -895,7 +1009,43 @@
           <w:rFonts w:hint="eastAsia"/>
         </w:rPr>
         <w:lastRenderedPageBreak/>
-        <w:t>This means that the directional vector (x,y,z) of the unit surface normal is mapped to (R,G,B)</w:t>
+        <w:t>This means that the directional vector (</w:t>
+      </w:r>
+      <w:proofErr w:type="spellStart"/>
+      <w:proofErr w:type="gramStart"/>
+      <w:r>
+        <w:rPr>
+          <w:rFonts w:hint="eastAsia"/>
+        </w:rPr>
+        <w:t>x,y</w:t>
+      </w:r>
+      <w:proofErr w:type="gramEnd"/>
+      <w:r>
+        <w:rPr>
+          <w:rFonts w:hint="eastAsia"/>
+        </w:rPr>
+        <w:t>,z</w:t>
+      </w:r>
+      <w:proofErr w:type="spellEnd"/>
+      <w:r>
+        <w:rPr>
+          <w:rFonts w:hint="eastAsia"/>
+        </w:rPr>
+        <w:t>) of the unit surface normal is mapped to (</w:t>
+      </w:r>
+      <w:proofErr w:type="gramStart"/>
+      <w:r>
+        <w:rPr>
+          <w:rFonts w:hint="eastAsia"/>
+        </w:rPr>
+        <w:t>R,G</w:t>
+      </w:r>
+      <w:proofErr w:type="gramEnd"/>
+      <w:r>
+        <w:rPr>
+          <w:rFonts w:hint="eastAsia"/>
+        </w:rPr>
+        <w:t>,B)</w:t>
       </w:r>
     </w:p>
     <w:p>
@@ -1136,7 +1286,15 @@
         <w:t xml:space="preserve"> </w:t>
       </w:r>
       <w:r>
-        <w:t>Moving Camera Code Into Its Own Class</w:t>
+        <w:t xml:space="preserve">Moving Camera Code </w:t>
+      </w:r>
+      <w:proofErr w:type="gramStart"/>
+      <w:r>
+        <w:t>Into</w:t>
+      </w:r>
+      <w:proofErr w:type="gramEnd"/>
+      <w:r>
+        <w:t xml:space="preserve"> Its Own Class</w:t>
       </w:r>
     </w:p>
     <w:p>
@@ -1146,9 +1304,11 @@
         </w:rPr>
         <w:t xml:space="preserve">After creating </w:t>
       </w:r>
+      <w:proofErr w:type="spellStart"/>
       <w:r>
         <w:t>rtweekend.h</w:t>
       </w:r>
+      <w:proofErr w:type="spellEnd"/>
       <w:r>
         <w:rPr>
           <w:rFonts w:hint="eastAsia"/>
@@ -1370,7 +1530,21 @@
         <w:rPr>
           <w:rFonts w:hint="eastAsia"/>
         </w:rPr>
-        <w:t>. At the current state, if we were to render a 8 x 8 checkerboard far away such that it</w:t>
+        <w:t xml:space="preserve">. At the current state, if we were to render </w:t>
+      </w:r>
+      <w:proofErr w:type="gramStart"/>
+      <w:r>
+        <w:rPr>
+          <w:rFonts w:hint="eastAsia"/>
+        </w:rPr>
+        <w:t>a</w:t>
+      </w:r>
+      <w:proofErr w:type="gramEnd"/>
+      <w:r>
+        <w:rPr>
+          <w:rFonts w:hint="eastAsia"/>
+        </w:rPr>
+        <w:t xml:space="preserve"> 8 x 8 checkerboard far away such that it</w:t>
       </w:r>
       <w:r>
         <w:t>’</w:t>
@@ -1439,7 +1613,21 @@
         <w:rPr>
           <w:rFonts w:hint="eastAsia"/>
         </w:rPr>
-        <w:t xml:space="preserve">ll sample the four square regions of a pixel that extends halfway into each of the four neighboring pixels </w:t>
+        <w:t xml:space="preserve">ll sample the </w:t>
+      </w:r>
+      <w:proofErr w:type="gramStart"/>
+      <w:r>
+        <w:rPr>
+          <w:rFonts w:hint="eastAsia"/>
+        </w:rPr>
+        <w:t>four square</w:t>
+      </w:r>
+      <w:proofErr w:type="gramEnd"/>
+      <w:r>
+        <w:rPr>
+          <w:rFonts w:hint="eastAsia"/>
+        </w:rPr>
+        <w:t xml:space="preserve"> regions of a pixel that extends halfway into each of the four neighboring pixels </w:t>
       </w:r>
       <w:r>
         <w:t>–</w:t>
@@ -1456,9 +1644,6 @@
     <w:p>
       <w:pPr>
         <w:pStyle w:val="2"/>
-        <w:rPr>
-          <w:rFonts w:hint="eastAsia"/>
-        </w:rPr>
       </w:pPr>
       <w:r>
         <w:rPr>
@@ -1471,11 +1656,6 @@
       </w:r>
     </w:p>
     <w:p>
-      <w:pPr>
-        <w:rPr>
-          <w:rFonts w:hint="eastAsia"/>
-        </w:rPr>
-      </w:pPr>
       <w:r>
         <w:rPr>
           <w:rFonts w:hint="eastAsia"/>
@@ -1483,12 +1663,131 @@
         <w:t>For a single pixel composed of multiple samples, the samples from the surrounding area of the pixel will be taken to average the color values.</w:t>
       </w:r>
     </w:p>
-    <w:p>
-      <w:pPr>
-        <w:rPr>
-          <w:rFonts w:hint="eastAsia"/>
-        </w:rPr>
-      </w:pPr>
+    <w:p/>
+    <w:p/>
+    <w:p>
+      <w:pPr>
+        <w:pStyle w:val="2"/>
+        <w:rPr>
+          <w:rFonts w:hint="eastAsia"/>
+        </w:rPr>
+      </w:pPr>
+      <w:r>
+        <w:rPr>
+          <w:rFonts w:hint="eastAsia"/>
+        </w:rPr>
+        <w:t>9</w:t>
+      </w:r>
+      <w:r>
+        <w:rPr>
+          <w:rFonts w:hint="eastAsia"/>
+        </w:rPr>
+        <w:t xml:space="preserve"> </w:t>
+      </w:r>
+      <w:r>
+        <w:rPr>
+          <w:rFonts w:hint="eastAsia"/>
+        </w:rPr>
+        <w:t>Diffuse Materials</w:t>
+      </w:r>
+    </w:p>
+    <w:p>
+      <w:pPr>
+        <w:rPr>
+          <w:rFonts w:hint="eastAsia"/>
+        </w:rPr>
+      </w:pPr>
+      <w:r>
+        <w:rPr>
+          <w:rFonts w:hint="eastAsia"/>
+        </w:rPr>
+        <w:t xml:space="preserve">Diffuse materials, or matte materials, are those with </w:t>
+      </w:r>
+      <w:r>
+        <w:t>a surface that reflects light in a non-directional</w:t>
+      </w:r>
+      <w:r>
+        <w:rPr>
+          <w:rFonts w:hint="eastAsia"/>
+        </w:rPr>
+        <w:t xml:space="preserve"> way</w:t>
+      </w:r>
+      <w:r>
+        <w:t>, scattering it equally in all directions</w:t>
+      </w:r>
+      <w:r>
+        <w:rPr>
+          <w:rFonts w:hint="eastAsia"/>
+        </w:rPr>
+        <w:t xml:space="preserve">. </w:t>
+      </w:r>
+      <w:r>
+        <w:t>The darker the surface, the more likely the ray is absorbed (that’s why it's dark!).</w:t>
+      </w:r>
+      <w:r>
+        <w:rPr>
+          <w:rFonts w:hint="eastAsia"/>
+        </w:rPr>
+        <w:t xml:space="preserve"> </w:t>
+      </w:r>
+      <w:r>
+        <w:t>Really any algorithm that randomizes direction will produce surfaces that look matte. </w:t>
+      </w:r>
+    </w:p>
+    <w:p>
+      <w:r>
+        <w:rPr>
+          <w:noProof/>
+        </w:rPr>
+        <w:drawing>
+          <wp:inline distT="0" distB="0" distL="0" distR="0" wp14:anchorId="1B3530F1" wp14:editId="7156D5E4">
+            <wp:extent cx="4371975" cy="3262481"/>
+            <wp:effectExtent l="0" t="0" r="0" b="0"/>
+            <wp:docPr id="1168297980" name="그림 1"/>
+            <wp:cNvGraphicFramePr>
+              <a:graphicFrameLocks xmlns:a="http://schemas.openxmlformats.org/drawingml/2006/main" noChangeAspect="1"/>
+            </wp:cNvGraphicFramePr>
+            <a:graphic xmlns:a="http://schemas.openxmlformats.org/drawingml/2006/main">
+              <a:graphicData uri="http://schemas.openxmlformats.org/drawingml/2006/picture">
+                <pic:pic xmlns:pic="http://schemas.openxmlformats.org/drawingml/2006/picture">
+                  <pic:nvPicPr>
+                    <pic:cNvPr id="0" name="Picture 1"/>
+                    <pic:cNvPicPr>
+                      <a:picLocks noChangeAspect="1" noChangeArrowheads="1"/>
+                    </pic:cNvPicPr>
+                  </pic:nvPicPr>
+                  <pic:blipFill>
+                    <a:blip r:embed="rId17">
+                      <a:extLst>
+                        <a:ext uri="{28A0092B-C50C-407E-A947-70E740481C1C}">
+                          <a14:useLocalDpi xmlns:a14="http://schemas.microsoft.com/office/drawing/2010/main" val="0"/>
+                        </a:ext>
+                      </a:extLst>
+                    </a:blip>
+                    <a:srcRect/>
+                    <a:stretch>
+                      <a:fillRect/>
+                    </a:stretch>
+                  </pic:blipFill>
+                  <pic:spPr bwMode="auto">
+                    <a:xfrm>
+                      <a:off x="0" y="0"/>
+                      <a:ext cx="4374981" cy="3264724"/>
+                    </a:xfrm>
+                    <a:prstGeom prst="rect">
+                      <a:avLst/>
+                    </a:prstGeom>
+                    <a:noFill/>
+                    <a:ln>
+                      <a:noFill/>
+                    </a:ln>
+                  </pic:spPr>
+                </pic:pic>
+              </a:graphicData>
+            </a:graphic>
+          </wp:inline>
+        </w:drawing>
+      </w:r>
     </w:p>
     <w:p>
       <w:pPr>
@@ -2400,7 +2699,6 @@
   <w:style w:type="character" w:default="1" w:styleId="a0">
     <w:name w:val="Default Paragraph Font"/>
     <w:uiPriority w:val="1"/>
-    <w:semiHidden/>
     <w:unhideWhenUsed/>
   </w:style>
   <w:style w:type="table" w:default="1" w:styleId="a1">

</xml_diff>

<commit_message>
Updated notes on rejection method
</commit_message>
<xml_diff>
--- a/Notes.docx
+++ b/Notes.docx
@@ -1676,27 +1676,22 @@
         <w:rPr>
           <w:rFonts w:hint="eastAsia"/>
         </w:rPr>
-        <w:t>9</w:t>
-      </w:r>
-      <w:r>
-        <w:rPr>
-          <w:rFonts w:hint="eastAsia"/>
-        </w:rPr>
-        <w:t xml:space="preserve"> </w:t>
-      </w:r>
-      <w:r>
-        <w:rPr>
-          <w:rFonts w:hint="eastAsia"/>
-        </w:rPr>
-        <w:t>Diffuse Materials</w:t>
-      </w:r>
-    </w:p>
-    <w:p>
-      <w:pPr>
-        <w:rPr>
-          <w:rFonts w:hint="eastAsia"/>
-        </w:rPr>
-      </w:pPr>
+        <w:t>9 Diffuse Materials</w:t>
+      </w:r>
+      <w:r>
+        <w:rPr>
+          <w:rFonts w:hint="eastAsia"/>
+        </w:rPr>
+        <w:t xml:space="preserve"> &amp; </w:t>
+      </w:r>
+      <w:r>
+        <w:rPr>
+          <w:rFonts w:hint="eastAsia"/>
+        </w:rPr>
+        <w:t>9.1 A Simple Diffuse Material</w:t>
+      </w:r>
+    </w:p>
+    <w:p>
       <w:r>
         <w:rPr>
           <w:rFonts w:hint="eastAsia"/>
@@ -1790,6 +1785,111 @@
       </w:r>
     </w:p>
     <w:p>
+      <w:r>
+        <w:rPr>
+          <w:rFonts w:hint="eastAsia"/>
+        </w:rPr>
+        <w:lastRenderedPageBreak/>
+        <w:t xml:space="preserve">The next step is to </w:t>
+      </w:r>
+      <w:r>
+        <w:t>manipulate random vector</w:t>
+      </w:r>
+      <w:r>
+        <w:rPr>
+          <w:rFonts w:hint="eastAsia"/>
+        </w:rPr>
+        <w:t>s</w:t>
+      </w:r>
+      <w:r>
+        <w:t xml:space="preserve"> so that we only get results that are on the surface of a hemisphere</w:t>
+      </w:r>
+      <w:r>
+        <w:rPr>
+          <w:rFonts w:hint="eastAsia"/>
+        </w:rPr>
+        <w:t>. The analytical methods to achieve this are very complicated, however.</w:t>
+      </w:r>
+      <w:r>
+        <w:rPr>
+          <w:rFonts w:hint="eastAsia"/>
+        </w:rPr>
+        <w:t xml:space="preserve"> </w:t>
+      </w:r>
+      <w:r>
+        <w:t>The easiest algorithm is the rejection method - repeatedly generating random samples until we produce a sample that meets the desired criteria. In other words, keep rejecting bad samples until you find a good one.</w:t>
+      </w:r>
+    </w:p>
+    <w:p>
+      <w:pPr>
+        <w:numPr>
+          <w:ilvl w:val="0"/>
+          <w:numId w:val="3"/>
+        </w:numPr>
+      </w:pPr>
+      <w:r>
+        <w:tab/>
+      </w:r>
+      <w:r>
+        <w:t>Generate a random vector inside the unit sphere</w:t>
+      </w:r>
+    </w:p>
+    <w:p>
+      <w:pPr>
+        <w:numPr>
+          <w:ilvl w:val="0"/>
+          <w:numId w:val="3"/>
+        </w:numPr>
+      </w:pPr>
+      <w:r>
+        <w:t>Normalize this vector to extend it to the sphere surface</w:t>
+      </w:r>
+    </w:p>
+    <w:p>
+      <w:pPr>
+        <w:numPr>
+          <w:ilvl w:val="0"/>
+          <w:numId w:val="3"/>
+        </w:numPr>
+      </w:pPr>
+      <w:r>
+        <w:t>Invert the normalized vector if it falls onto the wrong hemisphere</w:t>
+      </w:r>
+    </w:p>
+    <w:p>
+      <w:pPr>
+        <w:rPr>
+          <w:rFonts w:hint="eastAsia"/>
+        </w:rPr>
+      </w:pPr>
+    </w:p>
+    <w:p>
+      <w:pPr>
+        <w:rPr>
+          <w:rFonts w:hint="eastAsia"/>
+        </w:rPr>
+      </w:pPr>
+    </w:p>
+    <w:p>
+      <w:pPr>
+        <w:pStyle w:val="2"/>
+      </w:pPr>
+      <w:r>
+        <w:rPr>
+          <w:rFonts w:hint="eastAsia"/>
+        </w:rPr>
+        <w:t>9.</w:t>
+      </w:r>
+    </w:p>
+    <w:p>
+      <w:pPr>
+        <w:rPr>
+          <w:rFonts w:hint="eastAsia"/>
+        </w:rPr>
+      </w:pPr>
+    </w:p>
+    <w:p/>
+    <w:p>
       <w:pPr>
         <w:rPr>
           <w:rFonts w:hint="eastAsia"/>
@@ -1973,6 +2073,119 @@
     </w:lvl>
   </w:abstractNum>
   <w:abstractNum w:abstractNumId="1" w15:restartNumberingAfterBreak="0">
+    <w:nsid w:val="26F11E7F"/>
+    <w:multiLevelType w:val="multilevel"/>
+    <w:tmpl w:val="692C35FA"/>
+    <w:lvl w:ilvl="0">
+      <w:start w:val="1"/>
+      <w:numFmt w:val="decimal"/>
+      <w:lvlText w:val="%1."/>
+      <w:lvlJc w:val="left"/>
+      <w:pPr>
+        <w:tabs>
+          <w:tab w:val="num" w:pos="720"/>
+        </w:tabs>
+        <w:ind w:left="720" w:hanging="360"/>
+      </w:pPr>
+    </w:lvl>
+    <w:lvl w:ilvl="1" w:tentative="1">
+      <w:start w:val="1"/>
+      <w:numFmt w:val="decimal"/>
+      <w:lvlText w:val="%2."/>
+      <w:lvlJc w:val="left"/>
+      <w:pPr>
+        <w:tabs>
+          <w:tab w:val="num" w:pos="1440"/>
+        </w:tabs>
+        <w:ind w:left="1440" w:hanging="360"/>
+      </w:pPr>
+    </w:lvl>
+    <w:lvl w:ilvl="2" w:tentative="1">
+      <w:start w:val="1"/>
+      <w:numFmt w:val="decimal"/>
+      <w:lvlText w:val="%3."/>
+      <w:lvlJc w:val="left"/>
+      <w:pPr>
+        <w:tabs>
+          <w:tab w:val="num" w:pos="2160"/>
+        </w:tabs>
+        <w:ind w:left="2160" w:hanging="360"/>
+      </w:pPr>
+    </w:lvl>
+    <w:lvl w:ilvl="3" w:tentative="1">
+      <w:start w:val="1"/>
+      <w:numFmt w:val="decimal"/>
+      <w:lvlText w:val="%4."/>
+      <w:lvlJc w:val="left"/>
+      <w:pPr>
+        <w:tabs>
+          <w:tab w:val="num" w:pos="2880"/>
+        </w:tabs>
+        <w:ind w:left="2880" w:hanging="360"/>
+      </w:pPr>
+    </w:lvl>
+    <w:lvl w:ilvl="4" w:tentative="1">
+      <w:start w:val="1"/>
+      <w:numFmt w:val="decimal"/>
+      <w:lvlText w:val="%5."/>
+      <w:lvlJc w:val="left"/>
+      <w:pPr>
+        <w:tabs>
+          <w:tab w:val="num" w:pos="3600"/>
+        </w:tabs>
+        <w:ind w:left="3600" w:hanging="360"/>
+      </w:pPr>
+    </w:lvl>
+    <w:lvl w:ilvl="5" w:tentative="1">
+      <w:start w:val="1"/>
+      <w:numFmt w:val="decimal"/>
+      <w:lvlText w:val="%6."/>
+      <w:lvlJc w:val="left"/>
+      <w:pPr>
+        <w:tabs>
+          <w:tab w:val="num" w:pos="4320"/>
+        </w:tabs>
+        <w:ind w:left="4320" w:hanging="360"/>
+      </w:pPr>
+    </w:lvl>
+    <w:lvl w:ilvl="6" w:tentative="1">
+      <w:start w:val="1"/>
+      <w:numFmt w:val="decimal"/>
+      <w:lvlText w:val="%7."/>
+      <w:lvlJc w:val="left"/>
+      <w:pPr>
+        <w:tabs>
+          <w:tab w:val="num" w:pos="5040"/>
+        </w:tabs>
+        <w:ind w:left="5040" w:hanging="360"/>
+      </w:pPr>
+    </w:lvl>
+    <w:lvl w:ilvl="7" w:tentative="1">
+      <w:start w:val="1"/>
+      <w:numFmt w:val="decimal"/>
+      <w:lvlText w:val="%8."/>
+      <w:lvlJc w:val="left"/>
+      <w:pPr>
+        <w:tabs>
+          <w:tab w:val="num" w:pos="5760"/>
+        </w:tabs>
+        <w:ind w:left="5760" w:hanging="360"/>
+      </w:pPr>
+    </w:lvl>
+    <w:lvl w:ilvl="8" w:tentative="1">
+      <w:start w:val="1"/>
+      <w:numFmt w:val="decimal"/>
+      <w:lvlText w:val="%9."/>
+      <w:lvlJc w:val="left"/>
+      <w:pPr>
+        <w:tabs>
+          <w:tab w:val="num" w:pos="6480"/>
+        </w:tabs>
+        <w:ind w:left="6480" w:hanging="360"/>
+      </w:pPr>
+    </w:lvl>
+  </w:abstractNum>
+  <w:abstractNum w:abstractNumId="2" w15:restartNumberingAfterBreak="0">
     <w:nsid w:val="29723D54"/>
     <w:multiLevelType w:val="hybridMultilevel"/>
     <w:tmpl w:val="B61E451C"/>
@@ -2088,6 +2301,9 @@
     <w:abstractNumId w:val="0"/>
   </w:num>
   <w:num w:numId="2" w16cid:durableId="1689330428">
+    <w:abstractNumId w:val="2"/>
+  </w:num>
+  <w:num w:numId="3" w16cid:durableId="202404503">
     <w:abstractNumId w:val="1"/>
   </w:num>
 </w:numbering>

</xml_diff>

<commit_message>
Added random_unit_vector() to vec3.h
</commit_message>
<xml_diff>
--- a/Notes.docx
+++ b/Notes.docx
@@ -216,61 +216,15 @@
       <w:r>
         <w:tab/>
       </w:r>
-      <w:proofErr w:type="spellStart"/>
-      <w:r>
-        <w:rPr>
-          <w:rFonts w:hint="eastAsia"/>
-        </w:rPr>
-        <w:t>image_height</w:t>
-      </w:r>
-      <w:proofErr w:type="spellEnd"/>
-      <w:r>
-        <w:rPr>
-          <w:rFonts w:hint="eastAsia"/>
-        </w:rPr>
-        <w:t xml:space="preserve"> = (</w:t>
-      </w:r>
-      <w:proofErr w:type="spellStart"/>
-      <w:r>
-        <w:rPr>
-          <w:rFonts w:hint="eastAsia"/>
-        </w:rPr>
-        <w:t>image_height</w:t>
-      </w:r>
-      <w:proofErr w:type="spellEnd"/>
-      <w:r>
-        <w:rPr>
-          <w:rFonts w:hint="eastAsia"/>
-        </w:rPr>
-        <w:t xml:space="preserve"> &lt; 1</w:t>
-      </w:r>
-      <w:proofErr w:type="gramStart"/>
-      <w:r>
-        <w:rPr>
-          <w:rFonts w:hint="eastAsia"/>
-        </w:rPr>
-        <w:t xml:space="preserve">) </w:t>
-      </w:r>
-      <w:r>
-        <w:t>?</w:t>
-      </w:r>
-      <w:proofErr w:type="gramEnd"/>
-      <w:r>
-        <w:t xml:space="preserve"> </w:t>
-      </w:r>
-      <w:proofErr w:type="gramStart"/>
-      <w:r>
-        <w:t>1 :</w:t>
-      </w:r>
-      <w:proofErr w:type="gramEnd"/>
-      <w:r>
-        <w:t xml:space="preserve"> </w:t>
-      </w:r>
-      <w:proofErr w:type="spellStart"/>
-      <w:r>
-        <w:t>image_height</w:t>
-      </w:r>
-      <w:proofErr w:type="spellEnd"/>
+      <w:r>
+        <w:rPr>
+          <w:rFonts w:hint="eastAsia"/>
+        </w:rPr>
+        <w:t xml:space="preserve">image_height = (image_height &lt; 1) </w:t>
+      </w:r>
+      <w:r>
+        <w:t>? 1 : image_height</w:t>
+      </w:r>
     </w:p>
     <w:p>
       <w:pPr>
@@ -281,36 +235,11 @@
           <w:b/>
           <w:bCs/>
         </w:rPr>
-        <w:t xml:space="preserve">? </w:t>
-      </w:r>
-      <w:proofErr w:type="gramStart"/>
-      <w:r>
-        <w:rPr>
-          <w:b/>
-          <w:bCs/>
-        </w:rPr>
-        <w:t>1 :</w:t>
-      </w:r>
-      <w:proofErr w:type="gramEnd"/>
-      <w:r>
-        <w:rPr>
-          <w:b/>
-          <w:bCs/>
-        </w:rPr>
+        <w:t>? 1 : image_height</w:t>
+      </w:r>
+      <w:r>
         <w:t xml:space="preserve"> </w:t>
       </w:r>
-      <w:proofErr w:type="spellStart"/>
-      <w:r>
-        <w:rPr>
-          <w:b/>
-          <w:bCs/>
-        </w:rPr>
-        <w:t>image_height</w:t>
-      </w:r>
-      <w:proofErr w:type="spellEnd"/>
-      <w:r>
-        <w:t xml:space="preserve"> </w:t>
-      </w:r>
       <w:r>
         <w:rPr>
           <w:rFonts w:hint="eastAsia"/>
@@ -359,13 +288,8 @@
         <w:t>F</w:t>
       </w:r>
       <w:r>
-        <w:t xml:space="preserve">alse, use </w:t>
-      </w:r>
-      <w:proofErr w:type="spellStart"/>
-      <w:r>
-        <w:t>image_height</w:t>
-      </w:r>
-      <w:proofErr w:type="spellEnd"/>
+        <w:t>alse, use image_height</w:t>
+      </w:r>
     </w:p>
     <w:p>
       <w:r>
@@ -543,13 +467,8 @@
         </w:rPr>
         <w:t xml:space="preserve"> a standard equation defined by </w:t>
       </w:r>
-      <w:proofErr w:type="gramStart"/>
-      <w:r>
-        <w:t>lerp(</w:t>
-      </w:r>
-      <w:proofErr w:type="gramEnd"/>
-      <w:r>
-        <w:t>a, b, t) = a * (1 - t) + b * t</w:t>
+      <w:r>
+        <w:t>lerp(a, b, t) = a * (1 - t) + b * t</w:t>
       </w:r>
     </w:p>
     <w:p>
@@ -669,21 +588,7 @@
         <w:rPr>
           <w:rFonts w:hint="eastAsia"/>
         </w:rPr>
-        <w:t>(C-</w:t>
-      </w:r>
-      <w:proofErr w:type="gramStart"/>
-      <w:r>
-        <w:rPr>
-          <w:rFonts w:hint="eastAsia"/>
-        </w:rPr>
-        <w:t>P)*</w:t>
-      </w:r>
-      <w:proofErr w:type="gramEnd"/>
-      <w:r>
-        <w:rPr>
-          <w:rFonts w:hint="eastAsia"/>
-        </w:rPr>
-        <w:t>(C-P) is the dot product of the length of the origin-to-center vector. For the equation of that value being equal to r</w:t>
+        <w:t>(C-P)*(C-P) is the dot product of the length of the origin-to-center vector. For the equation of that value being equal to r</w:t>
       </w:r>
       <w:r>
         <w:rPr>
@@ -696,21 +601,10 @@
         <w:rPr>
           <w:rFonts w:hint="eastAsia"/>
         </w:rPr>
-        <w:t xml:space="preserve">, imagine a sphere of radius r migrated (C-P) distance away from origin (camera lens). The ray, if allowed to permeate through, will intersect </w:t>
-      </w:r>
-      <w:proofErr w:type="gramStart"/>
-      <w:r>
-        <w:rPr>
-          <w:rFonts w:hint="eastAsia"/>
-        </w:rPr>
-        <w:t xml:space="preserve">these </w:t>
-      </w:r>
-      <w:r>
-        <w:t>selection</w:t>
-      </w:r>
-      <w:proofErr w:type="gramEnd"/>
-      <w:r>
-        <w:t xml:space="preserve"> o</w:t>
+        <w:t xml:space="preserve">, imagine a sphere of radius r migrated (C-P) distance away from origin (camera lens). The ray, if allowed to permeate through, will intersect these </w:t>
+      </w:r>
+      <w:r>
+        <w:t>selection o</w:t>
       </w:r>
       <w:r>
         <w:rPr>
@@ -888,16 +782,8 @@
         <w:rPr>
           <w:rFonts w:hint="eastAsia"/>
         </w:rPr>
-        <w:t xml:space="preserve">6.1 Shading with Surface </w:t>
-      </w:r>
-      <w:proofErr w:type="spellStart"/>
-      <w:r>
-        <w:rPr>
-          <w:rFonts w:hint="eastAsia"/>
-        </w:rPr>
-        <w:t>Normals</w:t>
-      </w:r>
-      <w:proofErr w:type="spellEnd"/>
+        <w:t>6.1 Shading with Surface Normals</w:t>
+      </w:r>
     </w:p>
     <w:p>
       <w:r>
@@ -1009,43 +895,7 @@
           <w:rFonts w:hint="eastAsia"/>
         </w:rPr>
         <w:lastRenderedPageBreak/>
-        <w:t>This means that the directional vector (</w:t>
-      </w:r>
-      <w:proofErr w:type="spellStart"/>
-      <w:proofErr w:type="gramStart"/>
-      <w:r>
-        <w:rPr>
-          <w:rFonts w:hint="eastAsia"/>
-        </w:rPr>
-        <w:t>x,y</w:t>
-      </w:r>
-      <w:proofErr w:type="gramEnd"/>
-      <w:r>
-        <w:rPr>
-          <w:rFonts w:hint="eastAsia"/>
-        </w:rPr>
-        <w:t>,z</w:t>
-      </w:r>
-      <w:proofErr w:type="spellEnd"/>
-      <w:r>
-        <w:rPr>
-          <w:rFonts w:hint="eastAsia"/>
-        </w:rPr>
-        <w:t>) of the unit surface normal is mapped to (</w:t>
-      </w:r>
-      <w:proofErr w:type="gramStart"/>
-      <w:r>
-        <w:rPr>
-          <w:rFonts w:hint="eastAsia"/>
-        </w:rPr>
-        <w:t>R,G</w:t>
-      </w:r>
-      <w:proofErr w:type="gramEnd"/>
-      <w:r>
-        <w:rPr>
-          <w:rFonts w:hint="eastAsia"/>
-        </w:rPr>
-        <w:t>,B)</w:t>
+        <w:t>This means that the directional vector (x,y,z) of the unit surface normal is mapped to (R,G,B)</w:t>
       </w:r>
     </w:p>
     <w:p>
@@ -1286,15 +1136,7 @@
         <w:t xml:space="preserve"> </w:t>
       </w:r>
       <w:r>
-        <w:t xml:space="preserve">Moving Camera Code </w:t>
-      </w:r>
-      <w:proofErr w:type="gramStart"/>
-      <w:r>
-        <w:t>Into</w:t>
-      </w:r>
-      <w:proofErr w:type="gramEnd"/>
-      <w:r>
-        <w:t xml:space="preserve"> Its Own Class</w:t>
+        <w:t>Moving Camera Code Into Its Own Class</w:t>
       </w:r>
     </w:p>
     <w:p>
@@ -1304,11 +1146,9 @@
         </w:rPr>
         <w:t xml:space="preserve">After creating </w:t>
       </w:r>
-      <w:proofErr w:type="spellStart"/>
       <w:r>
         <w:t>rtweekend.h</w:t>
       </w:r>
-      <w:proofErr w:type="spellEnd"/>
       <w:r>
         <w:rPr>
           <w:rFonts w:hint="eastAsia"/>
@@ -1530,21 +1370,7 @@
         <w:rPr>
           <w:rFonts w:hint="eastAsia"/>
         </w:rPr>
-        <w:t xml:space="preserve">. At the current state, if we were to render </w:t>
-      </w:r>
-      <w:proofErr w:type="gramStart"/>
-      <w:r>
-        <w:rPr>
-          <w:rFonts w:hint="eastAsia"/>
-        </w:rPr>
-        <w:t>a</w:t>
-      </w:r>
-      <w:proofErr w:type="gramEnd"/>
-      <w:r>
-        <w:rPr>
-          <w:rFonts w:hint="eastAsia"/>
-        </w:rPr>
-        <w:t xml:space="preserve"> 8 x 8 checkerboard far away such that it</w:t>
+        <w:t>. At the current state, if we were to render a 8 x 8 checkerboard far away such that it</w:t>
       </w:r>
       <w:r>
         <w:t>’</w:t>
@@ -1613,21 +1439,7 @@
         <w:rPr>
           <w:rFonts w:hint="eastAsia"/>
         </w:rPr>
-        <w:t xml:space="preserve">ll sample the </w:t>
-      </w:r>
-      <w:proofErr w:type="gramStart"/>
-      <w:r>
-        <w:rPr>
-          <w:rFonts w:hint="eastAsia"/>
-        </w:rPr>
-        <w:t>four square</w:t>
-      </w:r>
-      <w:proofErr w:type="gramEnd"/>
-      <w:r>
-        <w:rPr>
-          <w:rFonts w:hint="eastAsia"/>
-        </w:rPr>
-        <w:t xml:space="preserve"> regions of a pixel that extends halfway into each of the four neighboring pixels </w:t>
+        <w:t xml:space="preserve">ll sample the four square regions of a pixel that extends halfway into each of the four neighboring pixels </w:t>
       </w:r>
       <w:r>
         <w:t>–</w:t>
@@ -1668,9 +1480,6 @@
     <w:p>
       <w:pPr>
         <w:pStyle w:val="2"/>
-        <w:rPr>
-          <w:rFonts w:hint="eastAsia"/>
-        </w:rPr>
       </w:pPr>
       <w:r>
         <w:rPr>
@@ -1682,13 +1491,7 @@
         <w:rPr>
           <w:rFonts w:hint="eastAsia"/>
         </w:rPr>
-        <w:t xml:space="preserve"> &amp; </w:t>
-      </w:r>
-      <w:r>
-        <w:rPr>
-          <w:rFonts w:hint="eastAsia"/>
-        </w:rPr>
-        <w:t>9.1 A Simple Diffuse Material</w:t>
+        <w:t xml:space="preserve"> &amp; 9.1 A Simple Diffuse Material</w:t>
       </w:r>
     </w:p>
     <w:p>
@@ -1828,10 +1631,13 @@
         </w:numPr>
       </w:pPr>
       <w:r>
-        <w:tab/>
-      </w:r>
-      <w:r>
         <w:t>Generate a random vector inside the unit sphere</w:t>
+      </w:r>
+      <w:r>
+        <w:rPr>
+          <w:rFonts w:hint="eastAsia"/>
+        </w:rPr>
+        <w:t xml:space="preserve"> (x, y, z all in [-1, +1])</w:t>
       </w:r>
     </w:p>
     <w:p>
@@ -1858,17 +1664,151 @@
     </w:p>
     <w:p>
       <w:pPr>
-        <w:rPr>
-          <w:rFonts w:hint="eastAsia"/>
-        </w:rPr>
-      </w:pPr>
-    </w:p>
-    <w:p>
-      <w:pPr>
-        <w:rPr>
-          <w:rFonts w:hint="eastAsia"/>
-        </w:rPr>
-      </w:pPr>
+        <w:ind w:firstLine="360"/>
+        <w:rPr>
+          <w:rFonts w:hint="eastAsia"/>
+        </w:rPr>
+      </w:pPr>
+      <w:r>
+        <w:rPr>
+          <w:noProof/>
+        </w:rPr>
+        <w:drawing>
+          <wp:inline distT="0" distB="0" distL="0" distR="0" wp14:anchorId="430B8BC5" wp14:editId="0187EE64">
+            <wp:extent cx="2714625" cy="2558481"/>
+            <wp:effectExtent l="0" t="0" r="0" b="0"/>
+            <wp:docPr id="1970494460" name="그림 1"/>
+            <wp:cNvGraphicFramePr>
+              <a:graphicFrameLocks xmlns:a="http://schemas.openxmlformats.org/drawingml/2006/main" noChangeAspect="1"/>
+            </wp:cNvGraphicFramePr>
+            <a:graphic xmlns:a="http://schemas.openxmlformats.org/drawingml/2006/main">
+              <a:graphicData uri="http://schemas.openxmlformats.org/drawingml/2006/picture">
+                <pic:pic xmlns:pic="http://schemas.openxmlformats.org/drawingml/2006/picture">
+                  <pic:nvPicPr>
+                    <pic:cNvPr id="0" name="Picture 1"/>
+                    <pic:cNvPicPr>
+                      <a:picLocks noChangeAspect="1" noChangeArrowheads="1"/>
+                    </pic:cNvPicPr>
+                  </pic:nvPicPr>
+                  <pic:blipFill>
+                    <a:blip r:embed="rId18" cstate="print">
+                      <a:extLst>
+                        <a:ext uri="{28A0092B-C50C-407E-A947-70E740481C1C}">
+                          <a14:useLocalDpi xmlns:a14="http://schemas.microsoft.com/office/drawing/2010/main" val="0"/>
+                        </a:ext>
+                      </a:extLst>
+                    </a:blip>
+                    <a:srcRect/>
+                    <a:stretch>
+                      <a:fillRect/>
+                    </a:stretch>
+                  </pic:blipFill>
+                  <pic:spPr bwMode="auto">
+                    <a:xfrm>
+                      <a:off x="0" y="0"/>
+                      <a:ext cx="2723842" cy="2567168"/>
+                    </a:xfrm>
+                    <a:prstGeom prst="rect">
+                      <a:avLst/>
+                    </a:prstGeom>
+                    <a:noFill/>
+                    <a:ln>
+                      <a:noFill/>
+                    </a:ln>
+                  </pic:spPr>
+                </pic:pic>
+              </a:graphicData>
+            </a:graphic>
+          </wp:inline>
+        </w:drawing>
+      </w:r>
+      <w:r>
+        <w:tab/>
+      </w:r>
+      <w:r>
+        <w:tab/>
+      </w:r>
+      <w:r>
+        <w:rPr>
+          <w:noProof/>
+        </w:rPr>
+        <w:drawing>
+          <wp:inline distT="0" distB="0" distL="0" distR="0" wp14:anchorId="5FA50A90" wp14:editId="3C46C1DC">
+            <wp:extent cx="2714625" cy="2568597"/>
+            <wp:effectExtent l="0" t="0" r="0" b="3175"/>
+            <wp:docPr id="1256597066" name="그림 2"/>
+            <wp:cNvGraphicFramePr>
+              <a:graphicFrameLocks xmlns:a="http://schemas.openxmlformats.org/drawingml/2006/main" noChangeAspect="1"/>
+            </wp:cNvGraphicFramePr>
+            <a:graphic xmlns:a="http://schemas.openxmlformats.org/drawingml/2006/main">
+              <a:graphicData uri="http://schemas.openxmlformats.org/drawingml/2006/picture">
+                <pic:pic xmlns:pic="http://schemas.openxmlformats.org/drawingml/2006/picture">
+                  <pic:nvPicPr>
+                    <pic:cNvPr id="0" name="Picture 3"/>
+                    <pic:cNvPicPr>
+                      <a:picLocks noChangeAspect="1" noChangeArrowheads="1"/>
+                    </pic:cNvPicPr>
+                  </pic:nvPicPr>
+                  <pic:blipFill>
+                    <a:blip r:embed="rId19" cstate="print">
+                      <a:extLst>
+                        <a:ext uri="{28A0092B-C50C-407E-A947-70E740481C1C}">
+                          <a14:useLocalDpi xmlns:a14="http://schemas.microsoft.com/office/drawing/2010/main" val="0"/>
+                        </a:ext>
+                      </a:extLst>
+                    </a:blip>
+                    <a:srcRect/>
+                    <a:stretch>
+                      <a:fillRect/>
+                    </a:stretch>
+                  </pic:blipFill>
+                  <pic:spPr bwMode="auto">
+                    <a:xfrm>
+                      <a:off x="0" y="0"/>
+                      <a:ext cx="2719527" cy="2573235"/>
+                    </a:xfrm>
+                    <a:prstGeom prst="rect">
+                      <a:avLst/>
+                    </a:prstGeom>
+                    <a:noFill/>
+                    <a:ln>
+                      <a:noFill/>
+                    </a:ln>
+                  </pic:spPr>
+                </pic:pic>
+              </a:graphicData>
+            </a:graphic>
+          </wp:inline>
+        </w:drawing>
+      </w:r>
+    </w:p>
+    <w:p>
+      <w:pPr>
+        <w:rPr>
+          <w:rFonts w:hint="eastAsia"/>
+        </w:rPr>
+      </w:pPr>
+      <w:r>
+        <w:tab/>
+      </w:r>
+      <w:r>
+        <w:rPr>
+          <w:rFonts w:hint="eastAsia"/>
+        </w:rPr>
+        <w:t>1 accepted out of 3 random vectors</w:t>
+      </w:r>
+      <w:r>
+        <w:tab/>
+      </w:r>
+      <w:r>
+        <w:tab/>
+      </w:r>
+      <w:r>
+        <w:rPr>
+          <w:rFonts w:hint="eastAsia"/>
+        </w:rPr>
+        <w:t>vector is normalized to create a unit vector</w:t>
+      </w:r>
     </w:p>
     <w:p>
       <w:pPr>
@@ -1881,21 +1821,9 @@
         <w:t>9.</w:t>
       </w:r>
     </w:p>
-    <w:p>
-      <w:pPr>
-        <w:rPr>
-          <w:rFonts w:hint="eastAsia"/>
-        </w:rPr>
-      </w:pPr>
-    </w:p>
     <w:p/>
-    <w:p>
-      <w:pPr>
-        <w:rPr>
-          <w:rFonts w:hint="eastAsia"/>
-        </w:rPr>
-      </w:pPr>
-    </w:p>
+    <w:p/>
+    <w:p/>
     <w:p/>
     <w:sectPr>
       <w:pgSz w:w="11906" w:h="16838"/>
@@ -2915,6 +2843,7 @@
   <w:style w:type="character" w:default="1" w:styleId="a0">
     <w:name w:val="Default Paragraph Font"/>
     <w:uiPriority w:val="1"/>
+    <w:semiHidden/>
     <w:unhideWhenUsed/>
   </w:style>
   <w:style w:type="table" w:default="1" w:styleId="a1">

</xml_diff>

<commit_message>
Fixed image and implemented first diffuse sphere
</commit_message>
<xml_diff>
--- a/Notes.docx
+++ b/Notes.docx
@@ -1783,11 +1783,6 @@
       </w:r>
     </w:p>
     <w:p>
-      <w:pPr>
-        <w:rPr>
-          <w:rFonts w:hint="eastAsia"/>
-        </w:rPr>
-      </w:pPr>
       <w:r>
         <w:tab/>
       </w:r>
@@ -1810,6 +1805,93 @@
         <w:t>vector is normalized to create a unit vector</w:t>
       </w:r>
     </w:p>
+    <w:p/>
+    <w:p>
+      <w:pPr>
+        <w:jc w:val="center"/>
+      </w:pPr>
+      <w:r>
+        <w:rPr>
+          <w:noProof/>
+        </w:rPr>
+        <w:drawing>
+          <wp:inline distT="0" distB="0" distL="0" distR="0" wp14:anchorId="293AF46B" wp14:editId="03872644">
+            <wp:extent cx="2628609" cy="2763229"/>
+            <wp:effectExtent l="0" t="0" r="635" b="0"/>
+            <wp:docPr id="2143732763" name="그림 3"/>
+            <wp:cNvGraphicFramePr>
+              <a:graphicFrameLocks xmlns:a="http://schemas.openxmlformats.org/drawingml/2006/main" noChangeAspect="1"/>
+            </wp:cNvGraphicFramePr>
+            <a:graphic xmlns:a="http://schemas.openxmlformats.org/drawingml/2006/main">
+              <a:graphicData uri="http://schemas.openxmlformats.org/drawingml/2006/picture">
+                <pic:pic xmlns:pic="http://schemas.openxmlformats.org/drawingml/2006/picture">
+                  <pic:nvPicPr>
+                    <pic:cNvPr id="0" name="Picture 5"/>
+                    <pic:cNvPicPr>
+                      <a:picLocks noChangeAspect="1" noChangeArrowheads="1"/>
+                    </pic:cNvPicPr>
+                  </pic:nvPicPr>
+                  <pic:blipFill>
+                    <a:blip r:embed="rId20" cstate="print">
+                      <a:extLst>
+                        <a:ext uri="{28A0092B-C50C-407E-A947-70E740481C1C}">
+                          <a14:useLocalDpi xmlns:a14="http://schemas.microsoft.com/office/drawing/2010/main" val="0"/>
+                        </a:ext>
+                      </a:extLst>
+                    </a:blip>
+                    <a:srcRect/>
+                    <a:stretch>
+                      <a:fillRect/>
+                    </a:stretch>
+                  </pic:blipFill>
+                  <pic:spPr bwMode="auto">
+                    <a:xfrm>
+                      <a:off x="0" y="0"/>
+                      <a:ext cx="2640231" cy="2775446"/>
+                    </a:xfrm>
+                    <a:prstGeom prst="rect">
+                      <a:avLst/>
+                    </a:prstGeom>
+                    <a:noFill/>
+                    <a:ln>
+                      <a:noFill/>
+                    </a:ln>
+                  </pic:spPr>
+                </pic:pic>
+              </a:graphicData>
+            </a:graphic>
+          </wp:inline>
+        </w:drawing>
+      </w:r>
+    </w:p>
+    <w:p>
+      <w:pPr>
+        <w:jc w:val="center"/>
+        <w:rPr>
+          <w:rFonts w:hint="eastAsia"/>
+        </w:rPr>
+      </w:pPr>
+      <w:r>
+        <w:t>C</w:t>
+      </w:r>
+      <w:r>
+        <w:rPr>
+          <w:rFonts w:hint="eastAsia"/>
+        </w:rPr>
+        <w:t>heck if the vector is in the correct hemisphere by taking dot product with the surface normal (positive value is correct)</w:t>
+      </w:r>
+    </w:p>
+    <w:p/>
+    <w:p>
+      <w:pPr>
+        <w:rPr>
+          <w:rFonts w:hint="eastAsia"/>
+        </w:rPr>
+      </w:pPr>
+      <w:r>
+        <w:t>If a ray bounces off of a material and keeps 100% of its color, then we say that the material is white. If a ray bounces off of a material and keeps 0% of its color, then we say that the material is black.</w:t>
+      </w:r>
+    </w:p>
     <w:p>
       <w:pPr>
         <w:pStyle w:val="2"/>
@@ -1818,6 +1900,7 @@
         <w:rPr>
           <w:rFonts w:hint="eastAsia"/>
         </w:rPr>
+        <w:lastRenderedPageBreak/>
         <w:t>9.</w:t>
       </w:r>
     </w:p>

</xml_diff>

<commit_message>
Added notes on true Lambertian reflection and revised README.md
</commit_message>
<xml_diff>
--- a/Notes.docx
+++ b/Notes.docx
@@ -216,15 +216,61 @@
       <w:r>
         <w:tab/>
       </w:r>
-      <w:r>
-        <w:rPr>
-          <w:rFonts w:hint="eastAsia"/>
-        </w:rPr>
-        <w:t xml:space="preserve">image_height = (image_height &lt; 1) </w:t>
-      </w:r>
-      <w:r>
-        <w:t>? 1 : image_height</w:t>
-      </w:r>
+      <w:proofErr w:type="spellStart"/>
+      <w:r>
+        <w:rPr>
+          <w:rFonts w:hint="eastAsia"/>
+        </w:rPr>
+        <w:t>image_height</w:t>
+      </w:r>
+      <w:proofErr w:type="spellEnd"/>
+      <w:r>
+        <w:rPr>
+          <w:rFonts w:hint="eastAsia"/>
+        </w:rPr>
+        <w:t xml:space="preserve"> = (</w:t>
+      </w:r>
+      <w:proofErr w:type="spellStart"/>
+      <w:r>
+        <w:rPr>
+          <w:rFonts w:hint="eastAsia"/>
+        </w:rPr>
+        <w:t>image_height</w:t>
+      </w:r>
+      <w:proofErr w:type="spellEnd"/>
+      <w:r>
+        <w:rPr>
+          <w:rFonts w:hint="eastAsia"/>
+        </w:rPr>
+        <w:t xml:space="preserve"> &lt; 1</w:t>
+      </w:r>
+      <w:proofErr w:type="gramStart"/>
+      <w:r>
+        <w:rPr>
+          <w:rFonts w:hint="eastAsia"/>
+        </w:rPr>
+        <w:t xml:space="preserve">) </w:t>
+      </w:r>
+      <w:r>
+        <w:t>?</w:t>
+      </w:r>
+      <w:proofErr w:type="gramEnd"/>
+      <w:r>
+        <w:t xml:space="preserve"> </w:t>
+      </w:r>
+      <w:proofErr w:type="gramStart"/>
+      <w:r>
+        <w:t>1 :</w:t>
+      </w:r>
+      <w:proofErr w:type="gramEnd"/>
+      <w:r>
+        <w:t xml:space="preserve"> </w:t>
+      </w:r>
+      <w:proofErr w:type="spellStart"/>
+      <w:r>
+        <w:t>image_height</w:t>
+      </w:r>
+      <w:proofErr w:type="spellEnd"/>
     </w:p>
     <w:p>
       <w:pPr>
@@ -235,11 +281,36 @@
           <w:b/>
           <w:bCs/>
         </w:rPr>
-        <w:t>? 1 : image_height</w:t>
-      </w:r>
-      <w:r>
+        <w:t xml:space="preserve">? </w:t>
+      </w:r>
+      <w:proofErr w:type="gramStart"/>
+      <w:r>
+        <w:rPr>
+          <w:b/>
+          <w:bCs/>
+        </w:rPr>
+        <w:t>1 :</w:t>
+      </w:r>
+      <w:proofErr w:type="gramEnd"/>
+      <w:r>
+        <w:rPr>
+          <w:b/>
+          <w:bCs/>
+        </w:rPr>
         <w:t xml:space="preserve"> </w:t>
       </w:r>
+      <w:proofErr w:type="spellStart"/>
+      <w:r>
+        <w:rPr>
+          <w:b/>
+          <w:bCs/>
+        </w:rPr>
+        <w:t>image_height</w:t>
+      </w:r>
+      <w:proofErr w:type="spellEnd"/>
+      <w:r>
+        <w:t xml:space="preserve"> </w:t>
+      </w:r>
       <w:r>
         <w:rPr>
           <w:rFonts w:hint="eastAsia"/>
@@ -288,8 +359,13 @@
         <w:t>F</w:t>
       </w:r>
       <w:r>
-        <w:t>alse, use image_height</w:t>
-      </w:r>
+        <w:t xml:space="preserve">alse, use </w:t>
+      </w:r>
+      <w:proofErr w:type="spellStart"/>
+      <w:r>
+        <w:t>image_height</w:t>
+      </w:r>
+      <w:proofErr w:type="spellEnd"/>
     </w:p>
     <w:p>
       <w:r>
@@ -467,8 +543,13 @@
         </w:rPr>
         <w:t xml:space="preserve"> a standard equation defined by </w:t>
       </w:r>
-      <w:r>
-        <w:t>lerp(a, b, t) = a * (1 - t) + b * t</w:t>
+      <w:proofErr w:type="gramStart"/>
+      <w:r>
+        <w:t>lerp(</w:t>
+      </w:r>
+      <w:proofErr w:type="gramEnd"/>
+      <w:r>
+        <w:t>a, b, t) = a * (1 - t) + b * t</w:t>
       </w:r>
     </w:p>
     <w:p>
@@ -588,7 +669,21 @@
         <w:rPr>
           <w:rFonts w:hint="eastAsia"/>
         </w:rPr>
-        <w:t>(C-P)*(C-P) is the dot product of the length of the origin-to-center vector. For the equation of that value being equal to r</w:t>
+        <w:t>(C-</w:t>
+      </w:r>
+      <w:proofErr w:type="gramStart"/>
+      <w:r>
+        <w:rPr>
+          <w:rFonts w:hint="eastAsia"/>
+        </w:rPr>
+        <w:t>P)*</w:t>
+      </w:r>
+      <w:proofErr w:type="gramEnd"/>
+      <w:r>
+        <w:rPr>
+          <w:rFonts w:hint="eastAsia"/>
+        </w:rPr>
+        <w:t>(C-P) is the dot product of the length of the origin-to-center vector. For the equation of that value being equal to r</w:t>
       </w:r>
       <w:r>
         <w:rPr>
@@ -601,10 +696,21 @@
         <w:rPr>
           <w:rFonts w:hint="eastAsia"/>
         </w:rPr>
-        <w:t xml:space="preserve">, imagine a sphere of radius r migrated (C-P) distance away from origin (camera lens). The ray, if allowed to permeate through, will intersect these </w:t>
-      </w:r>
-      <w:r>
-        <w:t>selection o</w:t>
+        <w:t xml:space="preserve">, imagine a sphere of radius r migrated (C-P) distance away from origin (camera lens). The ray, if allowed to permeate through, will intersect </w:t>
+      </w:r>
+      <w:proofErr w:type="gramStart"/>
+      <w:r>
+        <w:rPr>
+          <w:rFonts w:hint="eastAsia"/>
+        </w:rPr>
+        <w:t xml:space="preserve">these </w:t>
+      </w:r>
+      <w:r>
+        <w:t>selection</w:t>
+      </w:r>
+      <w:proofErr w:type="gramEnd"/>
+      <w:r>
+        <w:t xml:space="preserve"> o</w:t>
       </w:r>
       <w:r>
         <w:rPr>
@@ -782,8 +888,16 @@
         <w:rPr>
           <w:rFonts w:hint="eastAsia"/>
         </w:rPr>
-        <w:t>6.1 Shading with Surface Normals</w:t>
-      </w:r>
+        <w:t xml:space="preserve">6.1 Shading with Surface </w:t>
+      </w:r>
+      <w:proofErr w:type="spellStart"/>
+      <w:r>
+        <w:rPr>
+          <w:rFonts w:hint="eastAsia"/>
+        </w:rPr>
+        <w:t>Normals</w:t>
+      </w:r>
+      <w:proofErr w:type="spellEnd"/>
     </w:p>
     <w:p>
       <w:r>
@@ -895,7 +1009,43 @@
           <w:rFonts w:hint="eastAsia"/>
         </w:rPr>
         <w:lastRenderedPageBreak/>
-        <w:t>This means that the directional vector (x,y,z) of the unit surface normal is mapped to (R,G,B)</w:t>
+        <w:t>This means that the directional vector (</w:t>
+      </w:r>
+      <w:proofErr w:type="spellStart"/>
+      <w:proofErr w:type="gramStart"/>
+      <w:r>
+        <w:rPr>
+          <w:rFonts w:hint="eastAsia"/>
+        </w:rPr>
+        <w:t>x,y</w:t>
+      </w:r>
+      <w:proofErr w:type="gramEnd"/>
+      <w:r>
+        <w:rPr>
+          <w:rFonts w:hint="eastAsia"/>
+        </w:rPr>
+        <w:t>,z</w:t>
+      </w:r>
+      <w:proofErr w:type="spellEnd"/>
+      <w:r>
+        <w:rPr>
+          <w:rFonts w:hint="eastAsia"/>
+        </w:rPr>
+        <w:t>) of the unit surface normal is mapped to (</w:t>
+      </w:r>
+      <w:proofErr w:type="gramStart"/>
+      <w:r>
+        <w:rPr>
+          <w:rFonts w:hint="eastAsia"/>
+        </w:rPr>
+        <w:t>R,G</w:t>
+      </w:r>
+      <w:proofErr w:type="gramEnd"/>
+      <w:r>
+        <w:rPr>
+          <w:rFonts w:hint="eastAsia"/>
+        </w:rPr>
+        <w:t>,B)</w:t>
       </w:r>
     </w:p>
     <w:p>
@@ -1136,7 +1286,15 @@
         <w:t xml:space="preserve"> </w:t>
       </w:r>
       <w:r>
-        <w:t>Moving Camera Code Into Its Own Class</w:t>
+        <w:t xml:space="preserve">Moving Camera Code </w:t>
+      </w:r>
+      <w:proofErr w:type="gramStart"/>
+      <w:r>
+        <w:t>Into</w:t>
+      </w:r>
+      <w:proofErr w:type="gramEnd"/>
+      <w:r>
+        <w:t xml:space="preserve"> Its Own Class</w:t>
       </w:r>
     </w:p>
     <w:p>
@@ -1146,9 +1304,11 @@
         </w:rPr>
         <w:t xml:space="preserve">After creating </w:t>
       </w:r>
+      <w:proofErr w:type="spellStart"/>
       <w:r>
         <w:t>rtweekend.h</w:t>
       </w:r>
+      <w:proofErr w:type="spellEnd"/>
       <w:r>
         <w:rPr>
           <w:rFonts w:hint="eastAsia"/>
@@ -1370,7 +1530,21 @@
         <w:rPr>
           <w:rFonts w:hint="eastAsia"/>
         </w:rPr>
-        <w:t>. At the current state, if we were to render a 8 x 8 checkerboard far away such that it</w:t>
+        <w:t xml:space="preserve">. At the current state, if we were to render </w:t>
+      </w:r>
+      <w:proofErr w:type="gramStart"/>
+      <w:r>
+        <w:rPr>
+          <w:rFonts w:hint="eastAsia"/>
+        </w:rPr>
+        <w:t>a</w:t>
+      </w:r>
+      <w:proofErr w:type="gramEnd"/>
+      <w:r>
+        <w:rPr>
+          <w:rFonts w:hint="eastAsia"/>
+        </w:rPr>
+        <w:t xml:space="preserve"> 8 x 8 checkerboard far away such that it</w:t>
       </w:r>
       <w:r>
         <w:t>’</w:t>
@@ -1439,7 +1613,21 @@
         <w:rPr>
           <w:rFonts w:hint="eastAsia"/>
         </w:rPr>
-        <w:t xml:space="preserve">ll sample the four square regions of a pixel that extends halfway into each of the four neighboring pixels </w:t>
+        <w:t xml:space="preserve">ll sample the </w:t>
+      </w:r>
+      <w:proofErr w:type="gramStart"/>
+      <w:r>
+        <w:rPr>
+          <w:rFonts w:hint="eastAsia"/>
+        </w:rPr>
+        <w:t>four square</w:t>
+      </w:r>
+      <w:proofErr w:type="gramEnd"/>
+      <w:r>
+        <w:rPr>
+          <w:rFonts w:hint="eastAsia"/>
+        </w:rPr>
+        <w:t xml:space="preserve"> regions of a pixel that extends halfway into each of the four neighboring pixels </w:t>
       </w:r>
       <w:r>
         <w:t>–</w:t>
@@ -1665,9 +1853,6 @@
     <w:p>
       <w:pPr>
         <w:ind w:firstLine="360"/>
-        <w:rPr>
-          <w:rFonts w:hint="eastAsia"/>
-        </w:rPr>
       </w:pPr>
       <w:r>
         <w:rPr>
@@ -1867,9 +2052,6 @@
     <w:p>
       <w:pPr>
         <w:jc w:val="center"/>
-        <w:rPr>
-          <w:rFonts w:hint="eastAsia"/>
-        </w:rPr>
       </w:pPr>
       <w:r>
         <w:t>C</w:t>
@@ -1883,11 +2065,6 @@
     </w:p>
     <w:p/>
     <w:p>
-      <w:pPr>
-        <w:rPr>
-          <w:rFonts w:hint="eastAsia"/>
-        </w:rPr>
-      </w:pPr>
       <w:r>
         <w:t>If a ray bounces off of a material and keeps 100% of its color, then we say that the material is white. If a ray bounces off of a material and keeps 0% of its color, then we say that the material is black.</w:t>
       </w:r>
@@ -1895,6 +2072,9 @@
     <w:p>
       <w:pPr>
         <w:pStyle w:val="2"/>
+        <w:rPr>
+          <w:rFonts w:hint="eastAsia"/>
+        </w:rPr>
       </w:pPr>
       <w:r>
         <w:rPr>
@@ -1903,10 +2083,404 @@
         <w:lastRenderedPageBreak/>
         <w:t>9.</w:t>
       </w:r>
+      <w:r>
+        <w:rPr>
+          <w:rFonts w:hint="eastAsia"/>
+        </w:rPr>
+        <w:t xml:space="preserve">4 </w:t>
+      </w:r>
+      <w:r>
+        <w:t>True Lambertian Reflection</w:t>
+      </w:r>
+    </w:p>
+    <w:p>
+      <w:pPr>
+        <w:rPr>
+          <w:rFonts w:hint="eastAsia"/>
+        </w:rPr>
+      </w:pPr>
+      <w:r>
+        <w:t xml:space="preserve">A more accurate representation of real diffuse objects </w:t>
+      </w:r>
+      <w:r>
+        <w:rPr>
+          <w:rFonts w:hint="eastAsia"/>
+        </w:rPr>
+        <w:t>than just random s</w:t>
+      </w:r>
+      <w:r>
+        <w:t xml:space="preserve">cattering </w:t>
+      </w:r>
+      <w:r>
+        <w:rPr>
+          <w:rFonts w:hint="eastAsia"/>
+        </w:rPr>
+        <w:t xml:space="preserve">of </w:t>
+      </w:r>
+      <w:r>
+        <w:t>reflected rays evenly about the hemisphere</w:t>
+      </w:r>
+      <w:r>
+        <w:rPr>
+          <w:rFonts w:hint="eastAsia"/>
+        </w:rPr>
+        <w:t xml:space="preserve"> </w:t>
+      </w:r>
+      <w:r>
+        <w:t>is the </w:t>
+      </w:r>
+      <w:r>
+        <w:rPr>
+          <w:i/>
+          <w:iCs/>
+        </w:rPr>
+        <w:t>Lambertian</w:t>
+      </w:r>
+      <w:r>
+        <w:t> distribution.</w:t>
+      </w:r>
+      <w:r>
+        <w:rPr>
+          <w:rFonts w:hint="eastAsia"/>
+        </w:rPr>
+        <w:t xml:space="preserve"> </w:t>
+      </w:r>
+      <w:r>
+        <w:t xml:space="preserve">This distribution scatters reflected rays in a manner that is proportional to </w:t>
+      </w:r>
+      <w:r>
+        <w:rPr>
+          <w:i/>
+          <w:iCs/>
+        </w:rPr>
+        <w:t>cos(</w:t>
+      </w:r>
+      <w:r>
+        <w:rPr>
+          <w:rFonts w:ascii="Courier New" w:hAnsi="Courier New" w:cs="Courier New"/>
+          <w:i/>
+          <w:iCs/>
+        </w:rPr>
+        <w:t>ϕ</w:t>
+      </w:r>
+      <w:r>
+        <w:rPr>
+          <w:i/>
+          <w:iCs/>
+        </w:rPr>
+        <w:t>)</w:t>
+      </w:r>
+      <w:r>
+        <w:t xml:space="preserve">, where </w:t>
+      </w:r>
+      <w:r>
+        <w:rPr>
+          <w:rFonts w:ascii="Courier New" w:hAnsi="Courier New" w:cs="Courier New"/>
+          <w:i/>
+          <w:iCs/>
+        </w:rPr>
+        <w:t>ϕ</w:t>
+      </w:r>
+      <w:r>
+        <w:t xml:space="preserve"> is the angle between the reflected ray and the surface normal. This means that a reflected ray is most likely to scatter in a direction near the surface normal, and less likely to scatter in directions away from the normal. This non-uniform Lambertian distribution does a better job of modeling material reflection in the real world than our previous uniform scattering.</w:t>
+      </w:r>
+    </w:p>
+    <w:p>
+      <w:pPr>
+        <w:rPr>
+          <w:rFonts w:hint="eastAsia"/>
+        </w:rPr>
+      </w:pPr>
+      <w:r>
+        <w:t>We can create this distribution by adding a random unit vector to the normal vector. At the point of intersection on a surface there is the hit point, </w:t>
+      </w:r>
+      <w:r>
+        <w:rPr>
+          <w:b/>
+          <w:bCs/>
+        </w:rPr>
+        <w:t>p</w:t>
+      </w:r>
+      <w:r>
+        <w:t>, and there is the normal of the surface, </w:t>
+      </w:r>
+      <w:r>
+        <w:rPr>
+          <w:b/>
+          <w:bCs/>
+        </w:rPr>
+        <w:t>n</w:t>
+      </w:r>
+      <w:r>
+        <w:rPr>
+          <w:rFonts w:hint="eastAsia"/>
+        </w:rPr>
+        <w:t xml:space="preserve">. </w:t>
+      </w:r>
+      <w:r>
+        <w:rPr>
+          <w:rFonts w:hint="eastAsia"/>
+        </w:rPr>
+        <w:t xml:space="preserve">Imagine </w:t>
+      </w:r>
+      <w:proofErr w:type="gramStart"/>
+      <w:r>
+        <w:rPr>
+          <w:rFonts w:hint="eastAsia"/>
+        </w:rPr>
+        <w:t>two unit</w:t>
+      </w:r>
+      <w:proofErr w:type="gramEnd"/>
+      <w:r>
+        <w:rPr>
+          <w:rFonts w:hint="eastAsia"/>
+        </w:rPr>
+        <w:t xml:space="preserve"> spheres intersecting this hit point, one on each side of the sphere object.</w:t>
+      </w:r>
+      <w:r>
+        <w:rPr>
+          <w:rFonts w:hint="eastAsia"/>
+        </w:rPr>
+        <w:t xml:space="preserve"> </w:t>
+      </w:r>
+      <w:r>
+        <w:t xml:space="preserve">From this, </w:t>
+      </w:r>
+      <w:r>
+        <w:rPr>
+          <w:rFonts w:hint="eastAsia"/>
+        </w:rPr>
+        <w:t>the outside sphere will have its center at</w:t>
+      </w:r>
+      <w:r>
+        <w:t> (</w:t>
+      </w:r>
+      <w:proofErr w:type="spellStart"/>
+      <w:r>
+        <w:rPr>
+          <w:b/>
+          <w:bCs/>
+        </w:rPr>
+        <w:t>P</w:t>
+      </w:r>
+      <w:r>
+        <w:t>+</w:t>
+      </w:r>
+      <w:r>
+        <w:rPr>
+          <w:b/>
+          <w:bCs/>
+        </w:rPr>
+        <w:t>n</w:t>
+      </w:r>
+      <w:proofErr w:type="spellEnd"/>
+      <w:r>
+        <w:t xml:space="preserve">) and the </w:t>
+      </w:r>
+      <w:r>
+        <w:rPr>
+          <w:rFonts w:hint="eastAsia"/>
+        </w:rPr>
+        <w:t>inside</w:t>
+      </w:r>
+      <w:r>
+        <w:t xml:space="preserve"> sphere will have its center at (</w:t>
+      </w:r>
+      <w:r>
+        <w:rPr>
+          <w:b/>
+          <w:bCs/>
+        </w:rPr>
+        <w:t>P</w:t>
+      </w:r>
+      <w:r>
+        <w:rPr>
+          <w:rFonts w:ascii="Cambria Math" w:hAnsi="Cambria Math" w:cs="Cambria Math"/>
+        </w:rPr>
+        <w:t>−</w:t>
+      </w:r>
+      <w:r>
+        <w:rPr>
+          <w:b/>
+          <w:bCs/>
+        </w:rPr>
+        <w:t>n</w:t>
+      </w:r>
+      <w:r>
+        <w:t xml:space="preserve">). </w:t>
+      </w:r>
+    </w:p>
+    <w:p>
+      <w:r>
+        <w:t>We want to select the tangent unit sphere that is on the same side of the surface as the ray origin. Pick a random point </w:t>
+      </w:r>
+      <w:r>
+        <w:rPr>
+          <w:b/>
+          <w:bCs/>
+        </w:rPr>
+        <w:t>S</w:t>
+      </w:r>
+      <w:r>
+        <w:t> on this unit radius sphere and send a ray from the hit point </w:t>
+      </w:r>
+      <w:r>
+        <w:rPr>
+          <w:b/>
+          <w:bCs/>
+        </w:rPr>
+        <w:t>P</w:t>
+      </w:r>
+      <w:r>
+        <w:t> to the random point </w:t>
+      </w:r>
+      <w:r>
+        <w:rPr>
+          <w:b/>
+          <w:bCs/>
+        </w:rPr>
+        <w:t>S</w:t>
+      </w:r>
+      <w:r>
+        <w:t> (this is the vector (</w:t>
+      </w:r>
+      <w:r>
+        <w:rPr>
+          <w:b/>
+          <w:bCs/>
+        </w:rPr>
+        <w:t>S</w:t>
+      </w:r>
+      <w:r>
+        <w:rPr>
+          <w:rFonts w:ascii="Cambria Math" w:hAnsi="Cambria Math" w:cs="Cambria Math"/>
+        </w:rPr>
+        <w:t>−</w:t>
+      </w:r>
+      <w:r>
+        <w:rPr>
+          <w:b/>
+          <w:bCs/>
+        </w:rPr>
+        <w:t>P</w:t>
+      </w:r>
+      <w:r>
+        <w:t>))</w:t>
+      </w:r>
+      <w:r>
+        <w:rPr>
+          <w:rFonts w:hint="eastAsia"/>
+        </w:rPr>
+        <w:t>:</w:t>
+      </w:r>
+    </w:p>
+    <w:p>
+      <w:pPr>
+        <w:jc w:val="center"/>
+        <w:rPr>
+          <w:rFonts w:hint="eastAsia"/>
+        </w:rPr>
+      </w:pPr>
+      <w:r>
+        <w:rPr>
+          <w:noProof/>
+        </w:rPr>
+        <w:drawing>
+          <wp:inline distT="0" distB="0" distL="0" distR="0" wp14:anchorId="5AD1EEF9" wp14:editId="70BFF272">
+            <wp:extent cx="2652461" cy="2824797"/>
+            <wp:effectExtent l="0" t="0" r="0" b="0"/>
+            <wp:docPr id="1607477145" name="그림 1"/>
+            <wp:cNvGraphicFramePr>
+              <a:graphicFrameLocks xmlns:a="http://schemas.openxmlformats.org/drawingml/2006/main" noChangeAspect="1"/>
+            </wp:cNvGraphicFramePr>
+            <a:graphic xmlns:a="http://schemas.openxmlformats.org/drawingml/2006/main">
+              <a:graphicData uri="http://schemas.openxmlformats.org/drawingml/2006/picture">
+                <pic:pic xmlns:pic="http://schemas.openxmlformats.org/drawingml/2006/picture">
+                  <pic:nvPicPr>
+                    <pic:cNvPr id="0" name="Picture 1"/>
+                    <pic:cNvPicPr>
+                      <a:picLocks noChangeAspect="1" noChangeArrowheads="1"/>
+                    </pic:cNvPicPr>
+                  </pic:nvPicPr>
+                  <pic:blipFill>
+                    <a:blip r:embed="rId21" cstate="print">
+                      <a:extLst>
+                        <a:ext uri="{28A0092B-C50C-407E-A947-70E740481C1C}">
+                          <a14:useLocalDpi xmlns:a14="http://schemas.microsoft.com/office/drawing/2010/main" val="0"/>
+                        </a:ext>
+                      </a:extLst>
+                    </a:blip>
+                    <a:srcRect/>
+                    <a:stretch>
+                      <a:fillRect/>
+                    </a:stretch>
+                  </pic:blipFill>
+                  <pic:spPr bwMode="auto">
+                    <a:xfrm>
+                      <a:off x="0" y="0"/>
+                      <a:ext cx="2672157" cy="2845772"/>
+                    </a:xfrm>
+                    <a:prstGeom prst="rect">
+                      <a:avLst/>
+                    </a:prstGeom>
+                    <a:noFill/>
+                    <a:ln>
+                      <a:noFill/>
+                    </a:ln>
+                  </pic:spPr>
+                </pic:pic>
+              </a:graphicData>
+            </a:graphic>
+          </wp:inline>
+        </w:drawing>
+      </w:r>
+    </w:p>
+    <w:p>
+      <w:pPr>
+        <w:jc w:val="center"/>
+        <w:rPr>
+          <w:rFonts w:hint="eastAsia"/>
+        </w:rPr>
+      </w:pPr>
+      <w:r>
+        <w:t>Randomly generating a vector according to Lambertian distribution</w:t>
+      </w:r>
+    </w:p>
+    <w:p>
+      <w:pPr>
+        <w:rPr>
+          <w:rFonts w:hint="eastAsia"/>
+        </w:rPr>
+      </w:pPr>
+    </w:p>
+    <w:p>
+      <w:pPr>
+        <w:pStyle w:val="2"/>
+        <w:rPr>
+          <w:rFonts w:hint="eastAsia"/>
+        </w:rPr>
+      </w:pPr>
+      <w:r>
+        <w:rPr>
+          <w:rFonts w:hint="eastAsia"/>
+        </w:rPr>
+        <w:t>9</w:t>
+      </w:r>
+      <w:r>
+        <w:rPr>
+          <w:rFonts w:hint="eastAsia"/>
+        </w:rPr>
+        <w:t>.</w:t>
+      </w:r>
     </w:p>
     <w:p/>
-    <w:p/>
-    <w:p/>
+    <w:p>
+      <w:pPr>
+        <w:rPr>
+          <w:rFonts w:hint="eastAsia"/>
+        </w:rPr>
+      </w:pPr>
+    </w:p>
     <w:p/>
     <w:sectPr>
       <w:pgSz w:w="11906" w:h="16838"/>
@@ -2926,7 +3500,6 @@
   <w:style w:type="character" w:default="1" w:styleId="a0">
     <w:name w:val="Default Paragraph Font"/>
     <w:uiPriority w:val="1"/>
-    <w:semiHidden/>
     <w:unhideWhenUsed/>
   </w:style>
   <w:style w:type="table" w:default="1" w:styleId="a1">

</xml_diff>

<commit_message>
Generated new images & updated notes on Lambertian distribution
</commit_message>
<xml_diff>
--- a/Notes.docx
+++ b/Notes.docx
@@ -216,61 +216,15 @@
       <w:r>
         <w:tab/>
       </w:r>
-      <w:proofErr w:type="spellStart"/>
-      <w:r>
-        <w:rPr>
-          <w:rFonts w:hint="eastAsia"/>
-        </w:rPr>
-        <w:t>image_height</w:t>
-      </w:r>
-      <w:proofErr w:type="spellEnd"/>
-      <w:r>
-        <w:rPr>
-          <w:rFonts w:hint="eastAsia"/>
-        </w:rPr>
-        <w:t xml:space="preserve"> = (</w:t>
-      </w:r>
-      <w:proofErr w:type="spellStart"/>
-      <w:r>
-        <w:rPr>
-          <w:rFonts w:hint="eastAsia"/>
-        </w:rPr>
-        <w:t>image_height</w:t>
-      </w:r>
-      <w:proofErr w:type="spellEnd"/>
-      <w:r>
-        <w:rPr>
-          <w:rFonts w:hint="eastAsia"/>
-        </w:rPr>
-        <w:t xml:space="preserve"> &lt; 1</w:t>
-      </w:r>
-      <w:proofErr w:type="gramStart"/>
-      <w:r>
-        <w:rPr>
-          <w:rFonts w:hint="eastAsia"/>
-        </w:rPr>
-        <w:t xml:space="preserve">) </w:t>
-      </w:r>
-      <w:r>
-        <w:t>?</w:t>
-      </w:r>
-      <w:proofErr w:type="gramEnd"/>
-      <w:r>
-        <w:t xml:space="preserve"> </w:t>
-      </w:r>
-      <w:proofErr w:type="gramStart"/>
-      <w:r>
-        <w:t>1 :</w:t>
-      </w:r>
-      <w:proofErr w:type="gramEnd"/>
-      <w:r>
-        <w:t xml:space="preserve"> </w:t>
-      </w:r>
-      <w:proofErr w:type="spellStart"/>
-      <w:r>
-        <w:t>image_height</w:t>
-      </w:r>
-      <w:proofErr w:type="spellEnd"/>
+      <w:r>
+        <w:rPr>
+          <w:rFonts w:hint="eastAsia"/>
+        </w:rPr>
+        <w:t xml:space="preserve">image_height = (image_height &lt; 1) </w:t>
+      </w:r>
+      <w:r>
+        <w:t>? 1 : image_height</w:t>
+      </w:r>
     </w:p>
     <w:p>
       <w:pPr>
@@ -281,36 +235,11 @@
           <w:b/>
           <w:bCs/>
         </w:rPr>
-        <w:t xml:space="preserve">? </w:t>
-      </w:r>
-      <w:proofErr w:type="gramStart"/>
-      <w:r>
-        <w:rPr>
-          <w:b/>
-          <w:bCs/>
-        </w:rPr>
-        <w:t>1 :</w:t>
-      </w:r>
-      <w:proofErr w:type="gramEnd"/>
-      <w:r>
-        <w:rPr>
-          <w:b/>
-          <w:bCs/>
-        </w:rPr>
+        <w:t>? 1 : image_height</w:t>
+      </w:r>
+      <w:r>
         <w:t xml:space="preserve"> </w:t>
       </w:r>
-      <w:proofErr w:type="spellStart"/>
-      <w:r>
-        <w:rPr>
-          <w:b/>
-          <w:bCs/>
-        </w:rPr>
-        <w:t>image_height</w:t>
-      </w:r>
-      <w:proofErr w:type="spellEnd"/>
-      <w:r>
-        <w:t xml:space="preserve"> </w:t>
-      </w:r>
       <w:r>
         <w:rPr>
           <w:rFonts w:hint="eastAsia"/>
@@ -359,13 +288,8 @@
         <w:t>F</w:t>
       </w:r>
       <w:r>
-        <w:t xml:space="preserve">alse, use </w:t>
-      </w:r>
-      <w:proofErr w:type="spellStart"/>
-      <w:r>
-        <w:t>image_height</w:t>
-      </w:r>
-      <w:proofErr w:type="spellEnd"/>
+        <w:t>alse, use image_height</w:t>
+      </w:r>
     </w:p>
     <w:p>
       <w:r>
@@ -543,13 +467,8 @@
         </w:rPr>
         <w:t xml:space="preserve"> a standard equation defined by </w:t>
       </w:r>
-      <w:proofErr w:type="gramStart"/>
-      <w:r>
-        <w:t>lerp(</w:t>
-      </w:r>
-      <w:proofErr w:type="gramEnd"/>
-      <w:r>
-        <w:t>a, b, t) = a * (1 - t) + b * t</w:t>
+      <w:r>
+        <w:t>lerp(a, b, t) = a * (1 - t) + b * t</w:t>
       </w:r>
     </w:p>
     <w:p>
@@ -669,21 +588,7 @@
         <w:rPr>
           <w:rFonts w:hint="eastAsia"/>
         </w:rPr>
-        <w:t>(C-</w:t>
-      </w:r>
-      <w:proofErr w:type="gramStart"/>
-      <w:r>
-        <w:rPr>
-          <w:rFonts w:hint="eastAsia"/>
-        </w:rPr>
-        <w:t>P)*</w:t>
-      </w:r>
-      <w:proofErr w:type="gramEnd"/>
-      <w:r>
-        <w:rPr>
-          <w:rFonts w:hint="eastAsia"/>
-        </w:rPr>
-        <w:t>(C-P) is the dot product of the length of the origin-to-center vector. For the equation of that value being equal to r</w:t>
+        <w:t>(C-P)*(C-P) is the dot product of the length of the origin-to-center vector. For the equation of that value being equal to r</w:t>
       </w:r>
       <w:r>
         <w:rPr>
@@ -696,21 +601,10 @@
         <w:rPr>
           <w:rFonts w:hint="eastAsia"/>
         </w:rPr>
-        <w:t xml:space="preserve">, imagine a sphere of radius r migrated (C-P) distance away from origin (camera lens). The ray, if allowed to permeate through, will intersect </w:t>
-      </w:r>
-      <w:proofErr w:type="gramStart"/>
-      <w:r>
-        <w:rPr>
-          <w:rFonts w:hint="eastAsia"/>
-        </w:rPr>
-        <w:t xml:space="preserve">these </w:t>
-      </w:r>
-      <w:r>
-        <w:t>selection</w:t>
-      </w:r>
-      <w:proofErr w:type="gramEnd"/>
-      <w:r>
-        <w:t xml:space="preserve"> o</w:t>
+        <w:t xml:space="preserve">, imagine a sphere of radius r migrated (C-P) distance away from origin (camera lens). The ray, if allowed to permeate through, will intersect these </w:t>
+      </w:r>
+      <w:r>
+        <w:t>selection o</w:t>
       </w:r>
       <w:r>
         <w:rPr>
@@ -888,16 +782,8 @@
         <w:rPr>
           <w:rFonts w:hint="eastAsia"/>
         </w:rPr>
-        <w:t xml:space="preserve">6.1 Shading with Surface </w:t>
-      </w:r>
-      <w:proofErr w:type="spellStart"/>
-      <w:r>
-        <w:rPr>
-          <w:rFonts w:hint="eastAsia"/>
-        </w:rPr>
-        <w:t>Normals</w:t>
-      </w:r>
-      <w:proofErr w:type="spellEnd"/>
+        <w:t>6.1 Shading with Surface Normals</w:t>
+      </w:r>
     </w:p>
     <w:p>
       <w:r>
@@ -1009,43 +895,7 @@
           <w:rFonts w:hint="eastAsia"/>
         </w:rPr>
         <w:lastRenderedPageBreak/>
-        <w:t>This means that the directional vector (</w:t>
-      </w:r>
-      <w:proofErr w:type="spellStart"/>
-      <w:proofErr w:type="gramStart"/>
-      <w:r>
-        <w:rPr>
-          <w:rFonts w:hint="eastAsia"/>
-        </w:rPr>
-        <w:t>x,y</w:t>
-      </w:r>
-      <w:proofErr w:type="gramEnd"/>
-      <w:r>
-        <w:rPr>
-          <w:rFonts w:hint="eastAsia"/>
-        </w:rPr>
-        <w:t>,z</w:t>
-      </w:r>
-      <w:proofErr w:type="spellEnd"/>
-      <w:r>
-        <w:rPr>
-          <w:rFonts w:hint="eastAsia"/>
-        </w:rPr>
-        <w:t>) of the unit surface normal is mapped to (</w:t>
-      </w:r>
-      <w:proofErr w:type="gramStart"/>
-      <w:r>
-        <w:rPr>
-          <w:rFonts w:hint="eastAsia"/>
-        </w:rPr>
-        <w:t>R,G</w:t>
-      </w:r>
-      <w:proofErr w:type="gramEnd"/>
-      <w:r>
-        <w:rPr>
-          <w:rFonts w:hint="eastAsia"/>
-        </w:rPr>
-        <w:t>,B)</w:t>
+        <w:t>This means that the directional vector (x,y,z) of the unit surface normal is mapped to (R,G,B)</w:t>
       </w:r>
     </w:p>
     <w:p>
@@ -1286,15 +1136,7 @@
         <w:t xml:space="preserve"> </w:t>
       </w:r>
       <w:r>
-        <w:t xml:space="preserve">Moving Camera Code </w:t>
-      </w:r>
-      <w:proofErr w:type="gramStart"/>
-      <w:r>
-        <w:t>Into</w:t>
-      </w:r>
-      <w:proofErr w:type="gramEnd"/>
-      <w:r>
-        <w:t xml:space="preserve"> Its Own Class</w:t>
+        <w:t>Moving Camera Code Into Its Own Class</w:t>
       </w:r>
     </w:p>
     <w:p>
@@ -1304,11 +1146,9 @@
         </w:rPr>
         <w:t xml:space="preserve">After creating </w:t>
       </w:r>
-      <w:proofErr w:type="spellStart"/>
       <w:r>
         <w:t>rtweekend.h</w:t>
       </w:r>
-      <w:proofErr w:type="spellEnd"/>
       <w:r>
         <w:rPr>
           <w:rFonts w:hint="eastAsia"/>
@@ -1530,21 +1370,7 @@
         <w:rPr>
           <w:rFonts w:hint="eastAsia"/>
         </w:rPr>
-        <w:t xml:space="preserve">. At the current state, if we were to render </w:t>
-      </w:r>
-      <w:proofErr w:type="gramStart"/>
-      <w:r>
-        <w:rPr>
-          <w:rFonts w:hint="eastAsia"/>
-        </w:rPr>
-        <w:t>a</w:t>
-      </w:r>
-      <w:proofErr w:type="gramEnd"/>
-      <w:r>
-        <w:rPr>
-          <w:rFonts w:hint="eastAsia"/>
-        </w:rPr>
-        <w:t xml:space="preserve"> 8 x 8 checkerboard far away such that it</w:t>
+        <w:t>. At the current state, if we were to render a 8 x 8 checkerboard far away such that it</w:t>
       </w:r>
       <w:r>
         <w:t>’</w:t>
@@ -1613,21 +1439,7 @@
         <w:rPr>
           <w:rFonts w:hint="eastAsia"/>
         </w:rPr>
-        <w:t xml:space="preserve">ll sample the </w:t>
-      </w:r>
-      <w:proofErr w:type="gramStart"/>
-      <w:r>
-        <w:rPr>
-          <w:rFonts w:hint="eastAsia"/>
-        </w:rPr>
-        <w:t>four square</w:t>
-      </w:r>
-      <w:proofErr w:type="gramEnd"/>
-      <w:r>
-        <w:rPr>
-          <w:rFonts w:hint="eastAsia"/>
-        </w:rPr>
-        <w:t xml:space="preserve"> regions of a pixel that extends halfway into each of the four neighboring pixels </w:t>
+        <w:t xml:space="preserve">ll sample the four square regions of a pixel that extends halfway into each of the four neighboring pixels </w:t>
       </w:r>
       <w:r>
         <w:t>–</w:t>
@@ -2072,9 +1884,6 @@
     <w:p>
       <w:pPr>
         <w:pStyle w:val="2"/>
-        <w:rPr>
-          <w:rFonts w:hint="eastAsia"/>
-        </w:rPr>
       </w:pPr>
       <w:r>
         <w:rPr>
@@ -2094,11 +1903,6 @@
       </w:r>
     </w:p>
     <w:p>
-      <w:pPr>
-        <w:rPr>
-          <w:rFonts w:hint="eastAsia"/>
-        </w:rPr>
-      </w:pPr>
       <w:r>
         <w:t xml:space="preserve">A more accurate representation of real diffuse objects </w:t>
       </w:r>
@@ -2186,11 +1990,6 @@
       </w:r>
     </w:p>
     <w:p>
-      <w:pPr>
-        <w:rPr>
-          <w:rFonts w:hint="eastAsia"/>
-        </w:rPr>
-      </w:pPr>
       <w:r>
         <w:t>We can create this distribution by adding a random unit vector to the normal vector. At the point of intersection on a surface there is the hit point, </w:t>
       </w:r>
@@ -2221,21 +2020,7 @@
         <w:rPr>
           <w:rFonts w:hint="eastAsia"/>
         </w:rPr>
-        <w:t xml:space="preserve">Imagine </w:t>
-      </w:r>
-      <w:proofErr w:type="gramStart"/>
-      <w:r>
-        <w:rPr>
-          <w:rFonts w:hint="eastAsia"/>
-        </w:rPr>
-        <w:t>two unit</w:t>
-      </w:r>
-      <w:proofErr w:type="gramEnd"/>
-      <w:r>
-        <w:rPr>
-          <w:rFonts w:hint="eastAsia"/>
-        </w:rPr>
-        <w:t xml:space="preserve"> spheres intersecting this hit point, one on each side of the sphere object.</w:t>
+        <w:t>Imagine two unit spheres intersecting this hit point, one on each side of the sphere object.</w:t>
       </w:r>
       <w:r>
         <w:rPr>
@@ -2255,7 +2040,6 @@
       <w:r>
         <w:t> (</w:t>
       </w:r>
-      <w:proofErr w:type="spellStart"/>
       <w:r>
         <w:rPr>
           <w:b/>
@@ -2273,7 +2057,6 @@
         </w:rPr>
         <w:t>n</w:t>
       </w:r>
-      <w:proofErr w:type="spellEnd"/>
       <w:r>
         <w:t xml:space="preserve">) and the </w:t>
       </w:r>
@@ -2377,9 +2160,6 @@
     <w:p>
       <w:pPr>
         <w:jc w:val="center"/>
-        <w:rPr>
-          <w:rFonts w:hint="eastAsia"/>
-        </w:rPr>
       </w:pPr>
       <w:r>
         <w:rPr>
@@ -2438,20 +2218,100 @@
     <w:p>
       <w:pPr>
         <w:jc w:val="center"/>
-        <w:rPr>
-          <w:rFonts w:hint="eastAsia"/>
-        </w:rPr>
       </w:pPr>
       <w:r>
         <w:t>Randomly generating a vector according to Lambertian distribution</w:t>
       </w:r>
     </w:p>
     <w:p>
-      <w:pPr>
-        <w:rPr>
-          <w:rFonts w:hint="eastAsia"/>
-        </w:rPr>
-      </w:pPr>
+      <w:r>
+        <w:rPr>
+          <w:rFonts w:hint="eastAsia"/>
+        </w:rPr>
+        <w:t>Using Lambertian distribution over the selection of randomly dispersed rays results in two improvements:</w:t>
+      </w:r>
+    </w:p>
+    <w:p>
+      <w:pPr>
+        <w:pStyle w:val="a6"/>
+        <w:numPr>
+          <w:ilvl w:val="1"/>
+          <w:numId w:val="1"/>
+        </w:numPr>
+      </w:pPr>
+      <w:r>
+        <w:t>The shadows are more pronounced after the change</w:t>
+      </w:r>
+    </w:p>
+    <w:p>
+      <w:pPr>
+        <w:pStyle w:val="a6"/>
+        <w:numPr>
+          <w:ilvl w:val="1"/>
+          <w:numId w:val="1"/>
+        </w:numPr>
+      </w:pPr>
+      <w:r>
+        <w:t xml:space="preserve">Both spheres </w:t>
+      </w:r>
+      <w:r>
+        <w:rPr>
+          <w:rFonts w:hint="eastAsia"/>
+        </w:rPr>
+        <w:t xml:space="preserve">(sphere &amp; ground) </w:t>
+      </w:r>
+      <w:r>
+        <w:t>are tinted blue from the sky after the change</w:t>
+      </w:r>
+    </w:p>
+    <w:p>
+      <w:pPr>
+        <w:rPr>
+          <w:rFonts w:hint="eastAsia"/>
+        </w:rPr>
+      </w:pPr>
+      <w:r>
+        <w:rPr>
+          <w:rFonts w:hint="eastAsia"/>
+        </w:rPr>
+        <w:t>T</w:t>
+      </w:r>
+      <w:r>
+        <w:t>hese changes are due to the less uniform scattering of the light rays</w:t>
+      </w:r>
+      <w:r>
+        <w:rPr>
+          <w:rFonts w:hint="eastAsia"/>
+        </w:rPr>
+        <w:t xml:space="preserve"> </w:t>
+      </w:r>
+      <w:r>
+        <w:t>–</w:t>
+      </w:r>
+      <w:r>
+        <w:rPr>
+          <w:rFonts w:hint="eastAsia"/>
+        </w:rPr>
+        <w:t xml:space="preserve"> </w:t>
+      </w:r>
+      <w:r>
+        <w:t>more rays are scattering toward the normal. This means that for diffuse objects, they will appear darker because less light bounces toward the camera. For the shadows, more light bounces straight-up, so the area underneath the sphere is darker.</w:t>
+      </w:r>
+      <w:r>
+        <w:rPr>
+          <w:rFonts w:hint="eastAsia"/>
+        </w:rPr>
+        <w:t xml:space="preserve"> </w:t>
+      </w:r>
+      <w:r>
+        <w:t>Not many common, everyday objects are perfectly diffuse like this</w:t>
+      </w:r>
+      <w:r>
+        <w:rPr>
+          <w:rFonts w:hint="eastAsia"/>
+        </w:rPr>
+        <w:t>.</w:t>
+      </w:r>
     </w:p>
     <w:p>
       <w:pPr>
@@ -2464,23 +2324,51 @@
         <w:rPr>
           <w:rFonts w:hint="eastAsia"/>
         </w:rPr>
-        <w:t>9</w:t>
-      </w:r>
-      <w:r>
-        <w:rPr>
-          <w:rFonts w:hint="eastAsia"/>
-        </w:rPr>
-        <w:t>.</w:t>
+        <w:lastRenderedPageBreak/>
+        <w:t>9.</w:t>
+      </w:r>
+      <w:r>
+        <w:rPr>
+          <w:rFonts w:hint="eastAsia"/>
+        </w:rPr>
+        <w:t xml:space="preserve">5 </w:t>
+      </w:r>
+      <w:r>
+        <w:t>Using Gamma Correction for Accurate Color Intensity</w:t>
       </w:r>
     </w:p>
     <w:p/>
-    <w:p>
-      <w:pPr>
-        <w:rPr>
-          <w:rFonts w:hint="eastAsia"/>
-        </w:rPr>
-      </w:pPr>
-    </w:p>
+    <w:p/>
+    <w:p>
+      <w:pPr>
+        <w:rPr>
+          <w:rFonts w:hint="eastAsia"/>
+        </w:rPr>
+      </w:pPr>
+    </w:p>
+    <w:p>
+      <w:pPr>
+        <w:pStyle w:val="2"/>
+        <w:rPr>
+          <w:rFonts w:hint="eastAsia"/>
+        </w:rPr>
+      </w:pPr>
+      <w:r>
+        <w:rPr>
+          <w:rFonts w:hint="eastAsia"/>
+        </w:rPr>
+        <w:t>9.</w:t>
+      </w:r>
+    </w:p>
+    <w:p/>
+    <w:p>
+      <w:pPr>
+        <w:rPr>
+          <w:rFonts w:hint="eastAsia"/>
+        </w:rPr>
+      </w:pPr>
+    </w:p>
+    <w:p/>
     <w:p/>
     <w:sectPr>
       <w:pgSz w:w="11906" w:h="16838"/>
@@ -2547,7 +2435,7 @@
   <w:abstractNum w:abstractNumId="0" w15:restartNumberingAfterBreak="0">
     <w:nsid w:val="130608F4"/>
     <w:multiLevelType w:val="multilevel"/>
-    <w:tmpl w:val="3C620FE2"/>
+    <w:tmpl w:val="1474ED42"/>
     <w:lvl w:ilvl="0">
       <w:start w:val="1"/>
       <w:numFmt w:val="decimal"/>
@@ -2560,17 +2448,17 @@
         <w:ind w:left="720" w:hanging="360"/>
       </w:pPr>
     </w:lvl>
-    <w:lvl w:ilvl="1" w:tentative="1">
+    <w:lvl w:ilvl="1">
       <w:start w:val="1"/>
       <w:numFmt w:val="decimal"/>
-      <w:lvlText w:val="%2."/>
+      <w:lvlText w:val="%2)"/>
       <w:lvlJc w:val="left"/>
       <w:pPr>
-        <w:tabs>
-          <w:tab w:val="num" w:pos="1440"/>
-        </w:tabs>
         <w:ind w:left="1440" w:hanging="360"/>
       </w:pPr>
+      <w:rPr>
+        <w:rFonts w:hint="default"/>
+      </w:rPr>
     </w:lvl>
     <w:lvl w:ilvl="2" w:tentative="1">
       <w:start w:val="1"/>
@@ -3500,6 +3388,7 @@
   <w:style w:type="character" w:default="1" w:styleId="a0">
     <w:name w:val="Default Paragraph Font"/>
     <w:uiPriority w:val="1"/>
+    <w:semiHidden/>
     <w:unhideWhenUsed/>
   </w:style>
   <w:style w:type="table" w:default="1" w:styleId="a1">

</xml_diff>

<commit_message>
Implemented gamma correction and generated images at different reflectance levels for without gamma transformation
</commit_message>
<xml_diff>
--- a/Notes.docx
+++ b/Notes.docx
@@ -216,15 +216,61 @@
       <w:r>
         <w:tab/>
       </w:r>
-      <w:r>
-        <w:rPr>
-          <w:rFonts w:hint="eastAsia"/>
-        </w:rPr>
-        <w:t xml:space="preserve">image_height = (image_height &lt; 1) </w:t>
-      </w:r>
-      <w:r>
-        <w:t>? 1 : image_height</w:t>
-      </w:r>
+      <w:proofErr w:type="spellStart"/>
+      <w:r>
+        <w:rPr>
+          <w:rFonts w:hint="eastAsia"/>
+        </w:rPr>
+        <w:t>image_height</w:t>
+      </w:r>
+      <w:proofErr w:type="spellEnd"/>
+      <w:r>
+        <w:rPr>
+          <w:rFonts w:hint="eastAsia"/>
+        </w:rPr>
+        <w:t xml:space="preserve"> = (</w:t>
+      </w:r>
+      <w:proofErr w:type="spellStart"/>
+      <w:r>
+        <w:rPr>
+          <w:rFonts w:hint="eastAsia"/>
+        </w:rPr>
+        <w:t>image_height</w:t>
+      </w:r>
+      <w:proofErr w:type="spellEnd"/>
+      <w:r>
+        <w:rPr>
+          <w:rFonts w:hint="eastAsia"/>
+        </w:rPr>
+        <w:t xml:space="preserve"> &lt; 1</w:t>
+      </w:r>
+      <w:proofErr w:type="gramStart"/>
+      <w:r>
+        <w:rPr>
+          <w:rFonts w:hint="eastAsia"/>
+        </w:rPr>
+        <w:t xml:space="preserve">) </w:t>
+      </w:r>
+      <w:r>
+        <w:t>?</w:t>
+      </w:r>
+      <w:proofErr w:type="gramEnd"/>
+      <w:r>
+        <w:t xml:space="preserve"> </w:t>
+      </w:r>
+      <w:proofErr w:type="gramStart"/>
+      <w:r>
+        <w:t>1 :</w:t>
+      </w:r>
+      <w:proofErr w:type="gramEnd"/>
+      <w:r>
+        <w:t xml:space="preserve"> </w:t>
+      </w:r>
+      <w:proofErr w:type="spellStart"/>
+      <w:r>
+        <w:t>image_height</w:t>
+      </w:r>
+      <w:proofErr w:type="spellEnd"/>
     </w:p>
     <w:p>
       <w:pPr>
@@ -235,11 +281,36 @@
           <w:b/>
           <w:bCs/>
         </w:rPr>
-        <w:t>? 1 : image_height</w:t>
-      </w:r>
-      <w:r>
+        <w:t xml:space="preserve">? </w:t>
+      </w:r>
+      <w:proofErr w:type="gramStart"/>
+      <w:r>
+        <w:rPr>
+          <w:b/>
+          <w:bCs/>
+        </w:rPr>
+        <w:t>1 :</w:t>
+      </w:r>
+      <w:proofErr w:type="gramEnd"/>
+      <w:r>
+        <w:rPr>
+          <w:b/>
+          <w:bCs/>
+        </w:rPr>
         <w:t xml:space="preserve"> </w:t>
       </w:r>
+      <w:proofErr w:type="spellStart"/>
+      <w:r>
+        <w:rPr>
+          <w:b/>
+          <w:bCs/>
+        </w:rPr>
+        <w:t>image_height</w:t>
+      </w:r>
+      <w:proofErr w:type="spellEnd"/>
+      <w:r>
+        <w:t xml:space="preserve"> </w:t>
+      </w:r>
       <w:r>
         <w:rPr>
           <w:rFonts w:hint="eastAsia"/>
@@ -288,8 +359,13 @@
         <w:t>F</w:t>
       </w:r>
       <w:r>
-        <w:t>alse, use image_height</w:t>
-      </w:r>
+        <w:t xml:space="preserve">alse, use </w:t>
+      </w:r>
+      <w:proofErr w:type="spellStart"/>
+      <w:r>
+        <w:t>image_height</w:t>
+      </w:r>
+      <w:proofErr w:type="spellEnd"/>
     </w:p>
     <w:p>
       <w:r>
@@ -467,8 +543,13 @@
         </w:rPr>
         <w:t xml:space="preserve"> a standard equation defined by </w:t>
       </w:r>
-      <w:r>
-        <w:t>lerp(a, b, t) = a * (1 - t) + b * t</w:t>
+      <w:proofErr w:type="gramStart"/>
+      <w:r>
+        <w:t>lerp(</w:t>
+      </w:r>
+      <w:proofErr w:type="gramEnd"/>
+      <w:r>
+        <w:t>a, b, t) = a * (1 - t) + b * t</w:t>
       </w:r>
     </w:p>
     <w:p>
@@ -588,7 +669,21 @@
         <w:rPr>
           <w:rFonts w:hint="eastAsia"/>
         </w:rPr>
-        <w:t>(C-P)*(C-P) is the dot product of the length of the origin-to-center vector. For the equation of that value being equal to r</w:t>
+        <w:t>(C-</w:t>
+      </w:r>
+      <w:proofErr w:type="gramStart"/>
+      <w:r>
+        <w:rPr>
+          <w:rFonts w:hint="eastAsia"/>
+        </w:rPr>
+        <w:t>P)*</w:t>
+      </w:r>
+      <w:proofErr w:type="gramEnd"/>
+      <w:r>
+        <w:rPr>
+          <w:rFonts w:hint="eastAsia"/>
+        </w:rPr>
+        <w:t>(C-P) is the dot product of the length of the origin-to-center vector. For the equation of that value being equal to r</w:t>
       </w:r>
       <w:r>
         <w:rPr>
@@ -601,10 +696,21 @@
         <w:rPr>
           <w:rFonts w:hint="eastAsia"/>
         </w:rPr>
-        <w:t xml:space="preserve">, imagine a sphere of radius r migrated (C-P) distance away from origin (camera lens). The ray, if allowed to permeate through, will intersect these </w:t>
-      </w:r>
-      <w:r>
-        <w:t>selection o</w:t>
+        <w:t xml:space="preserve">, imagine a sphere of radius r migrated (C-P) distance away from origin (camera lens). The ray, if allowed to permeate through, will intersect </w:t>
+      </w:r>
+      <w:proofErr w:type="gramStart"/>
+      <w:r>
+        <w:rPr>
+          <w:rFonts w:hint="eastAsia"/>
+        </w:rPr>
+        <w:t xml:space="preserve">these </w:t>
+      </w:r>
+      <w:r>
+        <w:t>selection</w:t>
+      </w:r>
+      <w:proofErr w:type="gramEnd"/>
+      <w:r>
+        <w:t xml:space="preserve"> o</w:t>
       </w:r>
       <w:r>
         <w:rPr>
@@ -782,8 +888,16 @@
         <w:rPr>
           <w:rFonts w:hint="eastAsia"/>
         </w:rPr>
-        <w:t>6.1 Shading with Surface Normals</w:t>
-      </w:r>
+        <w:t xml:space="preserve">6.1 Shading with Surface </w:t>
+      </w:r>
+      <w:proofErr w:type="spellStart"/>
+      <w:r>
+        <w:rPr>
+          <w:rFonts w:hint="eastAsia"/>
+        </w:rPr>
+        <w:t>Normals</w:t>
+      </w:r>
+      <w:proofErr w:type="spellEnd"/>
     </w:p>
     <w:p>
       <w:r>
@@ -895,7 +1009,43 @@
           <w:rFonts w:hint="eastAsia"/>
         </w:rPr>
         <w:lastRenderedPageBreak/>
-        <w:t>This means that the directional vector (x,y,z) of the unit surface normal is mapped to (R,G,B)</w:t>
+        <w:t>This means that the directional vector (</w:t>
+      </w:r>
+      <w:proofErr w:type="spellStart"/>
+      <w:proofErr w:type="gramStart"/>
+      <w:r>
+        <w:rPr>
+          <w:rFonts w:hint="eastAsia"/>
+        </w:rPr>
+        <w:t>x,y</w:t>
+      </w:r>
+      <w:proofErr w:type="gramEnd"/>
+      <w:r>
+        <w:rPr>
+          <w:rFonts w:hint="eastAsia"/>
+        </w:rPr>
+        <w:t>,z</w:t>
+      </w:r>
+      <w:proofErr w:type="spellEnd"/>
+      <w:r>
+        <w:rPr>
+          <w:rFonts w:hint="eastAsia"/>
+        </w:rPr>
+        <w:t>) of the unit surface normal is mapped to (</w:t>
+      </w:r>
+      <w:proofErr w:type="gramStart"/>
+      <w:r>
+        <w:rPr>
+          <w:rFonts w:hint="eastAsia"/>
+        </w:rPr>
+        <w:t>R,G</w:t>
+      </w:r>
+      <w:proofErr w:type="gramEnd"/>
+      <w:r>
+        <w:rPr>
+          <w:rFonts w:hint="eastAsia"/>
+        </w:rPr>
+        <w:t>,B)</w:t>
       </w:r>
     </w:p>
     <w:p>
@@ -1136,7 +1286,15 @@
         <w:t xml:space="preserve"> </w:t>
       </w:r>
       <w:r>
-        <w:t>Moving Camera Code Into Its Own Class</w:t>
+        <w:t xml:space="preserve">Moving Camera Code </w:t>
+      </w:r>
+      <w:proofErr w:type="gramStart"/>
+      <w:r>
+        <w:t>Into</w:t>
+      </w:r>
+      <w:proofErr w:type="gramEnd"/>
+      <w:r>
+        <w:t xml:space="preserve"> Its Own Class</w:t>
       </w:r>
     </w:p>
     <w:p>
@@ -1146,9 +1304,11 @@
         </w:rPr>
         <w:t xml:space="preserve">After creating </w:t>
       </w:r>
+      <w:proofErr w:type="spellStart"/>
       <w:r>
         <w:t>rtweekend.h</w:t>
       </w:r>
+      <w:proofErr w:type="spellEnd"/>
       <w:r>
         <w:rPr>
           <w:rFonts w:hint="eastAsia"/>
@@ -1370,7 +1530,21 @@
         <w:rPr>
           <w:rFonts w:hint="eastAsia"/>
         </w:rPr>
-        <w:t>. At the current state, if we were to render a 8 x 8 checkerboard far away such that it</w:t>
+        <w:t xml:space="preserve">. At the current state, if we were to render </w:t>
+      </w:r>
+      <w:proofErr w:type="gramStart"/>
+      <w:r>
+        <w:rPr>
+          <w:rFonts w:hint="eastAsia"/>
+        </w:rPr>
+        <w:t>a</w:t>
+      </w:r>
+      <w:proofErr w:type="gramEnd"/>
+      <w:r>
+        <w:rPr>
+          <w:rFonts w:hint="eastAsia"/>
+        </w:rPr>
+        <w:t xml:space="preserve"> 8 x 8 checkerboard far away such that it</w:t>
       </w:r>
       <w:r>
         <w:t>’</w:t>
@@ -1439,7 +1613,21 @@
         <w:rPr>
           <w:rFonts w:hint="eastAsia"/>
         </w:rPr>
-        <w:t xml:space="preserve">ll sample the four square regions of a pixel that extends halfway into each of the four neighboring pixels </w:t>
+        <w:t xml:space="preserve">ll sample the </w:t>
+      </w:r>
+      <w:proofErr w:type="gramStart"/>
+      <w:r>
+        <w:rPr>
+          <w:rFonts w:hint="eastAsia"/>
+        </w:rPr>
+        <w:t>four square</w:t>
+      </w:r>
+      <w:proofErr w:type="gramEnd"/>
+      <w:r>
+        <w:rPr>
+          <w:rFonts w:hint="eastAsia"/>
+        </w:rPr>
+        <w:t xml:space="preserve"> regions of a pixel that extends halfway into each of the four neighboring pixels </w:t>
       </w:r>
       <w:r>
         <w:t>–</w:t>
@@ -2020,7 +2208,21 @@
         <w:rPr>
           <w:rFonts w:hint="eastAsia"/>
         </w:rPr>
-        <w:t>Imagine two unit spheres intersecting this hit point, one on each side of the sphere object.</w:t>
+        <w:t xml:space="preserve">Imagine </w:t>
+      </w:r>
+      <w:proofErr w:type="gramStart"/>
+      <w:r>
+        <w:rPr>
+          <w:rFonts w:hint="eastAsia"/>
+        </w:rPr>
+        <w:t>two unit</w:t>
+      </w:r>
+      <w:proofErr w:type="gramEnd"/>
+      <w:r>
+        <w:rPr>
+          <w:rFonts w:hint="eastAsia"/>
+        </w:rPr>
+        <w:t xml:space="preserve"> spheres intersecting this hit point, one on each side of the sphere object.</w:t>
       </w:r>
       <w:r>
         <w:rPr>
@@ -2040,6 +2242,7 @@
       <w:r>
         <w:t> (</w:t>
       </w:r>
+      <w:proofErr w:type="spellStart"/>
       <w:r>
         <w:rPr>
           <w:b/>
@@ -2057,6 +2260,7 @@
         </w:rPr>
         <w:t>n</w:t>
       </w:r>
+      <w:proofErr w:type="spellEnd"/>
       <w:r>
         <w:t xml:space="preserve">) and the </w:t>
       </w:r>
@@ -2228,7 +2432,21 @@
         <w:rPr>
           <w:rFonts w:hint="eastAsia"/>
         </w:rPr>
-        <w:t>Using Lambertian distribution over the selection of randomly dispersed rays results in two improvements:</w:t>
+        <w:t xml:space="preserve">Using Lambertian distribution over the selection of randomly dispersed </w:t>
+      </w:r>
+      <w:proofErr w:type="gramStart"/>
+      <w:r>
+        <w:rPr>
+          <w:rFonts w:hint="eastAsia"/>
+        </w:rPr>
+        <w:t>rays</w:t>
+      </w:r>
+      <w:proofErr w:type="gramEnd"/>
+      <w:r>
+        <w:rPr>
+          <w:rFonts w:hint="eastAsia"/>
+        </w:rPr>
+        <w:t xml:space="preserve"> results in two improvements:</w:t>
       </w:r>
     </w:p>
     <w:p>
@@ -2265,11 +2483,6 @@
       </w:r>
     </w:p>
     <w:p>
-      <w:pPr>
-        <w:rPr>
-          <w:rFonts w:hint="eastAsia"/>
-        </w:rPr>
-      </w:pPr>
       <w:r>
         <w:rPr>
           <w:rFonts w:hint="eastAsia"/>
@@ -2316,9 +2529,6 @@
     <w:p>
       <w:pPr>
         <w:pStyle w:val="2"/>
-        <w:rPr>
-          <w:rFonts w:hint="eastAsia"/>
-        </w:rPr>
       </w:pPr>
       <w:r>
         <w:rPr>
@@ -2337,37 +2547,372 @@
         <w:t>Using Gamma Correction for Accurate Color Intensity</w:t>
       </w:r>
     </w:p>
+    <w:p>
+      <w:pPr>
+        <w:rPr>
+          <w:rFonts w:hint="eastAsia"/>
+        </w:rPr>
+      </w:pPr>
+      <w:r>
+        <w:rPr>
+          <w:rFonts w:hint="eastAsia"/>
+        </w:rPr>
+        <w:t xml:space="preserve">Despite absorbing only half (0.5) of </w:t>
+      </w:r>
+      <w:r>
+        <w:t>the</w:t>
+      </w:r>
+      <w:r>
+        <w:rPr>
+          <w:rFonts w:hint="eastAsia"/>
+        </w:rPr>
+        <w:t xml:space="preserve"> energy of each bounce, the sphere is still pretty dark </w:t>
+      </w:r>
+      <w:r>
+        <w:t>–</w:t>
+      </w:r>
+      <w:r>
+        <w:rPr>
+          <w:rFonts w:hint="eastAsia"/>
+        </w:rPr>
+        <w:t xml:space="preserve"> in real life, it would be pretty bright. We will see the brightness gamut for the diffuse material by adjusting the reflectance of </w:t>
+      </w:r>
+      <w:proofErr w:type="spellStart"/>
+      <w:r>
+        <w:rPr>
+          <w:rFonts w:hint="eastAsia"/>
+        </w:rPr>
+        <w:t>ray_color</w:t>
+      </w:r>
+      <w:proofErr w:type="spellEnd"/>
+      <w:r>
+        <w:rPr>
+          <w:rFonts w:hint="eastAsia"/>
+        </w:rPr>
+        <w:t xml:space="preserve"> from 0.5 to 0.1</w:t>
+      </w:r>
+    </w:p>
+    <w:p>
+      <w:pPr>
+        <w:jc w:val="center"/>
+      </w:pPr>
+      <w:r>
+        <w:rPr>
+          <w:noProof/>
+        </w:rPr>
+        <w:drawing>
+          <wp:inline distT="0" distB="0" distL="0" distR="0" wp14:anchorId="40C13574" wp14:editId="75709977">
+            <wp:extent cx="3810000" cy="2143125"/>
+            <wp:effectExtent l="0" t="0" r="0" b="9525"/>
+            <wp:docPr id="1861439802" name="그림 1"/>
+            <wp:cNvGraphicFramePr>
+              <a:graphicFrameLocks xmlns:a="http://schemas.openxmlformats.org/drawingml/2006/main" noChangeAspect="1"/>
+            </wp:cNvGraphicFramePr>
+            <a:graphic xmlns:a="http://schemas.openxmlformats.org/drawingml/2006/main">
+              <a:graphicData uri="http://schemas.openxmlformats.org/drawingml/2006/picture">
+                <pic:pic xmlns:pic="http://schemas.openxmlformats.org/drawingml/2006/picture">
+                  <pic:nvPicPr>
+                    <pic:cNvPr id="0" name="Picture 1"/>
+                    <pic:cNvPicPr>
+                      <a:picLocks noChangeAspect="1" noChangeArrowheads="1"/>
+                    </pic:cNvPicPr>
+                  </pic:nvPicPr>
+                  <pic:blipFill>
+                    <a:blip r:embed="rId22">
+                      <a:extLst>
+                        <a:ext uri="{28A0092B-C50C-407E-A947-70E740481C1C}">
+                          <a14:useLocalDpi xmlns:a14="http://schemas.microsoft.com/office/drawing/2010/main" val="0"/>
+                        </a:ext>
+                      </a:extLst>
+                    </a:blip>
+                    <a:srcRect/>
+                    <a:stretch>
+                      <a:fillRect/>
+                    </a:stretch>
+                  </pic:blipFill>
+                  <pic:spPr bwMode="auto">
+                    <a:xfrm>
+                      <a:off x="0" y="0"/>
+                      <a:ext cx="3810000" cy="2143125"/>
+                    </a:xfrm>
+                    <a:prstGeom prst="rect">
+                      <a:avLst/>
+                    </a:prstGeom>
+                    <a:noFill/>
+                    <a:ln>
+                      <a:noFill/>
+                    </a:ln>
+                  </pic:spPr>
+                </pic:pic>
+              </a:graphicData>
+            </a:graphic>
+          </wp:inline>
+        </w:drawing>
+      </w:r>
+    </w:p>
+    <w:p>
+      <w:pPr>
+        <w:jc w:val="center"/>
+      </w:pPr>
+      <w:r>
+        <w:t>G</w:t>
+      </w:r>
+      <w:r>
+        <w:rPr>
+          <w:rFonts w:hint="eastAsia"/>
+        </w:rPr>
+        <w:t>amut of our renderer (10%, 30%, 50%, 70%, 90% reflectance)</w:t>
+      </w:r>
+    </w:p>
+    <w:p>
+      <w:pPr>
+        <w:rPr>
+          <w:rFonts w:hint="eastAsia"/>
+        </w:rPr>
+      </w:pPr>
+      <w:r>
+        <w:rPr>
+          <w:rFonts w:hint="eastAsia"/>
+        </w:rPr>
+        <w:t xml:space="preserve">The </w:t>
+      </w:r>
+      <w:r>
+        <w:t>50% reflectance render too dark to be half-way between white and black. Indeed, the 70% reflector is closer to middle-gray</w:t>
+      </w:r>
+      <w:r>
+        <w:rPr>
+          <w:rFonts w:hint="eastAsia"/>
+        </w:rPr>
+        <w:t xml:space="preserve"> because</w:t>
+      </w:r>
+      <w:r>
+        <w:t xml:space="preserve"> almost all computer programs assume that an image is “gamma corrected” before being written into an image file. This means that the 0 to 1 </w:t>
+      </w:r>
+      <w:proofErr w:type="gramStart"/>
+      <w:r>
+        <w:t>values</w:t>
+      </w:r>
+      <w:proofErr w:type="gramEnd"/>
+      <w:r>
+        <w:t xml:space="preserve"> have some transform applied before being stored as a byte. Images with data that are written without being transformed are said to be in </w:t>
+      </w:r>
+      <w:r>
+        <w:rPr>
+          <w:i/>
+          <w:iCs/>
+        </w:rPr>
+        <w:t>linear space</w:t>
+      </w:r>
+      <w:r>
+        <w:t xml:space="preserve">, whereas images that are transformed are said to be in </w:t>
+      </w:r>
+      <w:r>
+        <w:rPr>
+          <w:i/>
+          <w:iCs/>
+        </w:rPr>
+        <w:t>gamma space</w:t>
+      </w:r>
+      <w:r>
+        <w:t>. It is likely that the image viewer you are using is expecting an image in gamma space, but we are giving it an image in linear space. This is the reason why our image appears inaccurately dark.</w:t>
+      </w:r>
+    </w:p>
+    <w:p>
+      <w:r>
+        <w:t>As a simple approximation</w:t>
+      </w:r>
+      <w:r>
+        <w:rPr>
+          <w:rFonts w:hint="eastAsia"/>
+        </w:rPr>
+        <w:t xml:space="preserve"> of the gamma transform</w:t>
+      </w:r>
+      <w:r>
+        <w:t xml:space="preserve">, we can </w:t>
+      </w:r>
+      <w:r>
+        <w:rPr>
+          <w:rFonts w:hint="eastAsia"/>
+        </w:rPr>
+        <w:t>take the</w:t>
+      </w:r>
+      <w:r>
+        <w:t xml:space="preserve"> “gamma 2”</w:t>
+      </w:r>
+      <w:r>
+        <w:rPr>
+          <w:rFonts w:hint="eastAsia"/>
+        </w:rPr>
+        <w:t xml:space="preserve"> (</w:t>
+      </w:r>
+      <w:proofErr w:type="spellStart"/>
+      <w:r>
+        <w:rPr>
+          <w:rFonts w:hAnsiTheme="minorEastAsia" w:hint="eastAsia"/>
+          <w:i/>
+          <w:iCs/>
+        </w:rPr>
+        <w:t>γ</w:t>
+      </w:r>
+      <w:proofErr w:type="spellEnd"/>
+      <w:r>
+        <w:rPr>
+          <w:rFonts w:hint="eastAsia"/>
+        </w:rPr>
+        <w:t xml:space="preserve"> = 2)</w:t>
+      </w:r>
+      <w:r>
+        <w:t xml:space="preserve">, which is the power </w:t>
+      </w:r>
+      <w:r>
+        <w:rPr>
+          <w:rFonts w:hint="eastAsia"/>
+        </w:rPr>
+        <w:t>used to go</w:t>
+      </w:r>
+      <w:r>
+        <w:t xml:space="preserve"> from gamma space to linear space</w:t>
+      </w:r>
+      <w:r>
+        <w:rPr>
+          <w:rFonts w:hint="eastAsia"/>
+        </w:rPr>
+        <w:t>, and take its</w:t>
+      </w:r>
+      <w:r>
+        <w:t xml:space="preserve"> inverse </w:t>
+      </w:r>
+      <w:r>
+        <w:t>–</w:t>
+      </w:r>
+      <w:r>
+        <w:rPr>
+          <w:rFonts w:hint="eastAsia"/>
+        </w:rPr>
+        <w:t xml:space="preserve"> </w:t>
+      </w:r>
+      <w:r>
+        <w:t>an exponent of 1/</w:t>
+      </w:r>
+      <w:r>
+        <w:rPr>
+          <w:i/>
+          <w:iCs/>
+        </w:rPr>
+        <w:t>gamma</w:t>
+      </w:r>
+      <w:r>
+        <w:rPr>
+          <w:rFonts w:hint="eastAsia"/>
+        </w:rPr>
+        <w:t xml:space="preserve"> </w:t>
+      </w:r>
+      <w:r>
+        <w:t>–</w:t>
+      </w:r>
+      <w:r>
+        <w:rPr>
+          <w:rFonts w:hint="eastAsia"/>
+        </w:rPr>
+        <w:t xml:space="preserve"> or the </w:t>
+      </w:r>
+      <w:r>
+        <w:t>square-root. We'll also want to ensure that we robustly handle negative inputs.</w:t>
+      </w:r>
+    </w:p>
+    <w:p>
+      <w:pPr>
+        <w:jc w:val="center"/>
+        <w:rPr>
+          <w:rFonts w:hint="eastAsia"/>
+          <w:vertAlign w:val="superscript"/>
+        </w:rPr>
+      </w:pPr>
+      <w:r>
+        <w:rPr>
+          <w:rFonts w:hint="eastAsia"/>
+        </w:rPr>
+        <w:t>s</w:t>
+      </w:r>
+      <w:r>
+        <w:rPr>
+          <w:rFonts w:hint="eastAsia"/>
+        </w:rPr>
+        <w:t xml:space="preserve"> </w:t>
+      </w:r>
+      <w:r>
+        <w:t>=</w:t>
+      </w:r>
+      <w:r>
+        <w:rPr>
+          <w:rFonts w:hint="eastAsia"/>
+        </w:rPr>
+        <w:t xml:space="preserve"> </w:t>
+      </w:r>
+      <w:proofErr w:type="spellStart"/>
+      <w:r>
+        <w:t>cr</w:t>
+      </w:r>
+      <w:proofErr w:type="spellEnd"/>
+      <w:r>
+        <w:rPr>
+          <w:rFonts w:hint="eastAsia"/>
+          <w:vertAlign w:val="superscript"/>
+        </w:rPr>
+        <w:t>γ</w:t>
+      </w:r>
+      <w:r>
+        <w:rPr>
+          <w:rFonts w:hint="eastAsia"/>
+        </w:rPr>
+        <w:t xml:space="preserve">   </w:t>
+      </w:r>
+      <w:r>
+        <w:sym w:font="Wingdings" w:char="F0DF"/>
+      </w:r>
+      <w:r>
+        <w:sym w:font="Wingdings" w:char="F0E0"/>
+      </w:r>
+      <w:r>
+        <w:rPr>
+          <w:rFonts w:hint="eastAsia"/>
+        </w:rPr>
+        <w:t xml:space="preserve">  r = (s/c)</w:t>
+      </w:r>
+      <w:r>
+        <w:rPr>
+          <w:vertAlign w:val="superscript"/>
+        </w:rPr>
+        <w:t>γ</w:t>
+      </w:r>
+    </w:p>
+    <w:p/>
+    <w:p>
+      <w:pPr>
+        <w:rPr>
+          <w:rFonts w:hint="eastAsia"/>
+        </w:rPr>
+      </w:pPr>
+    </w:p>
+    <w:p>
+      <w:pPr>
+        <w:pStyle w:val="2"/>
+      </w:pPr>
+      <w:r>
+        <w:rPr>
+          <w:rFonts w:hint="eastAsia"/>
+        </w:rPr>
+        <w:t>10</w:t>
+      </w:r>
+      <w:r>
+        <w:rPr>
+          <w:rFonts w:hint="eastAsia"/>
+        </w:rPr>
+        <w:t>.</w:t>
+      </w:r>
+    </w:p>
     <w:p/>
     <w:p/>
-    <w:p>
-      <w:pPr>
-        <w:rPr>
-          <w:rFonts w:hint="eastAsia"/>
-        </w:rPr>
-      </w:pPr>
-    </w:p>
-    <w:p>
-      <w:pPr>
-        <w:pStyle w:val="2"/>
-        <w:rPr>
-          <w:rFonts w:hint="eastAsia"/>
-        </w:rPr>
-      </w:pPr>
-      <w:r>
-        <w:rPr>
-          <w:rFonts w:hint="eastAsia"/>
-        </w:rPr>
-        <w:t>9.</w:t>
-      </w:r>
-    </w:p>
-    <w:p/>
-    <w:p>
-      <w:pPr>
-        <w:rPr>
-          <w:rFonts w:hint="eastAsia"/>
-        </w:rPr>
-      </w:pPr>
-    </w:p>
     <w:p/>
     <w:p/>
     <w:sectPr>

</xml_diff>

<commit_message>
Updated material notes and added material.h
</commit_message>
<xml_diff>
--- a/Notes.docx
+++ b/Notes.docx
@@ -216,61 +216,15 @@
       <w:r>
         <w:tab/>
       </w:r>
-      <w:proofErr w:type="spellStart"/>
-      <w:r>
-        <w:rPr>
-          <w:rFonts w:hint="eastAsia"/>
-        </w:rPr>
-        <w:t>image_height</w:t>
-      </w:r>
-      <w:proofErr w:type="spellEnd"/>
-      <w:r>
-        <w:rPr>
-          <w:rFonts w:hint="eastAsia"/>
-        </w:rPr>
-        <w:t xml:space="preserve"> = (</w:t>
-      </w:r>
-      <w:proofErr w:type="spellStart"/>
-      <w:r>
-        <w:rPr>
-          <w:rFonts w:hint="eastAsia"/>
-        </w:rPr>
-        <w:t>image_height</w:t>
-      </w:r>
-      <w:proofErr w:type="spellEnd"/>
-      <w:r>
-        <w:rPr>
-          <w:rFonts w:hint="eastAsia"/>
-        </w:rPr>
-        <w:t xml:space="preserve"> &lt; 1</w:t>
-      </w:r>
-      <w:proofErr w:type="gramStart"/>
-      <w:r>
-        <w:rPr>
-          <w:rFonts w:hint="eastAsia"/>
-        </w:rPr>
-        <w:t xml:space="preserve">) </w:t>
-      </w:r>
-      <w:r>
-        <w:t>?</w:t>
-      </w:r>
-      <w:proofErr w:type="gramEnd"/>
-      <w:r>
-        <w:t xml:space="preserve"> </w:t>
-      </w:r>
-      <w:proofErr w:type="gramStart"/>
-      <w:r>
-        <w:t>1 :</w:t>
-      </w:r>
-      <w:proofErr w:type="gramEnd"/>
-      <w:r>
-        <w:t xml:space="preserve"> </w:t>
-      </w:r>
-      <w:proofErr w:type="spellStart"/>
-      <w:r>
-        <w:t>image_height</w:t>
-      </w:r>
-      <w:proofErr w:type="spellEnd"/>
+      <w:r>
+        <w:rPr>
+          <w:rFonts w:hint="eastAsia"/>
+        </w:rPr>
+        <w:t xml:space="preserve">image_height = (image_height &lt; 1) </w:t>
+      </w:r>
+      <w:r>
+        <w:t>? 1 : image_height</w:t>
+      </w:r>
     </w:p>
     <w:p>
       <w:pPr>
@@ -281,36 +235,11 @@
           <w:b/>
           <w:bCs/>
         </w:rPr>
-        <w:t xml:space="preserve">? </w:t>
-      </w:r>
-      <w:proofErr w:type="gramStart"/>
-      <w:r>
-        <w:rPr>
-          <w:b/>
-          <w:bCs/>
-        </w:rPr>
-        <w:t>1 :</w:t>
-      </w:r>
-      <w:proofErr w:type="gramEnd"/>
-      <w:r>
-        <w:rPr>
-          <w:b/>
-          <w:bCs/>
-        </w:rPr>
+        <w:t>? 1 : image_height</w:t>
+      </w:r>
+      <w:r>
         <w:t xml:space="preserve"> </w:t>
       </w:r>
-      <w:proofErr w:type="spellStart"/>
-      <w:r>
-        <w:rPr>
-          <w:b/>
-          <w:bCs/>
-        </w:rPr>
-        <w:t>image_height</w:t>
-      </w:r>
-      <w:proofErr w:type="spellEnd"/>
-      <w:r>
-        <w:t xml:space="preserve"> </w:t>
-      </w:r>
       <w:r>
         <w:rPr>
           <w:rFonts w:hint="eastAsia"/>
@@ -359,13 +288,8 @@
         <w:t>F</w:t>
       </w:r>
       <w:r>
-        <w:t xml:space="preserve">alse, use </w:t>
-      </w:r>
-      <w:proofErr w:type="spellStart"/>
-      <w:r>
-        <w:t>image_height</w:t>
-      </w:r>
-      <w:proofErr w:type="spellEnd"/>
+        <w:t>alse, use image_height</w:t>
+      </w:r>
     </w:p>
     <w:p>
       <w:r>
@@ -543,13 +467,8 @@
         </w:rPr>
         <w:t xml:space="preserve"> a standard equation defined by </w:t>
       </w:r>
-      <w:proofErr w:type="gramStart"/>
-      <w:r>
-        <w:t>lerp(</w:t>
-      </w:r>
-      <w:proofErr w:type="gramEnd"/>
-      <w:r>
-        <w:t>a, b, t) = a * (1 - t) + b * t</w:t>
+      <w:r>
+        <w:t>lerp(a, b, t) = a * (1 - t) + b * t</w:t>
       </w:r>
     </w:p>
     <w:p>
@@ -669,21 +588,7 @@
         <w:rPr>
           <w:rFonts w:hint="eastAsia"/>
         </w:rPr>
-        <w:t>(C-</w:t>
-      </w:r>
-      <w:proofErr w:type="gramStart"/>
-      <w:r>
-        <w:rPr>
-          <w:rFonts w:hint="eastAsia"/>
-        </w:rPr>
-        <w:t>P)*</w:t>
-      </w:r>
-      <w:proofErr w:type="gramEnd"/>
-      <w:r>
-        <w:rPr>
-          <w:rFonts w:hint="eastAsia"/>
-        </w:rPr>
-        <w:t>(C-P) is the dot product of the length of the origin-to-center vector. For the equation of that value being equal to r</w:t>
+        <w:t>(C-P)*(C-P) is the dot product of the length of the origin-to-center vector. For the equation of that value being equal to r</w:t>
       </w:r>
       <w:r>
         <w:rPr>
@@ -696,21 +601,10 @@
         <w:rPr>
           <w:rFonts w:hint="eastAsia"/>
         </w:rPr>
-        <w:t xml:space="preserve">, imagine a sphere of radius r migrated (C-P) distance away from origin (camera lens). The ray, if allowed to permeate through, will intersect </w:t>
-      </w:r>
-      <w:proofErr w:type="gramStart"/>
-      <w:r>
-        <w:rPr>
-          <w:rFonts w:hint="eastAsia"/>
-        </w:rPr>
-        <w:t xml:space="preserve">these </w:t>
-      </w:r>
-      <w:r>
-        <w:t>selection</w:t>
-      </w:r>
-      <w:proofErr w:type="gramEnd"/>
-      <w:r>
-        <w:t xml:space="preserve"> o</w:t>
+        <w:t xml:space="preserve">, imagine a sphere of radius r migrated (C-P) distance away from origin (camera lens). The ray, if allowed to permeate through, will intersect these </w:t>
+      </w:r>
+      <w:r>
+        <w:t>selection o</w:t>
       </w:r>
       <w:r>
         <w:rPr>
@@ -888,16 +782,8 @@
         <w:rPr>
           <w:rFonts w:hint="eastAsia"/>
         </w:rPr>
-        <w:t xml:space="preserve">6.1 Shading with Surface </w:t>
-      </w:r>
-      <w:proofErr w:type="spellStart"/>
-      <w:r>
-        <w:rPr>
-          <w:rFonts w:hint="eastAsia"/>
-        </w:rPr>
-        <w:t>Normals</w:t>
-      </w:r>
-      <w:proofErr w:type="spellEnd"/>
+        <w:t>6.1 Shading with Surface Normals</w:t>
+      </w:r>
     </w:p>
     <w:p>
       <w:r>
@@ -1009,43 +895,7 @@
           <w:rFonts w:hint="eastAsia"/>
         </w:rPr>
         <w:lastRenderedPageBreak/>
-        <w:t>This means that the directional vector (</w:t>
-      </w:r>
-      <w:proofErr w:type="spellStart"/>
-      <w:proofErr w:type="gramStart"/>
-      <w:r>
-        <w:rPr>
-          <w:rFonts w:hint="eastAsia"/>
-        </w:rPr>
-        <w:t>x,y</w:t>
-      </w:r>
-      <w:proofErr w:type="gramEnd"/>
-      <w:r>
-        <w:rPr>
-          <w:rFonts w:hint="eastAsia"/>
-        </w:rPr>
-        <w:t>,z</w:t>
-      </w:r>
-      <w:proofErr w:type="spellEnd"/>
-      <w:r>
-        <w:rPr>
-          <w:rFonts w:hint="eastAsia"/>
-        </w:rPr>
-        <w:t>) of the unit surface normal is mapped to (</w:t>
-      </w:r>
-      <w:proofErr w:type="gramStart"/>
-      <w:r>
-        <w:rPr>
-          <w:rFonts w:hint="eastAsia"/>
-        </w:rPr>
-        <w:t>R,G</w:t>
-      </w:r>
-      <w:proofErr w:type="gramEnd"/>
-      <w:r>
-        <w:rPr>
-          <w:rFonts w:hint="eastAsia"/>
-        </w:rPr>
-        <w:t>,B)</w:t>
+        <w:t>This means that the directional vector (x,y,z) of the unit surface normal is mapped to (R,G,B)</w:t>
       </w:r>
     </w:p>
     <w:p>
@@ -1286,15 +1136,7 @@
         <w:t xml:space="preserve"> </w:t>
       </w:r>
       <w:r>
-        <w:t xml:space="preserve">Moving Camera Code </w:t>
-      </w:r>
-      <w:proofErr w:type="gramStart"/>
-      <w:r>
-        <w:t>Into</w:t>
-      </w:r>
-      <w:proofErr w:type="gramEnd"/>
-      <w:r>
-        <w:t xml:space="preserve"> Its Own Class</w:t>
+        <w:t>Moving Camera Code Into Its Own Class</w:t>
       </w:r>
     </w:p>
     <w:p>
@@ -1304,11 +1146,9 @@
         </w:rPr>
         <w:t xml:space="preserve">After creating </w:t>
       </w:r>
-      <w:proofErr w:type="spellStart"/>
       <w:r>
         <w:t>rtweekend.h</w:t>
       </w:r>
-      <w:proofErr w:type="spellEnd"/>
       <w:r>
         <w:rPr>
           <w:rFonts w:hint="eastAsia"/>
@@ -1530,21 +1370,7 @@
         <w:rPr>
           <w:rFonts w:hint="eastAsia"/>
         </w:rPr>
-        <w:t xml:space="preserve">. At the current state, if we were to render </w:t>
-      </w:r>
-      <w:proofErr w:type="gramStart"/>
-      <w:r>
-        <w:rPr>
-          <w:rFonts w:hint="eastAsia"/>
-        </w:rPr>
-        <w:t>a</w:t>
-      </w:r>
-      <w:proofErr w:type="gramEnd"/>
-      <w:r>
-        <w:rPr>
-          <w:rFonts w:hint="eastAsia"/>
-        </w:rPr>
-        <w:t xml:space="preserve"> 8 x 8 checkerboard far away such that it</w:t>
+        <w:t>. At the current state, if we were to render a 8 x 8 checkerboard far away such that it</w:t>
       </w:r>
       <w:r>
         <w:t>’</w:t>
@@ -1613,21 +1439,7 @@
         <w:rPr>
           <w:rFonts w:hint="eastAsia"/>
         </w:rPr>
-        <w:t xml:space="preserve">ll sample the </w:t>
-      </w:r>
-      <w:proofErr w:type="gramStart"/>
-      <w:r>
-        <w:rPr>
-          <w:rFonts w:hint="eastAsia"/>
-        </w:rPr>
-        <w:t>four square</w:t>
-      </w:r>
-      <w:proofErr w:type="gramEnd"/>
-      <w:r>
-        <w:rPr>
-          <w:rFonts w:hint="eastAsia"/>
-        </w:rPr>
-        <w:t xml:space="preserve"> regions of a pixel that extends halfway into each of the four neighboring pixels </w:t>
+        <w:t xml:space="preserve">ll sample the four square regions of a pixel that extends halfway into each of the four neighboring pixels </w:t>
       </w:r>
       <w:r>
         <w:t>–</w:t>
@@ -2208,21 +2020,7 @@
         <w:rPr>
           <w:rFonts w:hint="eastAsia"/>
         </w:rPr>
-        <w:t xml:space="preserve">Imagine </w:t>
-      </w:r>
-      <w:proofErr w:type="gramStart"/>
-      <w:r>
-        <w:rPr>
-          <w:rFonts w:hint="eastAsia"/>
-        </w:rPr>
-        <w:t>two unit</w:t>
-      </w:r>
-      <w:proofErr w:type="gramEnd"/>
-      <w:r>
-        <w:rPr>
-          <w:rFonts w:hint="eastAsia"/>
-        </w:rPr>
-        <w:t xml:space="preserve"> spheres intersecting this hit point, one on each side of the sphere object.</w:t>
+        <w:t>Imagine two unit spheres intersecting this hit point, one on each side of the sphere object.</w:t>
       </w:r>
       <w:r>
         <w:rPr>
@@ -2242,7 +2040,6 @@
       <w:r>
         <w:t> (</w:t>
       </w:r>
-      <w:proofErr w:type="spellStart"/>
       <w:r>
         <w:rPr>
           <w:b/>
@@ -2260,7 +2057,6 @@
         </w:rPr>
         <w:t>n</w:t>
       </w:r>
-      <w:proofErr w:type="spellEnd"/>
       <w:r>
         <w:t xml:space="preserve">) and the </w:t>
       </w:r>
@@ -2432,21 +2228,7 @@
         <w:rPr>
           <w:rFonts w:hint="eastAsia"/>
         </w:rPr>
-        <w:t xml:space="preserve">Using Lambertian distribution over the selection of randomly dispersed </w:t>
-      </w:r>
-      <w:proofErr w:type="gramStart"/>
-      <w:r>
-        <w:rPr>
-          <w:rFonts w:hint="eastAsia"/>
-        </w:rPr>
-        <w:t>rays</w:t>
-      </w:r>
-      <w:proofErr w:type="gramEnd"/>
-      <w:r>
-        <w:rPr>
-          <w:rFonts w:hint="eastAsia"/>
-        </w:rPr>
-        <w:t xml:space="preserve"> results in two improvements:</w:t>
+        <w:t>Using Lambertian distribution over the selection of randomly dispersed rays results in two improvements:</w:t>
       </w:r>
     </w:p>
     <w:p>
@@ -2575,21 +2357,7 @@
         <w:rPr>
           <w:rFonts w:hint="eastAsia"/>
         </w:rPr>
-        <w:t xml:space="preserve"> in real life, it would be pretty bright. We will see the brightness gamut for the diffuse material by adjusting the reflectance of </w:t>
-      </w:r>
-      <w:proofErr w:type="spellStart"/>
-      <w:r>
-        <w:rPr>
-          <w:rFonts w:hint="eastAsia"/>
-        </w:rPr>
-        <w:t>ray_color</w:t>
-      </w:r>
-      <w:proofErr w:type="spellEnd"/>
-      <w:r>
-        <w:rPr>
-          <w:rFonts w:hint="eastAsia"/>
-        </w:rPr>
-        <w:t xml:space="preserve"> from 0.5 to 0.1</w:t>
+        <w:t xml:space="preserve"> in real life, it would be pretty bright. We will see the brightness gamut for the diffuse material by adjusting the reflectance of ray_color from 0.5 to 0.1</w:t>
       </w:r>
     </w:p>
     <w:p>
@@ -2686,15 +2454,7 @@
         <w:t xml:space="preserve"> because</w:t>
       </w:r>
       <w:r>
-        <w:t xml:space="preserve"> almost all computer programs assume that an image is “gamma corrected” before being written into an image file. This means that the 0 to 1 </w:t>
-      </w:r>
-      <w:proofErr w:type="gramStart"/>
-      <w:r>
-        <w:t>values</w:t>
-      </w:r>
-      <w:proofErr w:type="gramEnd"/>
-      <w:r>
-        <w:t xml:space="preserve"> have some transform applied before being stored as a byte. Images with data that are written without being transformed are said to be in </w:t>
+        <w:t xml:space="preserve"> almost all computer programs assume that an image is “gamma corrected” before being written into an image file. This means that the 0 to 1 values have some transform applied before being stored as a byte. Images with data that are written without being transformed are said to be in </w:t>
       </w:r>
       <w:r>
         <w:rPr>
@@ -2745,7 +2505,6 @@
         </w:rPr>
         <w:t xml:space="preserve"> (</w:t>
       </w:r>
-      <w:proofErr w:type="spellStart"/>
       <w:r>
         <w:rPr>
           <w:rFonts w:hAnsiTheme="minorEastAsia" w:hint="eastAsia"/>
@@ -2754,7 +2513,6 @@
         </w:rPr>
         <w:t>γ</w:t>
       </w:r>
-      <w:proofErr w:type="spellEnd"/>
       <w:r>
         <w:rPr>
           <w:rFonts w:hint="eastAsia"/>
@@ -2849,11 +2607,9 @@
         </w:rPr>
         <w:t xml:space="preserve"> </w:t>
       </w:r>
-      <w:proofErr w:type="spellStart"/>
       <w:r>
         <w:t>cr</w:t>
       </w:r>
-      <w:proofErr w:type="spellEnd"/>
       <w:r>
         <w:rPr>
           <w:rFonts w:hint="eastAsia"/>
@@ -2897,6 +2653,9 @@
     <w:p>
       <w:pPr>
         <w:pStyle w:val="2"/>
+        <w:rPr>
+          <w:rFonts w:hint="eastAsia"/>
+        </w:rPr>
       </w:pPr>
       <w:r>
         <w:rPr>
@@ -2910,8 +2669,98 @@
         </w:rPr>
         <w:t>.</w:t>
       </w:r>
-    </w:p>
-    <w:p/>
+      <w:r>
+        <w:rPr>
+          <w:rFonts w:hint="eastAsia"/>
+        </w:rPr>
+        <w:t xml:space="preserve">1 </w:t>
+      </w:r>
+      <w:r>
+        <w:t>An Abstract Class for Materials</w:t>
+      </w:r>
+    </w:p>
+    <w:p>
+      <w:r>
+        <w:t>We can have a universal material type with lots of parameters so any individual material type could just ignore the parameters that don't affect it, or we could have an abstract material class that encapsulates unique behavior.</w:t>
+      </w:r>
+      <w:r>
+        <w:rPr>
+          <w:rFonts w:hint="eastAsia"/>
+        </w:rPr>
+        <w:t xml:space="preserve"> Our material needs</w:t>
+      </w:r>
+      <w:r>
+        <w:rPr>
+          <w:rFonts w:hint="eastAsia"/>
+        </w:rPr>
+        <w:t xml:space="preserve"> to</w:t>
+      </w:r>
+      <w:r>
+        <w:rPr>
+          <w:rFonts w:hint="eastAsia"/>
+        </w:rPr>
+        <w:t>:</w:t>
+      </w:r>
+    </w:p>
+    <w:p>
+      <w:pPr>
+        <w:numPr>
+          <w:ilvl w:val="0"/>
+          <w:numId w:val="4"/>
+        </w:numPr>
+      </w:pPr>
+      <w:r>
+        <w:rPr>
+          <w:rFonts w:hint="eastAsia"/>
+        </w:rPr>
+        <w:t>p</w:t>
+      </w:r>
+      <w:r>
+        <w:t>roduce a scattered ray (or say it absorbed the incident ray).</w:t>
+      </w:r>
+    </w:p>
+    <w:p>
+      <w:pPr>
+        <w:numPr>
+          <w:ilvl w:val="0"/>
+          <w:numId w:val="4"/>
+        </w:numPr>
+      </w:pPr>
+      <w:r>
+        <w:rPr>
+          <w:rFonts w:hint="eastAsia"/>
+        </w:rPr>
+        <w:t>i</w:t>
+      </w:r>
+      <w:r>
+        <w:t>f scattered, say how much the ray should be attenuated</w:t>
+      </w:r>
+      <w:r>
+        <w:rPr>
+          <w:rFonts w:hint="eastAsia"/>
+        </w:rPr>
+        <w:t xml:space="preserve"> (</w:t>
+      </w:r>
+      <w:r>
+        <w:t>reduced in force</w:t>
+      </w:r>
+      <w:r>
+        <w:rPr>
+          <w:rFonts w:hint="eastAsia"/>
+        </w:rPr>
+        <w:t>)</w:t>
+      </w:r>
+      <w:r>
+        <w:t>.</w:t>
+      </w:r>
+    </w:p>
+    <w:p>
+      <w:pPr>
+        <w:rPr>
+          <w:rFonts w:hint="eastAsia"/>
+        </w:rPr>
+      </w:pPr>
+    </w:p>
     <w:p/>
     <w:p/>
     <w:p/>
@@ -3315,6 +3164,119 @@
       </w:rPr>
     </w:lvl>
   </w:abstractNum>
+  <w:abstractNum w:abstractNumId="3" w15:restartNumberingAfterBreak="0">
+    <w:nsid w:val="2D682529"/>
+    <w:multiLevelType w:val="multilevel"/>
+    <w:tmpl w:val="AF5A8D4C"/>
+    <w:lvl w:ilvl="0">
+      <w:start w:val="1"/>
+      <w:numFmt w:val="decimal"/>
+      <w:lvlText w:val="%1."/>
+      <w:lvlJc w:val="left"/>
+      <w:pPr>
+        <w:tabs>
+          <w:tab w:val="num" w:pos="720"/>
+        </w:tabs>
+        <w:ind w:left="720" w:hanging="360"/>
+      </w:pPr>
+    </w:lvl>
+    <w:lvl w:ilvl="1" w:tentative="1">
+      <w:start w:val="1"/>
+      <w:numFmt w:val="decimal"/>
+      <w:lvlText w:val="%2."/>
+      <w:lvlJc w:val="left"/>
+      <w:pPr>
+        <w:tabs>
+          <w:tab w:val="num" w:pos="1440"/>
+        </w:tabs>
+        <w:ind w:left="1440" w:hanging="360"/>
+      </w:pPr>
+    </w:lvl>
+    <w:lvl w:ilvl="2" w:tentative="1">
+      <w:start w:val="1"/>
+      <w:numFmt w:val="decimal"/>
+      <w:lvlText w:val="%3."/>
+      <w:lvlJc w:val="left"/>
+      <w:pPr>
+        <w:tabs>
+          <w:tab w:val="num" w:pos="2160"/>
+        </w:tabs>
+        <w:ind w:left="2160" w:hanging="360"/>
+      </w:pPr>
+    </w:lvl>
+    <w:lvl w:ilvl="3" w:tentative="1">
+      <w:start w:val="1"/>
+      <w:numFmt w:val="decimal"/>
+      <w:lvlText w:val="%4."/>
+      <w:lvlJc w:val="left"/>
+      <w:pPr>
+        <w:tabs>
+          <w:tab w:val="num" w:pos="2880"/>
+        </w:tabs>
+        <w:ind w:left="2880" w:hanging="360"/>
+      </w:pPr>
+    </w:lvl>
+    <w:lvl w:ilvl="4" w:tentative="1">
+      <w:start w:val="1"/>
+      <w:numFmt w:val="decimal"/>
+      <w:lvlText w:val="%5."/>
+      <w:lvlJc w:val="left"/>
+      <w:pPr>
+        <w:tabs>
+          <w:tab w:val="num" w:pos="3600"/>
+        </w:tabs>
+        <w:ind w:left="3600" w:hanging="360"/>
+      </w:pPr>
+    </w:lvl>
+    <w:lvl w:ilvl="5" w:tentative="1">
+      <w:start w:val="1"/>
+      <w:numFmt w:val="decimal"/>
+      <w:lvlText w:val="%6."/>
+      <w:lvlJc w:val="left"/>
+      <w:pPr>
+        <w:tabs>
+          <w:tab w:val="num" w:pos="4320"/>
+        </w:tabs>
+        <w:ind w:left="4320" w:hanging="360"/>
+      </w:pPr>
+    </w:lvl>
+    <w:lvl w:ilvl="6" w:tentative="1">
+      <w:start w:val="1"/>
+      <w:numFmt w:val="decimal"/>
+      <w:lvlText w:val="%7."/>
+      <w:lvlJc w:val="left"/>
+      <w:pPr>
+        <w:tabs>
+          <w:tab w:val="num" w:pos="5040"/>
+        </w:tabs>
+        <w:ind w:left="5040" w:hanging="360"/>
+      </w:pPr>
+    </w:lvl>
+    <w:lvl w:ilvl="7" w:tentative="1">
+      <w:start w:val="1"/>
+      <w:numFmt w:val="decimal"/>
+      <w:lvlText w:val="%8."/>
+      <w:lvlJc w:val="left"/>
+      <w:pPr>
+        <w:tabs>
+          <w:tab w:val="num" w:pos="5760"/>
+        </w:tabs>
+        <w:ind w:left="5760" w:hanging="360"/>
+      </w:pPr>
+    </w:lvl>
+    <w:lvl w:ilvl="8" w:tentative="1">
+      <w:start w:val="1"/>
+      <w:numFmt w:val="decimal"/>
+      <w:lvlText w:val="%9."/>
+      <w:lvlJc w:val="left"/>
+      <w:pPr>
+        <w:tabs>
+          <w:tab w:val="num" w:pos="6480"/>
+        </w:tabs>
+        <w:ind w:left="6480" w:hanging="360"/>
+      </w:pPr>
+    </w:lvl>
+  </w:abstractNum>
   <w:num w:numId="1" w16cid:durableId="1387534918">
     <w:abstractNumId w:val="0"/>
   </w:num>
@@ -3323,6 +3285,9 @@
   </w:num>
   <w:num w:numId="3" w16cid:durableId="202404503">
     <w:abstractNumId w:val="1"/>
+  </w:num>
+  <w:num w:numId="4" w16cid:durableId="270626225">
+    <w:abstractNumId w:val="3"/>
   </w:num>
 </w:numbering>
 </file>
@@ -3933,7 +3898,6 @@
   <w:style w:type="character" w:default="1" w:styleId="a0">
     <w:name w:val="Default Paragraph Font"/>
     <w:uiPriority w:val="1"/>
-    <w:semiHidden/>
     <w:unhideWhenUsed/>
   </w:style>
   <w:style w:type="table" w:default="1" w:styleId="a1">

</xml_diff>

<commit_message>
Updated notes and implemented mat ptr
</commit_message>
<xml_diff>
--- a/Notes.docx
+++ b/Notes.docx
@@ -2330,11 +2330,6 @@
       </w:r>
     </w:p>
     <w:p>
-      <w:pPr>
-        <w:rPr>
-          <w:rFonts w:hint="eastAsia"/>
-        </w:rPr>
-      </w:pPr>
       <w:r>
         <w:rPr>
           <w:rFonts w:hint="eastAsia"/>
@@ -2433,11 +2428,6 @@
       </w:r>
     </w:p>
     <w:p>
-      <w:pPr>
-        <w:rPr>
-          <w:rFonts w:hint="eastAsia"/>
-        </w:rPr>
-      </w:pPr>
       <w:r>
         <w:rPr>
           <w:rFonts w:hint="eastAsia"/>
@@ -2582,7 +2572,6 @@
       <w:pPr>
         <w:jc w:val="center"/>
         <w:rPr>
-          <w:rFonts w:hint="eastAsia"/>
           <w:vertAlign w:val="superscript"/>
         </w:rPr>
       </w:pPr>
@@ -2643,19 +2632,10 @@
       </w:r>
     </w:p>
     <w:p/>
-    <w:p>
-      <w:pPr>
-        <w:rPr>
-          <w:rFonts w:hint="eastAsia"/>
-        </w:rPr>
-      </w:pPr>
-    </w:p>
+    <w:p/>
     <w:p>
       <w:pPr>
         <w:pStyle w:val="2"/>
-        <w:rPr>
-          <w:rFonts w:hint="eastAsia"/>
-        </w:rPr>
       </w:pPr>
       <w:r>
         <w:rPr>
@@ -2754,12 +2734,43 @@
         <w:t>.</w:t>
       </w:r>
     </w:p>
-    <w:p>
-      <w:pPr>
-        <w:rPr>
-          <w:rFonts w:hint="eastAsia"/>
-        </w:rPr>
-      </w:pPr>
+    <w:p/>
+    <w:p/>
+    <w:p>
+      <w:pPr>
+        <w:pStyle w:val="2"/>
+      </w:pPr>
+      <w:r>
+        <w:rPr>
+          <w:rFonts w:hint="eastAsia"/>
+        </w:rPr>
+        <w:t>10.</w:t>
+      </w:r>
+      <w:r>
+        <w:rPr>
+          <w:rFonts w:hint="eastAsia"/>
+        </w:rPr>
+        <w:t>2</w:t>
+      </w:r>
+      <w:r>
+        <w:rPr>
+          <w:rFonts w:hint="eastAsia"/>
+        </w:rPr>
+        <w:t xml:space="preserve"> </w:t>
+      </w:r>
+      <w:r>
+        <w:t>A Data Structure to Describe Ray-Object Intersections</w:t>
+      </w:r>
+    </w:p>
+    <w:p>
+      <w:pPr>
+        <w:rPr>
+          <w:rFonts w:hint="eastAsia"/>
+        </w:rPr>
+      </w:pPr>
+      <w:r>
+        <w:t>hit_record is just a way to stuff a bunch of arguments into a class so we can send them as a group. When a ray hits a surface (a particular sphere for example), the material pointer in the hit_record will be set to point at the material pointer the sphere was given when it was set up in main() when we start. When the ray_color() routine gets the hit_record it can call member functions of the material pointer to find out what ray, if any, is scattered.</w:t>
+      </w:r>
     </w:p>
     <w:p/>
     <w:p/>

</xml_diff>

<commit_message>
Updated notes on albedo and added lambertian class
</commit_message>
<xml_diff>
--- a/Notes.docx
+++ b/Notes.docx
@@ -216,15 +216,61 @@
       <w:r>
         <w:tab/>
       </w:r>
-      <w:r>
-        <w:rPr>
-          <w:rFonts w:hint="eastAsia"/>
-        </w:rPr>
-        <w:t xml:space="preserve">image_height = (image_height &lt; 1) </w:t>
-      </w:r>
-      <w:r>
-        <w:t>? 1 : image_height</w:t>
-      </w:r>
+      <w:proofErr w:type="spellStart"/>
+      <w:r>
+        <w:rPr>
+          <w:rFonts w:hint="eastAsia"/>
+        </w:rPr>
+        <w:t>image_height</w:t>
+      </w:r>
+      <w:proofErr w:type="spellEnd"/>
+      <w:r>
+        <w:rPr>
+          <w:rFonts w:hint="eastAsia"/>
+        </w:rPr>
+        <w:t xml:space="preserve"> = (</w:t>
+      </w:r>
+      <w:proofErr w:type="spellStart"/>
+      <w:r>
+        <w:rPr>
+          <w:rFonts w:hint="eastAsia"/>
+        </w:rPr>
+        <w:t>image_height</w:t>
+      </w:r>
+      <w:proofErr w:type="spellEnd"/>
+      <w:r>
+        <w:rPr>
+          <w:rFonts w:hint="eastAsia"/>
+        </w:rPr>
+        <w:t xml:space="preserve"> &lt; 1</w:t>
+      </w:r>
+      <w:proofErr w:type="gramStart"/>
+      <w:r>
+        <w:rPr>
+          <w:rFonts w:hint="eastAsia"/>
+        </w:rPr>
+        <w:t xml:space="preserve">) </w:t>
+      </w:r>
+      <w:r>
+        <w:t>?</w:t>
+      </w:r>
+      <w:proofErr w:type="gramEnd"/>
+      <w:r>
+        <w:t xml:space="preserve"> </w:t>
+      </w:r>
+      <w:proofErr w:type="gramStart"/>
+      <w:r>
+        <w:t>1 :</w:t>
+      </w:r>
+      <w:proofErr w:type="gramEnd"/>
+      <w:r>
+        <w:t xml:space="preserve"> </w:t>
+      </w:r>
+      <w:proofErr w:type="spellStart"/>
+      <w:r>
+        <w:t>image_height</w:t>
+      </w:r>
+      <w:proofErr w:type="spellEnd"/>
     </w:p>
     <w:p>
       <w:pPr>
@@ -235,11 +281,36 @@
           <w:b/>
           <w:bCs/>
         </w:rPr>
-        <w:t>? 1 : image_height</w:t>
-      </w:r>
-      <w:r>
+        <w:t xml:space="preserve">? </w:t>
+      </w:r>
+      <w:proofErr w:type="gramStart"/>
+      <w:r>
+        <w:rPr>
+          <w:b/>
+          <w:bCs/>
+        </w:rPr>
+        <w:t>1 :</w:t>
+      </w:r>
+      <w:proofErr w:type="gramEnd"/>
+      <w:r>
+        <w:rPr>
+          <w:b/>
+          <w:bCs/>
+        </w:rPr>
         <w:t xml:space="preserve"> </w:t>
       </w:r>
+      <w:proofErr w:type="spellStart"/>
+      <w:r>
+        <w:rPr>
+          <w:b/>
+          <w:bCs/>
+        </w:rPr>
+        <w:t>image_height</w:t>
+      </w:r>
+      <w:proofErr w:type="spellEnd"/>
+      <w:r>
+        <w:t xml:space="preserve"> </w:t>
+      </w:r>
       <w:r>
         <w:rPr>
           <w:rFonts w:hint="eastAsia"/>
@@ -288,8 +359,13 @@
         <w:t>F</w:t>
       </w:r>
       <w:r>
-        <w:t>alse, use image_height</w:t>
-      </w:r>
+        <w:t xml:space="preserve">alse, use </w:t>
+      </w:r>
+      <w:proofErr w:type="spellStart"/>
+      <w:r>
+        <w:t>image_height</w:t>
+      </w:r>
+      <w:proofErr w:type="spellEnd"/>
     </w:p>
     <w:p>
       <w:r>
@@ -467,8 +543,13 @@
         </w:rPr>
         <w:t xml:space="preserve"> a standard equation defined by </w:t>
       </w:r>
-      <w:r>
-        <w:t>lerp(a, b, t) = a * (1 - t) + b * t</w:t>
+      <w:proofErr w:type="gramStart"/>
+      <w:r>
+        <w:t>lerp(</w:t>
+      </w:r>
+      <w:proofErr w:type="gramEnd"/>
+      <w:r>
+        <w:t>a, b, t) = a * (1 - t) + b * t</w:t>
       </w:r>
     </w:p>
     <w:p>
@@ -588,7 +669,21 @@
         <w:rPr>
           <w:rFonts w:hint="eastAsia"/>
         </w:rPr>
-        <w:t>(C-P)*(C-P) is the dot product of the length of the origin-to-center vector. For the equation of that value being equal to r</w:t>
+        <w:t>(C-</w:t>
+      </w:r>
+      <w:proofErr w:type="gramStart"/>
+      <w:r>
+        <w:rPr>
+          <w:rFonts w:hint="eastAsia"/>
+        </w:rPr>
+        <w:t>P)*</w:t>
+      </w:r>
+      <w:proofErr w:type="gramEnd"/>
+      <w:r>
+        <w:rPr>
+          <w:rFonts w:hint="eastAsia"/>
+        </w:rPr>
+        <w:t>(C-P) is the dot product of the length of the origin-to-center vector. For the equation of that value being equal to r</w:t>
       </w:r>
       <w:r>
         <w:rPr>
@@ -601,10 +696,21 @@
         <w:rPr>
           <w:rFonts w:hint="eastAsia"/>
         </w:rPr>
-        <w:t xml:space="preserve">, imagine a sphere of radius r migrated (C-P) distance away from origin (camera lens). The ray, if allowed to permeate through, will intersect these </w:t>
-      </w:r>
-      <w:r>
-        <w:t>selection o</w:t>
+        <w:t xml:space="preserve">, imagine a sphere of radius r migrated (C-P) distance away from origin (camera lens). The ray, if allowed to permeate through, will intersect </w:t>
+      </w:r>
+      <w:proofErr w:type="gramStart"/>
+      <w:r>
+        <w:rPr>
+          <w:rFonts w:hint="eastAsia"/>
+        </w:rPr>
+        <w:t xml:space="preserve">these </w:t>
+      </w:r>
+      <w:r>
+        <w:t>selection</w:t>
+      </w:r>
+      <w:proofErr w:type="gramEnd"/>
+      <w:r>
+        <w:t xml:space="preserve"> o</w:t>
       </w:r>
       <w:r>
         <w:rPr>
@@ -782,8 +888,16 @@
         <w:rPr>
           <w:rFonts w:hint="eastAsia"/>
         </w:rPr>
-        <w:t>6.1 Shading with Surface Normals</w:t>
-      </w:r>
+        <w:t xml:space="preserve">6.1 Shading with Surface </w:t>
+      </w:r>
+      <w:proofErr w:type="spellStart"/>
+      <w:r>
+        <w:rPr>
+          <w:rFonts w:hint="eastAsia"/>
+        </w:rPr>
+        <w:t>Normals</w:t>
+      </w:r>
+      <w:proofErr w:type="spellEnd"/>
     </w:p>
     <w:p>
       <w:r>
@@ -895,7 +1009,43 @@
           <w:rFonts w:hint="eastAsia"/>
         </w:rPr>
         <w:lastRenderedPageBreak/>
-        <w:t>This means that the directional vector (x,y,z) of the unit surface normal is mapped to (R,G,B)</w:t>
+        <w:t>This means that the directional vector (</w:t>
+      </w:r>
+      <w:proofErr w:type="spellStart"/>
+      <w:proofErr w:type="gramStart"/>
+      <w:r>
+        <w:rPr>
+          <w:rFonts w:hint="eastAsia"/>
+        </w:rPr>
+        <w:t>x,y</w:t>
+      </w:r>
+      <w:proofErr w:type="gramEnd"/>
+      <w:r>
+        <w:rPr>
+          <w:rFonts w:hint="eastAsia"/>
+        </w:rPr>
+        <w:t>,z</w:t>
+      </w:r>
+      <w:proofErr w:type="spellEnd"/>
+      <w:r>
+        <w:rPr>
+          <w:rFonts w:hint="eastAsia"/>
+        </w:rPr>
+        <w:t>) of the unit surface normal is mapped to (</w:t>
+      </w:r>
+      <w:proofErr w:type="gramStart"/>
+      <w:r>
+        <w:rPr>
+          <w:rFonts w:hint="eastAsia"/>
+        </w:rPr>
+        <w:t>R,G</w:t>
+      </w:r>
+      <w:proofErr w:type="gramEnd"/>
+      <w:r>
+        <w:rPr>
+          <w:rFonts w:hint="eastAsia"/>
+        </w:rPr>
+        <w:t>,B)</w:t>
       </w:r>
     </w:p>
     <w:p>
@@ -1136,7 +1286,15 @@
         <w:t xml:space="preserve"> </w:t>
       </w:r>
       <w:r>
-        <w:t>Moving Camera Code Into Its Own Class</w:t>
+        <w:t xml:space="preserve">Moving Camera Code </w:t>
+      </w:r>
+      <w:proofErr w:type="gramStart"/>
+      <w:r>
+        <w:t>Into</w:t>
+      </w:r>
+      <w:proofErr w:type="gramEnd"/>
+      <w:r>
+        <w:t xml:space="preserve"> Its Own Class</w:t>
       </w:r>
     </w:p>
     <w:p>
@@ -1146,9 +1304,11 @@
         </w:rPr>
         <w:t xml:space="preserve">After creating </w:t>
       </w:r>
+      <w:proofErr w:type="spellStart"/>
       <w:r>
         <w:t>rtweekend.h</w:t>
       </w:r>
+      <w:proofErr w:type="spellEnd"/>
       <w:r>
         <w:rPr>
           <w:rFonts w:hint="eastAsia"/>
@@ -1370,7 +1530,21 @@
         <w:rPr>
           <w:rFonts w:hint="eastAsia"/>
         </w:rPr>
-        <w:t>. At the current state, if we were to render a 8 x 8 checkerboard far away such that it</w:t>
+        <w:t xml:space="preserve">. At the current state, if we were to render </w:t>
+      </w:r>
+      <w:proofErr w:type="gramStart"/>
+      <w:r>
+        <w:rPr>
+          <w:rFonts w:hint="eastAsia"/>
+        </w:rPr>
+        <w:t>a</w:t>
+      </w:r>
+      <w:proofErr w:type="gramEnd"/>
+      <w:r>
+        <w:rPr>
+          <w:rFonts w:hint="eastAsia"/>
+        </w:rPr>
+        <w:t xml:space="preserve"> 8 x 8 checkerboard far away such that it</w:t>
       </w:r>
       <w:r>
         <w:t>’</w:t>
@@ -1439,7 +1613,21 @@
         <w:rPr>
           <w:rFonts w:hint="eastAsia"/>
         </w:rPr>
-        <w:t xml:space="preserve">ll sample the four square regions of a pixel that extends halfway into each of the four neighboring pixels </w:t>
+        <w:t xml:space="preserve">ll sample the </w:t>
+      </w:r>
+      <w:proofErr w:type="gramStart"/>
+      <w:r>
+        <w:rPr>
+          <w:rFonts w:hint="eastAsia"/>
+        </w:rPr>
+        <w:t>four square</w:t>
+      </w:r>
+      <w:proofErr w:type="gramEnd"/>
+      <w:r>
+        <w:rPr>
+          <w:rFonts w:hint="eastAsia"/>
+        </w:rPr>
+        <w:t xml:space="preserve"> regions of a pixel that extends halfway into each of the four neighboring pixels </w:t>
       </w:r>
       <w:r>
         <w:t>–</w:t>
@@ -2020,7 +2208,21 @@
         <w:rPr>
           <w:rFonts w:hint="eastAsia"/>
         </w:rPr>
-        <w:t>Imagine two unit spheres intersecting this hit point, one on each side of the sphere object.</w:t>
+        <w:t xml:space="preserve">Imagine </w:t>
+      </w:r>
+      <w:proofErr w:type="gramStart"/>
+      <w:r>
+        <w:rPr>
+          <w:rFonts w:hint="eastAsia"/>
+        </w:rPr>
+        <w:t>two unit</w:t>
+      </w:r>
+      <w:proofErr w:type="gramEnd"/>
+      <w:r>
+        <w:rPr>
+          <w:rFonts w:hint="eastAsia"/>
+        </w:rPr>
+        <w:t xml:space="preserve"> spheres intersecting this hit point, one on each side of the sphere object.</w:t>
       </w:r>
       <w:r>
         <w:rPr>
@@ -2040,6 +2242,7 @@
       <w:r>
         <w:t> (</w:t>
       </w:r>
+      <w:proofErr w:type="spellStart"/>
       <w:r>
         <w:rPr>
           <w:b/>
@@ -2057,6 +2260,7 @@
         </w:rPr>
         <w:t>n</w:t>
       </w:r>
+      <w:proofErr w:type="spellEnd"/>
       <w:r>
         <w:t xml:space="preserve">) and the </w:t>
       </w:r>
@@ -2228,7 +2432,21 @@
         <w:rPr>
           <w:rFonts w:hint="eastAsia"/>
         </w:rPr>
-        <w:t>Using Lambertian distribution over the selection of randomly dispersed rays results in two improvements:</w:t>
+        <w:t xml:space="preserve">Using Lambertian distribution over the selection of randomly dispersed </w:t>
+      </w:r>
+      <w:proofErr w:type="gramStart"/>
+      <w:r>
+        <w:rPr>
+          <w:rFonts w:hint="eastAsia"/>
+        </w:rPr>
+        <w:t>rays</w:t>
+      </w:r>
+      <w:proofErr w:type="gramEnd"/>
+      <w:r>
+        <w:rPr>
+          <w:rFonts w:hint="eastAsia"/>
+        </w:rPr>
+        <w:t xml:space="preserve"> results in two improvements:</w:t>
       </w:r>
     </w:p>
     <w:p>
@@ -2352,7 +2570,21 @@
         <w:rPr>
           <w:rFonts w:hint="eastAsia"/>
         </w:rPr>
-        <w:t xml:space="preserve"> in real life, it would be pretty bright. We will see the brightness gamut for the diffuse material by adjusting the reflectance of ray_color from 0.5 to 0.1</w:t>
+        <w:t xml:space="preserve"> in real life, it would be pretty bright. We will see the brightness gamut for the diffuse material by adjusting the reflectance of </w:t>
+      </w:r>
+      <w:proofErr w:type="spellStart"/>
+      <w:r>
+        <w:rPr>
+          <w:rFonts w:hint="eastAsia"/>
+        </w:rPr>
+        <w:t>ray_color</w:t>
+      </w:r>
+      <w:proofErr w:type="spellEnd"/>
+      <w:r>
+        <w:rPr>
+          <w:rFonts w:hint="eastAsia"/>
+        </w:rPr>
+        <w:t xml:space="preserve"> from 0.5 to 0.1</w:t>
       </w:r>
     </w:p>
     <w:p>
@@ -2444,7 +2676,15 @@
         <w:t xml:space="preserve"> because</w:t>
       </w:r>
       <w:r>
-        <w:t xml:space="preserve"> almost all computer programs assume that an image is “gamma corrected” before being written into an image file. This means that the 0 to 1 values have some transform applied before being stored as a byte. Images with data that are written without being transformed are said to be in </w:t>
+        <w:t xml:space="preserve"> almost all computer programs assume that an image is “gamma corrected” before being written into an image file. This means that the 0 to 1 </w:t>
+      </w:r>
+      <w:proofErr w:type="gramStart"/>
+      <w:r>
+        <w:t>values</w:t>
+      </w:r>
+      <w:proofErr w:type="gramEnd"/>
+      <w:r>
+        <w:t xml:space="preserve"> have some transform applied before being stored as a byte. Images with data that are written without being transformed are said to be in </w:t>
       </w:r>
       <w:r>
         <w:rPr>
@@ -2495,6 +2735,7 @@
         </w:rPr>
         <w:t xml:space="preserve"> (</w:t>
       </w:r>
+      <w:proofErr w:type="spellStart"/>
       <w:r>
         <w:rPr>
           <w:rFonts w:hAnsiTheme="minorEastAsia" w:hint="eastAsia"/>
@@ -2503,6 +2744,7 @@
         </w:rPr>
         <w:t>γ</w:t>
       </w:r>
+      <w:proofErr w:type="spellEnd"/>
       <w:r>
         <w:rPr>
           <w:rFonts w:hint="eastAsia"/>
@@ -2596,9 +2838,11 @@
         </w:rPr>
         <w:t xml:space="preserve"> </w:t>
       </w:r>
+      <w:proofErr w:type="spellStart"/>
       <w:r>
         <w:t>cr</w:t>
       </w:r>
+      <w:proofErr w:type="spellEnd"/>
       <w:r>
         <w:rPr>
           <w:rFonts w:hint="eastAsia"/>
@@ -2705,6 +2949,9 @@
           <w:ilvl w:val="0"/>
           <w:numId w:val="4"/>
         </w:numPr>
+        <w:rPr>
+          <w:rFonts w:hint="eastAsia"/>
+        </w:rPr>
       </w:pPr>
       <w:r>
         <w:rPr>
@@ -2732,6 +2979,88 @@
       </w:r>
       <w:r>
         <w:t>.</w:t>
+      </w:r>
+    </w:p>
+    <w:p>
+      <w:pPr>
+        <w:pStyle w:val="2"/>
+      </w:pPr>
+      <w:r>
+        <w:rPr>
+          <w:rFonts w:hint="eastAsia"/>
+        </w:rPr>
+        <w:lastRenderedPageBreak/>
+        <w:t>10.</w:t>
+      </w:r>
+      <w:r>
+        <w:rPr>
+          <w:rFonts w:hint="eastAsia"/>
+        </w:rPr>
+        <w:t>2</w:t>
+      </w:r>
+      <w:r>
+        <w:rPr>
+          <w:rFonts w:hint="eastAsia"/>
+        </w:rPr>
+        <w:t xml:space="preserve"> </w:t>
+      </w:r>
+      <w:r>
+        <w:t>A Data Structure to Describe Ray-Object Intersections</w:t>
+      </w:r>
+    </w:p>
+    <w:p>
+      <w:pPr>
+        <w:rPr>
+          <w:rFonts w:hint="eastAsia"/>
+        </w:rPr>
+      </w:pPr>
+      <w:proofErr w:type="spellStart"/>
+      <w:r>
+        <w:t>hit_record</w:t>
+      </w:r>
+      <w:proofErr w:type="spellEnd"/>
+      <w:r>
+        <w:t> is just a way to stuff a bunch of arguments into a class so we can send them as a group. When a ray hits a surface (a particular sphere for example), the material pointer in the </w:t>
+      </w:r>
+      <w:proofErr w:type="spellStart"/>
+      <w:r>
+        <w:t>hit_record</w:t>
+      </w:r>
+      <w:proofErr w:type="spellEnd"/>
+      <w:r>
+        <w:t> will be set to point at the material pointer the sphere was given when it was set up in </w:t>
+      </w:r>
+      <w:proofErr w:type="gramStart"/>
+      <w:r>
+        <w:t>main(</w:t>
+      </w:r>
+      <w:proofErr w:type="gramEnd"/>
+      <w:r>
+        <w:t>) when we start. When the </w:t>
+      </w:r>
+      <w:proofErr w:type="spellStart"/>
+      <w:r>
+        <w:t>ray_</w:t>
+      </w:r>
+      <w:proofErr w:type="gramStart"/>
+      <w:r>
+        <w:t>color</w:t>
+      </w:r>
+      <w:proofErr w:type="spellEnd"/>
+      <w:r>
+        <w:t>(</w:t>
+      </w:r>
+      <w:proofErr w:type="gramEnd"/>
+      <w:r>
+        <w:t>) routine gets the </w:t>
+      </w:r>
+      <w:proofErr w:type="spellStart"/>
+      <w:r>
+        <w:t>hit_record</w:t>
+      </w:r>
+      <w:proofErr w:type="spellEnd"/>
+      <w:r>
+        <w:t> it can call member functions of the material pointer to find out what ray, if any, is scattered.</w:t>
       </w:r>
     </w:p>
     <w:p/>
@@ -2750,7 +3079,7 @@
         <w:rPr>
           <w:rFonts w:hint="eastAsia"/>
         </w:rPr>
-        <w:t>2</w:t>
+        <w:t>3</w:t>
       </w:r>
       <w:r>
         <w:rPr>
@@ -2759,20 +3088,85 @@
         <w:t xml:space="preserve"> </w:t>
       </w:r>
       <w:r>
-        <w:t>A Data Structure to Describe Ray-Object Intersections</w:t>
-      </w:r>
-    </w:p>
-    <w:p>
-      <w:pPr>
-        <w:rPr>
-          <w:rFonts w:hint="eastAsia"/>
-        </w:rPr>
-      </w:pPr>
-      <w:r>
-        <w:t>hit_record is just a way to stuff a bunch of arguments into a class so we can send them as a group. When a ray hits a surface (a particular sphere for example), the material pointer in the hit_record will be set to point at the material pointer the sphere was given when it was set up in main() when we start. When the ray_color() routine gets the hit_record it can call member functions of the material pointer to find out what ray, if any, is scattered.</w:t>
+        <w:t>Modeling Light Scatter and Reflectance</w:t>
+      </w:r>
+    </w:p>
+    <w:p>
+      <w:r>
+        <w:rPr>
+          <w:i/>
+          <w:iCs/>
+        </w:rPr>
+        <w:t>albedo</w:t>
+      </w:r>
+      <w:r>
+        <w:t> (Latin for “whiteness”)</w:t>
+      </w:r>
+      <w:r>
+        <w:rPr>
+          <w:rFonts w:hint="eastAsia"/>
+        </w:rPr>
+        <w:t xml:space="preserve"> </w:t>
+      </w:r>
+      <w:r>
+        <w:t>is the measure of a surface's ability to reflect sunlight, ranging from 0 (no reflection) to 1 (100% reflection)</w:t>
+      </w:r>
+      <w:r>
+        <w:rPr>
+          <w:rFonts w:hint="eastAsia"/>
+        </w:rPr>
+        <w:t>, i.e., fractional reflectance.</w:t>
+      </w:r>
+    </w:p>
+    <w:p>
+      <w:pPr>
+        <w:rPr>
+          <w:rFonts w:hint="eastAsia"/>
+        </w:rPr>
+      </w:pPr>
+      <w:r>
+        <w:t>Albedo varies with material color and incident viewing direction (direction of incoming ray).</w:t>
+      </w:r>
+    </w:p>
+    <w:p>
+      <w:r>
+        <w:t>Lambertian (diffuse) reflectance can either always scatter and attenuate light according to its reflectance </w:t>
+      </w:r>
+      <w:r>
+        <w:rPr>
+          <w:i/>
+          <w:iCs/>
+        </w:rPr>
+        <w:t>R</w:t>
+      </w:r>
+      <w:r>
+        <w:t>, or it can sometimes scatter (with probability 1</w:t>
+      </w:r>
+      <w:r>
+        <w:rPr>
+          <w:rFonts w:ascii="Cambria Math" w:hAnsi="Cambria Math" w:cs="Cambria Math"/>
+        </w:rPr>
+        <w:t>−</w:t>
+      </w:r>
+      <w:r>
+        <w:rPr>
+          <w:i/>
+          <w:iCs/>
+        </w:rPr>
+        <w:t>R</w:t>
+      </w:r>
+      <w:r>
+        <w:t>) with no attenuation (where a ray that isn't scattered is just absorbed into the material). It could also be a mixture of both those strategies. We will choose to always scatter, so implementing Lambertian materials becomes a simple task</w:t>
       </w:r>
     </w:p>
     <w:p/>
+    <w:p>
+      <w:pPr>
+        <w:rPr>
+          <w:rFonts w:hint="eastAsia"/>
+        </w:rPr>
+      </w:pPr>
+    </w:p>
     <w:p/>
     <w:p/>
     <w:sectPr>

</xml_diff>

<commit_message>
Added notes and vec3 reflect()
</commit_message>
<xml_diff>
--- a/Notes.docx
+++ b/Notes.docx
@@ -2949,9 +2949,6 @@
           <w:ilvl w:val="0"/>
           <w:numId w:val="4"/>
         </w:numPr>
-        <w:rPr>
-          <w:rFonts w:hint="eastAsia"/>
-        </w:rPr>
       </w:pPr>
       <w:r>
         <w:rPr>
@@ -2990,30 +2987,13 @@
           <w:rFonts w:hint="eastAsia"/>
         </w:rPr>
         <w:lastRenderedPageBreak/>
-        <w:t>10.</w:t>
-      </w:r>
-      <w:r>
-        <w:rPr>
-          <w:rFonts w:hint="eastAsia"/>
-        </w:rPr>
-        <w:t>2</w:t>
-      </w:r>
-      <w:r>
-        <w:rPr>
-          <w:rFonts w:hint="eastAsia"/>
-        </w:rPr>
-        <w:t xml:space="preserve"> </w:t>
+        <w:t xml:space="preserve">10.2 </w:t>
       </w:r>
       <w:r>
         <w:t>A Data Structure to Describe Ray-Object Intersections</w:t>
       </w:r>
     </w:p>
     <w:p>
-      <w:pPr>
-        <w:rPr>
-          <w:rFonts w:hint="eastAsia"/>
-        </w:rPr>
-      </w:pPr>
       <w:proofErr w:type="spellStart"/>
       <w:r>
         <w:t>hit_record</w:t>
@@ -3073,19 +3053,7 @@
         <w:rPr>
           <w:rFonts w:hint="eastAsia"/>
         </w:rPr>
-        <w:t>10.</w:t>
-      </w:r>
-      <w:r>
-        <w:rPr>
-          <w:rFonts w:hint="eastAsia"/>
-        </w:rPr>
-        <w:t>3</w:t>
-      </w:r>
-      <w:r>
-        <w:rPr>
-          <w:rFonts w:hint="eastAsia"/>
-        </w:rPr>
-        <w:t xml:space="preserve"> </w:t>
+        <w:t xml:space="preserve">10.3 </w:t>
       </w:r>
       <w:r>
         <w:t>Modeling Light Scatter and Reflectance</w:t>
@@ -3119,11 +3087,6 @@
       </w:r>
     </w:p>
     <w:p>
-      <w:pPr>
-        <w:rPr>
-          <w:rFonts w:hint="eastAsia"/>
-        </w:rPr>
-      </w:pPr>
       <w:r>
         <w:t>Albedo varies with material color and incident viewing direction (direction of incoming ray).</w:t>
       </w:r>
@@ -3160,12 +3123,259 @@
       </w:r>
     </w:p>
     <w:p/>
-    <w:p>
-      <w:pPr>
-        <w:rPr>
-          <w:rFonts w:hint="eastAsia"/>
-        </w:rPr>
-      </w:pPr>
+    <w:p/>
+    <w:p>
+      <w:pPr>
+        <w:pStyle w:val="2"/>
+      </w:pPr>
+      <w:r>
+        <w:rPr>
+          <w:rFonts w:hint="eastAsia"/>
+        </w:rPr>
+        <w:t>10.</w:t>
+      </w:r>
+      <w:r>
+        <w:rPr>
+          <w:rFonts w:hint="eastAsia"/>
+        </w:rPr>
+        <w:t>4</w:t>
+      </w:r>
+      <w:r>
+        <w:rPr>
+          <w:rFonts w:hint="eastAsia"/>
+        </w:rPr>
+        <w:t xml:space="preserve"> </w:t>
+      </w:r>
+      <w:r>
+        <w:t>Mirrored Light Reflection</w:t>
+      </w:r>
+    </w:p>
+    <w:p>
+      <w:r>
+        <w:rPr>
+          <w:rFonts w:hint="eastAsia"/>
+        </w:rPr>
+        <w:t>Polished metals and metal mirrors will not reflect rays randomly</w:t>
+      </w:r>
+    </w:p>
+    <w:p>
+      <w:pPr>
+        <w:jc w:val="center"/>
+        <w:rPr>
+          <w:rFonts w:hint="eastAsia"/>
+        </w:rPr>
+      </w:pPr>
+      <w:r>
+        <w:rPr>
+          <w:noProof/>
+        </w:rPr>
+        <w:drawing>
+          <wp:inline distT="0" distB="0" distL="0" distR="0" wp14:anchorId="097DE91A" wp14:editId="4115F092">
+            <wp:extent cx="2597785" cy="1983957"/>
+            <wp:effectExtent l="0" t="0" r="0" b="0"/>
+            <wp:docPr id="1593445500" name="그림 1"/>
+            <wp:cNvGraphicFramePr>
+              <a:graphicFrameLocks xmlns:a="http://schemas.openxmlformats.org/drawingml/2006/main" noChangeAspect="1"/>
+            </wp:cNvGraphicFramePr>
+            <a:graphic xmlns:a="http://schemas.openxmlformats.org/drawingml/2006/main">
+              <a:graphicData uri="http://schemas.openxmlformats.org/drawingml/2006/picture">
+                <pic:pic xmlns:pic="http://schemas.openxmlformats.org/drawingml/2006/picture">
+                  <pic:nvPicPr>
+                    <pic:cNvPr id="0" name="Picture 1"/>
+                    <pic:cNvPicPr>
+                      <a:picLocks noChangeAspect="1" noChangeArrowheads="1"/>
+                    </pic:cNvPicPr>
+                  </pic:nvPicPr>
+                  <pic:blipFill>
+                    <a:blip r:embed="rId23" cstate="print">
+                      <a:extLst>
+                        <a:ext uri="{28A0092B-C50C-407E-A947-70E740481C1C}">
+                          <a14:useLocalDpi xmlns:a14="http://schemas.microsoft.com/office/drawing/2010/main" val="0"/>
+                        </a:ext>
+                      </a:extLst>
+                    </a:blip>
+                    <a:srcRect/>
+                    <a:stretch>
+                      <a:fillRect/>
+                    </a:stretch>
+                  </pic:blipFill>
+                  <pic:spPr bwMode="auto">
+                    <a:xfrm>
+                      <a:off x="0" y="0"/>
+                      <a:ext cx="2604576" cy="1989144"/>
+                    </a:xfrm>
+                    <a:prstGeom prst="rect">
+                      <a:avLst/>
+                    </a:prstGeom>
+                    <a:noFill/>
+                    <a:ln>
+                      <a:noFill/>
+                    </a:ln>
+                  </pic:spPr>
+                </pic:pic>
+              </a:graphicData>
+            </a:graphic>
+          </wp:inline>
+        </w:drawing>
+      </w:r>
+    </w:p>
+    <w:p>
+      <w:pPr>
+        <w:rPr>
+          <w:rFonts w:hint="eastAsia"/>
+        </w:rPr>
+      </w:pPr>
+      <w:r>
+        <w:rPr>
+          <w:rFonts w:hint="eastAsia"/>
+        </w:rPr>
+        <w:t xml:space="preserve">The reflected red ray is </w:t>
+      </w:r>
+      <w:r>
+        <w:rPr>
+          <w:rFonts w:hint="eastAsia"/>
+          <w:b/>
+          <w:bCs/>
+        </w:rPr>
+        <w:t>v + 2b</w:t>
+      </w:r>
+      <w:r>
+        <w:rPr>
+          <w:rFonts w:hint="eastAsia"/>
+        </w:rPr>
+        <w:t xml:space="preserve">. </w:t>
+      </w:r>
+      <w:r>
+        <w:rPr>
+          <w:b/>
+          <w:bCs/>
+        </w:rPr>
+        <w:t>n</w:t>
+      </w:r>
+      <w:r>
+        <w:t xml:space="preserve"> is a unit vector, but </w:t>
+      </w:r>
+      <w:r>
+        <w:rPr>
+          <w:b/>
+          <w:bCs/>
+        </w:rPr>
+        <w:t>v</w:t>
+      </w:r>
+      <w:r>
+        <w:t xml:space="preserve"> may not be. To get </w:t>
+      </w:r>
+      <w:r>
+        <w:rPr>
+          <w:b/>
+          <w:bCs/>
+        </w:rPr>
+        <w:t>v</w:t>
+      </w:r>
+      <w:r>
+        <w:t xml:space="preserve">, we scale the normal vector by the length of the projection of </w:t>
+      </w:r>
+      <w:r>
+        <w:rPr>
+          <w:b/>
+          <w:bCs/>
+        </w:rPr>
+        <w:t>v</w:t>
+      </w:r>
+      <w:r>
+        <w:t xml:space="preserve"> onto </w:t>
+      </w:r>
+      <w:r>
+        <w:rPr>
+          <w:b/>
+          <w:bCs/>
+        </w:rPr>
+        <w:t>n</w:t>
+      </w:r>
+      <w:r>
+        <w:t xml:space="preserve">, given by </w:t>
+      </w:r>
+      <w:r>
+        <w:rPr>
+          <w:b/>
+          <w:bCs/>
+        </w:rPr>
+        <w:t>v</w:t>
+      </w:r>
+      <w:r>
+        <w:rPr>
+          <w:rFonts w:hint="eastAsia"/>
+          <w:b/>
+          <w:bCs/>
+        </w:rPr>
+        <w:t xml:space="preserve"> </w:t>
+      </w:r>
+      <w:r>
+        <w:rPr>
+          <w:rFonts w:ascii="Cambria Math" w:hAnsi="Cambria Math" w:cs="Cambria Math"/>
+          <w:b/>
+          <w:bCs/>
+        </w:rPr>
+        <w:t>⋅</w:t>
+      </w:r>
+      <w:r>
+        <w:rPr>
+          <w:rFonts w:ascii="Cambria Math" w:hAnsi="Cambria Math" w:cs="Cambria Math" w:hint="eastAsia"/>
+          <w:b/>
+          <w:bCs/>
+        </w:rPr>
+        <w:t xml:space="preserve"> </w:t>
+      </w:r>
+      <w:r>
+        <w:rPr>
+          <w:b/>
+          <w:bCs/>
+        </w:rPr>
+        <w:t>n</w:t>
+      </w:r>
+      <w:r>
+        <w:t xml:space="preserve">. If </w:t>
+      </w:r>
+      <w:r>
+        <w:rPr>
+          <w:b/>
+          <w:bCs/>
+        </w:rPr>
+        <w:t>n</w:t>
+      </w:r>
+      <w:r>
+        <w:t xml:space="preserve"> were not a unit vector, we'd also need to divide this dot product by length of </w:t>
+      </w:r>
+      <w:r>
+        <w:rPr>
+          <w:b/>
+          <w:bCs/>
+        </w:rPr>
+        <w:t>n</w:t>
+      </w:r>
+      <w:r>
+        <w:t xml:space="preserve">. Lastly, because </w:t>
+      </w:r>
+      <w:r>
+        <w:rPr>
+          <w:b/>
+          <w:bCs/>
+        </w:rPr>
+        <w:t>v</w:t>
+      </w:r>
+      <w:r>
+        <w:t xml:space="preserve"> points into the surface, and we want </w:t>
+      </w:r>
+      <w:r>
+        <w:rPr>
+          <w:b/>
+          <w:bCs/>
+        </w:rPr>
+        <w:t>b</w:t>
+      </w:r>
+      <w:r>
+        <w:t xml:space="preserve"> to point out of the surface, we need to negate this projection length.</w:t>
+      </w:r>
     </w:p>
     <w:p/>
     <w:p/>
@@ -4303,6 +4513,7 @@
   <w:style w:type="character" w:default="1" w:styleId="a0">
     <w:name w:val="Default Paragraph Font"/>
     <w:uiPriority w:val="1"/>
+    <w:semiHidden/>
     <w:unhideWhenUsed/>
   </w:style>
   <w:style w:type="table" w:default="1" w:styleId="a1">

</xml_diff>

<commit_message>
Added notes on dielectrics
</commit_message>
<xml_diff>
--- a/Notes.docx
+++ b/Notes.docx
@@ -216,61 +216,15 @@
       <w:r>
         <w:tab/>
       </w:r>
-      <w:proofErr w:type="spellStart"/>
-      <w:r>
-        <w:rPr>
-          <w:rFonts w:hint="eastAsia"/>
-        </w:rPr>
-        <w:t>image_height</w:t>
-      </w:r>
-      <w:proofErr w:type="spellEnd"/>
-      <w:r>
-        <w:rPr>
-          <w:rFonts w:hint="eastAsia"/>
-        </w:rPr>
-        <w:t xml:space="preserve"> = (</w:t>
-      </w:r>
-      <w:proofErr w:type="spellStart"/>
-      <w:r>
-        <w:rPr>
-          <w:rFonts w:hint="eastAsia"/>
-        </w:rPr>
-        <w:t>image_height</w:t>
-      </w:r>
-      <w:proofErr w:type="spellEnd"/>
-      <w:r>
-        <w:rPr>
-          <w:rFonts w:hint="eastAsia"/>
-        </w:rPr>
-        <w:t xml:space="preserve"> &lt; 1</w:t>
-      </w:r>
-      <w:proofErr w:type="gramStart"/>
-      <w:r>
-        <w:rPr>
-          <w:rFonts w:hint="eastAsia"/>
-        </w:rPr>
-        <w:t xml:space="preserve">) </w:t>
-      </w:r>
-      <w:r>
-        <w:t>?</w:t>
-      </w:r>
-      <w:proofErr w:type="gramEnd"/>
-      <w:r>
-        <w:t xml:space="preserve"> </w:t>
-      </w:r>
-      <w:proofErr w:type="gramStart"/>
-      <w:r>
-        <w:t>1 :</w:t>
-      </w:r>
-      <w:proofErr w:type="gramEnd"/>
-      <w:r>
-        <w:t xml:space="preserve"> </w:t>
-      </w:r>
-      <w:proofErr w:type="spellStart"/>
-      <w:r>
-        <w:t>image_height</w:t>
-      </w:r>
-      <w:proofErr w:type="spellEnd"/>
+      <w:r>
+        <w:rPr>
+          <w:rFonts w:hint="eastAsia"/>
+        </w:rPr>
+        <w:t xml:space="preserve">image_height = (image_height &lt; 1) </w:t>
+      </w:r>
+      <w:r>
+        <w:t>? 1 : image_height</w:t>
+      </w:r>
     </w:p>
     <w:p>
       <w:pPr>
@@ -281,36 +235,11 @@
           <w:b/>
           <w:bCs/>
         </w:rPr>
-        <w:t xml:space="preserve">? </w:t>
-      </w:r>
-      <w:proofErr w:type="gramStart"/>
-      <w:r>
-        <w:rPr>
-          <w:b/>
-          <w:bCs/>
-        </w:rPr>
-        <w:t>1 :</w:t>
-      </w:r>
-      <w:proofErr w:type="gramEnd"/>
-      <w:r>
-        <w:rPr>
-          <w:b/>
-          <w:bCs/>
-        </w:rPr>
+        <w:t>? 1 : image_height</w:t>
+      </w:r>
+      <w:r>
         <w:t xml:space="preserve"> </w:t>
       </w:r>
-      <w:proofErr w:type="spellStart"/>
-      <w:r>
-        <w:rPr>
-          <w:b/>
-          <w:bCs/>
-        </w:rPr>
-        <w:t>image_height</w:t>
-      </w:r>
-      <w:proofErr w:type="spellEnd"/>
-      <w:r>
-        <w:t xml:space="preserve"> </w:t>
-      </w:r>
       <w:r>
         <w:rPr>
           <w:rFonts w:hint="eastAsia"/>
@@ -359,13 +288,8 @@
         <w:t>F</w:t>
       </w:r>
       <w:r>
-        <w:t xml:space="preserve">alse, use </w:t>
-      </w:r>
-      <w:proofErr w:type="spellStart"/>
-      <w:r>
-        <w:t>image_height</w:t>
-      </w:r>
-      <w:proofErr w:type="spellEnd"/>
+        <w:t>alse, use image_height</w:t>
+      </w:r>
     </w:p>
     <w:p>
       <w:r>
@@ -543,13 +467,8 @@
         </w:rPr>
         <w:t xml:space="preserve"> a standard equation defined by </w:t>
       </w:r>
-      <w:proofErr w:type="gramStart"/>
-      <w:r>
-        <w:t>lerp(</w:t>
-      </w:r>
-      <w:proofErr w:type="gramEnd"/>
-      <w:r>
-        <w:t>a, b, t) = a * (1 - t) + b * t</w:t>
+      <w:r>
+        <w:t>lerp(a, b, t) = a * (1 - t) + b * t</w:t>
       </w:r>
     </w:p>
     <w:p>
@@ -669,21 +588,7 @@
         <w:rPr>
           <w:rFonts w:hint="eastAsia"/>
         </w:rPr>
-        <w:t>(C-</w:t>
-      </w:r>
-      <w:proofErr w:type="gramStart"/>
-      <w:r>
-        <w:rPr>
-          <w:rFonts w:hint="eastAsia"/>
-        </w:rPr>
-        <w:t>P)*</w:t>
-      </w:r>
-      <w:proofErr w:type="gramEnd"/>
-      <w:r>
-        <w:rPr>
-          <w:rFonts w:hint="eastAsia"/>
-        </w:rPr>
-        <w:t>(C-P) is the dot product of the length of the origin-to-center vector. For the equation of that value being equal to r</w:t>
+        <w:t>(C-P)*(C-P) is the dot product of the length of the origin-to-center vector. For the equation of that value being equal to r</w:t>
       </w:r>
       <w:r>
         <w:rPr>
@@ -696,21 +601,10 @@
         <w:rPr>
           <w:rFonts w:hint="eastAsia"/>
         </w:rPr>
-        <w:t xml:space="preserve">, imagine a sphere of radius r migrated (C-P) distance away from origin (camera lens). The ray, if allowed to permeate through, will intersect </w:t>
-      </w:r>
-      <w:proofErr w:type="gramStart"/>
-      <w:r>
-        <w:rPr>
-          <w:rFonts w:hint="eastAsia"/>
-        </w:rPr>
-        <w:t xml:space="preserve">these </w:t>
-      </w:r>
-      <w:r>
-        <w:t>selection</w:t>
-      </w:r>
-      <w:proofErr w:type="gramEnd"/>
-      <w:r>
-        <w:t xml:space="preserve"> o</w:t>
+        <w:t xml:space="preserve">, imagine a sphere of radius r migrated (C-P) distance away from origin (camera lens). The ray, if allowed to permeate through, will intersect these </w:t>
+      </w:r>
+      <w:r>
+        <w:t>selection o</w:t>
       </w:r>
       <w:r>
         <w:rPr>
@@ -888,16 +782,8 @@
         <w:rPr>
           <w:rFonts w:hint="eastAsia"/>
         </w:rPr>
-        <w:t xml:space="preserve">6.1 Shading with Surface </w:t>
-      </w:r>
-      <w:proofErr w:type="spellStart"/>
-      <w:r>
-        <w:rPr>
-          <w:rFonts w:hint="eastAsia"/>
-        </w:rPr>
-        <w:t>Normals</w:t>
-      </w:r>
-      <w:proofErr w:type="spellEnd"/>
+        <w:t>6.1 Shading with Surface Normals</w:t>
+      </w:r>
     </w:p>
     <w:p>
       <w:r>
@@ -1009,43 +895,7 @@
           <w:rFonts w:hint="eastAsia"/>
         </w:rPr>
         <w:lastRenderedPageBreak/>
-        <w:t>This means that the directional vector (</w:t>
-      </w:r>
-      <w:proofErr w:type="spellStart"/>
-      <w:proofErr w:type="gramStart"/>
-      <w:r>
-        <w:rPr>
-          <w:rFonts w:hint="eastAsia"/>
-        </w:rPr>
-        <w:t>x,y</w:t>
-      </w:r>
-      <w:proofErr w:type="gramEnd"/>
-      <w:r>
-        <w:rPr>
-          <w:rFonts w:hint="eastAsia"/>
-        </w:rPr>
-        <w:t>,z</w:t>
-      </w:r>
-      <w:proofErr w:type="spellEnd"/>
-      <w:r>
-        <w:rPr>
-          <w:rFonts w:hint="eastAsia"/>
-        </w:rPr>
-        <w:t>) of the unit surface normal is mapped to (</w:t>
-      </w:r>
-      <w:proofErr w:type="gramStart"/>
-      <w:r>
-        <w:rPr>
-          <w:rFonts w:hint="eastAsia"/>
-        </w:rPr>
-        <w:t>R,G</w:t>
-      </w:r>
-      <w:proofErr w:type="gramEnd"/>
-      <w:r>
-        <w:rPr>
-          <w:rFonts w:hint="eastAsia"/>
-        </w:rPr>
-        <w:t>,B)</w:t>
+        <w:t>This means that the directional vector (x,y,z) of the unit surface normal is mapped to (R,G,B)</w:t>
       </w:r>
     </w:p>
     <w:p>
@@ -1286,15 +1136,7 @@
         <w:t xml:space="preserve"> </w:t>
       </w:r>
       <w:r>
-        <w:t xml:space="preserve">Moving Camera Code </w:t>
-      </w:r>
-      <w:proofErr w:type="gramStart"/>
-      <w:r>
-        <w:t>Into</w:t>
-      </w:r>
-      <w:proofErr w:type="gramEnd"/>
-      <w:r>
-        <w:t xml:space="preserve"> Its Own Class</w:t>
+        <w:t>Moving Camera Code Into Its Own Class</w:t>
       </w:r>
     </w:p>
     <w:p>
@@ -1304,11 +1146,9 @@
         </w:rPr>
         <w:t xml:space="preserve">After creating </w:t>
       </w:r>
-      <w:proofErr w:type="spellStart"/>
       <w:r>
         <w:t>rtweekend.h</w:t>
       </w:r>
-      <w:proofErr w:type="spellEnd"/>
       <w:r>
         <w:rPr>
           <w:rFonts w:hint="eastAsia"/>
@@ -1530,21 +1370,7 @@
         <w:rPr>
           <w:rFonts w:hint="eastAsia"/>
         </w:rPr>
-        <w:t xml:space="preserve">. At the current state, if we were to render </w:t>
-      </w:r>
-      <w:proofErr w:type="gramStart"/>
-      <w:r>
-        <w:rPr>
-          <w:rFonts w:hint="eastAsia"/>
-        </w:rPr>
-        <w:t>a</w:t>
-      </w:r>
-      <w:proofErr w:type="gramEnd"/>
-      <w:r>
-        <w:rPr>
-          <w:rFonts w:hint="eastAsia"/>
-        </w:rPr>
-        <w:t xml:space="preserve"> 8 x 8 checkerboard far away such that it</w:t>
+        <w:t>. At the current state, if we were to render a 8 x 8 checkerboard far away such that it</w:t>
       </w:r>
       <w:r>
         <w:t>’</w:t>
@@ -1613,21 +1439,7 @@
         <w:rPr>
           <w:rFonts w:hint="eastAsia"/>
         </w:rPr>
-        <w:t xml:space="preserve">ll sample the </w:t>
-      </w:r>
-      <w:proofErr w:type="gramStart"/>
-      <w:r>
-        <w:rPr>
-          <w:rFonts w:hint="eastAsia"/>
-        </w:rPr>
-        <w:t>four square</w:t>
-      </w:r>
-      <w:proofErr w:type="gramEnd"/>
-      <w:r>
-        <w:rPr>
-          <w:rFonts w:hint="eastAsia"/>
-        </w:rPr>
-        <w:t xml:space="preserve"> regions of a pixel that extends halfway into each of the four neighboring pixels </w:t>
+        <w:t xml:space="preserve">ll sample the four square regions of a pixel that extends halfway into each of the four neighboring pixels </w:t>
       </w:r>
       <w:r>
         <w:t>–</w:t>
@@ -2208,21 +2020,7 @@
         <w:rPr>
           <w:rFonts w:hint="eastAsia"/>
         </w:rPr>
-        <w:t xml:space="preserve">Imagine </w:t>
-      </w:r>
-      <w:proofErr w:type="gramStart"/>
-      <w:r>
-        <w:rPr>
-          <w:rFonts w:hint="eastAsia"/>
-        </w:rPr>
-        <w:t>two unit</w:t>
-      </w:r>
-      <w:proofErr w:type="gramEnd"/>
-      <w:r>
-        <w:rPr>
-          <w:rFonts w:hint="eastAsia"/>
-        </w:rPr>
-        <w:t xml:space="preserve"> spheres intersecting this hit point, one on each side of the sphere object.</w:t>
+        <w:t>Imagine two unit spheres intersecting this hit point, one on each side of the sphere object.</w:t>
       </w:r>
       <w:r>
         <w:rPr>
@@ -2242,7 +2040,6 @@
       <w:r>
         <w:t> (</w:t>
       </w:r>
-      <w:proofErr w:type="spellStart"/>
       <w:r>
         <w:rPr>
           <w:b/>
@@ -2260,7 +2057,6 @@
         </w:rPr>
         <w:t>n</w:t>
       </w:r>
-      <w:proofErr w:type="spellEnd"/>
       <w:r>
         <w:t xml:space="preserve">) and the </w:t>
       </w:r>
@@ -2432,21 +2228,7 @@
         <w:rPr>
           <w:rFonts w:hint="eastAsia"/>
         </w:rPr>
-        <w:t xml:space="preserve">Using Lambertian distribution over the selection of randomly dispersed </w:t>
-      </w:r>
-      <w:proofErr w:type="gramStart"/>
-      <w:r>
-        <w:rPr>
-          <w:rFonts w:hint="eastAsia"/>
-        </w:rPr>
-        <w:t>rays</w:t>
-      </w:r>
-      <w:proofErr w:type="gramEnd"/>
-      <w:r>
-        <w:rPr>
-          <w:rFonts w:hint="eastAsia"/>
-        </w:rPr>
-        <w:t xml:space="preserve"> results in two improvements:</w:t>
+        <w:t>Using Lambertian distribution over the selection of randomly dispersed rays results in two improvements:</w:t>
       </w:r>
     </w:p>
     <w:p>
@@ -2570,21 +2352,7 @@
         <w:rPr>
           <w:rFonts w:hint="eastAsia"/>
         </w:rPr>
-        <w:t xml:space="preserve"> in real life, it would be pretty bright. We will see the brightness gamut for the diffuse material by adjusting the reflectance of </w:t>
-      </w:r>
-      <w:proofErr w:type="spellStart"/>
-      <w:r>
-        <w:rPr>
-          <w:rFonts w:hint="eastAsia"/>
-        </w:rPr>
-        <w:t>ray_color</w:t>
-      </w:r>
-      <w:proofErr w:type="spellEnd"/>
-      <w:r>
-        <w:rPr>
-          <w:rFonts w:hint="eastAsia"/>
-        </w:rPr>
-        <w:t xml:space="preserve"> from 0.5 to 0.1</w:t>
+        <w:t xml:space="preserve"> in real life, it would be pretty bright. We will see the brightness gamut for the diffuse material by adjusting the reflectance of ray_color from 0.5 to 0.1</w:t>
       </w:r>
     </w:p>
     <w:p>
@@ -2676,15 +2444,7 @@
         <w:t xml:space="preserve"> because</w:t>
       </w:r>
       <w:r>
-        <w:t xml:space="preserve"> almost all computer programs assume that an image is “gamma corrected” before being written into an image file. This means that the 0 to 1 </w:t>
-      </w:r>
-      <w:proofErr w:type="gramStart"/>
-      <w:r>
-        <w:t>values</w:t>
-      </w:r>
-      <w:proofErr w:type="gramEnd"/>
-      <w:r>
-        <w:t xml:space="preserve"> have some transform applied before being stored as a byte. Images with data that are written without being transformed are said to be in </w:t>
+        <w:t xml:space="preserve"> almost all computer programs assume that an image is “gamma corrected” before being written into an image file. This means that the 0 to 1 values have some transform applied before being stored as a byte. Images with data that are written without being transformed are said to be in </w:t>
       </w:r>
       <w:r>
         <w:rPr>
@@ -2735,7 +2495,6 @@
         </w:rPr>
         <w:t xml:space="preserve"> (</w:t>
       </w:r>
-      <w:proofErr w:type="spellStart"/>
       <w:r>
         <w:rPr>
           <w:rFonts w:hAnsiTheme="minorEastAsia" w:hint="eastAsia"/>
@@ -2744,7 +2503,6 @@
         </w:rPr>
         <w:t>γ</w:t>
       </w:r>
-      <w:proofErr w:type="spellEnd"/>
       <w:r>
         <w:rPr>
           <w:rFonts w:hint="eastAsia"/>
@@ -2838,11 +2596,9 @@
         </w:rPr>
         <w:t xml:space="preserve"> </w:t>
       </w:r>
-      <w:proofErr w:type="spellStart"/>
       <w:r>
         <w:t>cr</w:t>
       </w:r>
-      <w:proofErr w:type="spellEnd"/>
       <w:r>
         <w:rPr>
           <w:rFonts w:hint="eastAsia"/>
@@ -2994,53 +2750,8 @@
       </w:r>
     </w:p>
     <w:p>
-      <w:proofErr w:type="spellStart"/>
-      <w:r>
-        <w:t>hit_record</w:t>
-      </w:r>
-      <w:proofErr w:type="spellEnd"/>
-      <w:r>
-        <w:t> is just a way to stuff a bunch of arguments into a class so we can send them as a group. When a ray hits a surface (a particular sphere for example), the material pointer in the </w:t>
-      </w:r>
-      <w:proofErr w:type="spellStart"/>
-      <w:r>
-        <w:t>hit_record</w:t>
-      </w:r>
-      <w:proofErr w:type="spellEnd"/>
-      <w:r>
-        <w:t> will be set to point at the material pointer the sphere was given when it was set up in </w:t>
-      </w:r>
-      <w:proofErr w:type="gramStart"/>
-      <w:r>
-        <w:t>main(</w:t>
-      </w:r>
-      <w:proofErr w:type="gramEnd"/>
-      <w:r>
-        <w:t>) when we start. When the </w:t>
-      </w:r>
-      <w:proofErr w:type="spellStart"/>
-      <w:r>
-        <w:t>ray_</w:t>
-      </w:r>
-      <w:proofErr w:type="gramStart"/>
-      <w:r>
-        <w:t>color</w:t>
-      </w:r>
-      <w:proofErr w:type="spellEnd"/>
-      <w:r>
-        <w:t>(</w:t>
-      </w:r>
-      <w:proofErr w:type="gramEnd"/>
-      <w:r>
-        <w:t>) routine gets the </w:t>
-      </w:r>
-      <w:proofErr w:type="spellStart"/>
-      <w:r>
-        <w:t>hit_record</w:t>
-      </w:r>
-      <w:proofErr w:type="spellEnd"/>
-      <w:r>
-        <w:t> it can call member functions of the material pointer to find out what ray, if any, is scattered.</w:t>
+      <w:r>
+        <w:t>hit_record is just a way to stuff a bunch of arguments into a class so we can send them as a group. When a ray hits a surface (a particular sphere for example), the material pointer in the hit_record will be set to point at the material pointer the sphere was given when it was set up in main() when we start. When the ray_color() routine gets the hit_record it can call member functions of the material pointer to find out what ray, if any, is scattered.</w:t>
       </w:r>
     </w:p>
     <w:p/>
@@ -3362,27 +3073,12 @@
     <w:p>
       <w:pPr>
         <w:pStyle w:val="2"/>
-        <w:rPr>
-          <w:rFonts w:hint="eastAsia"/>
-        </w:rPr>
-      </w:pPr>
-      <w:r>
-        <w:rPr>
-          <w:rFonts w:hint="eastAsia"/>
-        </w:rPr>
-        <w:t>10.</w:t>
-      </w:r>
-      <w:r>
-        <w:rPr>
-          <w:rFonts w:hint="eastAsia"/>
-        </w:rPr>
-        <w:t>6</w:t>
-      </w:r>
-      <w:r>
-        <w:rPr>
-          <w:rFonts w:hint="eastAsia"/>
-        </w:rPr>
-        <w:t xml:space="preserve"> </w:t>
+      </w:pPr>
+      <w:r>
+        <w:rPr>
+          <w:rFonts w:hint="eastAsia"/>
+        </w:rPr>
+        <w:t xml:space="preserve">10.6 </w:t>
       </w:r>
       <w:r>
         <w:t>Fuzzy Reflection</w:t>
@@ -3451,20 +3147,12 @@
     <w:p>
       <w:pPr>
         <w:jc w:val="center"/>
-        <w:rPr>
-          <w:rFonts w:hint="eastAsia"/>
-        </w:rPr>
       </w:pPr>
       <w:r>
         <w:t>Generating fuzzed reflection rays</w:t>
       </w:r>
     </w:p>
     <w:p>
-      <w:pPr>
-        <w:rPr>
-          <w:rFonts w:hint="eastAsia"/>
-        </w:rPr>
-      </w:pPr>
       <w:r>
         <w:t>The bigger the fuzz sphere, the fuzzier the reflections will be. This suggests adding a fuzziness parameter that is just the radius of the sphere (so zero is no perturbation). The catch is that for big spheres or grazing rays, we may scatter below the surface. We can just have the surface absorb those.</w:t>
       </w:r>
@@ -3474,13 +3162,118 @@
         <w:t>Also note that in order for the fuzz sphere to make sense, it needs to be consistently scaled compared to the reflection vector, which can vary in length arbitrarily. To address this, we need to normalize the reflected ray.</w:t>
       </w:r>
     </w:p>
-    <w:p>
-      <w:pPr>
-        <w:rPr>
-          <w:rFonts w:hint="eastAsia"/>
-        </w:rPr>
-      </w:pPr>
-    </w:p>
+    <w:p/>
+    <w:p/>
+    <w:p>
+      <w:pPr>
+        <w:pStyle w:val="2"/>
+      </w:pPr>
+      <w:r>
+        <w:rPr>
+          <w:rFonts w:hint="eastAsia"/>
+        </w:rPr>
+        <w:t>11 Dielectrics</w:t>
+      </w:r>
+    </w:p>
+    <w:p>
+      <w:r>
+        <w:t>Clear materials such as water, glass, and diamond are dielectrics. When a light ray hits them, it splits into a reflected ray and a refracted (transmitted) ray. They will be handled by randomly choosing between reflection and refraction, only generating one scattered ray per interaction.</w:t>
+      </w:r>
+    </w:p>
+    <w:p>
+      <w:r>
+        <w:rPr>
+          <w:rFonts w:hint="eastAsia"/>
+        </w:rPr>
+        <w:t>A</w:t>
+      </w:r>
+      <w:r>
+        <w:t xml:space="preserve"> </w:t>
+      </w:r>
+      <w:r>
+        <w:rPr>
+          <w:i/>
+          <w:iCs/>
+        </w:rPr>
+        <w:t xml:space="preserve">reflected ray </w:t>
+      </w:r>
+      <w:r>
+        <w:t>hits a surface and then “bounces” off in a new direction.</w:t>
+      </w:r>
+    </w:p>
+    <w:p>
+      <w:r>
+        <w:t xml:space="preserve">A </w:t>
+      </w:r>
+      <w:r>
+        <w:rPr>
+          <w:i/>
+          <w:iCs/>
+        </w:rPr>
+        <w:t>refracted ray</w:t>
+      </w:r>
+      <w:r>
+        <w:t xml:space="preserve"> bends as it transitions from a material's surroundings into the material itself (as with glass or water).</w:t>
+      </w:r>
+    </w:p>
+    <w:p>
+      <w:r>
+        <w:rPr>
+          <w:i/>
+          <w:iCs/>
+        </w:rPr>
+        <w:t>Refractive index</w:t>
+      </w:r>
+      <w:r>
+        <w:t xml:space="preserve"> determines the amount that a refracted ray bends. This is generally a single value that describes how much light bends when entering a material from a vacuum. Glass has a refractive index of something like 1.5–1.7, diamond is around 2.4, and air has a small refractive index of 1.000293.</w:t>
+      </w:r>
+    </w:p>
+    <w:p>
+      <w:r>
+        <w:t xml:space="preserve">When a transparent material is embedded in a different transparent material, you can describe the refraction with a relative refraction index: the refractive index of the object's material divided by the </w:t>
+      </w:r>
+      <w:r>
+        <w:lastRenderedPageBreak/>
+        <w:t>refractive index of the surrounding material. For example, if you want to render a glass ball under water, then the glass ball would have an effective refractive index of 1.125. This is given by the refractive index of glass (1.5) divided by the refractive index of water (1.333).</w:t>
+      </w:r>
+    </w:p>
+    <w:p/>
+    <w:p/>
+    <w:p>
+      <w:pPr>
+        <w:pStyle w:val="2"/>
+        <w:rPr>
+          <w:rFonts w:hint="eastAsia"/>
+        </w:rPr>
+      </w:pPr>
+      <w:r>
+        <w:rPr>
+          <w:rFonts w:hint="eastAsia"/>
+        </w:rPr>
+        <w:t>11</w:t>
+      </w:r>
+      <w:r>
+        <w:rPr>
+          <w:rFonts w:hint="eastAsia"/>
+        </w:rPr>
+        <w:t>.1</w:t>
+      </w:r>
+      <w:r>
+        <w:rPr>
+          <w:rFonts w:hint="eastAsia"/>
+        </w:rPr>
+        <w:t xml:space="preserve"> </w:t>
+      </w:r>
+      <w:r>
+        <w:rPr>
+          <w:rFonts w:hint="eastAsia"/>
+        </w:rPr>
+        <w:t>Refraction</w:t>
+      </w:r>
+    </w:p>
+    <w:p/>
+    <w:p/>
+    <w:p/>
     <w:p>
       <w:pPr>
         <w:rPr>
@@ -4623,6 +4416,7 @@
   <w:style w:type="character" w:default="1" w:styleId="a0">
     <w:name w:val="Default Paragraph Font"/>
     <w:uiPriority w:val="1"/>
+    <w:semiHidden/>
     <w:unhideWhenUsed/>
   </w:style>
   <w:style w:type="table" w:default="1" w:styleId="a1">

</xml_diff>

<commit_message>
Added Snell's law notes
</commit_message>
<xml_diff>
--- a/Notes.docx
+++ b/Notes.docx
@@ -3242,21 +3242,18 @@
     <w:p>
       <w:pPr>
         <w:pStyle w:val="2"/>
-        <w:rPr>
-          <w:rFonts w:hint="eastAsia"/>
-        </w:rPr>
-      </w:pPr>
-      <w:r>
-        <w:rPr>
-          <w:rFonts w:hint="eastAsia"/>
-        </w:rPr>
-        <w:t>11</w:t>
-      </w:r>
-      <w:r>
-        <w:rPr>
-          <w:rFonts w:hint="eastAsia"/>
-        </w:rPr>
-        <w:t>.1</w:t>
+      </w:pPr>
+      <w:r>
+        <w:rPr>
+          <w:rFonts w:hint="eastAsia"/>
+        </w:rPr>
+        <w:t>11.</w:t>
+      </w:r>
+      <w:r>
+        <w:rPr>
+          <w:rFonts w:hint="eastAsia"/>
+        </w:rPr>
+        <w:t>2</w:t>
       </w:r>
       <w:r>
         <w:rPr>
@@ -3265,15 +3262,282 @@
         <w:t xml:space="preserve"> </w:t>
       </w:r>
       <w:r>
-        <w:rPr>
-          <w:rFonts w:hint="eastAsia"/>
-        </w:rPr>
-        <w:t>Refraction</w:t>
-      </w:r>
-    </w:p>
-    <w:p/>
-    <w:p/>
-    <w:p/>
+        <w:t>Snell's Law</w:t>
+      </w:r>
+    </w:p>
+    <w:p>
+      <w:r>
+        <w:rPr>
+          <w:rFonts w:hint="eastAsia"/>
+        </w:rPr>
+        <w:t>Refraction as described by Snell</w:t>
+      </w:r>
+      <w:r>
+        <w:t>’</w:t>
+      </w:r>
+      <w:r>
+        <w:rPr>
+          <w:rFonts w:hint="eastAsia"/>
+        </w:rPr>
+        <w:t>s law is:</w:t>
+      </w:r>
+    </w:p>
+    <w:p>
+      <w:pPr>
+        <w:jc w:val="center"/>
+        <w:rPr>
+          <w:rFonts w:hint="eastAsia"/>
+        </w:rPr>
+      </w:pPr>
+      <w:r>
+        <w:drawing>
+          <wp:inline distT="0" distB="0" distL="0" distR="0" wp14:anchorId="6C04BC67" wp14:editId="0CBCBD92">
+            <wp:extent cx="2085990" cy="495304"/>
+            <wp:effectExtent l="0" t="0" r="0" b="0"/>
+            <wp:docPr id="1666119163" name="그림 1"/>
+            <wp:cNvGraphicFramePr>
+              <a:graphicFrameLocks xmlns:a="http://schemas.openxmlformats.org/drawingml/2006/main" noChangeAspect="1"/>
+            </wp:cNvGraphicFramePr>
+            <a:graphic xmlns:a="http://schemas.openxmlformats.org/drawingml/2006/main">
+              <a:graphicData uri="http://schemas.openxmlformats.org/drawingml/2006/picture">
+                <pic:pic xmlns:pic="http://schemas.openxmlformats.org/drawingml/2006/picture">
+                  <pic:nvPicPr>
+                    <pic:cNvPr id="1666119163" name=""/>
+                    <pic:cNvPicPr/>
+                  </pic:nvPicPr>
+                  <pic:blipFill>
+                    <a:blip r:embed="rId25"/>
+                    <a:stretch>
+                      <a:fillRect/>
+                    </a:stretch>
+                  </pic:blipFill>
+                  <pic:spPr>
+                    <a:xfrm>
+                      <a:off x="0" y="0"/>
+                      <a:ext cx="2085990" cy="495304"/>
+                    </a:xfrm>
+                    <a:prstGeom prst="rect">
+                      <a:avLst/>
+                    </a:prstGeom>
+                  </pic:spPr>
+                </pic:pic>
+              </a:graphicData>
+            </a:graphic>
+          </wp:inline>
+        </w:drawing>
+      </w:r>
+    </w:p>
+    <w:p>
+      <w:pPr>
+        <w:rPr>
+          <w:rFonts w:hint="eastAsia"/>
+        </w:rPr>
+      </w:pPr>
+      <w:r>
+        <w:rPr>
+          <w:rFonts w:hint="eastAsia"/>
+        </w:rPr>
+        <w:t>w</w:t>
+      </w:r>
+      <w:r>
+        <w:t>here θ and θ</w:t>
+      </w:r>
+      <w:r>
+        <w:t>’</w:t>
+      </w:r>
+      <w:r>
+        <w:t xml:space="preserve"> are the angles from the normal, and η and η′ (“eta” and “eta prime”) are the refractive indices</w:t>
+      </w:r>
+      <w:r>
+        <w:rPr>
+          <w:rFonts w:hint="eastAsia"/>
+        </w:rPr>
+        <w:t>.</w:t>
+      </w:r>
+    </w:p>
+    <w:p>
+      <w:pPr>
+        <w:jc w:val="center"/>
+      </w:pPr>
+      <w:r>
+        <w:rPr>
+          <w:noProof/>
+        </w:rPr>
+        <w:drawing>
+          <wp:inline distT="0" distB="0" distL="0" distR="0" wp14:anchorId="25A5C543" wp14:editId="682F2745">
+            <wp:extent cx="4348246" cy="1793558"/>
+            <wp:effectExtent l="0" t="0" r="0" b="0"/>
+            <wp:docPr id="752391430" name="그림 1"/>
+            <wp:cNvGraphicFramePr>
+              <a:graphicFrameLocks xmlns:a="http://schemas.openxmlformats.org/drawingml/2006/main" noChangeAspect="1"/>
+            </wp:cNvGraphicFramePr>
+            <a:graphic xmlns:a="http://schemas.openxmlformats.org/drawingml/2006/main">
+              <a:graphicData uri="http://schemas.openxmlformats.org/drawingml/2006/picture">
+                <pic:pic xmlns:pic="http://schemas.openxmlformats.org/drawingml/2006/picture">
+                  <pic:nvPicPr>
+                    <pic:cNvPr id="0" name="Picture 1"/>
+                    <pic:cNvPicPr>
+                      <a:picLocks noChangeAspect="1" noChangeArrowheads="1"/>
+                    </pic:cNvPicPr>
+                  </pic:nvPicPr>
+                  <pic:blipFill>
+                    <a:blip r:embed="rId26">
+                      <a:extLst>
+                        <a:ext uri="{28A0092B-C50C-407E-A947-70E740481C1C}">
+                          <a14:useLocalDpi xmlns:a14="http://schemas.microsoft.com/office/drawing/2010/main" val="0"/>
+                        </a:ext>
+                      </a:extLst>
+                    </a:blip>
+                    <a:srcRect/>
+                    <a:stretch>
+                      <a:fillRect/>
+                    </a:stretch>
+                  </pic:blipFill>
+                  <pic:spPr bwMode="auto">
+                    <a:xfrm>
+                      <a:off x="0" y="0"/>
+                      <a:ext cx="4365457" cy="1800657"/>
+                    </a:xfrm>
+                    <a:prstGeom prst="rect">
+                      <a:avLst/>
+                    </a:prstGeom>
+                    <a:noFill/>
+                    <a:ln>
+                      <a:noFill/>
+                    </a:ln>
+                  </pic:spPr>
+                </pic:pic>
+              </a:graphicData>
+            </a:graphic>
+          </wp:inline>
+        </w:drawing>
+      </w:r>
+    </w:p>
+    <w:p>
+      <w:pPr>
+        <w:jc w:val="center"/>
+        <w:rPr>
+          <w:rFonts w:hint="eastAsia"/>
+        </w:rPr>
+      </w:pPr>
+      <w:r>
+        <w:rPr>
+          <w:noProof/>
+        </w:rPr>
+        <w:drawing>
+          <wp:inline distT="0" distB="0" distL="0" distR="0" wp14:anchorId="779E190D" wp14:editId="22991C46">
+            <wp:extent cx="4119563" cy="2678842"/>
+            <wp:effectExtent l="0" t="0" r="0" b="7620"/>
+            <wp:docPr id="1081676429" name="그림 2" descr="Refraction and Snell's Law - YouTube"/>
+            <wp:cNvGraphicFramePr>
+              <a:graphicFrameLocks xmlns:a="http://schemas.openxmlformats.org/drawingml/2006/main" noChangeAspect="1"/>
+            </wp:cNvGraphicFramePr>
+            <a:graphic xmlns:a="http://schemas.openxmlformats.org/drawingml/2006/main">
+              <a:graphicData uri="http://schemas.openxmlformats.org/drawingml/2006/picture">
+                <pic:pic xmlns:pic="http://schemas.openxmlformats.org/drawingml/2006/picture">
+                  <pic:nvPicPr>
+                    <pic:cNvPr id="0" name="Picture 3" descr="Refraction and Snell's Law - YouTube"/>
+                    <pic:cNvPicPr>
+                      <a:picLocks noChangeAspect="1" noChangeArrowheads="1"/>
+                    </pic:cNvPicPr>
+                  </pic:nvPicPr>
+                  <pic:blipFill rotWithShape="1">
+                    <a:blip r:embed="rId27" cstate="print">
+                      <a:extLst>
+                        <a:ext uri="{28A0092B-C50C-407E-A947-70E740481C1C}">
+                          <a14:useLocalDpi xmlns:a14="http://schemas.microsoft.com/office/drawing/2010/main" val="0"/>
+                        </a:ext>
+                      </a:extLst>
+                    </a:blip>
+                    <a:srcRect r="20950" b="8614"/>
+                    <a:stretch>
+                      <a:fillRect/>
+                    </a:stretch>
+                  </pic:blipFill>
+                  <pic:spPr bwMode="auto">
+                    <a:xfrm>
+                      <a:off x="0" y="0"/>
+                      <a:ext cx="4145779" cy="2695890"/>
+                    </a:xfrm>
+                    <a:prstGeom prst="rect">
+                      <a:avLst/>
+                    </a:prstGeom>
+                    <a:noFill/>
+                    <a:ln>
+                      <a:noFill/>
+                    </a:ln>
+                    <a:extLst>
+                      <a:ext uri="{53640926-AAD7-44D8-BBD7-CCE9431645EC}">
+                        <a14:shadowObscured xmlns:a14="http://schemas.microsoft.com/office/drawing/2010/main"/>
+                      </a:ext>
+                    </a:extLst>
+                  </pic:spPr>
+                </pic:pic>
+              </a:graphicData>
+            </a:graphic>
+          </wp:inline>
+        </w:drawing>
+      </w:r>
+    </w:p>
+    <w:p>
+      <w:r>
+        <w:rPr>
+          <w:rFonts w:hint="eastAsia"/>
+        </w:rPr>
+        <w:t xml:space="preserve">To determine the direction of the refracted ray, we must solve for sin </w:t>
+      </w:r>
+      <w:r>
+        <w:t>θ’</w:t>
+      </w:r>
+    </w:p>
+    <w:p>
+      <w:pPr>
+        <w:jc w:val="center"/>
+      </w:pPr>
+      <w:r>
+        <w:drawing>
+          <wp:inline distT="0" distB="0" distL="0" distR="0" wp14:anchorId="7DF656C2" wp14:editId="6E6B39E6">
+            <wp:extent cx="1733563" cy="542929"/>
+            <wp:effectExtent l="0" t="0" r="0" b="9525"/>
+            <wp:docPr id="1445834664" name="그림 1"/>
+            <wp:cNvGraphicFramePr>
+              <a:graphicFrameLocks xmlns:a="http://schemas.openxmlformats.org/drawingml/2006/main" noChangeAspect="1"/>
+            </wp:cNvGraphicFramePr>
+            <a:graphic xmlns:a="http://schemas.openxmlformats.org/drawingml/2006/main">
+              <a:graphicData uri="http://schemas.openxmlformats.org/drawingml/2006/picture">
+                <pic:pic xmlns:pic="http://schemas.openxmlformats.org/drawingml/2006/picture">
+                  <pic:nvPicPr>
+                    <pic:cNvPr id="1445834664" name=""/>
+                    <pic:cNvPicPr/>
+                  </pic:nvPicPr>
+                  <pic:blipFill>
+                    <a:blip r:embed="rId28"/>
+                    <a:stretch>
+                      <a:fillRect/>
+                    </a:stretch>
+                  </pic:blipFill>
+                  <pic:spPr>
+                    <a:xfrm>
+                      <a:off x="0" y="0"/>
+                      <a:ext cx="1733563" cy="542929"/>
+                    </a:xfrm>
+                    <a:prstGeom prst="rect">
+                      <a:avLst/>
+                    </a:prstGeom>
+                  </pic:spPr>
+                </pic:pic>
+              </a:graphicData>
+            </a:graphic>
+          </wp:inline>
+        </w:drawing>
+      </w:r>
+      <w:r>
+        <w:rPr>
+          <w:rFonts w:hint="eastAsia"/>
+        </w:rPr>
+        <w:t>:</w:t>
+      </w:r>
+    </w:p>
     <w:p>
       <w:pPr>
         <w:rPr>

</xml_diff>

<commit_message>
Updated Snell's law notes
</commit_message>
<xml_diff>
--- a/Notes.docx
+++ b/Notes.docx
@@ -3285,11 +3285,11 @@
     <w:p>
       <w:pPr>
         <w:jc w:val="center"/>
-        <w:rPr>
-          <w:rFonts w:hint="eastAsia"/>
-        </w:rPr>
-      </w:pPr>
-      <w:r>
+      </w:pPr>
+      <w:r>
+        <w:rPr>
+          <w:noProof/>
+        </w:rPr>
         <w:drawing>
           <wp:inline distT="0" distB="0" distL="0" distR="0" wp14:anchorId="6C04BC67" wp14:editId="0CBCBD92">
             <wp:extent cx="2085990" cy="495304"/>
@@ -3328,11 +3328,6 @@
       </w:r>
     </w:p>
     <w:p>
-      <w:pPr>
-        <w:rPr>
-          <w:rFonts w:hint="eastAsia"/>
-        </w:rPr>
-      </w:pPr>
       <w:r>
         <w:rPr>
           <w:rFonts w:hint="eastAsia"/>
@@ -3340,13 +3335,7 @@
         <w:t>w</w:t>
       </w:r>
       <w:r>
-        <w:t>here θ and θ</w:t>
-      </w:r>
-      <w:r>
-        <w:t>’</w:t>
-      </w:r>
-      <w:r>
-        <w:t xml:space="preserve"> are the angles from the normal, and η and η′ (“eta” and “eta prime”) are the refractive indices</w:t>
+        <w:t>here θ and θ’ are the angles from the normal, and η and η′ (“eta” and “eta prime”) are the refractive indices</w:t>
       </w:r>
       <w:r>
         <w:rPr>
@@ -3416,16 +3405,13 @@
     <w:p>
       <w:pPr>
         <w:jc w:val="center"/>
-        <w:rPr>
-          <w:rFonts w:hint="eastAsia"/>
-        </w:rPr>
       </w:pPr>
       <w:r>
         <w:rPr>
           <w:noProof/>
         </w:rPr>
         <w:drawing>
-          <wp:inline distT="0" distB="0" distL="0" distR="0" wp14:anchorId="779E190D" wp14:editId="22991C46">
+          <wp:inline distT="0" distB="0" distL="0" distR="0" wp14:anchorId="779E190D" wp14:editId="25CA1BD2">
             <wp:extent cx="4119563" cy="2678842"/>
             <wp:effectExtent l="0" t="0" r="0" b="7620"/>
             <wp:docPr id="1081676429" name="그림 2" descr="Refraction and Snell's Law - YouTube"/>
@@ -3495,6 +3481,9 @@
         <w:jc w:val="center"/>
       </w:pPr>
       <w:r>
+        <w:rPr>
+          <w:noProof/>
+        </w:rPr>
         <w:drawing>
           <wp:inline distT="0" distB="0" distL="0" distR="0" wp14:anchorId="7DF656C2" wp14:editId="6E6B39E6">
             <wp:extent cx="1733563" cy="542929"/>
@@ -3539,11 +3528,44 @@
       </w:r>
     </w:p>
     <w:p>
-      <w:pPr>
-        <w:rPr>
-          <w:rFonts w:hint="eastAsia"/>
-        </w:rPr>
-      </w:pPr>
+      <w:r>
+        <w:lastRenderedPageBreak/>
+        <w:drawing>
+          <wp:inline distT="0" distB="0" distL="0" distR="0" wp14:anchorId="04E7A163" wp14:editId="025C30D5">
+            <wp:extent cx="6645910" cy="2589530"/>
+            <wp:effectExtent l="0" t="0" r="2540" b="1270"/>
+            <wp:docPr id="356225357" name="그림 1"/>
+            <wp:cNvGraphicFramePr>
+              <a:graphicFrameLocks xmlns:a="http://schemas.openxmlformats.org/drawingml/2006/main" noChangeAspect="1"/>
+            </wp:cNvGraphicFramePr>
+            <a:graphic xmlns:a="http://schemas.openxmlformats.org/drawingml/2006/main">
+              <a:graphicData uri="http://schemas.openxmlformats.org/drawingml/2006/picture">
+                <pic:pic xmlns:pic="http://schemas.openxmlformats.org/drawingml/2006/picture">
+                  <pic:nvPicPr>
+                    <pic:cNvPr id="356225357" name=""/>
+                    <pic:cNvPicPr/>
+                  </pic:nvPicPr>
+                  <pic:blipFill>
+                    <a:blip r:embed="rId29"/>
+                    <a:stretch>
+                      <a:fillRect/>
+                    </a:stretch>
+                  </pic:blipFill>
+                  <pic:spPr>
+                    <a:xfrm>
+                      <a:off x="0" y="0"/>
+                      <a:ext cx="6645910" cy="2589530"/>
+                    </a:xfrm>
+                    <a:prstGeom prst="rect">
+                      <a:avLst/>
+                    </a:prstGeom>
+                  </pic:spPr>
+                </pic:pic>
+              </a:graphicData>
+            </a:graphic>
+          </wp:inline>
+        </w:drawing>
+      </w:r>
     </w:p>
     <w:p/>
     <w:sectPr>

</xml_diff>

<commit_message>
Updated Snell's law notes on ray vector derivation
</commit_message>
<xml_diff>
--- a/Notes.docx
+++ b/Notes.docx
@@ -3411,7 +3411,7 @@
           <w:noProof/>
         </w:rPr>
         <w:drawing>
-          <wp:inline distT="0" distB="0" distL="0" distR="0" wp14:anchorId="779E190D" wp14:editId="25CA1BD2">
+          <wp:inline distT="0" distB="0" distL="0" distR="0" wp14:anchorId="779E190D" wp14:editId="0E792DF6">
             <wp:extent cx="4119563" cy="2678842"/>
             <wp:effectExtent l="0" t="0" r="0" b="7620"/>
             <wp:docPr id="1081676429" name="그림 2" descr="Refraction and Snell's Law - YouTube"/>
@@ -3529,6 +3529,9 @@
     </w:p>
     <w:p>
       <w:r>
+        <w:rPr>
+          <w:noProof/>
+        </w:rPr>
         <w:lastRenderedPageBreak/>
         <w:drawing>
           <wp:inline distT="0" distB="0" distL="0" distR="0" wp14:anchorId="04E7A163" wp14:editId="025C30D5">
@@ -3567,7 +3570,80 @@
         </w:drawing>
       </w:r>
     </w:p>
+    <w:p>
+      <w:r>
+        <w:t>U</w:t>
+      </w:r>
+      <w:r>
+        <w:rPr>
+          <w:rFonts w:hint="eastAsia"/>
+        </w:rPr>
+        <w:t>sing the dot product formula, we can solve for cos</w:t>
+      </w:r>
+      <w:r>
+        <w:rPr>
+          <w:rFonts w:hint="eastAsia"/>
+        </w:rPr>
+        <w:t xml:space="preserve"> </w:t>
+      </w:r>
+      <w:r>
+        <w:t>θ</w:t>
+      </w:r>
+      <w:r>
+        <w:rPr>
+          <w:rFonts w:hint="eastAsia"/>
+        </w:rPr>
+        <w:t>:</w:t>
+      </w:r>
+    </w:p>
+    <w:p>
+      <w:r>
+        <w:drawing>
+          <wp:inline distT="0" distB="0" distL="0" distR="0" wp14:anchorId="78ECE42B" wp14:editId="617CDEB8">
+            <wp:extent cx="6645910" cy="2439670"/>
+            <wp:effectExtent l="0" t="0" r="2540" b="0"/>
+            <wp:docPr id="1483913870" name="그림 1"/>
+            <wp:cNvGraphicFramePr>
+              <a:graphicFrameLocks xmlns:a="http://schemas.openxmlformats.org/drawingml/2006/main" noChangeAspect="1"/>
+            </wp:cNvGraphicFramePr>
+            <a:graphic xmlns:a="http://schemas.openxmlformats.org/drawingml/2006/main">
+              <a:graphicData uri="http://schemas.openxmlformats.org/drawingml/2006/picture">
+                <pic:pic xmlns:pic="http://schemas.openxmlformats.org/drawingml/2006/picture">
+                  <pic:nvPicPr>
+                    <pic:cNvPr id="1483913870" name=""/>
+                    <pic:cNvPicPr/>
+                  </pic:nvPicPr>
+                  <pic:blipFill>
+                    <a:blip r:embed="rId30"/>
+                    <a:stretch>
+                      <a:fillRect/>
+                    </a:stretch>
+                  </pic:blipFill>
+                  <pic:spPr>
+                    <a:xfrm>
+                      <a:off x="0" y="0"/>
+                      <a:ext cx="6645910" cy="2439670"/>
+                    </a:xfrm>
+                    <a:prstGeom prst="rect">
+                      <a:avLst/>
+                    </a:prstGeom>
+                  </pic:spPr>
+                </pic:pic>
+              </a:graphicData>
+            </a:graphic>
+          </wp:inline>
+        </w:drawing>
+      </w:r>
+    </w:p>
     <w:p/>
+    <w:p/>
+    <w:p>
+      <w:pPr>
+        <w:rPr>
+          <w:rFonts w:hint="eastAsia"/>
+        </w:rPr>
+      </w:pPr>
+    </w:p>
     <w:sectPr>
       <w:pgSz w:w="11906" w:h="16838"/>
       <w:pgMar w:top="720" w:right="720" w:bottom="720" w:left="720" w:header="851" w:footer="992" w:gutter="0"/>

</xml_diff>

<commit_message>
Updated notes on total internal reflection
</commit_message>
<xml_diff>
--- a/Notes.docx
+++ b/Notes.docx
@@ -216,61 +216,15 @@
       <w:r>
         <w:tab/>
       </w:r>
-      <w:proofErr w:type="spellStart"/>
-      <w:r>
-        <w:rPr>
-          <w:rFonts w:hint="eastAsia"/>
-        </w:rPr>
-        <w:t>image_height</w:t>
-      </w:r>
-      <w:proofErr w:type="spellEnd"/>
-      <w:r>
-        <w:rPr>
-          <w:rFonts w:hint="eastAsia"/>
-        </w:rPr>
-        <w:t xml:space="preserve"> = (</w:t>
-      </w:r>
-      <w:proofErr w:type="spellStart"/>
-      <w:r>
-        <w:rPr>
-          <w:rFonts w:hint="eastAsia"/>
-        </w:rPr>
-        <w:t>image_height</w:t>
-      </w:r>
-      <w:proofErr w:type="spellEnd"/>
-      <w:r>
-        <w:rPr>
-          <w:rFonts w:hint="eastAsia"/>
-        </w:rPr>
-        <w:t xml:space="preserve"> &lt; 1</w:t>
-      </w:r>
-      <w:proofErr w:type="gramStart"/>
-      <w:r>
-        <w:rPr>
-          <w:rFonts w:hint="eastAsia"/>
-        </w:rPr>
-        <w:t xml:space="preserve">) </w:t>
-      </w:r>
-      <w:r>
-        <w:t>?</w:t>
-      </w:r>
-      <w:proofErr w:type="gramEnd"/>
-      <w:r>
-        <w:t xml:space="preserve"> </w:t>
-      </w:r>
-      <w:proofErr w:type="gramStart"/>
-      <w:r>
-        <w:t>1 :</w:t>
-      </w:r>
-      <w:proofErr w:type="gramEnd"/>
-      <w:r>
-        <w:t xml:space="preserve"> </w:t>
-      </w:r>
-      <w:proofErr w:type="spellStart"/>
-      <w:r>
-        <w:t>image_height</w:t>
-      </w:r>
-      <w:proofErr w:type="spellEnd"/>
+      <w:r>
+        <w:rPr>
+          <w:rFonts w:hint="eastAsia"/>
+        </w:rPr>
+        <w:t xml:space="preserve">image_height = (image_height &lt; 1) </w:t>
+      </w:r>
+      <w:r>
+        <w:t>? 1 : image_height</w:t>
+      </w:r>
     </w:p>
     <w:p>
       <w:pPr>
@@ -281,36 +235,11 @@
           <w:b/>
           <w:bCs/>
         </w:rPr>
-        <w:t xml:space="preserve">? </w:t>
-      </w:r>
-      <w:proofErr w:type="gramStart"/>
-      <w:r>
-        <w:rPr>
-          <w:b/>
-          <w:bCs/>
-        </w:rPr>
-        <w:t>1 :</w:t>
-      </w:r>
-      <w:proofErr w:type="gramEnd"/>
-      <w:r>
-        <w:rPr>
-          <w:b/>
-          <w:bCs/>
-        </w:rPr>
+        <w:t>? 1 : image_height</w:t>
+      </w:r>
+      <w:r>
         <w:t xml:space="preserve"> </w:t>
       </w:r>
-      <w:proofErr w:type="spellStart"/>
-      <w:r>
-        <w:rPr>
-          <w:b/>
-          <w:bCs/>
-        </w:rPr>
-        <w:t>image_height</w:t>
-      </w:r>
-      <w:proofErr w:type="spellEnd"/>
-      <w:r>
-        <w:t xml:space="preserve"> </w:t>
-      </w:r>
       <w:r>
         <w:rPr>
           <w:rFonts w:hint="eastAsia"/>
@@ -359,13 +288,8 @@
         <w:t>F</w:t>
       </w:r>
       <w:r>
-        <w:t xml:space="preserve">alse, use </w:t>
-      </w:r>
-      <w:proofErr w:type="spellStart"/>
-      <w:r>
-        <w:t>image_height</w:t>
-      </w:r>
-      <w:proofErr w:type="spellEnd"/>
+        <w:t>alse, use image_height</w:t>
+      </w:r>
     </w:p>
     <w:p>
       <w:r>
@@ -543,13 +467,8 @@
         </w:rPr>
         <w:t xml:space="preserve"> a standard equation defined by </w:t>
       </w:r>
-      <w:proofErr w:type="gramStart"/>
-      <w:r>
-        <w:t>lerp(</w:t>
-      </w:r>
-      <w:proofErr w:type="gramEnd"/>
-      <w:r>
-        <w:t>a, b, t) = a * (1 - t) + b * t</w:t>
+      <w:r>
+        <w:t>lerp(a, b, t) = a * (1 - t) + b * t</w:t>
       </w:r>
     </w:p>
     <w:p>
@@ -669,21 +588,7 @@
         <w:rPr>
           <w:rFonts w:hint="eastAsia"/>
         </w:rPr>
-        <w:t>(C-</w:t>
-      </w:r>
-      <w:proofErr w:type="gramStart"/>
-      <w:r>
-        <w:rPr>
-          <w:rFonts w:hint="eastAsia"/>
-        </w:rPr>
-        <w:t>P)*</w:t>
-      </w:r>
-      <w:proofErr w:type="gramEnd"/>
-      <w:r>
-        <w:rPr>
-          <w:rFonts w:hint="eastAsia"/>
-        </w:rPr>
-        <w:t>(C-P) is the dot product of the length of the origin-to-center vector. For the equation of that value being equal to r</w:t>
+        <w:t>(C-P)*(C-P) is the dot product of the length of the origin-to-center vector. For the equation of that value being equal to r</w:t>
       </w:r>
       <w:r>
         <w:rPr>
@@ -696,21 +601,10 @@
         <w:rPr>
           <w:rFonts w:hint="eastAsia"/>
         </w:rPr>
-        <w:t xml:space="preserve">, imagine a sphere of radius r migrated (C-P) distance away from origin (camera lens). The ray, if allowed to permeate through, will intersect </w:t>
-      </w:r>
-      <w:proofErr w:type="gramStart"/>
-      <w:r>
-        <w:rPr>
-          <w:rFonts w:hint="eastAsia"/>
-        </w:rPr>
-        <w:t xml:space="preserve">these </w:t>
-      </w:r>
-      <w:r>
-        <w:t>selection</w:t>
-      </w:r>
-      <w:proofErr w:type="gramEnd"/>
-      <w:r>
-        <w:t xml:space="preserve"> o</w:t>
+        <w:t xml:space="preserve">, imagine a sphere of radius r migrated (C-P) distance away from origin (camera lens). The ray, if allowed to permeate through, will intersect these </w:t>
+      </w:r>
+      <w:r>
+        <w:t>selection o</w:t>
       </w:r>
       <w:r>
         <w:rPr>
@@ -1001,43 +895,7 @@
           <w:rFonts w:hint="eastAsia"/>
         </w:rPr>
         <w:lastRenderedPageBreak/>
-        <w:t>This means that the directional vector (</w:t>
-      </w:r>
-      <w:proofErr w:type="spellStart"/>
-      <w:proofErr w:type="gramStart"/>
-      <w:r>
-        <w:rPr>
-          <w:rFonts w:hint="eastAsia"/>
-        </w:rPr>
-        <w:t>x,y</w:t>
-      </w:r>
-      <w:proofErr w:type="gramEnd"/>
-      <w:r>
-        <w:rPr>
-          <w:rFonts w:hint="eastAsia"/>
-        </w:rPr>
-        <w:t>,z</w:t>
-      </w:r>
-      <w:proofErr w:type="spellEnd"/>
-      <w:r>
-        <w:rPr>
-          <w:rFonts w:hint="eastAsia"/>
-        </w:rPr>
-        <w:t>) of the unit surface normal is mapped to (</w:t>
-      </w:r>
-      <w:proofErr w:type="gramStart"/>
-      <w:r>
-        <w:rPr>
-          <w:rFonts w:hint="eastAsia"/>
-        </w:rPr>
-        <w:t>R,G</w:t>
-      </w:r>
-      <w:proofErr w:type="gramEnd"/>
-      <w:r>
-        <w:rPr>
-          <w:rFonts w:hint="eastAsia"/>
-        </w:rPr>
-        <w:t>,B)</w:t>
+        <w:t>This means that the directional vector (x,y,z) of the unit surface normal is mapped to (R,G,B)</w:t>
       </w:r>
     </w:p>
     <w:p>
@@ -1247,21 +1105,7 @@
         <w:rPr>
           <w:rFonts w:hint="eastAsia"/>
         </w:rPr>
-        <w:t xml:space="preserve">s based on preference. However, because there </w:t>
-      </w:r>
-      <w:proofErr w:type="gramStart"/>
-      <w:r>
-        <w:rPr>
-          <w:rFonts w:hint="eastAsia"/>
-        </w:rPr>
-        <w:t>are</w:t>
-      </w:r>
-      <w:proofErr w:type="gramEnd"/>
-      <w:r>
-        <w:rPr>
-          <w:rFonts w:hint="eastAsia"/>
-        </w:rPr>
-        <w:t xml:space="preserve"> way more material types than different geometries, it</w:t>
+        <w:t>s based on preference. However, because there are way more material types than different geometries, it</w:t>
       </w:r>
       <w:r>
         <w:t>’</w:t>
@@ -1292,15 +1136,7 @@
         <w:t xml:space="preserve"> </w:t>
       </w:r>
       <w:r>
-        <w:t xml:space="preserve">Moving Camera Code </w:t>
-      </w:r>
-      <w:proofErr w:type="gramStart"/>
-      <w:r>
-        <w:t>Into</w:t>
-      </w:r>
-      <w:proofErr w:type="gramEnd"/>
-      <w:r>
-        <w:t xml:space="preserve"> Its Own Class</w:t>
+        <w:t>Moving Camera Code Into Its Own Class</w:t>
       </w:r>
     </w:p>
     <w:p>
@@ -1310,11 +1146,9 @@
         </w:rPr>
         <w:t xml:space="preserve">After creating </w:t>
       </w:r>
-      <w:proofErr w:type="spellStart"/>
       <w:r>
         <w:t>rtweekend.h</w:t>
       </w:r>
-      <w:proofErr w:type="spellEnd"/>
       <w:r>
         <w:rPr>
           <w:rFonts w:hint="eastAsia"/>
@@ -1536,21 +1370,7 @@
         <w:rPr>
           <w:rFonts w:hint="eastAsia"/>
         </w:rPr>
-        <w:t xml:space="preserve">. At the current state, if we were to render </w:t>
-      </w:r>
-      <w:proofErr w:type="gramStart"/>
-      <w:r>
-        <w:rPr>
-          <w:rFonts w:hint="eastAsia"/>
-        </w:rPr>
-        <w:t>a</w:t>
-      </w:r>
-      <w:proofErr w:type="gramEnd"/>
-      <w:r>
-        <w:rPr>
-          <w:rFonts w:hint="eastAsia"/>
-        </w:rPr>
-        <w:t xml:space="preserve"> 8 x 8 checkerboard far away such that it</w:t>
+        <w:t>. At the current state, if we were to render a 8 x 8 checkerboard far away such that it</w:t>
       </w:r>
       <w:r>
         <w:t>’</w:t>
@@ -1619,21 +1439,7 @@
         <w:rPr>
           <w:rFonts w:hint="eastAsia"/>
         </w:rPr>
-        <w:t xml:space="preserve">ll sample the </w:t>
-      </w:r>
-      <w:proofErr w:type="gramStart"/>
-      <w:r>
-        <w:rPr>
-          <w:rFonts w:hint="eastAsia"/>
-        </w:rPr>
-        <w:t>four square</w:t>
-      </w:r>
-      <w:proofErr w:type="gramEnd"/>
-      <w:r>
-        <w:rPr>
-          <w:rFonts w:hint="eastAsia"/>
-        </w:rPr>
-        <w:t xml:space="preserve"> regions of a pixel that extends halfway into each of the four neighboring pixels </w:t>
+        <w:t xml:space="preserve">ll sample the four square regions of a pixel that extends halfway into each of the four neighboring pixels </w:t>
       </w:r>
       <w:r>
         <w:t>–</w:t>
@@ -2214,21 +2020,7 @@
         <w:rPr>
           <w:rFonts w:hint="eastAsia"/>
         </w:rPr>
-        <w:t xml:space="preserve">Imagine </w:t>
-      </w:r>
-      <w:proofErr w:type="gramStart"/>
-      <w:r>
-        <w:rPr>
-          <w:rFonts w:hint="eastAsia"/>
-        </w:rPr>
-        <w:t>two unit</w:t>
-      </w:r>
-      <w:proofErr w:type="gramEnd"/>
-      <w:r>
-        <w:rPr>
-          <w:rFonts w:hint="eastAsia"/>
-        </w:rPr>
-        <w:t xml:space="preserve"> spheres intersecting this hit point, one on each side of the sphere object.</w:t>
+        <w:t>Imagine two unit spheres intersecting this hit point, one on each side of the sphere object.</w:t>
       </w:r>
       <w:r>
         <w:rPr>
@@ -2248,7 +2040,6 @@
       <w:r>
         <w:t> (</w:t>
       </w:r>
-      <w:proofErr w:type="spellStart"/>
       <w:r>
         <w:rPr>
           <w:b/>
@@ -2266,7 +2057,6 @@
         </w:rPr>
         <w:t>n</w:t>
       </w:r>
-      <w:proofErr w:type="spellEnd"/>
       <w:r>
         <w:t xml:space="preserve">) and the </w:t>
       </w:r>
@@ -2562,21 +2352,7 @@
         <w:rPr>
           <w:rFonts w:hint="eastAsia"/>
         </w:rPr>
-        <w:t xml:space="preserve"> in real life, it would be pretty bright. We will see the brightness gamut for the diffuse material by adjusting the reflectance of </w:t>
-      </w:r>
-      <w:proofErr w:type="spellStart"/>
-      <w:r>
-        <w:rPr>
-          <w:rFonts w:hint="eastAsia"/>
-        </w:rPr>
-        <w:t>ray_color</w:t>
-      </w:r>
-      <w:proofErr w:type="spellEnd"/>
-      <w:r>
-        <w:rPr>
-          <w:rFonts w:hint="eastAsia"/>
-        </w:rPr>
-        <w:t xml:space="preserve"> from 0.5 to 0.1</w:t>
+        <w:t xml:space="preserve"> in real life, it would be pretty bright. We will see the brightness gamut for the diffuse material by adjusting the reflectance of ray_color from 0.5 to 0.1</w:t>
       </w:r>
     </w:p>
     <w:p>
@@ -2668,15 +2444,7 @@
         <w:t xml:space="preserve"> because</w:t>
       </w:r>
       <w:r>
-        <w:t xml:space="preserve"> almost all computer programs assume that an image is “gamma corrected” before being written into an image file. This means that the 0 to 1 </w:t>
-      </w:r>
-      <w:proofErr w:type="gramStart"/>
-      <w:r>
-        <w:t>values</w:t>
-      </w:r>
-      <w:proofErr w:type="gramEnd"/>
-      <w:r>
-        <w:t xml:space="preserve"> have some transform applied before being stored as a byte. Images with data that are written without being transformed are said to be in </w:t>
+        <w:t xml:space="preserve"> almost all computer programs assume that an image is “gamma corrected” before being written into an image file. This means that the 0 to 1 values have some transform applied before being stored as a byte. Images with data that are written without being transformed are said to be in </w:t>
       </w:r>
       <w:r>
         <w:rPr>
@@ -2727,7 +2495,6 @@
         </w:rPr>
         <w:t xml:space="preserve"> (</w:t>
       </w:r>
-      <w:proofErr w:type="spellStart"/>
       <w:r>
         <w:rPr>
           <w:rFonts w:hAnsiTheme="minorEastAsia" w:hint="eastAsia"/>
@@ -2736,7 +2503,6 @@
         </w:rPr>
         <w:t>γ</w:t>
       </w:r>
-      <w:proofErr w:type="spellEnd"/>
       <w:r>
         <w:rPr>
           <w:rFonts w:hint="eastAsia"/>
@@ -2830,11 +2596,9 @@
         </w:rPr>
         <w:t xml:space="preserve"> </w:t>
       </w:r>
-      <w:proofErr w:type="spellStart"/>
       <w:r>
         <w:t>cr</w:t>
       </w:r>
-      <w:proofErr w:type="spellEnd"/>
       <w:r>
         <w:rPr>
           <w:rFonts w:hint="eastAsia"/>
@@ -2986,53 +2750,8 @@
       </w:r>
     </w:p>
     <w:p>
-      <w:proofErr w:type="spellStart"/>
-      <w:r>
-        <w:t>hit_record</w:t>
-      </w:r>
-      <w:proofErr w:type="spellEnd"/>
-      <w:r>
-        <w:t> is just a way to stuff a bunch of arguments into a class so we can send them as a group. When a ray hits a surface (a particular sphere for example), the material pointer in the </w:t>
-      </w:r>
-      <w:proofErr w:type="spellStart"/>
-      <w:r>
-        <w:t>hit_record</w:t>
-      </w:r>
-      <w:proofErr w:type="spellEnd"/>
-      <w:r>
-        <w:t> will be set to point at the material pointer the sphere was given when it was set up in </w:t>
-      </w:r>
-      <w:proofErr w:type="gramStart"/>
-      <w:r>
-        <w:t>main(</w:t>
-      </w:r>
-      <w:proofErr w:type="gramEnd"/>
-      <w:r>
-        <w:t>) when we start. When the </w:t>
-      </w:r>
-      <w:proofErr w:type="spellStart"/>
-      <w:r>
-        <w:t>ray_</w:t>
-      </w:r>
-      <w:proofErr w:type="gramStart"/>
-      <w:r>
-        <w:t>color</w:t>
-      </w:r>
-      <w:proofErr w:type="spellEnd"/>
-      <w:r>
-        <w:t>(</w:t>
-      </w:r>
-      <w:proofErr w:type="gramEnd"/>
-      <w:r>
-        <w:t>) routine gets the </w:t>
-      </w:r>
-      <w:proofErr w:type="spellStart"/>
-      <w:r>
-        <w:t>hit_record</w:t>
-      </w:r>
-      <w:proofErr w:type="spellEnd"/>
-      <w:r>
-        <w:t> it can call member functions of the material pointer to find out what ray, if any, is scattered.</w:t>
+      <w:r>
+        <w:t>hit_record is just a way to stuff a bunch of arguments into a class so we can send them as a group. When a ray hits a surface (a particular sphere for example), the material pointer in the hit_record will be set to point at the material pointer the sphere was given when it was set up in main() when we start. When the ray_color() routine gets the hit_record it can call member functions of the material pointer to find out what ray, if any, is scattered.</w:t>
       </w:r>
     </w:p>
     <w:p/>
@@ -3692,7 +3411,7 @@
           <w:noProof/>
         </w:rPr>
         <w:drawing>
-          <wp:inline distT="0" distB="0" distL="0" distR="0" wp14:anchorId="779E190D" wp14:editId="0E792DF6">
+          <wp:inline distT="0" distB="0" distL="0" distR="0" wp14:anchorId="779E190D" wp14:editId="6C0E1758">
             <wp:extent cx="4119563" cy="2678842"/>
             <wp:effectExtent l="0" t="0" r="0" b="7620"/>
             <wp:docPr id="1081676429" name="그림 2" descr="Refraction and Snell's Law - YouTube"/>
@@ -3815,9 +3534,9 @@
         </w:rPr>
         <w:lastRenderedPageBreak/>
         <w:drawing>
-          <wp:inline distT="0" distB="0" distL="0" distR="0" wp14:anchorId="04E7A163" wp14:editId="025C30D5">
-            <wp:extent cx="6645910" cy="2589530"/>
-            <wp:effectExtent l="0" t="0" r="2540" b="1270"/>
+          <wp:inline distT="0" distB="0" distL="0" distR="0" wp14:anchorId="04E7A163" wp14:editId="27020367">
+            <wp:extent cx="6271895" cy="2443798"/>
+            <wp:effectExtent l="0" t="0" r="0" b="0"/>
             <wp:docPr id="356225357" name="그림 1"/>
             <wp:cNvGraphicFramePr>
               <a:graphicFrameLocks xmlns:a="http://schemas.openxmlformats.org/drawingml/2006/main" noChangeAspect="1"/>
@@ -3838,7 +3557,7 @@
                   <pic:spPr>
                     <a:xfrm>
                       <a:off x="0" y="0"/>
-                      <a:ext cx="6645910" cy="2589530"/>
+                      <a:ext cx="6278671" cy="2446438"/>
                     </a:xfrm>
                     <a:prstGeom prst="rect">
                       <a:avLst/>
@@ -3859,13 +3578,7 @@
         <w:rPr>
           <w:rFonts w:hint="eastAsia"/>
         </w:rPr>
-        <w:t>sing the dot product formula, we can solve for cos</w:t>
-      </w:r>
-      <w:r>
-        <w:rPr>
-          <w:rFonts w:hint="eastAsia"/>
-        </w:rPr>
-        <w:t xml:space="preserve"> </w:t>
+        <w:t xml:space="preserve">sing the dot product formula, we can solve for cos </w:t>
       </w:r>
       <w:r>
         <w:t>θ</w:t>
@@ -3879,10 +3592,13 @@
     </w:p>
     <w:p>
       <w:r>
+        <w:rPr>
+          <w:noProof/>
+        </w:rPr>
         <w:drawing>
-          <wp:inline distT="0" distB="0" distL="0" distR="0" wp14:anchorId="78ECE42B" wp14:editId="617CDEB8">
-            <wp:extent cx="6645910" cy="2439670"/>
-            <wp:effectExtent l="0" t="0" r="2540" b="0"/>
+          <wp:inline distT="0" distB="0" distL="0" distR="0" wp14:anchorId="78ECE42B" wp14:editId="60D2DBE1">
+            <wp:extent cx="6272213" cy="2302488"/>
+            <wp:effectExtent l="0" t="0" r="0" b="3175"/>
             <wp:docPr id="1483913870" name="그림 1"/>
             <wp:cNvGraphicFramePr>
               <a:graphicFrameLocks xmlns:a="http://schemas.openxmlformats.org/drawingml/2006/main" noChangeAspect="1"/>
@@ -3903,7 +3619,7 @@
                   <pic:spPr>
                     <a:xfrm>
                       <a:off x="0" y="0"/>
-                      <a:ext cx="6645910" cy="2439670"/>
+                      <a:ext cx="6278851" cy="2304925"/>
                     </a:xfrm>
                     <a:prstGeom prst="rect">
                       <a:avLst/>
@@ -3920,10 +3636,296 @@
     <w:p/>
     <w:p>
       <w:pPr>
-        <w:rPr>
-          <w:rFonts w:hint="eastAsia"/>
-        </w:rPr>
-      </w:pPr>
+        <w:pStyle w:val="2"/>
+      </w:pPr>
+      <w:r>
+        <w:rPr>
+          <w:rFonts w:hint="eastAsia"/>
+        </w:rPr>
+        <w:t>11.</w:t>
+      </w:r>
+      <w:r>
+        <w:rPr>
+          <w:rFonts w:hint="eastAsia"/>
+        </w:rPr>
+        <w:t>3</w:t>
+      </w:r>
+      <w:r>
+        <w:rPr>
+          <w:rFonts w:hint="eastAsia"/>
+        </w:rPr>
+        <w:t xml:space="preserve"> </w:t>
+      </w:r>
+      <w:r>
+        <w:t>Total Internal Reflection</w:t>
+      </w:r>
+    </w:p>
+    <w:p>
+      <w:r>
+        <w:t>One issue with refraction is that there are ray angles for which no solution is possible using Snell's law</w:t>
+      </w:r>
+      <w:r>
+        <w:rPr>
+          <w:rFonts w:hint="eastAsia"/>
+        </w:rPr>
+        <w:t>; w</w:t>
+      </w:r>
+      <w:r>
+        <w:t>hen a ray enters a medium of lower index of refraction at a sufficiently glancing angle, it can refract with an angle greater than 90°.</w:t>
+      </w:r>
+    </w:p>
+    <w:p>
+      <w:r>
+        <w:drawing>
+          <wp:inline distT="0" distB="0" distL="0" distR="0" wp14:anchorId="537E512B" wp14:editId="347617CD">
+            <wp:extent cx="6300788" cy="2549574"/>
+            <wp:effectExtent l="0" t="0" r="5080" b="3175"/>
+            <wp:docPr id="1998396684" name="그림 1"/>
+            <wp:cNvGraphicFramePr>
+              <a:graphicFrameLocks xmlns:a="http://schemas.openxmlformats.org/drawingml/2006/main" noChangeAspect="1"/>
+            </wp:cNvGraphicFramePr>
+            <a:graphic xmlns:a="http://schemas.openxmlformats.org/drawingml/2006/main">
+              <a:graphicData uri="http://schemas.openxmlformats.org/drawingml/2006/picture">
+                <pic:pic xmlns:pic="http://schemas.openxmlformats.org/drawingml/2006/picture">
+                  <pic:nvPicPr>
+                    <pic:cNvPr id="1998396684" name=""/>
+                    <pic:cNvPicPr/>
+                  </pic:nvPicPr>
+                  <pic:blipFill>
+                    <a:blip r:embed="rId31"/>
+                    <a:stretch>
+                      <a:fillRect/>
+                    </a:stretch>
+                  </pic:blipFill>
+                  <pic:spPr>
+                    <a:xfrm>
+                      <a:off x="0" y="0"/>
+                      <a:ext cx="6305847" cy="2551621"/>
+                    </a:xfrm>
+                    <a:prstGeom prst="rect">
+                      <a:avLst/>
+                    </a:prstGeom>
+                  </pic:spPr>
+                </pic:pic>
+              </a:graphicData>
+            </a:graphic>
+          </wp:inline>
+        </w:drawing>
+      </w:r>
+    </w:p>
+    <w:p>
+      <w:pPr>
+        <w:rPr>
+          <w:rFonts w:hint="eastAsia"/>
+        </w:rPr>
+      </w:pPr>
+      <w:r>
+        <w:rPr>
+          <w:rFonts w:hint="eastAsia"/>
+        </w:rPr>
+        <w:lastRenderedPageBreak/>
+        <w:t xml:space="preserve">If the angle is so steep that </w:t>
+      </w:r>
+      <w:r>
+        <w:rPr>
+          <w:rFonts w:hint="eastAsia"/>
+        </w:rPr>
+        <w:t xml:space="preserve">sin </w:t>
+      </w:r>
+      <w:r>
+        <w:t>θ</w:t>
+      </w:r>
+      <w:r>
+        <w:rPr>
+          <w:rFonts w:hint="eastAsia"/>
+        </w:rPr>
+        <w:t xml:space="preserve"> is near 1, </w:t>
+      </w:r>
+      <w:r>
+        <w:rPr>
+          <w:rFonts w:hint="eastAsia"/>
+        </w:rPr>
+        <w:t xml:space="preserve">sin </w:t>
+      </w:r>
+      <w:r>
+        <w:t>θ’</w:t>
+      </w:r>
+      <w:r>
+        <w:rPr>
+          <w:rFonts w:hint="eastAsia"/>
+        </w:rPr>
+        <w:t xml:space="preserve"> will be above 1, which is impossible </w:t>
+      </w:r>
+      <w:r>
+        <w:t>–</w:t>
+      </w:r>
+      <w:r>
+        <w:rPr>
+          <w:rFonts w:hint="eastAsia"/>
+        </w:rPr>
+        <w:t xml:space="preserve"> </w:t>
+      </w:r>
+      <w:r>
+        <w:t>the equality between the two sides of the equation is broken, and a solution cannot exist. </w:t>
+      </w:r>
+      <w:r>
+        <w:rPr>
+          <w:rFonts w:hint="eastAsia"/>
+        </w:rPr>
+        <w:t xml:space="preserve">This means that </w:t>
+      </w:r>
+      <w:r>
+        <w:t>the glass cannot refract, and therefore must reflect the ray</w:t>
+      </w:r>
+      <w:r>
+        <w:rPr>
+          <w:rFonts w:hint="eastAsia"/>
+        </w:rPr>
+        <w:t xml:space="preserve">. </w:t>
+      </w:r>
+    </w:p>
+    <w:p>
+      <w:pPr>
+        <w:rPr>
+          <w:rFonts w:hint="eastAsia"/>
+        </w:rPr>
+      </w:pPr>
+      <w:r>
+        <w:t xml:space="preserve">Here all the light is reflected, and because in practice that is usually inside solid objects, it is called </w:t>
+      </w:r>
+      <w:r>
+        <w:rPr>
+          <w:b/>
+          <w:bCs/>
+        </w:rPr>
+        <w:t>total internal reflection</w:t>
+      </w:r>
+      <w:r>
+        <w:t xml:space="preserve">. This is why sometimes the water-to-air boundary acts as a perfect mirror when you are submerged </w:t>
+      </w:r>
+      <w:r>
+        <w:t>–</w:t>
+      </w:r>
+      <w:r>
+        <w:rPr>
+          <w:rFonts w:hint="eastAsia"/>
+        </w:rPr>
+        <w:t xml:space="preserve"> </w:t>
+      </w:r>
+      <w:r>
+        <w:t>if you're under water looking up, you can see things above the water, but when you are close to the surface and looking sideways, the water surface looks like a mirror.</w:t>
+      </w:r>
+    </w:p>
+    <w:p>
+      <w:r>
+        <w:rPr>
+          <w:rFonts w:hint="eastAsia"/>
+        </w:rPr>
+        <w:t xml:space="preserve">We can solve for </w:t>
+      </w:r>
+      <w:r>
+        <w:rPr>
+          <w:rFonts w:hint="eastAsia"/>
+        </w:rPr>
+        <w:t xml:space="preserve">sin </w:t>
+      </w:r>
+      <w:r>
+        <w:t>θ</w:t>
+      </w:r>
+      <w:r>
+        <w:rPr>
+          <w:rFonts w:hint="eastAsia"/>
+        </w:rPr>
+        <w:t xml:space="preserve"> with:</w:t>
+      </w:r>
+    </w:p>
+    <w:p>
+      <w:pPr>
+        <w:ind w:firstLine="800"/>
+        <w:rPr>
+          <w:rFonts w:hint="eastAsia"/>
+        </w:rPr>
+      </w:pPr>
+      <w:r>
+        <w:drawing>
+          <wp:inline distT="0" distB="0" distL="0" distR="0" wp14:anchorId="368A766E" wp14:editId="78EE2EC7">
+            <wp:extent cx="2219341" cy="600079"/>
+            <wp:effectExtent l="0" t="0" r="9525" b="9525"/>
+            <wp:docPr id="1017393502" name="그림 1"/>
+            <wp:cNvGraphicFramePr>
+              <a:graphicFrameLocks xmlns:a="http://schemas.openxmlformats.org/drawingml/2006/main" noChangeAspect="1"/>
+            </wp:cNvGraphicFramePr>
+            <a:graphic xmlns:a="http://schemas.openxmlformats.org/drawingml/2006/main">
+              <a:graphicData uri="http://schemas.openxmlformats.org/drawingml/2006/picture">
+                <pic:pic xmlns:pic="http://schemas.openxmlformats.org/drawingml/2006/picture">
+                  <pic:nvPicPr>
+                    <pic:cNvPr id="1017393502" name=""/>
+                    <pic:cNvPicPr/>
+                  </pic:nvPicPr>
+                  <pic:blipFill>
+                    <a:blip r:embed="rId32"/>
+                    <a:stretch>
+                      <a:fillRect/>
+                    </a:stretch>
+                  </pic:blipFill>
+                  <pic:spPr>
+                    <a:xfrm>
+                      <a:off x="0" y="0"/>
+                      <a:ext cx="2219341" cy="600079"/>
+                    </a:xfrm>
+                    <a:prstGeom prst="rect">
+                      <a:avLst/>
+                    </a:prstGeom>
+                  </pic:spPr>
+                </pic:pic>
+              </a:graphicData>
+            </a:graphic>
+          </wp:inline>
+        </w:drawing>
+      </w:r>
+      <w:r>
+        <w:tab/>
+      </w:r>
+      <w:r>
+        <w:tab/>
+      </w:r>
+      <w:r>
+        <w:drawing>
+          <wp:inline distT="0" distB="0" distL="0" distR="0" wp14:anchorId="24EBB2BC" wp14:editId="01349D42">
+            <wp:extent cx="1581162" cy="476253"/>
+            <wp:effectExtent l="0" t="0" r="0" b="0"/>
+            <wp:docPr id="1512965216" name="그림 1"/>
+            <wp:cNvGraphicFramePr>
+              <a:graphicFrameLocks xmlns:a="http://schemas.openxmlformats.org/drawingml/2006/main" noChangeAspect="1"/>
+            </wp:cNvGraphicFramePr>
+            <a:graphic xmlns:a="http://schemas.openxmlformats.org/drawingml/2006/main">
+              <a:graphicData uri="http://schemas.openxmlformats.org/drawingml/2006/picture">
+                <pic:pic xmlns:pic="http://schemas.openxmlformats.org/drawingml/2006/picture">
+                  <pic:nvPicPr>
+                    <pic:cNvPr id="1512965216" name=""/>
+                    <pic:cNvPicPr/>
+                  </pic:nvPicPr>
+                  <pic:blipFill>
+                    <a:blip r:embed="rId33"/>
+                    <a:stretch>
+                      <a:fillRect/>
+                    </a:stretch>
+                  </pic:blipFill>
+                  <pic:spPr>
+                    <a:xfrm>
+                      <a:off x="0" y="0"/>
+                      <a:ext cx="1581162" cy="476253"/>
+                    </a:xfrm>
+                    <a:prstGeom prst="rect">
+                      <a:avLst/>
+                    </a:prstGeom>
+                  </pic:spPr>
+                </pic:pic>
+              </a:graphicData>
+            </a:graphic>
+          </wp:inline>
+        </w:drawing>
+      </w:r>
     </w:p>
     <w:p/>
     <w:p>
@@ -3933,6 +3935,7 @@
         </w:rPr>
       </w:pPr>
     </w:p>
+    <w:p/>
     <w:sectPr>
       <w:pgSz w:w="11906" w:h="16838"/>
       <w:pgMar w:top="720" w:right="720" w:bottom="720" w:left="720" w:header="851" w:footer="992" w:gutter="0"/>
@@ -5067,7 +5070,6 @@
   <w:style w:type="character" w:default="1" w:styleId="a0">
     <w:name w:val="Default Paragraph Font"/>
     <w:uiPriority w:val="1"/>
-    <w:semiHidden/>
     <w:unhideWhenUsed/>
   </w:style>
   <w:style w:type="table" w:default="1" w:styleId="a1">

</xml_diff>

<commit_message>
Finished total internal reflection implementation & notes
</commit_message>
<xml_diff>
--- a/Notes.docx
+++ b/Notes.docx
@@ -3411,7 +3411,7 @@
           <w:noProof/>
         </w:rPr>
         <w:drawing>
-          <wp:inline distT="0" distB="0" distL="0" distR="0" wp14:anchorId="779E190D" wp14:editId="6C0E1758">
+          <wp:inline distT="0" distB="0" distL="0" distR="0" wp14:anchorId="779E190D" wp14:editId="77658A87">
             <wp:extent cx="4119563" cy="2678842"/>
             <wp:effectExtent l="0" t="0" r="0" b="7620"/>
             <wp:docPr id="1081676429" name="그림 2" descr="Refraction and Snell's Law - YouTube"/>
@@ -3642,19 +3642,7 @@
         <w:rPr>
           <w:rFonts w:hint="eastAsia"/>
         </w:rPr>
-        <w:t>11.</w:t>
-      </w:r>
-      <w:r>
-        <w:rPr>
-          <w:rFonts w:hint="eastAsia"/>
-        </w:rPr>
-        <w:t>3</w:t>
-      </w:r>
-      <w:r>
-        <w:rPr>
-          <w:rFonts w:hint="eastAsia"/>
-        </w:rPr>
-        <w:t xml:space="preserve"> </w:t>
+        <w:t xml:space="preserve">11.3 </w:t>
       </w:r>
       <w:r>
         <w:t>Total Internal Reflection</w:t>
@@ -3676,6 +3664,9 @@
     </w:p>
     <w:p>
       <w:r>
+        <w:rPr>
+          <w:noProof/>
+        </w:rPr>
         <w:drawing>
           <wp:inline distT="0" distB="0" distL="0" distR="0" wp14:anchorId="537E512B" wp14:editId="347617CD">
             <wp:extent cx="6300788" cy="2549574"/>
@@ -3714,23 +3705,12 @@
       </w:r>
     </w:p>
     <w:p>
-      <w:pPr>
-        <w:rPr>
-          <w:rFonts w:hint="eastAsia"/>
-        </w:rPr>
-      </w:pPr>
       <w:r>
         <w:rPr>
           <w:rFonts w:hint="eastAsia"/>
         </w:rPr>
         <w:lastRenderedPageBreak/>
-        <w:t xml:space="preserve">If the angle is so steep that </w:t>
-      </w:r>
-      <w:r>
-        <w:rPr>
-          <w:rFonts w:hint="eastAsia"/>
-        </w:rPr>
-        <w:t xml:space="preserve">sin </w:t>
+        <w:t xml:space="preserve">If the angle is so steep that sin </w:t>
       </w:r>
       <w:r>
         <w:t>θ</w:t>
@@ -3739,13 +3719,7 @@
         <w:rPr>
           <w:rFonts w:hint="eastAsia"/>
         </w:rPr>
-        <w:t xml:space="preserve"> is near 1, </w:t>
-      </w:r>
-      <w:r>
-        <w:rPr>
-          <w:rFonts w:hint="eastAsia"/>
-        </w:rPr>
-        <w:t xml:space="preserve">sin </w:t>
+        <w:t xml:space="preserve"> is near 1, sin </w:t>
       </w:r>
       <w:r>
         <w:t>θ’</w:t>
@@ -3785,11 +3759,6 @@
       </w:r>
     </w:p>
     <w:p>
-      <w:pPr>
-        <w:rPr>
-          <w:rFonts w:hint="eastAsia"/>
-        </w:rPr>
-      </w:pPr>
       <w:r>
         <w:t xml:space="preserve">Here all the light is reflected, and because in practice that is usually inside solid objects, it is called </w:t>
       </w:r>
@@ -3821,13 +3790,7 @@
         <w:rPr>
           <w:rFonts w:hint="eastAsia"/>
         </w:rPr>
-        <w:t xml:space="preserve">We can solve for </w:t>
-      </w:r>
-      <w:r>
-        <w:rPr>
-          <w:rFonts w:hint="eastAsia"/>
-        </w:rPr>
-        <w:t xml:space="preserve">sin </w:t>
+        <w:t xml:space="preserve">We can solve for sin </w:t>
       </w:r>
       <w:r>
         <w:t>θ</w:t>
@@ -3842,11 +3805,11 @@
     <w:p>
       <w:pPr>
         <w:ind w:firstLine="800"/>
-        <w:rPr>
-          <w:rFonts w:hint="eastAsia"/>
-        </w:rPr>
-      </w:pPr>
-      <w:r>
+      </w:pPr>
+      <w:r>
+        <w:rPr>
+          <w:noProof/>
+        </w:rPr>
         <w:drawing>
           <wp:inline distT="0" distB="0" distL="0" distR="0" wp14:anchorId="368A766E" wp14:editId="78EE2EC7">
             <wp:extent cx="2219341" cy="600079"/>
@@ -3890,6 +3853,9 @@
         <w:tab/>
       </w:r>
       <w:r>
+        <w:rPr>
+          <w:noProof/>
+        </w:rPr>
         <w:drawing>
           <wp:inline distT="0" distB="0" distL="0" distR="0" wp14:anchorId="24EBB2BC" wp14:editId="01349D42">
             <wp:extent cx="1581162" cy="476253"/>
@@ -3928,6 +3894,118 @@
       </w:r>
     </w:p>
     <w:p/>
+    <w:p>
+      <w:pPr>
+        <w:rPr>
+          <w:rFonts w:hint="eastAsia"/>
+        </w:rPr>
+      </w:pPr>
+      <w:r>
+        <w:rPr>
+          <w:rFonts w:hint="eastAsia"/>
+        </w:rPr>
+        <w:t>G</w:t>
+      </w:r>
+      <w:r>
+        <w:t xml:space="preserve">iven a sphere of material with an index of refraction greater than air, there's no incident angle that will yield total internal reflection </w:t>
+      </w:r>
+      <w:r>
+        <w:t>–</w:t>
+      </w:r>
+      <w:r>
+        <w:t xml:space="preserve"> neither at the ray-sphere entrance point nor at the ray exit. This is due to the geometry of spheres, as a grazing incoming ray will always be bent to a smaller angle, and then bent back to the original angle on exit</w:t>
+      </w:r>
+    </w:p>
+    <w:p>
+      <w:r>
+        <w:t>So how can we illustrate total internal reflection</w:t>
+      </w:r>
+      <w:r>
+        <w:rPr>
+          <w:rFonts w:hint="eastAsia"/>
+        </w:rPr>
+        <w:t xml:space="preserve"> for glass/dielectric material</w:t>
+      </w:r>
+      <w:r>
+        <w:t xml:space="preserve">? </w:t>
+      </w:r>
+      <w:r>
+        <w:rPr>
+          <w:rFonts w:hint="eastAsia"/>
+        </w:rPr>
+        <w:t>If</w:t>
+      </w:r>
+      <w:r>
+        <w:t xml:space="preserve"> the sphere has an index of refraction less than the medium it's in, then we can hit it with shallow grazing angles, getting total external reflection. That should be good enough to observe the effect.</w:t>
+      </w:r>
+    </w:p>
+    <w:p>
+      <w:r>
+        <w:t xml:space="preserve">We'll model a world filled with water (index of refraction approximately 1.33), and change the sphere material to air (index of refraction 1.00) </w:t>
+      </w:r>
+      <w:r>
+        <w:t>–</w:t>
+      </w:r>
+      <w:r>
+        <w:t xml:space="preserve"> an air bubble! To do this, change the left sphere material's index of refraction to</w:t>
+      </w:r>
+      <w:r>
+        <w:rPr>
+          <w:rFonts w:hint="eastAsia"/>
+        </w:rPr>
+        <w:t>:</w:t>
+      </w:r>
+    </w:p>
+    <w:p>
+      <w:pPr>
+        <w:jc w:val="center"/>
+      </w:pPr>
+      <w:r>
+        <w:drawing>
+          <wp:inline distT="0" distB="0" distL="0" distR="0" wp14:anchorId="27D0477A" wp14:editId="7C52E729">
+            <wp:extent cx="2895621" cy="685805"/>
+            <wp:effectExtent l="0" t="0" r="0" b="0"/>
+            <wp:docPr id="1753706873" name="그림 1"/>
+            <wp:cNvGraphicFramePr>
+              <a:graphicFrameLocks xmlns:a="http://schemas.openxmlformats.org/drawingml/2006/main" noChangeAspect="1"/>
+            </wp:cNvGraphicFramePr>
+            <a:graphic xmlns:a="http://schemas.openxmlformats.org/drawingml/2006/main">
+              <a:graphicData uri="http://schemas.openxmlformats.org/drawingml/2006/picture">
+                <pic:pic xmlns:pic="http://schemas.openxmlformats.org/drawingml/2006/picture">
+                  <pic:nvPicPr>
+                    <pic:cNvPr id="1753706873" name=""/>
+                    <pic:cNvPicPr/>
+                  </pic:nvPicPr>
+                  <pic:blipFill>
+                    <a:blip r:embed="rId34"/>
+                    <a:stretch>
+                      <a:fillRect/>
+                    </a:stretch>
+                  </pic:blipFill>
+                  <pic:spPr>
+                    <a:xfrm>
+                      <a:off x="0" y="0"/>
+                      <a:ext cx="2895621" cy="685805"/>
+                    </a:xfrm>
+                    <a:prstGeom prst="rect">
+                      <a:avLst/>
+                    </a:prstGeom>
+                  </pic:spPr>
+                </pic:pic>
+              </a:graphicData>
+            </a:graphic>
+          </wp:inline>
+        </w:drawing>
+      </w:r>
+    </w:p>
+    <w:p/>
+    <w:p>
+      <w:pPr>
+        <w:rPr>
+          <w:rFonts w:hint="eastAsia"/>
+        </w:rPr>
+      </w:pPr>
+    </w:p>
     <w:p>
       <w:pPr>
         <w:rPr>

</xml_diff>

<commit_message>
Added image rendered using Schlick approximation
</commit_message>
<xml_diff>
--- a/Notes.docx
+++ b/Notes.docx
@@ -242,10 +242,29 @@
         <w:rPr>
           <w:rFonts w:hint="eastAsia"/>
         </w:rPr>
-        <w:t xml:space="preserve"> &lt; 1) </w:t>
-      </w:r>
-      <w:r>
-        <w:t xml:space="preserve">? 1 : </w:t>
+        <w:t xml:space="preserve"> &lt; 1</w:t>
+      </w:r>
+      <w:proofErr w:type="gramStart"/>
+      <w:r>
+        <w:rPr>
+          <w:rFonts w:hint="eastAsia"/>
+        </w:rPr>
+        <w:t xml:space="preserve">) </w:t>
+      </w:r>
+      <w:r>
+        <w:t>?</w:t>
+      </w:r>
+      <w:proofErr w:type="gramEnd"/>
+      <w:r>
+        <w:t xml:space="preserve"> </w:t>
+      </w:r>
+      <w:proofErr w:type="gramStart"/>
+      <w:r>
+        <w:t>1 :</w:t>
+      </w:r>
+      <w:proofErr w:type="gramEnd"/>
+      <w:r>
+        <w:t xml:space="preserve"> </w:t>
       </w:r>
       <w:proofErr w:type="spellStart"/>
       <w:r>
@@ -262,7 +281,23 @@
           <w:b/>
           <w:bCs/>
         </w:rPr>
-        <w:t xml:space="preserve">? 1 : </w:t>
+        <w:t xml:space="preserve">? </w:t>
+      </w:r>
+      <w:proofErr w:type="gramStart"/>
+      <w:r>
+        <w:rPr>
+          <w:b/>
+          <w:bCs/>
+        </w:rPr>
+        <w:t>1 :</w:t>
+      </w:r>
+      <w:proofErr w:type="gramEnd"/>
+      <w:r>
+        <w:rPr>
+          <w:b/>
+          <w:bCs/>
+        </w:rPr>
+        <w:t xml:space="preserve"> </w:t>
       </w:r>
       <w:proofErr w:type="spellStart"/>
       <w:r>
@@ -508,8 +543,13 @@
         </w:rPr>
         <w:t xml:space="preserve"> a standard equation defined by </w:t>
       </w:r>
-      <w:r>
-        <w:t>lerp(a, b, t) = a * (1 - t) + b * t</w:t>
+      <w:proofErr w:type="gramStart"/>
+      <w:r>
+        <w:t>lerp(</w:t>
+      </w:r>
+      <w:proofErr w:type="gramEnd"/>
+      <w:r>
+        <w:t>a, b, t) = a * (1 - t) + b * t</w:t>
       </w:r>
     </w:p>
     <w:p>
@@ -629,7 +669,21 @@
         <w:rPr>
           <w:rFonts w:hint="eastAsia"/>
         </w:rPr>
-        <w:t>(C-P)*(C-P) is the dot product of the length of the origin-to-center vector. For the equation of that value being equal to r</w:t>
+        <w:t>(C-</w:t>
+      </w:r>
+      <w:proofErr w:type="gramStart"/>
+      <w:r>
+        <w:rPr>
+          <w:rFonts w:hint="eastAsia"/>
+        </w:rPr>
+        <w:t>P)*</w:t>
+      </w:r>
+      <w:proofErr w:type="gramEnd"/>
+      <w:r>
+        <w:rPr>
+          <w:rFonts w:hint="eastAsia"/>
+        </w:rPr>
+        <w:t>(C-P) is the dot product of the length of the origin-to-center vector. For the equation of that value being equal to r</w:t>
       </w:r>
       <w:r>
         <w:rPr>
@@ -642,10 +696,21 @@
         <w:rPr>
           <w:rFonts w:hint="eastAsia"/>
         </w:rPr>
-        <w:t xml:space="preserve">, imagine a sphere of radius r migrated (C-P) distance away from origin (camera lens). The ray, if allowed to permeate through, will intersect these </w:t>
-      </w:r>
-      <w:r>
-        <w:t>selection o</w:t>
+        <w:t xml:space="preserve">, imagine a sphere of radius r migrated (C-P) distance away from origin (camera lens). The ray, if allowed to permeate through, will intersect </w:t>
+      </w:r>
+      <w:proofErr w:type="gramStart"/>
+      <w:r>
+        <w:rPr>
+          <w:rFonts w:hint="eastAsia"/>
+        </w:rPr>
+        <w:t xml:space="preserve">these </w:t>
+      </w:r>
+      <w:r>
+        <w:t>selection</w:t>
+      </w:r>
+      <w:proofErr w:type="gramEnd"/>
+      <w:r>
+        <w:t xml:space="preserve"> o</w:t>
       </w:r>
       <w:r>
         <w:rPr>
@@ -939,18 +1004,40 @@
         <w:t>This means that the directional vector (</w:t>
       </w:r>
       <w:proofErr w:type="spellStart"/>
-      <w:r>
-        <w:rPr>
-          <w:rFonts w:hint="eastAsia"/>
-        </w:rPr>
-        <w:t>x,y,z</w:t>
+      <w:proofErr w:type="gramStart"/>
+      <w:r>
+        <w:rPr>
+          <w:rFonts w:hint="eastAsia"/>
+        </w:rPr>
+        <w:t>x,y</w:t>
+      </w:r>
+      <w:proofErr w:type="gramEnd"/>
+      <w:r>
+        <w:rPr>
+          <w:rFonts w:hint="eastAsia"/>
+        </w:rPr>
+        <w:t>,z</w:t>
       </w:r>
       <w:proofErr w:type="spellEnd"/>
       <w:r>
         <w:rPr>
           <w:rFonts w:hint="eastAsia"/>
         </w:rPr>
-        <w:t>) of the unit surface normal is mapped to (R,G,B)</w:t>
+        <w:t>) of the unit surface normal is mapped to (</w:t>
+      </w:r>
+      <w:proofErr w:type="gramStart"/>
+      <w:r>
+        <w:rPr>
+          <w:rFonts w:hint="eastAsia"/>
+        </w:rPr>
+        <w:t>R,G</w:t>
+      </w:r>
+      <w:proofErr w:type="gramEnd"/>
+      <w:r>
+        <w:rPr>
+          <w:rFonts w:hint="eastAsia"/>
+        </w:rPr>
+        <w:t>,B)</w:t>
       </w:r>
     </w:p>
     <w:p>
@@ -1160,7 +1247,21 @@
         <w:rPr>
           <w:rFonts w:hint="eastAsia"/>
         </w:rPr>
-        <w:t>s based on preference. However, because there are way more material types than different geometries, it</w:t>
+        <w:t xml:space="preserve">s based on preference. However, because there </w:t>
+      </w:r>
+      <w:proofErr w:type="gramStart"/>
+      <w:r>
+        <w:rPr>
+          <w:rFonts w:hint="eastAsia"/>
+        </w:rPr>
+        <w:t>are</w:t>
+      </w:r>
+      <w:proofErr w:type="gramEnd"/>
+      <w:r>
+        <w:rPr>
+          <w:rFonts w:hint="eastAsia"/>
+        </w:rPr>
+        <w:t xml:space="preserve"> way more material types than different geometries, it</w:t>
       </w:r>
       <w:r>
         <w:t>’</w:t>
@@ -1191,7 +1292,15 @@
         <w:t xml:space="preserve"> </w:t>
       </w:r>
       <w:r>
-        <w:t>Moving Camera Code Into Its Own Class</w:t>
+        <w:t xml:space="preserve">Moving Camera Code </w:t>
+      </w:r>
+      <w:proofErr w:type="gramStart"/>
+      <w:r>
+        <w:t>Into</w:t>
+      </w:r>
+      <w:proofErr w:type="gramEnd"/>
+      <w:r>
+        <w:t xml:space="preserve"> Its Own Class</w:t>
       </w:r>
     </w:p>
     <w:p>
@@ -1427,7 +1536,21 @@
         <w:rPr>
           <w:rFonts w:hint="eastAsia"/>
         </w:rPr>
-        <w:t>. At the current state, if we were to render a 8 x 8 checkerboard far away such that it</w:t>
+        <w:t xml:space="preserve">. At the current state, if we were to render </w:t>
+      </w:r>
+      <w:proofErr w:type="gramStart"/>
+      <w:r>
+        <w:rPr>
+          <w:rFonts w:hint="eastAsia"/>
+        </w:rPr>
+        <w:t>a</w:t>
+      </w:r>
+      <w:proofErr w:type="gramEnd"/>
+      <w:r>
+        <w:rPr>
+          <w:rFonts w:hint="eastAsia"/>
+        </w:rPr>
+        <w:t xml:space="preserve"> 8 x 8 checkerboard far away such that it</w:t>
       </w:r>
       <w:r>
         <w:t>’</w:t>
@@ -1496,7 +1619,21 @@
         <w:rPr>
           <w:rFonts w:hint="eastAsia"/>
         </w:rPr>
-        <w:t xml:space="preserve">ll sample the four square regions of a pixel that extends halfway into each of the four neighboring pixels </w:t>
+        <w:t xml:space="preserve">ll sample the </w:t>
+      </w:r>
+      <w:proofErr w:type="gramStart"/>
+      <w:r>
+        <w:rPr>
+          <w:rFonts w:hint="eastAsia"/>
+        </w:rPr>
+        <w:t>four square</w:t>
+      </w:r>
+      <w:proofErr w:type="gramEnd"/>
+      <w:r>
+        <w:rPr>
+          <w:rFonts w:hint="eastAsia"/>
+        </w:rPr>
+        <w:t xml:space="preserve"> regions of a pixel that extends halfway into each of the four neighboring pixels </w:t>
       </w:r>
       <w:r>
         <w:t>–</w:t>
@@ -2077,7 +2214,21 @@
         <w:rPr>
           <w:rFonts w:hint="eastAsia"/>
         </w:rPr>
-        <w:t>Imagine two unit spheres intersecting this hit point, one on each side of the sphere object.</w:t>
+        <w:t xml:space="preserve">Imagine </w:t>
+      </w:r>
+      <w:proofErr w:type="gramStart"/>
+      <w:r>
+        <w:rPr>
+          <w:rFonts w:hint="eastAsia"/>
+        </w:rPr>
+        <w:t>two unit</w:t>
+      </w:r>
+      <w:proofErr w:type="gramEnd"/>
+      <w:r>
+        <w:rPr>
+          <w:rFonts w:hint="eastAsia"/>
+        </w:rPr>
+        <w:t xml:space="preserve"> spheres intersecting this hit point, one on each side of the sphere object.</w:t>
       </w:r>
       <w:r>
         <w:rPr>
@@ -2517,7 +2668,15 @@
         <w:t xml:space="preserve"> because</w:t>
       </w:r>
       <w:r>
-        <w:t xml:space="preserve"> almost all computer programs assume that an image is “gamma corrected” before being written into an image file. This means that the 0 to 1 values have some transform applied before being stored as a byte. Images with data that are written without being transformed are said to be in </w:t>
+        <w:t xml:space="preserve"> almost all computer programs assume that an image is “gamma corrected” before being written into an image file. This means that the 0 to 1 </w:t>
+      </w:r>
+      <w:proofErr w:type="gramStart"/>
+      <w:r>
+        <w:t>values</w:t>
+      </w:r>
+      <w:proofErr w:type="gramEnd"/>
+      <w:r>
+        <w:t xml:space="preserve"> have some transform applied before being stored as a byte. Images with data that are written without being transformed are said to be in </w:t>
       </w:r>
       <w:r>
         <w:rPr>
@@ -2841,15 +3000,31 @@
       </w:r>
       <w:proofErr w:type="spellEnd"/>
       <w:r>
-        <w:t> will be set to point at the material pointer the sphere was given when it was set up in main() when we start. When the </w:t>
+        <w:t> will be set to point at the material pointer the sphere was given when it was set up in </w:t>
+      </w:r>
+      <w:proofErr w:type="gramStart"/>
+      <w:r>
+        <w:t>main(</w:t>
+      </w:r>
+      <w:proofErr w:type="gramEnd"/>
+      <w:r>
+        <w:t>) when we start. When the </w:t>
       </w:r>
       <w:proofErr w:type="spellStart"/>
       <w:r>
-        <w:t>ray_color</w:t>
+        <w:t>ray_</w:t>
+      </w:r>
+      <w:proofErr w:type="gramStart"/>
+      <w:r>
+        <w:t>color</w:t>
       </w:r>
       <w:proofErr w:type="spellEnd"/>
       <w:r>
-        <w:t>() routine gets the </w:t>
+        <w:t>(</w:t>
+      </w:r>
+      <w:proofErr w:type="gramEnd"/>
+      <w:r>
+        <w:t>) routine gets the </w:t>
       </w:r>
       <w:proofErr w:type="spellStart"/>
       <w:r>
@@ -3517,7 +3692,7 @@
           <w:noProof/>
         </w:rPr>
         <w:drawing>
-          <wp:inline distT="0" distB="0" distL="0" distR="0" wp14:anchorId="779E190D" wp14:editId="77658A87">
+          <wp:inline distT="0" distB="0" distL="0" distR="0" wp14:anchorId="779E190D" wp14:editId="70DBF4AA">
             <wp:extent cx="4119563" cy="2678842"/>
             <wp:effectExtent l="0" t="0" r="0" b="7620"/>
             <wp:docPr id="1081676429" name="그림 2" descr="Refraction and Snell's Law - YouTube"/>
@@ -4001,11 +4176,6 @@
     </w:p>
     <w:p/>
     <w:p>
-      <w:pPr>
-        <w:rPr>
-          <w:rFonts w:hint="eastAsia"/>
-        </w:rPr>
-      </w:pPr>
       <w:r>
         <w:rPr>
           <w:rFonts w:hint="eastAsia"/>
@@ -4067,6 +4237,9 @@
         <w:jc w:val="center"/>
       </w:pPr>
       <w:r>
+        <w:rPr>
+          <w:noProof/>
+        </w:rPr>
         <w:drawing>
           <wp:inline distT="0" distB="0" distL="0" distR="0" wp14:anchorId="27D0477A" wp14:editId="7C52E729">
             <wp:extent cx="2895621" cy="685805"/>
@@ -4114,13 +4287,83 @@
         <w:rPr>
           <w:rFonts w:hint="eastAsia"/>
         </w:rPr>
+        <w:t xml:space="preserve">11.4 </w:t>
+      </w:r>
+      <w:r>
+        <w:t>Schlick Approximation</w:t>
+      </w:r>
+    </w:p>
+    <w:p>
+      <w:r>
+        <w:rPr>
+          <w:rFonts w:hint="eastAsia"/>
+        </w:rPr>
+        <w:t>R</w:t>
+      </w:r>
+      <w:r>
+        <w:t xml:space="preserve">eal glass has reflectivity that varies with angle </w:t>
+      </w:r>
+      <w:r>
+        <w:t>–</w:t>
+      </w:r>
+      <w:r>
+        <w:t xml:space="preserve"> look</w:t>
+      </w:r>
+      <w:r>
+        <w:rPr>
+          <w:rFonts w:hint="eastAsia"/>
+        </w:rPr>
+        <w:t>ing</w:t>
+      </w:r>
+      <w:r>
+        <w:t xml:space="preserve"> at a window at a steep angle </w:t>
+      </w:r>
+      <w:r>
+        <w:rPr>
+          <w:rFonts w:hint="eastAsia"/>
+        </w:rPr>
+        <w:t>makes it</w:t>
+      </w:r>
+      <w:r>
+        <w:t xml:space="preserve"> be</w:t>
+      </w:r>
+      <w:r>
+        <w:rPr>
+          <w:rFonts w:hint="eastAsia"/>
+        </w:rPr>
+        <w:t>have like</w:t>
+      </w:r>
+      <w:r>
+        <w:t xml:space="preserve"> a mirror.</w:t>
+      </w:r>
+      <w:r>
+        <w:rPr>
+          <w:rFonts w:hint="eastAsia"/>
+        </w:rPr>
+        <w:t xml:space="preserve"> </w:t>
+      </w:r>
+      <w:r>
+        <w:t>There is a super complex equation, but usually a cheap, yet surprisingly accurate polynomial approximation by Christophe Schlick is used.</w:t>
+      </w:r>
+    </w:p>
+    <w:p/>
+    <w:p/>
+    <w:p>
+      <w:pPr>
+        <w:pStyle w:val="2"/>
+      </w:pPr>
+      <w:r>
+        <w:rPr>
+          <w:rFonts w:hint="eastAsia"/>
+        </w:rPr>
+        <w:lastRenderedPageBreak/>
         <w:t>11.</w:t>
       </w:r>
       <w:r>
         <w:rPr>
           <w:rFonts w:hint="eastAsia"/>
         </w:rPr>
-        <w:t>4</w:t>
+        <w:t>5</w:t>
       </w:r>
       <w:r>
         <w:rPr>
@@ -4129,67 +4372,12 @@
         <w:t xml:space="preserve"> </w:t>
       </w:r>
       <w:r>
-        <w:t>Schlick Approximation</w:t>
-      </w:r>
-    </w:p>
-    <w:p>
-      <w:pPr>
-        <w:rPr>
-          <w:rFonts w:hint="eastAsia"/>
-        </w:rPr>
-      </w:pPr>
-      <w:r>
-        <w:rPr>
-          <w:rFonts w:hint="eastAsia"/>
-        </w:rPr>
-        <w:t>R</w:t>
-      </w:r>
-      <w:r>
-        <w:t xml:space="preserve">eal glass has reflectivity that varies with angle </w:t>
-      </w:r>
-      <w:r>
-        <w:t>–</w:t>
-      </w:r>
-      <w:r>
-        <w:t xml:space="preserve"> look</w:t>
-      </w:r>
-      <w:r>
-        <w:rPr>
-          <w:rFonts w:hint="eastAsia"/>
-        </w:rPr>
-        <w:t>ing</w:t>
-      </w:r>
-      <w:r>
-        <w:t xml:space="preserve"> at a window at a steep angle </w:t>
-      </w:r>
-      <w:r>
-        <w:rPr>
-          <w:rFonts w:hint="eastAsia"/>
-        </w:rPr>
-        <w:t>makes it</w:t>
-      </w:r>
-      <w:r>
-        <w:t xml:space="preserve"> be</w:t>
-      </w:r>
-      <w:r>
-        <w:rPr>
-          <w:rFonts w:hint="eastAsia"/>
-        </w:rPr>
-        <w:t>have like</w:t>
-      </w:r>
-      <w:r>
-        <w:t xml:space="preserve"> a mirror.</w:t>
-      </w:r>
-      <w:r>
-        <w:rPr>
-          <w:rFonts w:hint="eastAsia"/>
-        </w:rPr>
-        <w:t xml:space="preserve"> </w:t>
-      </w:r>
-      <w:r>
-        <w:t>There is a super complex equation, but usually a cheap, yet surprisingly accurate polynomial approximation by Christophe Schlick is used.</w:t>
-      </w:r>
-    </w:p>
+        <w:t>Modeling a Hollow Glass Sphere</w:t>
+      </w:r>
+    </w:p>
+    <w:p/>
+    <w:p/>
+    <w:p/>
     <w:p>
       <w:pPr>
         <w:rPr>

</xml_diff>

<commit_message>
Implementing hollow glass sphere
</commit_message>
<xml_diff>
--- a/Notes.docx
+++ b/Notes.docx
@@ -216,61 +216,15 @@
       <w:r>
         <w:tab/>
       </w:r>
-      <w:proofErr w:type="spellStart"/>
-      <w:r>
-        <w:rPr>
-          <w:rFonts w:hint="eastAsia"/>
-        </w:rPr>
-        <w:t>image_height</w:t>
-      </w:r>
-      <w:proofErr w:type="spellEnd"/>
-      <w:r>
-        <w:rPr>
-          <w:rFonts w:hint="eastAsia"/>
-        </w:rPr>
-        <w:t xml:space="preserve"> = (</w:t>
-      </w:r>
-      <w:proofErr w:type="spellStart"/>
-      <w:r>
-        <w:rPr>
-          <w:rFonts w:hint="eastAsia"/>
-        </w:rPr>
-        <w:t>image_height</w:t>
-      </w:r>
-      <w:proofErr w:type="spellEnd"/>
-      <w:r>
-        <w:rPr>
-          <w:rFonts w:hint="eastAsia"/>
-        </w:rPr>
-        <w:t xml:space="preserve"> &lt; 1</w:t>
-      </w:r>
-      <w:proofErr w:type="gramStart"/>
-      <w:r>
-        <w:rPr>
-          <w:rFonts w:hint="eastAsia"/>
-        </w:rPr>
-        <w:t xml:space="preserve">) </w:t>
-      </w:r>
-      <w:r>
-        <w:t>?</w:t>
-      </w:r>
-      <w:proofErr w:type="gramEnd"/>
-      <w:r>
-        <w:t xml:space="preserve"> </w:t>
-      </w:r>
-      <w:proofErr w:type="gramStart"/>
-      <w:r>
-        <w:t>1 :</w:t>
-      </w:r>
-      <w:proofErr w:type="gramEnd"/>
-      <w:r>
-        <w:t xml:space="preserve"> </w:t>
-      </w:r>
-      <w:proofErr w:type="spellStart"/>
-      <w:r>
-        <w:t>image_height</w:t>
-      </w:r>
-      <w:proofErr w:type="spellEnd"/>
+      <w:r>
+        <w:rPr>
+          <w:rFonts w:hint="eastAsia"/>
+        </w:rPr>
+        <w:t xml:space="preserve">image_height = (image_height &lt; 1) </w:t>
+      </w:r>
+      <w:r>
+        <w:t>? 1 : image_height</w:t>
+      </w:r>
     </w:p>
     <w:p>
       <w:pPr>
@@ -281,36 +235,11 @@
           <w:b/>
           <w:bCs/>
         </w:rPr>
-        <w:t xml:space="preserve">? </w:t>
-      </w:r>
-      <w:proofErr w:type="gramStart"/>
-      <w:r>
-        <w:rPr>
-          <w:b/>
-          <w:bCs/>
-        </w:rPr>
-        <w:t>1 :</w:t>
-      </w:r>
-      <w:proofErr w:type="gramEnd"/>
-      <w:r>
-        <w:rPr>
-          <w:b/>
-          <w:bCs/>
-        </w:rPr>
+        <w:t>? 1 : image_height</w:t>
+      </w:r>
+      <w:r>
         <w:t xml:space="preserve"> </w:t>
       </w:r>
-      <w:proofErr w:type="spellStart"/>
-      <w:r>
-        <w:rPr>
-          <w:b/>
-          <w:bCs/>
-        </w:rPr>
-        <w:t>image_height</w:t>
-      </w:r>
-      <w:proofErr w:type="spellEnd"/>
-      <w:r>
-        <w:t xml:space="preserve"> </w:t>
-      </w:r>
       <w:r>
         <w:rPr>
           <w:rFonts w:hint="eastAsia"/>
@@ -359,13 +288,8 @@
         <w:t>F</w:t>
       </w:r>
       <w:r>
-        <w:t xml:space="preserve">alse, use </w:t>
-      </w:r>
-      <w:proofErr w:type="spellStart"/>
-      <w:r>
-        <w:t>image_height</w:t>
-      </w:r>
-      <w:proofErr w:type="spellEnd"/>
+        <w:t>alse, use image_height</w:t>
+      </w:r>
     </w:p>
     <w:p>
       <w:r>
@@ -543,13 +467,8 @@
         </w:rPr>
         <w:t xml:space="preserve"> a standard equation defined by </w:t>
       </w:r>
-      <w:proofErr w:type="gramStart"/>
-      <w:r>
-        <w:t>lerp(</w:t>
-      </w:r>
-      <w:proofErr w:type="gramEnd"/>
-      <w:r>
-        <w:t>a, b, t) = a * (1 - t) + b * t</w:t>
+      <w:r>
+        <w:t>lerp(a, b, t) = a * (1 - t) + b * t</w:t>
       </w:r>
     </w:p>
     <w:p>
@@ -669,21 +588,7 @@
         <w:rPr>
           <w:rFonts w:hint="eastAsia"/>
         </w:rPr>
-        <w:t>(C-</w:t>
-      </w:r>
-      <w:proofErr w:type="gramStart"/>
-      <w:r>
-        <w:rPr>
-          <w:rFonts w:hint="eastAsia"/>
-        </w:rPr>
-        <w:t>P)*</w:t>
-      </w:r>
-      <w:proofErr w:type="gramEnd"/>
-      <w:r>
-        <w:rPr>
-          <w:rFonts w:hint="eastAsia"/>
-        </w:rPr>
-        <w:t>(C-P) is the dot product of the length of the origin-to-center vector. For the equation of that value being equal to r</w:t>
+        <w:t>(C-P)*(C-P) is the dot product of the length of the origin-to-center vector. For the equation of that value being equal to r</w:t>
       </w:r>
       <w:r>
         <w:rPr>
@@ -696,21 +601,10 @@
         <w:rPr>
           <w:rFonts w:hint="eastAsia"/>
         </w:rPr>
-        <w:t xml:space="preserve">, imagine a sphere of radius r migrated (C-P) distance away from origin (camera lens). The ray, if allowed to permeate through, will intersect </w:t>
-      </w:r>
-      <w:proofErr w:type="gramStart"/>
-      <w:r>
-        <w:rPr>
-          <w:rFonts w:hint="eastAsia"/>
-        </w:rPr>
-        <w:t xml:space="preserve">these </w:t>
-      </w:r>
-      <w:r>
-        <w:t>selection</w:t>
-      </w:r>
-      <w:proofErr w:type="gramEnd"/>
-      <w:r>
-        <w:t xml:space="preserve"> o</w:t>
+        <w:t xml:space="preserve">, imagine a sphere of radius r migrated (C-P) distance away from origin (camera lens). The ray, if allowed to permeate through, will intersect these </w:t>
+      </w:r>
+      <w:r>
+        <w:t>selection o</w:t>
       </w:r>
       <w:r>
         <w:rPr>
@@ -1001,43 +895,7 @@
           <w:rFonts w:hint="eastAsia"/>
         </w:rPr>
         <w:lastRenderedPageBreak/>
-        <w:t>This means that the directional vector (</w:t>
-      </w:r>
-      <w:proofErr w:type="spellStart"/>
-      <w:proofErr w:type="gramStart"/>
-      <w:r>
-        <w:rPr>
-          <w:rFonts w:hint="eastAsia"/>
-        </w:rPr>
-        <w:t>x,y</w:t>
-      </w:r>
-      <w:proofErr w:type="gramEnd"/>
-      <w:r>
-        <w:rPr>
-          <w:rFonts w:hint="eastAsia"/>
-        </w:rPr>
-        <w:t>,z</w:t>
-      </w:r>
-      <w:proofErr w:type="spellEnd"/>
-      <w:r>
-        <w:rPr>
-          <w:rFonts w:hint="eastAsia"/>
-        </w:rPr>
-        <w:t>) of the unit surface normal is mapped to (</w:t>
-      </w:r>
-      <w:proofErr w:type="gramStart"/>
-      <w:r>
-        <w:rPr>
-          <w:rFonts w:hint="eastAsia"/>
-        </w:rPr>
-        <w:t>R,G</w:t>
-      </w:r>
-      <w:proofErr w:type="gramEnd"/>
-      <w:r>
-        <w:rPr>
-          <w:rFonts w:hint="eastAsia"/>
-        </w:rPr>
-        <w:t>,B)</w:t>
+        <w:t>This means that the directional vector (x,y,z) of the unit surface normal is mapped to (R,G,B)</w:t>
       </w:r>
     </w:p>
     <w:p>
@@ -1247,21 +1105,7 @@
         <w:rPr>
           <w:rFonts w:hint="eastAsia"/>
         </w:rPr>
-        <w:t xml:space="preserve">s based on preference. However, because there </w:t>
-      </w:r>
-      <w:proofErr w:type="gramStart"/>
-      <w:r>
-        <w:rPr>
-          <w:rFonts w:hint="eastAsia"/>
-        </w:rPr>
-        <w:t>are</w:t>
-      </w:r>
-      <w:proofErr w:type="gramEnd"/>
-      <w:r>
-        <w:rPr>
-          <w:rFonts w:hint="eastAsia"/>
-        </w:rPr>
-        <w:t xml:space="preserve"> way more material types than different geometries, it</w:t>
+        <w:t>s based on preference. However, because there are way more material types than different geometries, it</w:t>
       </w:r>
       <w:r>
         <w:t>’</w:t>
@@ -1292,15 +1136,7 @@
         <w:t xml:space="preserve"> </w:t>
       </w:r>
       <w:r>
-        <w:t xml:space="preserve">Moving Camera Code </w:t>
-      </w:r>
-      <w:proofErr w:type="gramStart"/>
-      <w:r>
-        <w:t>Into</w:t>
-      </w:r>
-      <w:proofErr w:type="gramEnd"/>
-      <w:r>
-        <w:t xml:space="preserve"> Its Own Class</w:t>
+        <w:t>Moving Camera Code Into Its Own Class</w:t>
       </w:r>
     </w:p>
     <w:p>
@@ -1310,11 +1146,9 @@
         </w:rPr>
         <w:t xml:space="preserve">After creating </w:t>
       </w:r>
-      <w:proofErr w:type="spellStart"/>
       <w:r>
         <w:t>rtweekend.h</w:t>
       </w:r>
-      <w:proofErr w:type="spellEnd"/>
       <w:r>
         <w:rPr>
           <w:rFonts w:hint="eastAsia"/>
@@ -1536,21 +1370,7 @@
         <w:rPr>
           <w:rFonts w:hint="eastAsia"/>
         </w:rPr>
-        <w:t xml:space="preserve">. At the current state, if we were to render </w:t>
-      </w:r>
-      <w:proofErr w:type="gramStart"/>
-      <w:r>
-        <w:rPr>
-          <w:rFonts w:hint="eastAsia"/>
-        </w:rPr>
-        <w:t>a</w:t>
-      </w:r>
-      <w:proofErr w:type="gramEnd"/>
-      <w:r>
-        <w:rPr>
-          <w:rFonts w:hint="eastAsia"/>
-        </w:rPr>
-        <w:t xml:space="preserve"> 8 x 8 checkerboard far away such that it</w:t>
+        <w:t>. At the current state, if we were to render a 8 x 8 checkerboard far away such that it</w:t>
       </w:r>
       <w:r>
         <w:t>’</w:t>
@@ -1619,21 +1439,7 @@
         <w:rPr>
           <w:rFonts w:hint="eastAsia"/>
         </w:rPr>
-        <w:t xml:space="preserve">ll sample the </w:t>
-      </w:r>
-      <w:proofErr w:type="gramStart"/>
-      <w:r>
-        <w:rPr>
-          <w:rFonts w:hint="eastAsia"/>
-        </w:rPr>
-        <w:t>four square</w:t>
-      </w:r>
-      <w:proofErr w:type="gramEnd"/>
-      <w:r>
-        <w:rPr>
-          <w:rFonts w:hint="eastAsia"/>
-        </w:rPr>
-        <w:t xml:space="preserve"> regions of a pixel that extends halfway into each of the four neighboring pixels </w:t>
+        <w:t xml:space="preserve">ll sample the four square regions of a pixel that extends halfway into each of the four neighboring pixels </w:t>
       </w:r>
       <w:r>
         <w:t>–</w:t>
@@ -2214,21 +2020,7 @@
         <w:rPr>
           <w:rFonts w:hint="eastAsia"/>
         </w:rPr>
-        <w:t xml:space="preserve">Imagine </w:t>
-      </w:r>
-      <w:proofErr w:type="gramStart"/>
-      <w:r>
-        <w:rPr>
-          <w:rFonts w:hint="eastAsia"/>
-        </w:rPr>
-        <w:t>two unit</w:t>
-      </w:r>
-      <w:proofErr w:type="gramEnd"/>
-      <w:r>
-        <w:rPr>
-          <w:rFonts w:hint="eastAsia"/>
-        </w:rPr>
-        <w:t xml:space="preserve"> spheres intersecting this hit point, one on each side of the sphere object.</w:t>
+        <w:t>Imagine two unit spheres intersecting this hit point, one on each side of the sphere object.</w:t>
       </w:r>
       <w:r>
         <w:rPr>
@@ -2248,7 +2040,6 @@
       <w:r>
         <w:t> (</w:t>
       </w:r>
-      <w:proofErr w:type="spellStart"/>
       <w:r>
         <w:rPr>
           <w:b/>
@@ -2266,7 +2057,6 @@
         </w:rPr>
         <w:t>n</w:t>
       </w:r>
-      <w:proofErr w:type="spellEnd"/>
       <w:r>
         <w:t xml:space="preserve">) and the </w:t>
       </w:r>
@@ -2562,21 +2352,7 @@
         <w:rPr>
           <w:rFonts w:hint="eastAsia"/>
         </w:rPr>
-        <w:t xml:space="preserve"> in real life, it would be pretty bright. We will see the brightness gamut for the diffuse material by adjusting the reflectance of </w:t>
-      </w:r>
-      <w:proofErr w:type="spellStart"/>
-      <w:r>
-        <w:rPr>
-          <w:rFonts w:hint="eastAsia"/>
-        </w:rPr>
-        <w:t>ray_color</w:t>
-      </w:r>
-      <w:proofErr w:type="spellEnd"/>
-      <w:r>
-        <w:rPr>
-          <w:rFonts w:hint="eastAsia"/>
-        </w:rPr>
-        <w:t xml:space="preserve"> from 0.5 to 0.1</w:t>
+        <w:t xml:space="preserve"> in real life, it would be pretty bright. We will see the brightness gamut for the diffuse material by adjusting the reflectance of ray_color from 0.5 to 0.1</w:t>
       </w:r>
     </w:p>
     <w:p>
@@ -2668,15 +2444,7 @@
         <w:t xml:space="preserve"> because</w:t>
       </w:r>
       <w:r>
-        <w:t xml:space="preserve"> almost all computer programs assume that an image is “gamma corrected” before being written into an image file. This means that the 0 to 1 </w:t>
-      </w:r>
-      <w:proofErr w:type="gramStart"/>
-      <w:r>
-        <w:t>values</w:t>
-      </w:r>
-      <w:proofErr w:type="gramEnd"/>
-      <w:r>
-        <w:t xml:space="preserve"> have some transform applied before being stored as a byte. Images with data that are written without being transformed are said to be in </w:t>
+        <w:t xml:space="preserve"> almost all computer programs assume that an image is “gamma corrected” before being written into an image file. This means that the 0 to 1 values have some transform applied before being stored as a byte. Images with data that are written without being transformed are said to be in </w:t>
       </w:r>
       <w:r>
         <w:rPr>
@@ -2727,7 +2495,6 @@
         </w:rPr>
         <w:t xml:space="preserve"> (</w:t>
       </w:r>
-      <w:proofErr w:type="spellStart"/>
       <w:r>
         <w:rPr>
           <w:rFonts w:hAnsiTheme="minorEastAsia" w:hint="eastAsia"/>
@@ -2736,7 +2503,6 @@
         </w:rPr>
         <w:t>γ</w:t>
       </w:r>
-      <w:proofErr w:type="spellEnd"/>
       <w:r>
         <w:rPr>
           <w:rFonts w:hint="eastAsia"/>
@@ -2830,11 +2596,9 @@
         </w:rPr>
         <w:t xml:space="preserve"> </w:t>
       </w:r>
-      <w:proofErr w:type="spellStart"/>
       <w:r>
         <w:t>cr</w:t>
       </w:r>
-      <w:proofErr w:type="spellEnd"/>
       <w:r>
         <w:rPr>
           <w:rFonts w:hint="eastAsia"/>
@@ -2986,53 +2750,8 @@
       </w:r>
     </w:p>
     <w:p>
-      <w:proofErr w:type="spellStart"/>
-      <w:r>
-        <w:t>hit_record</w:t>
-      </w:r>
-      <w:proofErr w:type="spellEnd"/>
-      <w:r>
-        <w:t> is just a way to stuff a bunch of arguments into a class so we can send them as a group. When a ray hits a surface (a particular sphere for example), the material pointer in the </w:t>
-      </w:r>
-      <w:proofErr w:type="spellStart"/>
-      <w:r>
-        <w:t>hit_record</w:t>
-      </w:r>
-      <w:proofErr w:type="spellEnd"/>
-      <w:r>
-        <w:t> will be set to point at the material pointer the sphere was given when it was set up in </w:t>
-      </w:r>
-      <w:proofErr w:type="gramStart"/>
-      <w:r>
-        <w:t>main(</w:t>
-      </w:r>
-      <w:proofErr w:type="gramEnd"/>
-      <w:r>
-        <w:t>) when we start. When the </w:t>
-      </w:r>
-      <w:proofErr w:type="spellStart"/>
-      <w:r>
-        <w:t>ray_</w:t>
-      </w:r>
-      <w:proofErr w:type="gramStart"/>
-      <w:r>
-        <w:t>color</w:t>
-      </w:r>
-      <w:proofErr w:type="spellEnd"/>
-      <w:r>
-        <w:t>(</w:t>
-      </w:r>
-      <w:proofErr w:type="gramEnd"/>
-      <w:r>
-        <w:t>) routine gets the </w:t>
-      </w:r>
-      <w:proofErr w:type="spellStart"/>
-      <w:r>
-        <w:t>hit_record</w:t>
-      </w:r>
-      <w:proofErr w:type="spellEnd"/>
-      <w:r>
-        <w:t> it can call member functions of the material pointer to find out what ray, if any, is scattered.</w:t>
+      <w:r>
+        <w:t>hit_record is just a way to stuff a bunch of arguments into a class so we can send them as a group. When a ray hits a surface (a particular sphere for example), the material pointer in the hit_record will be set to point at the material pointer the sphere was given when it was set up in main() when we start. When the ray_color() routine gets the hit_record it can call member functions of the material pointer to find out what ray, if any, is scattered.</w:t>
       </w:r>
     </w:p>
     <w:p/>
@@ -3692,7 +3411,7 @@
           <w:noProof/>
         </w:rPr>
         <w:drawing>
-          <wp:inline distT="0" distB="0" distL="0" distR="0" wp14:anchorId="779E190D" wp14:editId="70DBF4AA">
+          <wp:inline distT="0" distB="0" distL="0" distR="0" wp14:anchorId="779E190D" wp14:editId="60A889F1">
             <wp:extent cx="4119563" cy="2678842"/>
             <wp:effectExtent l="0" t="0" r="0" b="7620"/>
             <wp:docPr id="1081676429" name="그림 2" descr="Refraction and Snell's Law - YouTube"/>
@@ -4357,34 +4076,82 @@
           <w:rFonts w:hint="eastAsia"/>
         </w:rPr>
         <w:lastRenderedPageBreak/>
-        <w:t>11.</w:t>
-      </w:r>
-      <w:r>
-        <w:rPr>
-          <w:rFonts w:hint="eastAsia"/>
-        </w:rPr>
-        <w:t>5</w:t>
-      </w:r>
-      <w:r>
-        <w:rPr>
-          <w:rFonts w:hint="eastAsia"/>
-        </w:rPr>
-        <w:t xml:space="preserve"> </w:t>
+        <w:t xml:space="preserve">11.5 </w:t>
       </w:r>
       <w:r>
         <w:t>Modeling a Hollow Glass Sphere</w:t>
       </w:r>
     </w:p>
+    <w:p>
+      <w:pPr>
+        <w:rPr>
+          <w:rFonts w:hint="eastAsia"/>
+        </w:rPr>
+      </w:pPr>
+      <w:r>
+        <w:rPr>
+          <w:rFonts w:hint="eastAsia"/>
+        </w:rPr>
+        <w:t xml:space="preserve">A hollow glass sphere can be modeled by creating a sphere of some thickness with another sphere of air inside it. </w:t>
+      </w:r>
+      <w:r>
+        <w:rPr>
+          <w:rFonts w:hint="eastAsia"/>
+        </w:rPr>
+        <w:t xml:space="preserve">For a </w:t>
+      </w:r>
+      <w:r>
+        <w:t>ray going through such an object, it will hit the outer sphere, refract, hit the inner sphere (assuming we do hit it), refract a second time, and travel through the air inside. Then it will continue on, hit the inside surface of the inner sphere, refract back, then hit the inside surface of the outer sphere, and finally refract and exit back into the scene atmosphere.</w:t>
+      </w:r>
+    </w:p>
+    <w:p>
+      <w:r>
+        <w:t>The outer sphere is just modeled with a standard glass sphere, with a refractive index of around 1.50 (modeling a refraction from the outside air into glass). The inner sphere is a bit different because </w:t>
+      </w:r>
+      <w:r>
+        <w:rPr>
+          <w:i/>
+          <w:iCs/>
+        </w:rPr>
+        <w:t>its</w:t>
+      </w:r>
+      <w:r>
+        <w:t> refractive index should be relative to the material of the surrounding outer sphere, thus modeling a transition from glass into the inner air.</w:t>
+      </w:r>
+    </w:p>
+    <w:p>
+      <w:r>
+        <w:t>This is actually simple to specify, as the </w:t>
+      </w:r>
+      <w:r>
+        <w:rPr>
+          <w:i/>
+          <w:iCs/>
+        </w:rPr>
+        <w:t>refraction_index</w:t>
+      </w:r>
+      <w:r>
+        <w:t> parameter to the dielectric material can be interpreted as the </w:t>
+      </w:r>
+      <w:r>
+        <w:rPr>
+          <w:i/>
+          <w:iCs/>
+        </w:rPr>
+        <w:t>ratio</w:t>
+      </w:r>
+      <w:r>
+        <w:t> of the refractive index of the object divided by the refractive index of the enclosing medium. In this case, the inner sphere would have a refractive index of air (the inner sphere material) over the index of refraction of glass (the enclosing medium), or 1.00/1.50=0.67.</w:t>
+      </w:r>
+    </w:p>
+    <w:p>
+      <w:pPr>
+        <w:rPr>
+          <w:rFonts w:hint="eastAsia"/>
+        </w:rPr>
+      </w:pPr>
+    </w:p>
     <w:p/>
-    <w:p/>
-    <w:p/>
-    <w:p>
-      <w:pPr>
-        <w:rPr>
-          <w:rFonts w:hint="eastAsia"/>
-        </w:rPr>
-      </w:pPr>
-    </w:p>
     <w:p/>
     <w:sectPr>
       <w:pgSz w:w="11906" w:h="16838"/>

</xml_diff>

<commit_message>
Added some field of view notes
</commit_message>
<xml_diff>
--- a/Notes.docx
+++ b/Notes.docx
@@ -216,15 +216,42 @@
       <w:r>
         <w:tab/>
       </w:r>
-      <w:r>
-        <w:rPr>
-          <w:rFonts w:hint="eastAsia"/>
-        </w:rPr>
-        <w:t xml:space="preserve">image_height = (image_height &lt; 1) </w:t>
-      </w:r>
-      <w:r>
-        <w:t>? 1 : image_height</w:t>
-      </w:r>
+      <w:proofErr w:type="spellStart"/>
+      <w:r>
+        <w:rPr>
+          <w:rFonts w:hint="eastAsia"/>
+        </w:rPr>
+        <w:t>image_height</w:t>
+      </w:r>
+      <w:proofErr w:type="spellEnd"/>
+      <w:r>
+        <w:rPr>
+          <w:rFonts w:hint="eastAsia"/>
+        </w:rPr>
+        <w:t xml:space="preserve"> = (</w:t>
+      </w:r>
+      <w:proofErr w:type="spellStart"/>
+      <w:r>
+        <w:rPr>
+          <w:rFonts w:hint="eastAsia"/>
+        </w:rPr>
+        <w:t>image_height</w:t>
+      </w:r>
+      <w:proofErr w:type="spellEnd"/>
+      <w:r>
+        <w:rPr>
+          <w:rFonts w:hint="eastAsia"/>
+        </w:rPr>
+        <w:t xml:space="preserve"> &lt; 1) </w:t>
+      </w:r>
+      <w:r>
+        <w:t xml:space="preserve">? 1 : </w:t>
+      </w:r>
+      <w:proofErr w:type="spellStart"/>
+      <w:r>
+        <w:t>image_height</w:t>
+      </w:r>
+      <w:proofErr w:type="spellEnd"/>
     </w:p>
     <w:p>
       <w:pPr>
@@ -235,8 +262,17 @@
           <w:b/>
           <w:bCs/>
         </w:rPr>
-        <w:t>? 1 : image_height</w:t>
-      </w:r>
+        <w:t xml:space="preserve">? 1 : </w:t>
+      </w:r>
+      <w:proofErr w:type="spellStart"/>
+      <w:r>
+        <w:rPr>
+          <w:b/>
+          <w:bCs/>
+        </w:rPr>
+        <w:t>image_height</w:t>
+      </w:r>
+      <w:proofErr w:type="spellEnd"/>
       <w:r>
         <w:t xml:space="preserve"> </w:t>
       </w:r>
@@ -288,8 +324,13 @@
         <w:t>F</w:t>
       </w:r>
       <w:r>
-        <w:t>alse, use image_height</w:t>
-      </w:r>
+        <w:t xml:space="preserve">alse, use </w:t>
+      </w:r>
+      <w:proofErr w:type="spellStart"/>
+      <w:r>
+        <w:t>image_height</w:t>
+      </w:r>
+      <w:proofErr w:type="spellEnd"/>
     </w:p>
     <w:p>
       <w:r>
@@ -895,7 +936,21 @@
           <w:rFonts w:hint="eastAsia"/>
         </w:rPr>
         <w:lastRenderedPageBreak/>
-        <w:t>This means that the directional vector (x,y,z) of the unit surface normal is mapped to (R,G,B)</w:t>
+        <w:t>This means that the directional vector (</w:t>
+      </w:r>
+      <w:proofErr w:type="spellStart"/>
+      <w:r>
+        <w:rPr>
+          <w:rFonts w:hint="eastAsia"/>
+        </w:rPr>
+        <w:t>x,y,z</w:t>
+      </w:r>
+      <w:proofErr w:type="spellEnd"/>
+      <w:r>
+        <w:rPr>
+          <w:rFonts w:hint="eastAsia"/>
+        </w:rPr>
+        <w:t>) of the unit surface normal is mapped to (R,G,B)</w:t>
       </w:r>
     </w:p>
     <w:p>
@@ -1146,9 +1201,11 @@
         </w:rPr>
         <w:t xml:space="preserve">After creating </w:t>
       </w:r>
+      <w:proofErr w:type="spellStart"/>
       <w:r>
         <w:t>rtweekend.h</w:t>
       </w:r>
+      <w:proofErr w:type="spellEnd"/>
       <w:r>
         <w:rPr>
           <w:rFonts w:hint="eastAsia"/>
@@ -2040,6 +2097,7 @@
       <w:r>
         <w:t> (</w:t>
       </w:r>
+      <w:proofErr w:type="spellStart"/>
       <w:r>
         <w:rPr>
           <w:b/>
@@ -2057,6 +2115,7 @@
         </w:rPr>
         <w:t>n</w:t>
       </w:r>
+      <w:proofErr w:type="spellEnd"/>
       <w:r>
         <w:t xml:space="preserve">) and the </w:t>
       </w:r>
@@ -2352,7 +2411,21 @@
         <w:rPr>
           <w:rFonts w:hint="eastAsia"/>
         </w:rPr>
-        <w:t xml:space="preserve"> in real life, it would be pretty bright. We will see the brightness gamut for the diffuse material by adjusting the reflectance of ray_color from 0.5 to 0.1</w:t>
+        <w:t xml:space="preserve"> in real life, it would be pretty bright. We will see the brightness gamut for the diffuse material by adjusting the reflectance of </w:t>
+      </w:r>
+      <w:proofErr w:type="spellStart"/>
+      <w:r>
+        <w:rPr>
+          <w:rFonts w:hint="eastAsia"/>
+        </w:rPr>
+        <w:t>ray_color</w:t>
+      </w:r>
+      <w:proofErr w:type="spellEnd"/>
+      <w:r>
+        <w:rPr>
+          <w:rFonts w:hint="eastAsia"/>
+        </w:rPr>
+        <w:t xml:space="preserve"> from 0.5 to 0.1</w:t>
       </w:r>
     </w:p>
     <w:p>
@@ -2495,6 +2568,7 @@
         </w:rPr>
         <w:t xml:space="preserve"> (</w:t>
       </w:r>
+      <w:proofErr w:type="spellStart"/>
       <w:r>
         <w:rPr>
           <w:rFonts w:hAnsiTheme="minorEastAsia" w:hint="eastAsia"/>
@@ -2503,6 +2577,7 @@
         </w:rPr>
         <w:t>γ</w:t>
       </w:r>
+      <w:proofErr w:type="spellEnd"/>
       <w:r>
         <w:rPr>
           <w:rFonts w:hint="eastAsia"/>
@@ -2596,9 +2671,11 @@
         </w:rPr>
         <w:t xml:space="preserve"> </w:t>
       </w:r>
+      <w:proofErr w:type="spellStart"/>
       <w:r>
         <w:t>cr</w:t>
       </w:r>
+      <w:proofErr w:type="spellEnd"/>
       <w:r>
         <w:rPr>
           <w:rFonts w:hint="eastAsia"/>
@@ -2750,8 +2827,37 @@
       </w:r>
     </w:p>
     <w:p>
-      <w:r>
-        <w:t>hit_record is just a way to stuff a bunch of arguments into a class so we can send them as a group. When a ray hits a surface (a particular sphere for example), the material pointer in the hit_record will be set to point at the material pointer the sphere was given when it was set up in main() when we start. When the ray_color() routine gets the hit_record it can call member functions of the material pointer to find out what ray, if any, is scattered.</w:t>
+      <w:proofErr w:type="spellStart"/>
+      <w:r>
+        <w:t>hit_record</w:t>
+      </w:r>
+      <w:proofErr w:type="spellEnd"/>
+      <w:r>
+        <w:t> is just a way to stuff a bunch of arguments into a class so we can send them as a group. When a ray hits a surface (a particular sphere for example), the material pointer in the </w:t>
+      </w:r>
+      <w:proofErr w:type="spellStart"/>
+      <w:r>
+        <w:t>hit_record</w:t>
+      </w:r>
+      <w:proofErr w:type="spellEnd"/>
+      <w:r>
+        <w:t> will be set to point at the material pointer the sphere was given when it was set up in main() when we start. When the </w:t>
+      </w:r>
+      <w:proofErr w:type="spellStart"/>
+      <w:r>
+        <w:t>ray_color</w:t>
+      </w:r>
+      <w:proofErr w:type="spellEnd"/>
+      <w:r>
+        <w:t>() routine gets the </w:t>
+      </w:r>
+      <w:proofErr w:type="spellStart"/>
+      <w:r>
+        <w:t>hit_record</w:t>
+      </w:r>
+      <w:proofErr w:type="spellEnd"/>
+      <w:r>
+        <w:t> it can call member functions of the material pointer to find out what ray, if any, is scattered.</w:t>
       </w:r>
     </w:p>
     <w:p/>
@@ -3411,7 +3517,7 @@
           <w:noProof/>
         </w:rPr>
         <w:drawing>
-          <wp:inline distT="0" distB="0" distL="0" distR="0" wp14:anchorId="779E190D" wp14:editId="60A889F1">
+          <wp:inline distT="0" distB="0" distL="0" distR="0" wp14:anchorId="779E190D" wp14:editId="26B90CCD">
             <wp:extent cx="4119563" cy="2678842"/>
             <wp:effectExtent l="0" t="0" r="0" b="7620"/>
             <wp:docPr id="1081676429" name="그림 2" descr="Refraction and Snell's Law - YouTube"/>
@@ -4083,11 +4189,6 @@
       </w:r>
     </w:p>
     <w:p>
-      <w:pPr>
-        <w:rPr>
-          <w:rFonts w:hint="eastAsia"/>
-        </w:rPr>
-      </w:pPr>
       <w:r>
         <w:rPr>
           <w:rFonts w:hint="eastAsia"/>
@@ -4123,6 +4224,7 @@
       <w:r>
         <w:t>This is actually simple to specify, as the </w:t>
       </w:r>
+      <w:proofErr w:type="spellStart"/>
       <w:r>
         <w:rPr>
           <w:i/>
@@ -4130,6 +4232,7 @@
         </w:rPr>
         <w:t>refraction_index</w:t>
       </w:r>
+      <w:proofErr w:type="spellEnd"/>
       <w:r>
         <w:t> parameter to the dielectric material can be interpreted as the </w:t>
       </w:r>
@@ -4144,14 +4247,252 @@
         <w:t> of the refractive index of the object divided by the refractive index of the enclosing medium. In this case, the inner sphere would have a refractive index of air (the inner sphere material) over the index of refraction of glass (the enclosing medium), or 1.00/1.50=0.67.</w:t>
       </w:r>
     </w:p>
-    <w:p>
-      <w:pPr>
-        <w:rPr>
-          <w:rFonts w:hint="eastAsia"/>
-        </w:rPr>
-      </w:pPr>
-    </w:p>
     <w:p/>
+    <w:p/>
+    <w:p>
+      <w:pPr>
+        <w:pStyle w:val="2"/>
+      </w:pPr>
+      <w:r>
+        <w:rPr>
+          <w:rFonts w:hint="eastAsia"/>
+        </w:rPr>
+        <w:t>12</w:t>
+      </w:r>
+      <w:r>
+        <w:rPr>
+          <w:rFonts w:hint="eastAsia"/>
+        </w:rPr>
+        <w:t xml:space="preserve"> </w:t>
+      </w:r>
+      <w:proofErr w:type="spellStart"/>
+      <w:r>
+        <w:t>Positionable</w:t>
+      </w:r>
+      <w:proofErr w:type="spellEnd"/>
+      <w:r>
+        <w:t xml:space="preserve"> Camera</w:t>
+      </w:r>
+    </w:p>
+    <w:p>
+      <w:pPr>
+        <w:rPr>
+          <w:rFonts w:hint="eastAsia"/>
+        </w:rPr>
+      </w:pPr>
+      <w:r>
+        <w:rPr>
+          <w:rFonts w:hint="eastAsia"/>
+        </w:rPr>
+        <w:t xml:space="preserve">A </w:t>
+      </w:r>
+      <w:r>
+        <w:rPr>
+          <w:i/>
+          <w:iCs/>
+        </w:rPr>
+        <w:t>field of view</w:t>
+      </w:r>
+      <w:r>
+        <w:t xml:space="preserve"> (</w:t>
+      </w:r>
+      <w:proofErr w:type="spellStart"/>
+      <w:r>
+        <w:t>fov</w:t>
+      </w:r>
+      <w:proofErr w:type="spellEnd"/>
+      <w:r>
+        <w:rPr>
+          <w:rFonts w:hint="eastAsia"/>
+        </w:rPr>
+        <w:t>)</w:t>
+      </w:r>
+      <w:r>
+        <w:t xml:space="preserve"> is the visual angle from edge to edge of the rendered image</w:t>
+      </w:r>
+      <w:r>
+        <w:rPr>
+          <w:rFonts w:hint="eastAsia"/>
+        </w:rPr>
+        <w:t>.</w:t>
+      </w:r>
+    </w:p>
+    <w:p/>
+    <w:p/>
+    <w:p>
+      <w:pPr>
+        <w:pStyle w:val="2"/>
+      </w:pPr>
+      <w:r>
+        <w:rPr>
+          <w:rFonts w:hint="eastAsia"/>
+        </w:rPr>
+        <w:t>12</w:t>
+      </w:r>
+      <w:r>
+        <w:rPr>
+          <w:rFonts w:hint="eastAsia"/>
+        </w:rPr>
+        <w:t xml:space="preserve">.1 </w:t>
+      </w:r>
+      <w:r>
+        <w:t>Camera Viewing Geometry</w:t>
+      </w:r>
+    </w:p>
+    <w:p>
+      <w:pPr>
+        <w:rPr>
+          <w:rFonts w:hint="eastAsia"/>
+        </w:rPr>
+      </w:pPr>
+      <w:r>
+        <w:rPr>
+          <w:rFonts w:hint="eastAsia"/>
+        </w:rPr>
+        <w:t>W</w:t>
+      </w:r>
+      <w:r>
+        <w:t>e'll keep the rays coming from the origin and heading to the z=</w:t>
+      </w:r>
+      <w:r>
+        <w:rPr>
+          <w:rFonts w:ascii="Cambria Math" w:hAnsi="Cambria Math" w:cs="Cambria Math" w:hint="eastAsia"/>
+        </w:rPr>
+        <w:t>-</w:t>
+      </w:r>
+      <w:r>
+        <w:t>1 plane</w:t>
+      </w:r>
+      <w:r>
+        <w:rPr>
+          <w:rFonts w:hint="eastAsia"/>
+        </w:rPr>
+        <w:t xml:space="preserve"> with</w:t>
+      </w:r>
+      <w:r>
+        <w:t xml:space="preserve"> </w:t>
+      </w:r>
+      <w:r>
+        <w:rPr>
+          <w:i/>
+          <w:iCs/>
+        </w:rPr>
+        <w:t>h</w:t>
+      </w:r>
+      <w:r>
+        <w:t xml:space="preserve"> a ratio to that distance</w:t>
+      </w:r>
+      <w:r>
+        <w:rPr>
+          <w:rFonts w:hint="eastAsia"/>
+        </w:rPr>
+        <w:t xml:space="preserve">. </w:t>
+      </w:r>
+      <w:r>
+        <w:rPr>
+          <w:rFonts w:hint="eastAsia"/>
+        </w:rPr>
+        <w:t>This implies h = tan (</w:t>
+      </w:r>
+      <w:r>
+        <w:t>θ</w:t>
+      </w:r>
+      <w:r>
+        <w:rPr>
+          <w:rFonts w:hint="eastAsia"/>
+        </w:rPr>
+        <w:t>/2)</w:t>
+      </w:r>
+      <w:r>
+        <w:rPr>
+          <w:rFonts w:hint="eastAsia"/>
+        </w:rPr>
+        <w:t>:</w:t>
+      </w:r>
+    </w:p>
+    <w:p>
+      <w:pPr>
+        <w:jc w:val="center"/>
+      </w:pPr>
+      <w:r>
+        <w:rPr>
+          <w:noProof/>
+        </w:rPr>
+        <w:drawing>
+          <wp:inline distT="0" distB="0" distL="0" distR="0" wp14:anchorId="0C008127" wp14:editId="1C68E1F8">
+            <wp:extent cx="2500313" cy="2593962"/>
+            <wp:effectExtent l="0" t="0" r="0" b="0"/>
+            <wp:docPr id="65283196" name="그림 1"/>
+            <wp:cNvGraphicFramePr>
+              <a:graphicFrameLocks xmlns:a="http://schemas.openxmlformats.org/drawingml/2006/main" noChangeAspect="1"/>
+            </wp:cNvGraphicFramePr>
+            <a:graphic xmlns:a="http://schemas.openxmlformats.org/drawingml/2006/main">
+              <a:graphicData uri="http://schemas.openxmlformats.org/drawingml/2006/picture">
+                <pic:pic xmlns:pic="http://schemas.openxmlformats.org/drawingml/2006/picture">
+                  <pic:nvPicPr>
+                    <pic:cNvPr id="0" name="Picture 1"/>
+                    <pic:cNvPicPr>
+                      <a:picLocks noChangeAspect="1" noChangeArrowheads="1"/>
+                    </pic:cNvPicPr>
+                  </pic:nvPicPr>
+                  <pic:blipFill>
+                    <a:blip r:embed="rId35" cstate="print">
+                      <a:extLst>
+                        <a:ext uri="{28A0092B-C50C-407E-A947-70E740481C1C}">
+                          <a14:useLocalDpi xmlns:a14="http://schemas.microsoft.com/office/drawing/2010/main" val="0"/>
+                        </a:ext>
+                      </a:extLst>
+                    </a:blip>
+                    <a:srcRect/>
+                    <a:stretch>
+                      <a:fillRect/>
+                    </a:stretch>
+                  </pic:blipFill>
+                  <pic:spPr bwMode="auto">
+                    <a:xfrm>
+                      <a:off x="0" y="0"/>
+                      <a:ext cx="2518180" cy="2612498"/>
+                    </a:xfrm>
+                    <a:prstGeom prst="rect">
+                      <a:avLst/>
+                    </a:prstGeom>
+                    <a:noFill/>
+                    <a:ln>
+                      <a:noFill/>
+                    </a:ln>
+                  </pic:spPr>
+                </pic:pic>
+              </a:graphicData>
+            </a:graphic>
+          </wp:inline>
+        </w:drawing>
+      </w:r>
+    </w:p>
+    <w:p>
+      <w:pPr>
+        <w:jc w:val="center"/>
+        <w:rPr>
+          <w:rFonts w:hint="eastAsia"/>
+        </w:rPr>
+      </w:pPr>
+      <w:r>
+        <w:t>Camera viewing geometry (from the side)</w:t>
+      </w:r>
+    </w:p>
+    <w:p>
+      <w:pPr>
+        <w:rPr>
+          <w:rFonts w:hint="eastAsia"/>
+        </w:rPr>
+      </w:pPr>
+    </w:p>
+    <w:p>
+      <w:pPr>
+        <w:rPr>
+          <w:rFonts w:hint="eastAsia"/>
+        </w:rPr>
+      </w:pPr>
+    </w:p>
     <w:p/>
     <w:sectPr>
       <w:pgSz w:w="11906" w:h="16838"/>
@@ -5287,6 +5628,7 @@
   <w:style w:type="character" w:default="1" w:styleId="a0">
     <w:name w:val="Default Paragraph Font"/>
     <w:uiPriority w:val="1"/>
+    <w:semiHidden/>
     <w:unhideWhenUsed/>
   </w:style>
   <w:style w:type="table" w:default="1" w:styleId="a1">

</xml_diff>

<commit_message>
Tested 90 degree field of view
</commit_message>
<xml_diff>
--- a/Notes.docx
+++ b/Notes.docx
@@ -242,10 +242,29 @@
         <w:rPr>
           <w:rFonts w:hint="eastAsia"/>
         </w:rPr>
-        <w:t xml:space="preserve"> &lt; 1) </w:t>
-      </w:r>
-      <w:r>
-        <w:t xml:space="preserve">? 1 : </w:t>
+        <w:t xml:space="preserve"> &lt; 1</w:t>
+      </w:r>
+      <w:proofErr w:type="gramStart"/>
+      <w:r>
+        <w:rPr>
+          <w:rFonts w:hint="eastAsia"/>
+        </w:rPr>
+        <w:t xml:space="preserve">) </w:t>
+      </w:r>
+      <w:r>
+        <w:t>?</w:t>
+      </w:r>
+      <w:proofErr w:type="gramEnd"/>
+      <w:r>
+        <w:t xml:space="preserve"> </w:t>
+      </w:r>
+      <w:proofErr w:type="gramStart"/>
+      <w:r>
+        <w:t>1 :</w:t>
+      </w:r>
+      <w:proofErr w:type="gramEnd"/>
+      <w:r>
+        <w:t xml:space="preserve"> </w:t>
       </w:r>
       <w:proofErr w:type="spellStart"/>
       <w:r>
@@ -262,7 +281,23 @@
           <w:b/>
           <w:bCs/>
         </w:rPr>
-        <w:t xml:space="preserve">? 1 : </w:t>
+        <w:t xml:space="preserve">? </w:t>
+      </w:r>
+      <w:proofErr w:type="gramStart"/>
+      <w:r>
+        <w:rPr>
+          <w:b/>
+          <w:bCs/>
+        </w:rPr>
+        <w:t>1 :</w:t>
+      </w:r>
+      <w:proofErr w:type="gramEnd"/>
+      <w:r>
+        <w:rPr>
+          <w:b/>
+          <w:bCs/>
+        </w:rPr>
+        <w:t xml:space="preserve"> </w:t>
       </w:r>
       <w:proofErr w:type="spellStart"/>
       <w:r>
@@ -508,8 +543,13 @@
         </w:rPr>
         <w:t xml:space="preserve"> a standard equation defined by </w:t>
       </w:r>
-      <w:r>
-        <w:t>lerp(a, b, t) = a * (1 - t) + b * t</w:t>
+      <w:proofErr w:type="gramStart"/>
+      <w:r>
+        <w:t>lerp(</w:t>
+      </w:r>
+      <w:proofErr w:type="gramEnd"/>
+      <w:r>
+        <w:t>a, b, t) = a * (1 - t) + b * t</w:t>
       </w:r>
     </w:p>
     <w:p>
@@ -629,7 +669,21 @@
         <w:rPr>
           <w:rFonts w:hint="eastAsia"/>
         </w:rPr>
-        <w:t>(C-P)*(C-P) is the dot product of the length of the origin-to-center vector. For the equation of that value being equal to r</w:t>
+        <w:t>(C-</w:t>
+      </w:r>
+      <w:proofErr w:type="gramStart"/>
+      <w:r>
+        <w:rPr>
+          <w:rFonts w:hint="eastAsia"/>
+        </w:rPr>
+        <w:t>P)*</w:t>
+      </w:r>
+      <w:proofErr w:type="gramEnd"/>
+      <w:r>
+        <w:rPr>
+          <w:rFonts w:hint="eastAsia"/>
+        </w:rPr>
+        <w:t>(C-P) is the dot product of the length of the origin-to-center vector. For the equation of that value being equal to r</w:t>
       </w:r>
       <w:r>
         <w:rPr>
@@ -642,10 +696,21 @@
         <w:rPr>
           <w:rFonts w:hint="eastAsia"/>
         </w:rPr>
-        <w:t xml:space="preserve">, imagine a sphere of radius r migrated (C-P) distance away from origin (camera lens). The ray, if allowed to permeate through, will intersect these </w:t>
-      </w:r>
-      <w:r>
-        <w:t>selection o</w:t>
+        <w:t xml:space="preserve">, imagine a sphere of radius r migrated (C-P) distance away from origin (camera lens). The ray, if allowed to permeate through, will intersect </w:t>
+      </w:r>
+      <w:proofErr w:type="gramStart"/>
+      <w:r>
+        <w:rPr>
+          <w:rFonts w:hint="eastAsia"/>
+        </w:rPr>
+        <w:t xml:space="preserve">these </w:t>
+      </w:r>
+      <w:r>
+        <w:t>selection</w:t>
+      </w:r>
+      <w:proofErr w:type="gramEnd"/>
+      <w:r>
+        <w:t xml:space="preserve"> o</w:t>
       </w:r>
       <w:r>
         <w:rPr>
@@ -939,18 +1004,40 @@
         <w:t>This means that the directional vector (</w:t>
       </w:r>
       <w:proofErr w:type="spellStart"/>
-      <w:r>
-        <w:rPr>
-          <w:rFonts w:hint="eastAsia"/>
-        </w:rPr>
-        <w:t>x,y,z</w:t>
+      <w:proofErr w:type="gramStart"/>
+      <w:r>
+        <w:rPr>
+          <w:rFonts w:hint="eastAsia"/>
+        </w:rPr>
+        <w:t>x,y</w:t>
+      </w:r>
+      <w:proofErr w:type="gramEnd"/>
+      <w:r>
+        <w:rPr>
+          <w:rFonts w:hint="eastAsia"/>
+        </w:rPr>
+        <w:t>,z</w:t>
       </w:r>
       <w:proofErr w:type="spellEnd"/>
       <w:r>
         <w:rPr>
           <w:rFonts w:hint="eastAsia"/>
         </w:rPr>
-        <w:t>) of the unit surface normal is mapped to (R,G,B)</w:t>
+        <w:t>) of the unit surface normal is mapped to (</w:t>
+      </w:r>
+      <w:proofErr w:type="gramStart"/>
+      <w:r>
+        <w:rPr>
+          <w:rFonts w:hint="eastAsia"/>
+        </w:rPr>
+        <w:t>R,G</w:t>
+      </w:r>
+      <w:proofErr w:type="gramEnd"/>
+      <w:r>
+        <w:rPr>
+          <w:rFonts w:hint="eastAsia"/>
+        </w:rPr>
+        <w:t>,B)</w:t>
       </w:r>
     </w:p>
     <w:p>
@@ -1160,7 +1247,21 @@
         <w:rPr>
           <w:rFonts w:hint="eastAsia"/>
         </w:rPr>
-        <w:t>s based on preference. However, because there are way more material types than different geometries, it</w:t>
+        <w:t xml:space="preserve">s based on preference. However, because there </w:t>
+      </w:r>
+      <w:proofErr w:type="gramStart"/>
+      <w:r>
+        <w:rPr>
+          <w:rFonts w:hint="eastAsia"/>
+        </w:rPr>
+        <w:t>are</w:t>
+      </w:r>
+      <w:proofErr w:type="gramEnd"/>
+      <w:r>
+        <w:rPr>
+          <w:rFonts w:hint="eastAsia"/>
+        </w:rPr>
+        <w:t xml:space="preserve"> way more material types than different geometries, it</w:t>
       </w:r>
       <w:r>
         <w:t>’</w:t>
@@ -1191,7 +1292,15 @@
         <w:t xml:space="preserve"> </w:t>
       </w:r>
       <w:r>
-        <w:t>Moving Camera Code Into Its Own Class</w:t>
+        <w:t xml:space="preserve">Moving Camera Code </w:t>
+      </w:r>
+      <w:proofErr w:type="gramStart"/>
+      <w:r>
+        <w:t>Into</w:t>
+      </w:r>
+      <w:proofErr w:type="gramEnd"/>
+      <w:r>
+        <w:t xml:space="preserve"> Its Own Class</w:t>
       </w:r>
     </w:p>
     <w:p>
@@ -1427,7 +1536,21 @@
         <w:rPr>
           <w:rFonts w:hint="eastAsia"/>
         </w:rPr>
-        <w:t>. At the current state, if we were to render a 8 x 8 checkerboard far away such that it</w:t>
+        <w:t xml:space="preserve">. At the current state, if we were to render </w:t>
+      </w:r>
+      <w:proofErr w:type="gramStart"/>
+      <w:r>
+        <w:rPr>
+          <w:rFonts w:hint="eastAsia"/>
+        </w:rPr>
+        <w:t>a</w:t>
+      </w:r>
+      <w:proofErr w:type="gramEnd"/>
+      <w:r>
+        <w:rPr>
+          <w:rFonts w:hint="eastAsia"/>
+        </w:rPr>
+        <w:t xml:space="preserve"> 8 x 8 checkerboard far away such that it</w:t>
       </w:r>
       <w:r>
         <w:t>’</w:t>
@@ -1496,7 +1619,21 @@
         <w:rPr>
           <w:rFonts w:hint="eastAsia"/>
         </w:rPr>
-        <w:t xml:space="preserve">ll sample the four square regions of a pixel that extends halfway into each of the four neighboring pixels </w:t>
+        <w:t xml:space="preserve">ll sample the </w:t>
+      </w:r>
+      <w:proofErr w:type="gramStart"/>
+      <w:r>
+        <w:rPr>
+          <w:rFonts w:hint="eastAsia"/>
+        </w:rPr>
+        <w:t>four square</w:t>
+      </w:r>
+      <w:proofErr w:type="gramEnd"/>
+      <w:r>
+        <w:rPr>
+          <w:rFonts w:hint="eastAsia"/>
+        </w:rPr>
+        <w:t xml:space="preserve"> regions of a pixel that extends halfway into each of the four neighboring pixels </w:t>
       </w:r>
       <w:r>
         <w:t>–</w:t>
@@ -2077,7 +2214,21 @@
         <w:rPr>
           <w:rFonts w:hint="eastAsia"/>
         </w:rPr>
-        <w:t>Imagine two unit spheres intersecting this hit point, one on each side of the sphere object.</w:t>
+        <w:t xml:space="preserve">Imagine </w:t>
+      </w:r>
+      <w:proofErr w:type="gramStart"/>
+      <w:r>
+        <w:rPr>
+          <w:rFonts w:hint="eastAsia"/>
+        </w:rPr>
+        <w:t>two unit</w:t>
+      </w:r>
+      <w:proofErr w:type="gramEnd"/>
+      <w:r>
+        <w:rPr>
+          <w:rFonts w:hint="eastAsia"/>
+        </w:rPr>
+        <w:t xml:space="preserve"> spheres intersecting this hit point, one on each side of the sphere object.</w:t>
       </w:r>
       <w:r>
         <w:rPr>
@@ -2517,7 +2668,15 @@
         <w:t xml:space="preserve"> because</w:t>
       </w:r>
       <w:r>
-        <w:t xml:space="preserve"> almost all computer programs assume that an image is “gamma corrected” before being written into an image file. This means that the 0 to 1 values have some transform applied before being stored as a byte. Images with data that are written without being transformed are said to be in </w:t>
+        <w:t xml:space="preserve"> almost all computer programs assume that an image is “gamma corrected” before being written into an image file. This means that the 0 to 1 </w:t>
+      </w:r>
+      <w:proofErr w:type="gramStart"/>
+      <w:r>
+        <w:t>values</w:t>
+      </w:r>
+      <w:proofErr w:type="gramEnd"/>
+      <w:r>
+        <w:t xml:space="preserve"> have some transform applied before being stored as a byte. Images with data that are written without being transformed are said to be in </w:t>
       </w:r>
       <w:r>
         <w:rPr>
@@ -2841,15 +3000,31 @@
       </w:r>
       <w:proofErr w:type="spellEnd"/>
       <w:r>
-        <w:t> will be set to point at the material pointer the sphere was given when it was set up in main() when we start. When the </w:t>
+        <w:t> will be set to point at the material pointer the sphere was given when it was set up in </w:t>
+      </w:r>
+      <w:proofErr w:type="gramStart"/>
+      <w:r>
+        <w:t>main(</w:t>
+      </w:r>
+      <w:proofErr w:type="gramEnd"/>
+      <w:r>
+        <w:t>) when we start. When the </w:t>
       </w:r>
       <w:proofErr w:type="spellStart"/>
       <w:r>
-        <w:t>ray_color</w:t>
+        <w:t>ray_</w:t>
+      </w:r>
+      <w:proofErr w:type="gramStart"/>
+      <w:r>
+        <w:t>color</w:t>
       </w:r>
       <w:proofErr w:type="spellEnd"/>
       <w:r>
-        <w:t>() routine gets the </w:t>
+        <w:t>(</w:t>
+      </w:r>
+      <w:proofErr w:type="gramEnd"/>
+      <w:r>
+        <w:t>) routine gets the </w:t>
       </w:r>
       <w:proofErr w:type="spellStart"/>
       <w:r>
@@ -3517,7 +3692,7 @@
           <w:noProof/>
         </w:rPr>
         <w:drawing>
-          <wp:inline distT="0" distB="0" distL="0" distR="0" wp14:anchorId="779E190D" wp14:editId="26B90CCD">
+          <wp:inline distT="0" distB="0" distL="0" distR="0" wp14:anchorId="779E190D" wp14:editId="0EF956BC">
             <wp:extent cx="4119563" cy="2678842"/>
             <wp:effectExtent l="0" t="0" r="0" b="7620"/>
             <wp:docPr id="1081676429" name="그림 2" descr="Refraction and Snell's Law - YouTube"/>
@@ -4257,13 +4432,7 @@
         <w:rPr>
           <w:rFonts w:hint="eastAsia"/>
         </w:rPr>
-        <w:t>12</w:t>
-      </w:r>
-      <w:r>
-        <w:rPr>
-          <w:rFonts w:hint="eastAsia"/>
-        </w:rPr>
-        <w:t xml:space="preserve"> </w:t>
+        <w:t xml:space="preserve">12 </w:t>
       </w:r>
       <w:proofErr w:type="spellStart"/>
       <w:r>
@@ -4275,11 +4444,6 @@
       </w:r>
     </w:p>
     <w:p>
-      <w:pPr>
-        <w:rPr>
-          <w:rFonts w:hint="eastAsia"/>
-        </w:rPr>
-      </w:pPr>
       <w:r>
         <w:rPr>
           <w:rFonts w:hint="eastAsia"/>
@@ -4327,24 +4491,13 @@
         <w:rPr>
           <w:rFonts w:hint="eastAsia"/>
         </w:rPr>
-        <w:t>12</w:t>
-      </w:r>
-      <w:r>
-        <w:rPr>
-          <w:rFonts w:hint="eastAsia"/>
-        </w:rPr>
-        <w:t xml:space="preserve">.1 </w:t>
+        <w:t xml:space="preserve">12.1 </w:t>
       </w:r>
       <w:r>
         <w:t>Camera Viewing Geometry</w:t>
       </w:r>
     </w:p>
     <w:p>
-      <w:pPr>
-        <w:rPr>
-          <w:rFonts w:hint="eastAsia"/>
-        </w:rPr>
-      </w:pPr>
       <w:r>
         <w:rPr>
           <w:rFonts w:hint="eastAsia"/>
@@ -4386,13 +4539,7 @@
         <w:rPr>
           <w:rFonts w:hint="eastAsia"/>
         </w:rPr>
-        <w:t xml:space="preserve">. </w:t>
-      </w:r>
-      <w:r>
-        <w:rPr>
-          <w:rFonts w:hint="eastAsia"/>
-        </w:rPr>
-        <w:t>This implies h = tan (</w:t>
+        <w:t>. This implies h = tan (</w:t>
       </w:r>
       <w:r>
         <w:t>θ</w:t>
@@ -4481,18 +4628,27 @@
     </w:p>
     <w:p>
       <w:pPr>
-        <w:rPr>
-          <w:rFonts w:hint="eastAsia"/>
-        </w:rPr>
-      </w:pPr>
-    </w:p>
-    <w:p>
-      <w:pPr>
-        <w:rPr>
-          <w:rFonts w:hint="eastAsia"/>
-        </w:rPr>
-      </w:pPr>
-    </w:p>
+        <w:pStyle w:val="2"/>
+      </w:pPr>
+      <w:r>
+        <w:rPr>
+          <w:rFonts w:hint="eastAsia"/>
+        </w:rPr>
+        <w:lastRenderedPageBreak/>
+        <w:t xml:space="preserve">12.1 </w:t>
+      </w:r>
+      <w:r>
+        <w:t>Positioning and Orienting the Camera</w:t>
+      </w:r>
+    </w:p>
+    <w:p>
+      <w:pPr>
+        <w:rPr>
+          <w:rFonts w:hint="eastAsia"/>
+        </w:rPr>
+      </w:pPr>
+    </w:p>
+    <w:p/>
     <w:p/>
     <w:sectPr>
       <w:pgSz w:w="11906" w:h="16838"/>
@@ -5628,7 +5784,6 @@
   <w:style w:type="character" w:default="1" w:styleId="a0">
     <w:name w:val="Default Paragraph Font"/>
     <w:uiPriority w:val="1"/>
-    <w:semiHidden/>
     <w:unhideWhenUsed/>
   </w:style>
   <w:style w:type="table" w:default="1" w:styleId="a1">

</xml_diff>

<commit_message>
Updated camera position notes
</commit_message>
<xml_diff>
--- a/Notes.docx
+++ b/Notes.docx
@@ -216,61 +216,15 @@
       <w:r>
         <w:tab/>
       </w:r>
-      <w:proofErr w:type="spellStart"/>
-      <w:r>
-        <w:rPr>
-          <w:rFonts w:hint="eastAsia"/>
-        </w:rPr>
-        <w:t>image_height</w:t>
-      </w:r>
-      <w:proofErr w:type="spellEnd"/>
-      <w:r>
-        <w:rPr>
-          <w:rFonts w:hint="eastAsia"/>
-        </w:rPr>
-        <w:t xml:space="preserve"> = (</w:t>
-      </w:r>
-      <w:proofErr w:type="spellStart"/>
-      <w:r>
-        <w:rPr>
-          <w:rFonts w:hint="eastAsia"/>
-        </w:rPr>
-        <w:t>image_height</w:t>
-      </w:r>
-      <w:proofErr w:type="spellEnd"/>
-      <w:r>
-        <w:rPr>
-          <w:rFonts w:hint="eastAsia"/>
-        </w:rPr>
-        <w:t xml:space="preserve"> &lt; 1</w:t>
-      </w:r>
-      <w:proofErr w:type="gramStart"/>
-      <w:r>
-        <w:rPr>
-          <w:rFonts w:hint="eastAsia"/>
-        </w:rPr>
-        <w:t xml:space="preserve">) </w:t>
-      </w:r>
-      <w:r>
-        <w:t>?</w:t>
-      </w:r>
-      <w:proofErr w:type="gramEnd"/>
-      <w:r>
-        <w:t xml:space="preserve"> </w:t>
-      </w:r>
-      <w:proofErr w:type="gramStart"/>
-      <w:r>
-        <w:t>1 :</w:t>
-      </w:r>
-      <w:proofErr w:type="gramEnd"/>
-      <w:r>
-        <w:t xml:space="preserve"> </w:t>
-      </w:r>
-      <w:proofErr w:type="spellStart"/>
-      <w:r>
-        <w:t>image_height</w:t>
-      </w:r>
-      <w:proofErr w:type="spellEnd"/>
+      <w:r>
+        <w:rPr>
+          <w:rFonts w:hint="eastAsia"/>
+        </w:rPr>
+        <w:t xml:space="preserve">image_height = (image_height &lt; 1) </w:t>
+      </w:r>
+      <w:r>
+        <w:t>? 1 : image_height</w:t>
+      </w:r>
     </w:p>
     <w:p>
       <w:pPr>
@@ -281,36 +235,11 @@
           <w:b/>
           <w:bCs/>
         </w:rPr>
-        <w:t xml:space="preserve">? </w:t>
-      </w:r>
-      <w:proofErr w:type="gramStart"/>
-      <w:r>
-        <w:rPr>
-          <w:b/>
-          <w:bCs/>
-        </w:rPr>
-        <w:t>1 :</w:t>
-      </w:r>
-      <w:proofErr w:type="gramEnd"/>
-      <w:r>
-        <w:rPr>
-          <w:b/>
-          <w:bCs/>
-        </w:rPr>
+        <w:t>? 1 : image_height</w:t>
+      </w:r>
+      <w:r>
         <w:t xml:space="preserve"> </w:t>
       </w:r>
-      <w:proofErr w:type="spellStart"/>
-      <w:r>
-        <w:rPr>
-          <w:b/>
-          <w:bCs/>
-        </w:rPr>
-        <w:t>image_height</w:t>
-      </w:r>
-      <w:proofErr w:type="spellEnd"/>
-      <w:r>
-        <w:t xml:space="preserve"> </w:t>
-      </w:r>
       <w:r>
         <w:rPr>
           <w:rFonts w:hint="eastAsia"/>
@@ -359,13 +288,8 @@
         <w:t>F</w:t>
       </w:r>
       <w:r>
-        <w:t xml:space="preserve">alse, use </w:t>
-      </w:r>
-      <w:proofErr w:type="spellStart"/>
-      <w:r>
-        <w:t>image_height</w:t>
-      </w:r>
-      <w:proofErr w:type="spellEnd"/>
+        <w:t>alse, use image_height</w:t>
+      </w:r>
     </w:p>
     <w:p>
       <w:r>
@@ -543,13 +467,8 @@
         </w:rPr>
         <w:t xml:space="preserve"> a standard equation defined by </w:t>
       </w:r>
-      <w:proofErr w:type="gramStart"/>
-      <w:r>
-        <w:t>lerp(</w:t>
-      </w:r>
-      <w:proofErr w:type="gramEnd"/>
-      <w:r>
-        <w:t>a, b, t) = a * (1 - t) + b * t</w:t>
+      <w:r>
+        <w:t>lerp(a, b, t) = a * (1 - t) + b * t</w:t>
       </w:r>
     </w:p>
     <w:p>
@@ -669,21 +588,7 @@
         <w:rPr>
           <w:rFonts w:hint="eastAsia"/>
         </w:rPr>
-        <w:t>(C-</w:t>
-      </w:r>
-      <w:proofErr w:type="gramStart"/>
-      <w:r>
-        <w:rPr>
-          <w:rFonts w:hint="eastAsia"/>
-        </w:rPr>
-        <w:t>P)*</w:t>
-      </w:r>
-      <w:proofErr w:type="gramEnd"/>
-      <w:r>
-        <w:rPr>
-          <w:rFonts w:hint="eastAsia"/>
-        </w:rPr>
-        <w:t>(C-P) is the dot product of the length of the origin-to-center vector. For the equation of that value being equal to r</w:t>
+        <w:t>(C-P)*(C-P) is the dot product of the length of the origin-to-center vector. For the equation of that value being equal to r</w:t>
       </w:r>
       <w:r>
         <w:rPr>
@@ -696,21 +601,10 @@
         <w:rPr>
           <w:rFonts w:hint="eastAsia"/>
         </w:rPr>
-        <w:t xml:space="preserve">, imagine a sphere of radius r migrated (C-P) distance away from origin (camera lens). The ray, if allowed to permeate through, will intersect </w:t>
-      </w:r>
-      <w:proofErr w:type="gramStart"/>
-      <w:r>
-        <w:rPr>
-          <w:rFonts w:hint="eastAsia"/>
-        </w:rPr>
-        <w:t xml:space="preserve">these </w:t>
-      </w:r>
-      <w:r>
-        <w:t>selection</w:t>
-      </w:r>
-      <w:proofErr w:type="gramEnd"/>
-      <w:r>
-        <w:t xml:space="preserve"> o</w:t>
+        <w:t xml:space="preserve">, imagine a sphere of radius r migrated (C-P) distance away from origin (camera lens). The ray, if allowed to permeate through, will intersect these </w:t>
+      </w:r>
+      <w:r>
+        <w:t>selection o</w:t>
       </w:r>
       <w:r>
         <w:rPr>
@@ -1001,43 +895,7 @@
           <w:rFonts w:hint="eastAsia"/>
         </w:rPr>
         <w:lastRenderedPageBreak/>
-        <w:t>This means that the directional vector (</w:t>
-      </w:r>
-      <w:proofErr w:type="spellStart"/>
-      <w:proofErr w:type="gramStart"/>
-      <w:r>
-        <w:rPr>
-          <w:rFonts w:hint="eastAsia"/>
-        </w:rPr>
-        <w:t>x,y</w:t>
-      </w:r>
-      <w:proofErr w:type="gramEnd"/>
-      <w:r>
-        <w:rPr>
-          <w:rFonts w:hint="eastAsia"/>
-        </w:rPr>
-        <w:t>,z</w:t>
-      </w:r>
-      <w:proofErr w:type="spellEnd"/>
-      <w:r>
-        <w:rPr>
-          <w:rFonts w:hint="eastAsia"/>
-        </w:rPr>
-        <w:t>) of the unit surface normal is mapped to (</w:t>
-      </w:r>
-      <w:proofErr w:type="gramStart"/>
-      <w:r>
-        <w:rPr>
-          <w:rFonts w:hint="eastAsia"/>
-        </w:rPr>
-        <w:t>R,G</w:t>
-      </w:r>
-      <w:proofErr w:type="gramEnd"/>
-      <w:r>
-        <w:rPr>
-          <w:rFonts w:hint="eastAsia"/>
-        </w:rPr>
-        <w:t>,B)</w:t>
+        <w:t>This means that the directional vector (x,y,z) of the unit surface normal is mapped to (R,G,B)</w:t>
       </w:r>
     </w:p>
     <w:p>
@@ -1247,21 +1105,7 @@
         <w:rPr>
           <w:rFonts w:hint="eastAsia"/>
         </w:rPr>
-        <w:t xml:space="preserve">s based on preference. However, because there </w:t>
-      </w:r>
-      <w:proofErr w:type="gramStart"/>
-      <w:r>
-        <w:rPr>
-          <w:rFonts w:hint="eastAsia"/>
-        </w:rPr>
-        <w:t>are</w:t>
-      </w:r>
-      <w:proofErr w:type="gramEnd"/>
-      <w:r>
-        <w:rPr>
-          <w:rFonts w:hint="eastAsia"/>
-        </w:rPr>
-        <w:t xml:space="preserve"> way more material types than different geometries, it</w:t>
+        <w:t>s based on preference. However, because there are way more material types than different geometries, it</w:t>
       </w:r>
       <w:r>
         <w:t>’</w:t>
@@ -1292,15 +1136,7 @@
         <w:t xml:space="preserve"> </w:t>
       </w:r>
       <w:r>
-        <w:t xml:space="preserve">Moving Camera Code </w:t>
-      </w:r>
-      <w:proofErr w:type="gramStart"/>
-      <w:r>
-        <w:t>Into</w:t>
-      </w:r>
-      <w:proofErr w:type="gramEnd"/>
-      <w:r>
-        <w:t xml:space="preserve"> Its Own Class</w:t>
+        <w:t>Moving Camera Code Into Its Own Class</w:t>
       </w:r>
     </w:p>
     <w:p>
@@ -1310,11 +1146,9 @@
         </w:rPr>
         <w:t xml:space="preserve">After creating </w:t>
       </w:r>
-      <w:proofErr w:type="spellStart"/>
       <w:r>
         <w:t>rtweekend.h</w:t>
       </w:r>
-      <w:proofErr w:type="spellEnd"/>
       <w:r>
         <w:rPr>
           <w:rFonts w:hint="eastAsia"/>
@@ -1536,21 +1370,7 @@
         <w:rPr>
           <w:rFonts w:hint="eastAsia"/>
         </w:rPr>
-        <w:t xml:space="preserve">. At the current state, if we were to render </w:t>
-      </w:r>
-      <w:proofErr w:type="gramStart"/>
-      <w:r>
-        <w:rPr>
-          <w:rFonts w:hint="eastAsia"/>
-        </w:rPr>
-        <w:t>a</w:t>
-      </w:r>
-      <w:proofErr w:type="gramEnd"/>
-      <w:r>
-        <w:rPr>
-          <w:rFonts w:hint="eastAsia"/>
-        </w:rPr>
-        <w:t xml:space="preserve"> 8 x 8 checkerboard far away such that it</w:t>
+        <w:t>. At the current state, if we were to render a 8 x 8 checkerboard far away such that it</w:t>
       </w:r>
       <w:r>
         <w:t>’</w:t>
@@ -1619,21 +1439,7 @@
         <w:rPr>
           <w:rFonts w:hint="eastAsia"/>
         </w:rPr>
-        <w:t xml:space="preserve">ll sample the </w:t>
-      </w:r>
-      <w:proofErr w:type="gramStart"/>
-      <w:r>
-        <w:rPr>
-          <w:rFonts w:hint="eastAsia"/>
-        </w:rPr>
-        <w:t>four square</w:t>
-      </w:r>
-      <w:proofErr w:type="gramEnd"/>
-      <w:r>
-        <w:rPr>
-          <w:rFonts w:hint="eastAsia"/>
-        </w:rPr>
-        <w:t xml:space="preserve"> regions of a pixel that extends halfway into each of the four neighboring pixels </w:t>
+        <w:t xml:space="preserve">ll sample the four square regions of a pixel that extends halfway into each of the four neighboring pixels </w:t>
       </w:r>
       <w:r>
         <w:t>–</w:t>
@@ -2214,21 +2020,7 @@
         <w:rPr>
           <w:rFonts w:hint="eastAsia"/>
         </w:rPr>
-        <w:t xml:space="preserve">Imagine </w:t>
-      </w:r>
-      <w:proofErr w:type="gramStart"/>
-      <w:r>
-        <w:rPr>
-          <w:rFonts w:hint="eastAsia"/>
-        </w:rPr>
-        <w:t>two unit</w:t>
-      </w:r>
-      <w:proofErr w:type="gramEnd"/>
-      <w:r>
-        <w:rPr>
-          <w:rFonts w:hint="eastAsia"/>
-        </w:rPr>
-        <w:t xml:space="preserve"> spheres intersecting this hit point, one on each side of the sphere object.</w:t>
+        <w:t>Imagine two unit spheres intersecting this hit point, one on each side of the sphere object.</w:t>
       </w:r>
       <w:r>
         <w:rPr>
@@ -2248,7 +2040,6 @@
       <w:r>
         <w:t> (</w:t>
       </w:r>
-      <w:proofErr w:type="spellStart"/>
       <w:r>
         <w:rPr>
           <w:b/>
@@ -2266,7 +2057,6 @@
         </w:rPr>
         <w:t>n</w:t>
       </w:r>
-      <w:proofErr w:type="spellEnd"/>
       <w:r>
         <w:t xml:space="preserve">) and the </w:t>
       </w:r>
@@ -2562,21 +2352,7 @@
         <w:rPr>
           <w:rFonts w:hint="eastAsia"/>
         </w:rPr>
-        <w:t xml:space="preserve"> in real life, it would be pretty bright. We will see the brightness gamut for the diffuse material by adjusting the reflectance of </w:t>
-      </w:r>
-      <w:proofErr w:type="spellStart"/>
-      <w:r>
-        <w:rPr>
-          <w:rFonts w:hint="eastAsia"/>
-        </w:rPr>
-        <w:t>ray_color</w:t>
-      </w:r>
-      <w:proofErr w:type="spellEnd"/>
-      <w:r>
-        <w:rPr>
-          <w:rFonts w:hint="eastAsia"/>
-        </w:rPr>
-        <w:t xml:space="preserve"> from 0.5 to 0.1</w:t>
+        <w:t xml:space="preserve"> in real life, it would be pretty bright. We will see the brightness gamut for the diffuse material by adjusting the reflectance of ray_color from 0.5 to 0.1</w:t>
       </w:r>
     </w:p>
     <w:p>
@@ -2668,15 +2444,7 @@
         <w:t xml:space="preserve"> because</w:t>
       </w:r>
       <w:r>
-        <w:t xml:space="preserve"> almost all computer programs assume that an image is “gamma corrected” before being written into an image file. This means that the 0 to 1 </w:t>
-      </w:r>
-      <w:proofErr w:type="gramStart"/>
-      <w:r>
-        <w:t>values</w:t>
-      </w:r>
-      <w:proofErr w:type="gramEnd"/>
-      <w:r>
-        <w:t xml:space="preserve"> have some transform applied before being stored as a byte. Images with data that are written without being transformed are said to be in </w:t>
+        <w:t xml:space="preserve"> almost all computer programs assume that an image is “gamma corrected” before being written into an image file. This means that the 0 to 1 values have some transform applied before being stored as a byte. Images with data that are written without being transformed are said to be in </w:t>
       </w:r>
       <w:r>
         <w:rPr>
@@ -2727,7 +2495,6 @@
         </w:rPr>
         <w:t xml:space="preserve"> (</w:t>
       </w:r>
-      <w:proofErr w:type="spellStart"/>
       <w:r>
         <w:rPr>
           <w:rFonts w:hAnsiTheme="minorEastAsia" w:hint="eastAsia"/>
@@ -2736,7 +2503,6 @@
         </w:rPr>
         <w:t>γ</w:t>
       </w:r>
-      <w:proofErr w:type="spellEnd"/>
       <w:r>
         <w:rPr>
           <w:rFonts w:hint="eastAsia"/>
@@ -2830,11 +2596,9 @@
         </w:rPr>
         <w:t xml:space="preserve"> </w:t>
       </w:r>
-      <w:proofErr w:type="spellStart"/>
       <w:r>
         <w:t>cr</w:t>
       </w:r>
-      <w:proofErr w:type="spellEnd"/>
       <w:r>
         <w:rPr>
           <w:rFonts w:hint="eastAsia"/>
@@ -2986,53 +2750,8 @@
       </w:r>
     </w:p>
     <w:p>
-      <w:proofErr w:type="spellStart"/>
-      <w:r>
-        <w:t>hit_record</w:t>
-      </w:r>
-      <w:proofErr w:type="spellEnd"/>
-      <w:r>
-        <w:t> is just a way to stuff a bunch of arguments into a class so we can send them as a group. When a ray hits a surface (a particular sphere for example), the material pointer in the </w:t>
-      </w:r>
-      <w:proofErr w:type="spellStart"/>
-      <w:r>
-        <w:t>hit_record</w:t>
-      </w:r>
-      <w:proofErr w:type="spellEnd"/>
-      <w:r>
-        <w:t> will be set to point at the material pointer the sphere was given when it was set up in </w:t>
-      </w:r>
-      <w:proofErr w:type="gramStart"/>
-      <w:r>
-        <w:t>main(</w:t>
-      </w:r>
-      <w:proofErr w:type="gramEnd"/>
-      <w:r>
-        <w:t>) when we start. When the </w:t>
-      </w:r>
-      <w:proofErr w:type="spellStart"/>
-      <w:r>
-        <w:t>ray_</w:t>
-      </w:r>
-      <w:proofErr w:type="gramStart"/>
-      <w:r>
-        <w:t>color</w:t>
-      </w:r>
-      <w:proofErr w:type="spellEnd"/>
-      <w:r>
-        <w:t>(</w:t>
-      </w:r>
-      <w:proofErr w:type="gramEnd"/>
-      <w:r>
-        <w:t>) routine gets the </w:t>
-      </w:r>
-      <w:proofErr w:type="spellStart"/>
-      <w:r>
-        <w:t>hit_record</w:t>
-      </w:r>
-      <w:proofErr w:type="spellEnd"/>
-      <w:r>
-        <w:t> it can call member functions of the material pointer to find out what ray, if any, is scattered.</w:t>
+      <w:r>
+        <w:t>hit_record is just a way to stuff a bunch of arguments into a class so we can send them as a group. When a ray hits a surface (a particular sphere for example), the material pointer in the hit_record will be set to point at the material pointer the sphere was given when it was set up in main() when we start. When the ray_color() routine gets the hit_record it can call member functions of the material pointer to find out what ray, if any, is scattered.</w:t>
       </w:r>
     </w:p>
     <w:p/>
@@ -3692,7 +3411,7 @@
           <w:noProof/>
         </w:rPr>
         <w:drawing>
-          <wp:inline distT="0" distB="0" distL="0" distR="0" wp14:anchorId="779E190D" wp14:editId="0EF956BC">
+          <wp:inline distT="0" distB="0" distL="0" distR="0" wp14:anchorId="779E190D" wp14:editId="234BD463">
             <wp:extent cx="4119563" cy="2678842"/>
             <wp:effectExtent l="0" t="0" r="0" b="7620"/>
             <wp:docPr id="1081676429" name="그림 2" descr="Refraction and Snell's Law - YouTube"/>
@@ -4399,7 +4118,6 @@
       <w:r>
         <w:t>This is actually simple to specify, as the </w:t>
       </w:r>
-      <w:proofErr w:type="spellStart"/>
       <w:r>
         <w:rPr>
           <w:i/>
@@ -4407,7 +4125,6 @@
         </w:rPr>
         <w:t>refraction_index</w:t>
       </w:r>
-      <w:proofErr w:type="spellEnd"/>
       <w:r>
         <w:t> parameter to the dielectric material can be interpreted as the </w:t>
       </w:r>
@@ -4434,13 +4151,8 @@
         </w:rPr>
         <w:t xml:space="preserve">12 </w:t>
       </w:r>
-      <w:proofErr w:type="spellStart"/>
-      <w:r>
-        <w:t>Positionable</w:t>
-      </w:r>
-      <w:proofErr w:type="spellEnd"/>
-      <w:r>
-        <w:t xml:space="preserve"> Camera</w:t>
+      <w:r>
+        <w:t>Positionable Camera</w:t>
       </w:r>
     </w:p>
     <w:p>
@@ -4458,13 +4170,8 @@
         <w:t>field of view</w:t>
       </w:r>
       <w:r>
-        <w:t xml:space="preserve"> (</w:t>
-      </w:r>
-      <w:proofErr w:type="spellStart"/>
-      <w:r>
-        <w:t>fov</w:t>
-      </w:r>
-      <w:proofErr w:type="spellEnd"/>
+        <w:t xml:space="preserve"> (fov</w:t>
+      </w:r>
       <w:r>
         <w:rPr>
           <w:rFonts w:hint="eastAsia"/>
@@ -4618,9 +4325,6 @@
     <w:p>
       <w:pPr>
         <w:jc w:val="center"/>
-        <w:rPr>
-          <w:rFonts w:hint="eastAsia"/>
-        </w:rPr>
       </w:pPr>
       <w:r>
         <w:t>Camera viewing geometry (from the side)</w:t>
@@ -4639,6 +4343,284 @@
       </w:r>
       <w:r>
         <w:t>Positioning and Orienting the Camera</w:t>
+      </w:r>
+    </w:p>
+    <w:p>
+      <w:r>
+        <w:t xml:space="preserve">We’ll call the position where we place the camera </w:t>
+      </w:r>
+      <w:r>
+        <w:rPr>
+          <w:i/>
+          <w:iCs/>
+        </w:rPr>
+        <w:t>lookfrom</w:t>
+      </w:r>
+      <w:r>
+        <w:t xml:space="preserve">, and the point we look at </w:t>
+      </w:r>
+      <w:r>
+        <w:rPr>
+          <w:i/>
+          <w:iCs/>
+        </w:rPr>
+        <w:t>lookat</w:t>
+      </w:r>
+      <w:r>
+        <w:rPr>
+          <w:rFonts w:hint="eastAsia"/>
+        </w:rPr>
+        <w:t xml:space="preserve"> </w:t>
+      </w:r>
+      <w:r>
+        <w:t>–</w:t>
+      </w:r>
+      <w:r>
+        <w:rPr>
+          <w:rFonts w:hint="eastAsia"/>
+        </w:rPr>
+        <w:t xml:space="preserve"> l</w:t>
+      </w:r>
+      <w:r>
+        <w:t>ater, a direction to look in instead of a point to look at</w:t>
+      </w:r>
+      <w:r>
+        <w:rPr>
+          <w:rFonts w:hint="eastAsia"/>
+        </w:rPr>
+        <w:t xml:space="preserve"> can be defined instead.</w:t>
+      </w:r>
+    </w:p>
+    <w:p>
+      <w:r>
+        <w:t xml:space="preserve">We also need a way to specify the </w:t>
+      </w:r>
+      <w:r>
+        <w:rPr>
+          <w:i/>
+          <w:iCs/>
+        </w:rPr>
+        <w:t>roll</w:t>
+      </w:r>
+      <w:r>
+        <w:t>, or sideways tilt, of the camera: the rotation around the lookat-lookfrom axis. Another way to think about it is that even if you keep lookfrom and lookat constant, you can still rotate your head around your nose. What we need is a way to specify an “up” vector for the camera.</w:t>
+      </w:r>
+    </w:p>
+    <w:p>
+      <w:pPr>
+        <w:jc w:val="center"/>
+      </w:pPr>
+      <w:r>
+        <w:rPr>
+          <w:noProof/>
+        </w:rPr>
+        <w:drawing>
+          <wp:inline distT="0" distB="0" distL="0" distR="0" wp14:anchorId="14487574" wp14:editId="15CD075C">
+            <wp:extent cx="3778884" cy="1889442"/>
+            <wp:effectExtent l="0" t="0" r="0" b="0"/>
+            <wp:docPr id="1880258292" name="그림 1"/>
+            <wp:cNvGraphicFramePr>
+              <a:graphicFrameLocks xmlns:a="http://schemas.openxmlformats.org/drawingml/2006/main" noChangeAspect="1"/>
+            </wp:cNvGraphicFramePr>
+            <a:graphic xmlns:a="http://schemas.openxmlformats.org/drawingml/2006/main">
+              <a:graphicData uri="http://schemas.openxmlformats.org/drawingml/2006/picture">
+                <pic:pic xmlns:pic="http://schemas.openxmlformats.org/drawingml/2006/picture">
+                  <pic:nvPicPr>
+                    <pic:cNvPr id="0" name="Picture 1"/>
+                    <pic:cNvPicPr>
+                      <a:picLocks noChangeAspect="1" noChangeArrowheads="1"/>
+                    </pic:cNvPicPr>
+                  </pic:nvPicPr>
+                  <pic:blipFill>
+                    <a:blip r:embed="rId36">
+                      <a:extLst>
+                        <a:ext uri="{28A0092B-C50C-407E-A947-70E740481C1C}">
+                          <a14:useLocalDpi xmlns:a14="http://schemas.microsoft.com/office/drawing/2010/main" val="0"/>
+                        </a:ext>
+                      </a:extLst>
+                    </a:blip>
+                    <a:srcRect/>
+                    <a:stretch>
+                      <a:fillRect/>
+                    </a:stretch>
+                  </pic:blipFill>
+                  <pic:spPr bwMode="auto">
+                    <a:xfrm>
+                      <a:off x="0" y="0"/>
+                      <a:ext cx="3781102" cy="1890551"/>
+                    </a:xfrm>
+                    <a:prstGeom prst="rect">
+                      <a:avLst/>
+                    </a:prstGeom>
+                    <a:noFill/>
+                    <a:ln>
+                      <a:noFill/>
+                    </a:ln>
+                  </pic:spPr>
+                </pic:pic>
+              </a:graphicData>
+            </a:graphic>
+          </wp:inline>
+        </w:drawing>
+      </w:r>
+    </w:p>
+    <w:p>
+      <w:pPr>
+        <w:jc w:val="center"/>
+      </w:pPr>
+      <w:r>
+        <w:rPr>
+          <w:rFonts w:hint="eastAsia"/>
+        </w:rPr>
+        <w:t>Camera view direction</w:t>
+      </w:r>
+    </w:p>
+    <w:p>
+      <w:pPr>
+        <w:jc w:val="center"/>
+      </w:pPr>
+    </w:p>
+    <w:p>
+      <w:pPr>
+        <w:jc w:val="center"/>
+      </w:pPr>
+      <w:r>
+        <w:rPr>
+          <w:noProof/>
+        </w:rPr>
+        <w:drawing>
+          <wp:inline distT="0" distB="0" distL="0" distR="0" wp14:anchorId="12DFBAF3" wp14:editId="575CEF0E">
+            <wp:extent cx="6645910" cy="1877695"/>
+            <wp:effectExtent l="0" t="0" r="2540" b="8255"/>
+            <wp:docPr id="398063713" name="그림 1"/>
+            <wp:cNvGraphicFramePr>
+              <a:graphicFrameLocks xmlns:a="http://schemas.openxmlformats.org/drawingml/2006/main" noChangeAspect="1"/>
+            </wp:cNvGraphicFramePr>
+            <a:graphic xmlns:a="http://schemas.openxmlformats.org/drawingml/2006/main">
+              <a:graphicData uri="http://schemas.openxmlformats.org/drawingml/2006/picture">
+                <pic:pic xmlns:pic="http://schemas.openxmlformats.org/drawingml/2006/picture">
+                  <pic:nvPicPr>
+                    <pic:cNvPr id="0" name="Picture 1"/>
+                    <pic:cNvPicPr>
+                      <a:picLocks noChangeAspect="1" noChangeArrowheads="1"/>
+                    </pic:cNvPicPr>
+                  </pic:nvPicPr>
+                  <pic:blipFill>
+                    <a:blip r:embed="rId37">
+                      <a:extLst>
+                        <a:ext uri="{28A0092B-C50C-407E-A947-70E740481C1C}">
+                          <a14:useLocalDpi xmlns:a14="http://schemas.microsoft.com/office/drawing/2010/main" val="0"/>
+                        </a:ext>
+                      </a:extLst>
+                    </a:blip>
+                    <a:srcRect/>
+                    <a:stretch>
+                      <a:fillRect/>
+                    </a:stretch>
+                  </pic:blipFill>
+                  <pic:spPr bwMode="auto">
+                    <a:xfrm>
+                      <a:off x="0" y="0"/>
+                      <a:ext cx="6645910" cy="1877695"/>
+                    </a:xfrm>
+                    <a:prstGeom prst="rect">
+                      <a:avLst/>
+                    </a:prstGeom>
+                    <a:noFill/>
+                    <a:ln>
+                      <a:noFill/>
+                    </a:ln>
+                  </pic:spPr>
+                </pic:pic>
+              </a:graphicData>
+            </a:graphic>
+          </wp:inline>
+        </w:drawing>
+      </w:r>
+    </w:p>
+    <w:p>
+      <w:pPr>
+        <w:jc w:val="center"/>
+        <w:rPr>
+          <w:rFonts w:hint="eastAsia"/>
+        </w:rPr>
+      </w:pPr>
+      <w:r>
+        <w:t>V</w:t>
+      </w:r>
+      <w:r>
+        <w:rPr>
+          <w:rFonts w:hint="eastAsia"/>
+        </w:rPr>
+        <w:t xml:space="preserve">ectors </w:t>
+      </w:r>
+      <w:r>
+        <w:rPr>
+          <w:rFonts w:hint="eastAsia"/>
+          <w:i/>
+          <w:iCs/>
+        </w:rPr>
+        <w:t xml:space="preserve">u </w:t>
+      </w:r>
+      <w:r>
+        <w:rPr>
+          <w:rFonts w:hint="eastAsia"/>
+        </w:rPr>
+        <w:t xml:space="preserve">(right), </w:t>
+      </w:r>
+      <w:r>
+        <w:rPr>
+          <w:rFonts w:hint="eastAsia"/>
+          <w:i/>
+          <w:iCs/>
+        </w:rPr>
+        <w:t>v</w:t>
+      </w:r>
+      <w:r>
+        <w:rPr>
+          <w:rFonts w:hint="eastAsia"/>
+        </w:rPr>
+        <w:t xml:space="preserve"> (up), </w:t>
+      </w:r>
+      <w:r>
+        <w:rPr>
+          <w:rFonts w:hint="eastAsia"/>
+          <w:i/>
+          <w:iCs/>
+        </w:rPr>
+        <w:t xml:space="preserve">w </w:t>
+      </w:r>
+      <w:r>
+        <w:rPr>
+          <w:rFonts w:hint="eastAsia"/>
+        </w:rPr>
+        <w:t xml:space="preserve">(opposite) and </w:t>
+      </w:r>
+      <w:r>
+        <w:rPr>
+          <w:rFonts w:hint="eastAsia"/>
+          <w:i/>
+          <w:iCs/>
+        </w:rPr>
+        <w:t>vup</w:t>
+      </w:r>
+      <w:r>
+        <w:rPr>
+          <w:rFonts w:hint="eastAsia"/>
+        </w:rPr>
+        <w:t xml:space="preserve"> (</w:t>
+      </w:r>
+      <w:r>
+        <w:rPr>
+          <w:rFonts w:hint="eastAsia"/>
+        </w:rPr>
+        <w:t>view</w:t>
+      </w:r>
+      <w:r>
+        <w:rPr>
+          <w:rFonts w:hint="eastAsia"/>
+        </w:rPr>
+        <w:t xml:space="preserve"> up)</w:t>
       </w:r>
     </w:p>
     <w:p>
@@ -5784,6 +5766,7 @@
   <w:style w:type="character" w:default="1" w:styleId="a0">
     <w:name w:val="Default Paragraph Font"/>
     <w:uiPriority w:val="1"/>
+    <w:semiHidden/>
     <w:unhideWhenUsed/>
   </w:style>
   <w:style w:type="table" w:default="1" w:styleId="a1">

</xml_diff>

<commit_message>
Implemented angled view with varying field of view
</commit_message>
<xml_diff>
--- a/Notes.docx
+++ b/Notes.docx
@@ -4631,6 +4631,27 @@
       </w:pPr>
     </w:p>
     <w:p/>
+    <w:p/>
+    <w:p>
+      <w:pPr>
+        <w:rPr>
+          <w:rFonts w:hint="eastAsia"/>
+        </w:rPr>
+      </w:pPr>
+      <w:r>
+        <w:rPr>
+          <w:rFonts w:hint="eastAsia"/>
+        </w:rPr>
+        <w:t>Defocus Blur</w:t>
+      </w:r>
+    </w:p>
+    <w:p>
+      <w:pPr>
+        <w:rPr>
+          <w:rFonts w:hint="eastAsia"/>
+        </w:rPr>
+      </w:pPr>
+    </w:p>
     <w:p/>
     <w:sectPr>
       <w:pgSz w:w="11906" w:h="16838"/>

</xml_diff>

<commit_message>
Updated defocus blur notes
</commit_message>
<xml_diff>
--- a/Notes.docx
+++ b/Notes.docx
@@ -216,15 +216,42 @@
       <w:r>
         <w:tab/>
       </w:r>
-      <w:r>
-        <w:rPr>
-          <w:rFonts w:hint="eastAsia"/>
-        </w:rPr>
-        <w:t xml:space="preserve">image_height = (image_height &lt; 1) </w:t>
-      </w:r>
-      <w:r>
-        <w:t>? 1 : image_height</w:t>
-      </w:r>
+      <w:proofErr w:type="spellStart"/>
+      <w:r>
+        <w:rPr>
+          <w:rFonts w:hint="eastAsia"/>
+        </w:rPr>
+        <w:t>image_height</w:t>
+      </w:r>
+      <w:proofErr w:type="spellEnd"/>
+      <w:r>
+        <w:rPr>
+          <w:rFonts w:hint="eastAsia"/>
+        </w:rPr>
+        <w:t xml:space="preserve"> = (</w:t>
+      </w:r>
+      <w:proofErr w:type="spellStart"/>
+      <w:r>
+        <w:rPr>
+          <w:rFonts w:hint="eastAsia"/>
+        </w:rPr>
+        <w:t>image_height</w:t>
+      </w:r>
+      <w:proofErr w:type="spellEnd"/>
+      <w:r>
+        <w:rPr>
+          <w:rFonts w:hint="eastAsia"/>
+        </w:rPr>
+        <w:t xml:space="preserve"> &lt; 1) </w:t>
+      </w:r>
+      <w:r>
+        <w:t xml:space="preserve">? 1 : </w:t>
+      </w:r>
+      <w:proofErr w:type="spellStart"/>
+      <w:r>
+        <w:t>image_height</w:t>
+      </w:r>
+      <w:proofErr w:type="spellEnd"/>
     </w:p>
     <w:p>
       <w:pPr>
@@ -235,8 +262,17 @@
           <w:b/>
           <w:bCs/>
         </w:rPr>
-        <w:t>? 1 : image_height</w:t>
-      </w:r>
+        <w:t xml:space="preserve">? 1 : </w:t>
+      </w:r>
+      <w:proofErr w:type="spellStart"/>
+      <w:r>
+        <w:rPr>
+          <w:b/>
+          <w:bCs/>
+        </w:rPr>
+        <w:t>image_height</w:t>
+      </w:r>
+      <w:proofErr w:type="spellEnd"/>
       <w:r>
         <w:t xml:space="preserve"> </w:t>
       </w:r>
@@ -288,8 +324,13 @@
         <w:t>F</w:t>
       </w:r>
       <w:r>
-        <w:t>alse, use image_height</w:t>
-      </w:r>
+        <w:t xml:space="preserve">alse, use </w:t>
+      </w:r>
+      <w:proofErr w:type="spellStart"/>
+      <w:r>
+        <w:t>image_height</w:t>
+      </w:r>
+      <w:proofErr w:type="spellEnd"/>
     </w:p>
     <w:p>
       <w:r>
@@ -895,7 +936,21 @@
           <w:rFonts w:hint="eastAsia"/>
         </w:rPr>
         <w:lastRenderedPageBreak/>
-        <w:t>This means that the directional vector (x,y,z) of the unit surface normal is mapped to (R,G,B)</w:t>
+        <w:t>This means that the directional vector (</w:t>
+      </w:r>
+      <w:proofErr w:type="spellStart"/>
+      <w:r>
+        <w:rPr>
+          <w:rFonts w:hint="eastAsia"/>
+        </w:rPr>
+        <w:t>x,y,z</w:t>
+      </w:r>
+      <w:proofErr w:type="spellEnd"/>
+      <w:r>
+        <w:rPr>
+          <w:rFonts w:hint="eastAsia"/>
+        </w:rPr>
+        <w:t>) of the unit surface normal is mapped to (R,G,B)</w:t>
       </w:r>
     </w:p>
     <w:p>
@@ -1146,9 +1201,11 @@
         </w:rPr>
         <w:t xml:space="preserve">After creating </w:t>
       </w:r>
+      <w:proofErr w:type="spellStart"/>
       <w:r>
         <w:t>rtweekend.h</w:t>
       </w:r>
+      <w:proofErr w:type="spellEnd"/>
       <w:r>
         <w:rPr>
           <w:rFonts w:hint="eastAsia"/>
@@ -2040,6 +2097,7 @@
       <w:r>
         <w:t> (</w:t>
       </w:r>
+      <w:proofErr w:type="spellStart"/>
       <w:r>
         <w:rPr>
           <w:b/>
@@ -2057,6 +2115,7 @@
         </w:rPr>
         <w:t>n</w:t>
       </w:r>
+      <w:proofErr w:type="spellEnd"/>
       <w:r>
         <w:t xml:space="preserve">) and the </w:t>
       </w:r>
@@ -2352,7 +2411,21 @@
         <w:rPr>
           <w:rFonts w:hint="eastAsia"/>
         </w:rPr>
-        <w:t xml:space="preserve"> in real life, it would be pretty bright. We will see the brightness gamut for the diffuse material by adjusting the reflectance of ray_color from 0.5 to 0.1</w:t>
+        <w:t xml:space="preserve"> in real life, it would be pretty bright. We will see the brightness gamut for the diffuse material by adjusting the reflectance of </w:t>
+      </w:r>
+      <w:proofErr w:type="spellStart"/>
+      <w:r>
+        <w:rPr>
+          <w:rFonts w:hint="eastAsia"/>
+        </w:rPr>
+        <w:t>ray_color</w:t>
+      </w:r>
+      <w:proofErr w:type="spellEnd"/>
+      <w:r>
+        <w:rPr>
+          <w:rFonts w:hint="eastAsia"/>
+        </w:rPr>
+        <w:t xml:space="preserve"> from 0.5 to 0.1</w:t>
       </w:r>
     </w:p>
     <w:p>
@@ -2495,6 +2568,7 @@
         </w:rPr>
         <w:t xml:space="preserve"> (</w:t>
       </w:r>
+      <w:proofErr w:type="spellStart"/>
       <w:r>
         <w:rPr>
           <w:rFonts w:hAnsiTheme="minorEastAsia" w:hint="eastAsia"/>
@@ -2503,6 +2577,7 @@
         </w:rPr>
         <w:t>γ</w:t>
       </w:r>
+      <w:proofErr w:type="spellEnd"/>
       <w:r>
         <w:rPr>
           <w:rFonts w:hint="eastAsia"/>
@@ -2596,9 +2671,11 @@
         </w:rPr>
         <w:t xml:space="preserve"> </w:t>
       </w:r>
+      <w:proofErr w:type="spellStart"/>
       <w:r>
         <w:t>cr</w:t>
       </w:r>
+      <w:proofErr w:type="spellEnd"/>
       <w:r>
         <w:rPr>
           <w:rFonts w:hint="eastAsia"/>
@@ -2750,8 +2827,37 @@
       </w:r>
     </w:p>
     <w:p>
-      <w:r>
-        <w:t>hit_record is just a way to stuff a bunch of arguments into a class so we can send them as a group. When a ray hits a surface (a particular sphere for example), the material pointer in the hit_record will be set to point at the material pointer the sphere was given when it was set up in main() when we start. When the ray_color() routine gets the hit_record it can call member functions of the material pointer to find out what ray, if any, is scattered.</w:t>
+      <w:proofErr w:type="spellStart"/>
+      <w:r>
+        <w:t>hit_record</w:t>
+      </w:r>
+      <w:proofErr w:type="spellEnd"/>
+      <w:r>
+        <w:t> is just a way to stuff a bunch of arguments into a class so we can send them as a group. When a ray hits a surface (a particular sphere for example), the material pointer in the </w:t>
+      </w:r>
+      <w:proofErr w:type="spellStart"/>
+      <w:r>
+        <w:t>hit_record</w:t>
+      </w:r>
+      <w:proofErr w:type="spellEnd"/>
+      <w:r>
+        <w:t> will be set to point at the material pointer the sphere was given when it was set up in main() when we start. When the </w:t>
+      </w:r>
+      <w:proofErr w:type="spellStart"/>
+      <w:r>
+        <w:t>ray_color</w:t>
+      </w:r>
+      <w:proofErr w:type="spellEnd"/>
+      <w:r>
+        <w:t>() routine gets the </w:t>
+      </w:r>
+      <w:proofErr w:type="spellStart"/>
+      <w:r>
+        <w:t>hit_record</w:t>
+      </w:r>
+      <w:proofErr w:type="spellEnd"/>
+      <w:r>
+        <w:t> it can call member functions of the material pointer to find out what ray, if any, is scattered.</w:t>
       </w:r>
     </w:p>
     <w:p/>
@@ -3411,7 +3517,7 @@
           <w:noProof/>
         </w:rPr>
         <w:drawing>
-          <wp:inline distT="0" distB="0" distL="0" distR="0" wp14:anchorId="779E190D" wp14:editId="234BD463">
+          <wp:inline distT="0" distB="0" distL="0" distR="0" wp14:anchorId="779E190D" wp14:editId="6C4394DD">
             <wp:extent cx="4119563" cy="2678842"/>
             <wp:effectExtent l="0" t="0" r="0" b="7620"/>
             <wp:docPr id="1081676429" name="그림 2" descr="Refraction and Snell's Law - YouTube"/>
@@ -4118,6 +4224,7 @@
       <w:r>
         <w:t>This is actually simple to specify, as the </w:t>
       </w:r>
+      <w:proofErr w:type="spellStart"/>
       <w:r>
         <w:rPr>
           <w:i/>
@@ -4125,6 +4232,7 @@
         </w:rPr>
         <w:t>refraction_index</w:t>
       </w:r>
+      <w:proofErr w:type="spellEnd"/>
       <w:r>
         <w:t> parameter to the dielectric material can be interpreted as the </w:t>
       </w:r>
@@ -4151,8 +4259,13 @@
         </w:rPr>
         <w:t xml:space="preserve">12 </w:t>
       </w:r>
-      <w:r>
-        <w:t>Positionable Camera</w:t>
+      <w:proofErr w:type="spellStart"/>
+      <w:r>
+        <w:t>Positionable</w:t>
+      </w:r>
+      <w:proofErr w:type="spellEnd"/>
+      <w:r>
+        <w:t xml:space="preserve"> Camera</w:t>
       </w:r>
     </w:p>
     <w:p>
@@ -4170,8 +4283,13 @@
         <w:t>field of view</w:t>
       </w:r>
       <w:r>
-        <w:t xml:space="preserve"> (fov</w:t>
-      </w:r>
+        <w:t xml:space="preserve"> (</w:t>
+      </w:r>
+      <w:proofErr w:type="spellStart"/>
+      <w:r>
+        <w:t>fov</w:t>
+      </w:r>
+      <w:proofErr w:type="spellEnd"/>
       <w:r>
         <w:rPr>
           <w:rFonts w:hint="eastAsia"/>
@@ -4349,6 +4467,7 @@
       <w:r>
         <w:t xml:space="preserve">We’ll call the position where we place the camera </w:t>
       </w:r>
+      <w:proofErr w:type="spellStart"/>
       <w:r>
         <w:rPr>
           <w:i/>
@@ -4356,9 +4475,11 @@
         </w:rPr>
         <w:t>lookfrom</w:t>
       </w:r>
+      <w:proofErr w:type="spellEnd"/>
       <w:r>
         <w:t xml:space="preserve">, and the point we look at </w:t>
       </w:r>
+      <w:proofErr w:type="spellStart"/>
       <w:r>
         <w:rPr>
           <w:i/>
@@ -4366,6 +4487,7 @@
         </w:rPr>
         <w:t>lookat</w:t>
       </w:r>
+      <w:proofErr w:type="spellEnd"/>
       <w:r>
         <w:rPr>
           <w:rFonts w:hint="eastAsia"/>
@@ -4403,7 +4525,31 @@
         <w:t>roll</w:t>
       </w:r>
       <w:r>
-        <w:t>, or sideways tilt, of the camera: the rotation around the lookat-lookfrom axis. Another way to think about it is that even if you keep lookfrom and lookat constant, you can still rotate your head around your nose. What we need is a way to specify an “up” vector for the camera.</w:t>
+        <w:t xml:space="preserve">, or sideways tilt, of the camera: the rotation around the </w:t>
+      </w:r>
+      <w:proofErr w:type="spellStart"/>
+      <w:r>
+        <w:t>lookat-lookfrom</w:t>
+      </w:r>
+      <w:proofErr w:type="spellEnd"/>
+      <w:r>
+        <w:t xml:space="preserve"> axis. Another way to think about it is that even if you keep </w:t>
+      </w:r>
+      <w:proofErr w:type="spellStart"/>
+      <w:r>
+        <w:t>lookfrom</w:t>
+      </w:r>
+      <w:proofErr w:type="spellEnd"/>
+      <w:r>
+        <w:t xml:space="preserve"> and </w:t>
+      </w:r>
+      <w:proofErr w:type="spellStart"/>
+      <w:r>
+        <w:t>lookat</w:t>
+      </w:r>
+      <w:proofErr w:type="spellEnd"/>
+      <w:r>
+        <w:t xml:space="preserve"> constant, you can still rotate your head around your nose. What we need is a way to specify an “up” vector for the camera.</w:t>
       </w:r>
     </w:p>
     <w:p>
@@ -4541,9 +4687,6 @@
     <w:p>
       <w:pPr>
         <w:jc w:val="center"/>
-        <w:rPr>
-          <w:rFonts w:hint="eastAsia"/>
-        </w:rPr>
       </w:pPr>
       <w:r>
         <w:t>V</w:t>
@@ -4596,6 +4739,7 @@
         </w:rPr>
         <w:t xml:space="preserve">(opposite) and </w:t>
       </w:r>
+      <w:proofErr w:type="spellStart"/>
       <w:r>
         <w:rPr>
           <w:rFonts w:hint="eastAsia"/>
@@ -4604,6 +4748,7 @@
         </w:rPr>
         <w:t>vup</w:t>
       </w:r>
+      <w:proofErr w:type="spellEnd"/>
       <w:r>
         <w:rPr>
           <w:rFonts w:hint="eastAsia"/>
@@ -4622,36 +4767,92 @@
         </w:rPr>
         <w:t xml:space="preserve"> up)</w:t>
       </w:r>
-    </w:p>
-    <w:p>
-      <w:pPr>
-        <w:rPr>
-          <w:rFonts w:hint="eastAsia"/>
-        </w:rPr>
-      </w:pPr>
     </w:p>
     <w:p/>
     <w:p/>
     <w:p>
       <w:pPr>
-        <w:rPr>
-          <w:rFonts w:hint="eastAsia"/>
-        </w:rPr>
-      </w:pPr>
-      <w:r>
-        <w:rPr>
-          <w:rFonts w:hint="eastAsia"/>
-        </w:rPr>
-        <w:t>Defocus Blur</w:t>
-      </w:r>
-    </w:p>
-    <w:p>
-      <w:pPr>
-        <w:rPr>
-          <w:rFonts w:hint="eastAsia"/>
-        </w:rPr>
-      </w:pPr>
-    </w:p>
+        <w:pStyle w:val="2"/>
+      </w:pPr>
+      <w:r>
+        <w:rPr>
+          <w:rFonts w:hint="eastAsia"/>
+        </w:rPr>
+        <w:t>12.1 Defocus Blur</w:t>
+      </w:r>
+    </w:p>
+    <w:p>
+      <w:r>
+        <w:rPr>
+          <w:i/>
+          <w:iCs/>
+        </w:rPr>
+        <w:t>D</w:t>
+      </w:r>
+      <w:r>
+        <w:rPr>
+          <w:rFonts w:hint="eastAsia"/>
+          <w:i/>
+          <w:iCs/>
+        </w:rPr>
+        <w:t>efocus blur</w:t>
+      </w:r>
+      <w:r>
+        <w:rPr>
+          <w:rFonts w:hint="eastAsia"/>
+        </w:rPr>
+        <w:t xml:space="preserve"> is known as </w:t>
+      </w:r>
+      <w:r>
+        <w:rPr>
+          <w:rFonts w:hint="eastAsia"/>
+          <w:i/>
+          <w:iCs/>
+        </w:rPr>
+        <w:t>depth of field</w:t>
+      </w:r>
+      <w:r>
+        <w:rPr>
+          <w:rFonts w:hint="eastAsia"/>
+        </w:rPr>
+        <w:t xml:space="preserve"> among photographers.</w:t>
+      </w:r>
+    </w:p>
+    <w:p>
+      <w:r>
+        <w:t xml:space="preserve">The reason we have defocus blur in real cameras is because they need a big hole (rather than just a pinhole) through which to gather light. A large hole would defocus everything, but if we stick a lens in front of the film/sensor, there will be a certain distance at which everything is in focus. Objects placed at that distance will appear in focus and will linearly appear blurrier the further they are from that distance. You can think of a lens this way: all light rays coming from a specific point at the focus </w:t>
+      </w:r>
+      <w:r>
+        <w:lastRenderedPageBreak/>
+        <w:t xml:space="preserve">distance </w:t>
+      </w:r>
+      <w:r>
+        <w:t>–</w:t>
+      </w:r>
+      <w:r>
+        <w:rPr>
+          <w:rFonts w:hint="eastAsia"/>
+        </w:rPr>
+        <w:t xml:space="preserve"> </w:t>
+      </w:r>
+      <w:r>
+        <w:t xml:space="preserve">and that hit the lens </w:t>
+      </w:r>
+      <w:r>
+        <w:t>–</w:t>
+      </w:r>
+      <w:r>
+        <w:rPr>
+          <w:rFonts w:hint="eastAsia"/>
+        </w:rPr>
+        <w:t xml:space="preserve"> </w:t>
+      </w:r>
+      <w:r>
+        <w:t>will be bent back to a single point on the image sensor.</w:t>
+      </w:r>
+    </w:p>
+    <w:p/>
+    <w:p/>
     <w:p/>
     <w:sectPr>
       <w:pgSz w:w="11906" w:h="16838"/>

</xml_diff>

<commit_message>
Added A Thin Lens Approximation notes
</commit_message>
<xml_diff>
--- a/Notes.docx
+++ b/Notes.docx
@@ -216,42 +216,15 @@
       <w:r>
         <w:tab/>
       </w:r>
-      <w:proofErr w:type="spellStart"/>
-      <w:r>
-        <w:rPr>
-          <w:rFonts w:hint="eastAsia"/>
-        </w:rPr>
-        <w:t>image_height</w:t>
-      </w:r>
-      <w:proofErr w:type="spellEnd"/>
-      <w:r>
-        <w:rPr>
-          <w:rFonts w:hint="eastAsia"/>
-        </w:rPr>
-        <w:t xml:space="preserve"> = (</w:t>
-      </w:r>
-      <w:proofErr w:type="spellStart"/>
-      <w:r>
-        <w:rPr>
-          <w:rFonts w:hint="eastAsia"/>
-        </w:rPr>
-        <w:t>image_height</w:t>
-      </w:r>
-      <w:proofErr w:type="spellEnd"/>
-      <w:r>
-        <w:rPr>
-          <w:rFonts w:hint="eastAsia"/>
-        </w:rPr>
-        <w:t xml:space="preserve"> &lt; 1) </w:t>
-      </w:r>
-      <w:r>
-        <w:t xml:space="preserve">? 1 : </w:t>
-      </w:r>
-      <w:proofErr w:type="spellStart"/>
-      <w:r>
-        <w:t>image_height</w:t>
-      </w:r>
-      <w:proofErr w:type="spellEnd"/>
+      <w:r>
+        <w:rPr>
+          <w:rFonts w:hint="eastAsia"/>
+        </w:rPr>
+        <w:t xml:space="preserve">image_height = (image_height &lt; 1) </w:t>
+      </w:r>
+      <w:r>
+        <w:t>? 1 : image_height</w:t>
+      </w:r>
     </w:p>
     <w:p>
       <w:pPr>
@@ -262,17 +235,8 @@
           <w:b/>
           <w:bCs/>
         </w:rPr>
-        <w:t xml:space="preserve">? 1 : </w:t>
-      </w:r>
-      <w:proofErr w:type="spellStart"/>
-      <w:r>
-        <w:rPr>
-          <w:b/>
-          <w:bCs/>
-        </w:rPr>
-        <w:t>image_height</w:t>
-      </w:r>
-      <w:proofErr w:type="spellEnd"/>
+        <w:t>? 1 : image_height</w:t>
+      </w:r>
       <w:r>
         <w:t xml:space="preserve"> </w:t>
       </w:r>
@@ -324,13 +288,8 @@
         <w:t>F</w:t>
       </w:r>
       <w:r>
-        <w:t xml:space="preserve">alse, use </w:t>
-      </w:r>
-      <w:proofErr w:type="spellStart"/>
-      <w:r>
-        <w:t>image_height</w:t>
-      </w:r>
-      <w:proofErr w:type="spellEnd"/>
+        <w:t>alse, use image_height</w:t>
+      </w:r>
     </w:p>
     <w:p>
       <w:r>
@@ -936,21 +895,7 @@
           <w:rFonts w:hint="eastAsia"/>
         </w:rPr>
         <w:lastRenderedPageBreak/>
-        <w:t>This means that the directional vector (</w:t>
-      </w:r>
-      <w:proofErr w:type="spellStart"/>
-      <w:r>
-        <w:rPr>
-          <w:rFonts w:hint="eastAsia"/>
-        </w:rPr>
-        <w:t>x,y,z</w:t>
-      </w:r>
-      <w:proofErr w:type="spellEnd"/>
-      <w:r>
-        <w:rPr>
-          <w:rFonts w:hint="eastAsia"/>
-        </w:rPr>
-        <w:t>) of the unit surface normal is mapped to (R,G,B)</w:t>
+        <w:t>This means that the directional vector (x,y,z) of the unit surface normal is mapped to (R,G,B)</w:t>
       </w:r>
     </w:p>
     <w:p>
@@ -1201,11 +1146,9 @@
         </w:rPr>
         <w:t xml:space="preserve">After creating </w:t>
       </w:r>
-      <w:proofErr w:type="spellStart"/>
       <w:r>
         <w:t>rtweekend.h</w:t>
       </w:r>
-      <w:proofErr w:type="spellEnd"/>
       <w:r>
         <w:rPr>
           <w:rFonts w:hint="eastAsia"/>
@@ -2097,7 +2040,6 @@
       <w:r>
         <w:t> (</w:t>
       </w:r>
-      <w:proofErr w:type="spellStart"/>
       <w:r>
         <w:rPr>
           <w:b/>
@@ -2115,7 +2057,6 @@
         </w:rPr>
         <w:t>n</w:t>
       </w:r>
-      <w:proofErr w:type="spellEnd"/>
       <w:r>
         <w:t xml:space="preserve">) and the </w:t>
       </w:r>
@@ -2411,21 +2352,7 @@
         <w:rPr>
           <w:rFonts w:hint="eastAsia"/>
         </w:rPr>
-        <w:t xml:space="preserve"> in real life, it would be pretty bright. We will see the brightness gamut for the diffuse material by adjusting the reflectance of </w:t>
-      </w:r>
-      <w:proofErr w:type="spellStart"/>
-      <w:r>
-        <w:rPr>
-          <w:rFonts w:hint="eastAsia"/>
-        </w:rPr>
-        <w:t>ray_color</w:t>
-      </w:r>
-      <w:proofErr w:type="spellEnd"/>
-      <w:r>
-        <w:rPr>
-          <w:rFonts w:hint="eastAsia"/>
-        </w:rPr>
-        <w:t xml:space="preserve"> from 0.5 to 0.1</w:t>
+        <w:t xml:space="preserve"> in real life, it would be pretty bright. We will see the brightness gamut for the diffuse material by adjusting the reflectance of ray_color from 0.5 to 0.1</w:t>
       </w:r>
     </w:p>
     <w:p>
@@ -2568,7 +2495,6 @@
         </w:rPr>
         <w:t xml:space="preserve"> (</w:t>
       </w:r>
-      <w:proofErr w:type="spellStart"/>
       <w:r>
         <w:rPr>
           <w:rFonts w:hAnsiTheme="minorEastAsia" w:hint="eastAsia"/>
@@ -2577,7 +2503,6 @@
         </w:rPr>
         <w:t>γ</w:t>
       </w:r>
-      <w:proofErr w:type="spellEnd"/>
       <w:r>
         <w:rPr>
           <w:rFonts w:hint="eastAsia"/>
@@ -2671,11 +2596,9 @@
         </w:rPr>
         <w:t xml:space="preserve"> </w:t>
       </w:r>
-      <w:proofErr w:type="spellStart"/>
       <w:r>
         <w:t>cr</w:t>
       </w:r>
-      <w:proofErr w:type="spellEnd"/>
       <w:r>
         <w:rPr>
           <w:rFonts w:hint="eastAsia"/>
@@ -2827,37 +2750,8 @@
       </w:r>
     </w:p>
     <w:p>
-      <w:proofErr w:type="spellStart"/>
-      <w:r>
-        <w:t>hit_record</w:t>
-      </w:r>
-      <w:proofErr w:type="spellEnd"/>
-      <w:r>
-        <w:t> is just a way to stuff a bunch of arguments into a class so we can send them as a group. When a ray hits a surface (a particular sphere for example), the material pointer in the </w:t>
-      </w:r>
-      <w:proofErr w:type="spellStart"/>
-      <w:r>
-        <w:t>hit_record</w:t>
-      </w:r>
-      <w:proofErr w:type="spellEnd"/>
-      <w:r>
-        <w:t> will be set to point at the material pointer the sphere was given when it was set up in main() when we start. When the </w:t>
-      </w:r>
-      <w:proofErr w:type="spellStart"/>
-      <w:r>
-        <w:t>ray_color</w:t>
-      </w:r>
-      <w:proofErr w:type="spellEnd"/>
-      <w:r>
-        <w:t>() routine gets the </w:t>
-      </w:r>
-      <w:proofErr w:type="spellStart"/>
-      <w:r>
-        <w:t>hit_record</w:t>
-      </w:r>
-      <w:proofErr w:type="spellEnd"/>
-      <w:r>
-        <w:t> it can call member functions of the material pointer to find out what ray, if any, is scattered.</w:t>
+      <w:r>
+        <w:t>hit_record is just a way to stuff a bunch of arguments into a class so we can send them as a group. When a ray hits a surface (a particular sphere for example), the material pointer in the hit_record will be set to point at the material pointer the sphere was given when it was set up in main() when we start. When the ray_color() routine gets the hit_record it can call member functions of the material pointer to find out what ray, if any, is scattered.</w:t>
       </w:r>
     </w:p>
     <w:p/>
@@ -3517,7 +3411,7 @@
           <w:noProof/>
         </w:rPr>
         <w:drawing>
-          <wp:inline distT="0" distB="0" distL="0" distR="0" wp14:anchorId="779E190D" wp14:editId="6C4394DD">
+          <wp:inline distT="0" distB="0" distL="0" distR="0" wp14:anchorId="779E190D" wp14:editId="2DF9D840">
             <wp:extent cx="4119563" cy="2678842"/>
             <wp:effectExtent l="0" t="0" r="0" b="7620"/>
             <wp:docPr id="1081676429" name="그림 2" descr="Refraction and Snell's Law - YouTube"/>
@@ -4224,7 +4118,6 @@
       <w:r>
         <w:t>This is actually simple to specify, as the </w:t>
       </w:r>
-      <w:proofErr w:type="spellStart"/>
       <w:r>
         <w:rPr>
           <w:i/>
@@ -4232,7 +4125,6 @@
         </w:rPr>
         <w:t>refraction_index</w:t>
       </w:r>
-      <w:proofErr w:type="spellEnd"/>
       <w:r>
         <w:t> parameter to the dielectric material can be interpreted as the </w:t>
       </w:r>
@@ -4259,13 +4151,8 @@
         </w:rPr>
         <w:t xml:space="preserve">12 </w:t>
       </w:r>
-      <w:proofErr w:type="spellStart"/>
-      <w:r>
-        <w:t>Positionable</w:t>
-      </w:r>
-      <w:proofErr w:type="spellEnd"/>
-      <w:r>
-        <w:t xml:space="preserve"> Camera</w:t>
+      <w:r>
+        <w:t>Positionable Camera</w:t>
       </w:r>
     </w:p>
     <w:p>
@@ -4283,13 +4170,8 @@
         <w:t>field of view</w:t>
       </w:r>
       <w:r>
-        <w:t xml:space="preserve"> (</w:t>
-      </w:r>
-      <w:proofErr w:type="spellStart"/>
-      <w:r>
-        <w:t>fov</w:t>
-      </w:r>
-      <w:proofErr w:type="spellEnd"/>
+        <w:t xml:space="preserve"> (fov</w:t>
+      </w:r>
       <w:r>
         <w:rPr>
           <w:rFonts w:hint="eastAsia"/>
@@ -4467,7 +4349,6 @@
       <w:r>
         <w:t xml:space="preserve">We’ll call the position where we place the camera </w:t>
       </w:r>
-      <w:proofErr w:type="spellStart"/>
       <w:r>
         <w:rPr>
           <w:i/>
@@ -4475,11 +4356,9 @@
         </w:rPr>
         <w:t>lookfrom</w:t>
       </w:r>
-      <w:proofErr w:type="spellEnd"/>
       <w:r>
         <w:t xml:space="preserve">, and the point we look at </w:t>
       </w:r>
-      <w:proofErr w:type="spellStart"/>
       <w:r>
         <w:rPr>
           <w:i/>
@@ -4487,7 +4366,6 @@
         </w:rPr>
         <w:t>lookat</w:t>
       </w:r>
-      <w:proofErr w:type="spellEnd"/>
       <w:r>
         <w:rPr>
           <w:rFonts w:hint="eastAsia"/>
@@ -4525,31 +4403,7 @@
         <w:t>roll</w:t>
       </w:r>
       <w:r>
-        <w:t xml:space="preserve">, or sideways tilt, of the camera: the rotation around the </w:t>
-      </w:r>
-      <w:proofErr w:type="spellStart"/>
-      <w:r>
-        <w:t>lookat-lookfrom</w:t>
-      </w:r>
-      <w:proofErr w:type="spellEnd"/>
-      <w:r>
-        <w:t xml:space="preserve"> axis. Another way to think about it is that even if you keep </w:t>
-      </w:r>
-      <w:proofErr w:type="spellStart"/>
-      <w:r>
-        <w:t>lookfrom</w:t>
-      </w:r>
-      <w:proofErr w:type="spellEnd"/>
-      <w:r>
-        <w:t xml:space="preserve"> and </w:t>
-      </w:r>
-      <w:proofErr w:type="spellStart"/>
-      <w:r>
-        <w:t>lookat</w:t>
-      </w:r>
-      <w:proofErr w:type="spellEnd"/>
-      <w:r>
-        <w:t xml:space="preserve"> constant, you can still rotate your head around your nose. What we need is a way to specify an “up” vector for the camera.</w:t>
+        <w:t>, or sideways tilt, of the camera: the rotation around the lookat-lookfrom axis. Another way to think about it is that even if you keep lookfrom and lookat constant, you can still rotate your head around your nose. What we need is a way to specify an “up” vector for the camera.</w:t>
       </w:r>
     </w:p>
     <w:p>
@@ -4739,7 +4593,6 @@
         </w:rPr>
         <w:t xml:space="preserve">(opposite) and </w:t>
       </w:r>
-      <w:proofErr w:type="spellStart"/>
       <w:r>
         <w:rPr>
           <w:rFonts w:hint="eastAsia"/>
@@ -4748,7 +4601,6 @@
         </w:rPr>
         <w:t>vup</w:t>
       </w:r>
-      <w:proofErr w:type="spellEnd"/>
       <w:r>
         <w:rPr>
           <w:rFonts w:hint="eastAsia"/>
@@ -4778,7 +4630,19 @@
         <w:rPr>
           <w:rFonts w:hint="eastAsia"/>
         </w:rPr>
-        <w:t>12.1 Defocus Blur</w:t>
+        <w:t>1</w:t>
+      </w:r>
+      <w:r>
+        <w:rPr>
+          <w:rFonts w:hint="eastAsia"/>
+        </w:rPr>
+        <w:t>3</w:t>
+      </w:r>
+      <w:r>
+        <w:rPr>
+          <w:rFonts w:hint="eastAsia"/>
+        </w:rPr>
+        <w:t xml:space="preserve"> Defocus Blur</w:t>
       </w:r>
     </w:p>
     <w:p>
@@ -4849,11 +4713,330 @@
       </w:r>
       <w:r>
         <w:t>will be bent back to a single point on the image sensor.</w:t>
+      </w:r>
+    </w:p>
+    <w:p>
+      <w:pPr>
+        <w:pStyle w:val="a6"/>
+        <w:numPr>
+          <w:ilvl w:val="0"/>
+          <w:numId w:val="2"/>
+        </w:numPr>
+        <w:rPr>
+          <w:rFonts w:hint="eastAsia"/>
+        </w:rPr>
+      </w:pPr>
+      <w:r>
+        <w:t>If the hole is large, rays from one scene point spread out and hit a patch on the sensor, not a single spot → everything looks blurry (defocused).</w:t>
+      </w:r>
+    </w:p>
+    <w:p>
+      <w:r>
+        <w:t>We call the distance between the camera center and the plane where everything is in perfect focus the focus distance. Be aware that the focus distance is not usually the same as the focal length — the focal length is the distance between the camera center and the image plane. For our model, however, these two will have the same value, as we will put our pixel grid right on the focus plane, which is focus distance away from the camera center.</w:t>
+      </w:r>
+    </w:p>
+    <w:p>
+      <w:r>
+        <w:t xml:space="preserve">In a physical camera, the focus distance is controlled by the distance between the lens and the film/sensor. That is why you see the lens move relative to the camera when you change what is in focus. The “aperture” is a hole to control how big the lens is effectively. For a real camera, if you need more </w:t>
+      </w:r>
+      <w:r>
+        <w:t>light,</w:t>
+      </w:r>
+      <w:r>
+        <w:t xml:space="preserve"> you make the aperture bigger, and will get more blur for objects away from the focus distance. For our virtual camera, we can have a perfect sensor and never need more light, so we only use an aperture when we want defocus blur.</w:t>
+      </w:r>
+    </w:p>
+    <w:p>
+      <w:pPr>
+        <w:rPr>
+          <w:rFonts w:hint="eastAsia"/>
+        </w:rPr>
+      </w:pPr>
+    </w:p>
+    <w:p/>
+    <w:p>
+      <w:pPr>
+        <w:pStyle w:val="2"/>
+      </w:pPr>
+      <w:r>
+        <w:rPr>
+          <w:rFonts w:hint="eastAsia"/>
+        </w:rPr>
+        <w:t>1</w:t>
+      </w:r>
+      <w:r>
+        <w:rPr>
+          <w:rFonts w:hint="eastAsia"/>
+        </w:rPr>
+        <w:t>3</w:t>
+      </w:r>
+      <w:r>
+        <w:rPr>
+          <w:rFonts w:hint="eastAsia"/>
+        </w:rPr>
+        <w:t xml:space="preserve">.1 </w:t>
+      </w:r>
+      <w:r>
+        <w:t>A Thin Lens Approximation</w:t>
+      </w:r>
+    </w:p>
+    <w:p>
+      <w:r>
+        <w:t>For our code, we could simulate the order: sensor, then lens, then aperture. Then we could figure out where to send the rays, and flip the image after it's computed (the image is projected upside down on the film). Graphics people, however, usually use a thin lens approximation:</w:t>
+      </w:r>
+    </w:p>
+    <w:p>
+      <w:pPr>
+        <w:jc w:val="center"/>
+      </w:pPr>
+      <w:r>
+        <w:rPr>
+          <w:noProof/>
+        </w:rPr>
+        <w:drawing>
+          <wp:inline distT="0" distB="0" distL="0" distR="0" wp14:anchorId="5E7626E5" wp14:editId="59961676">
+            <wp:extent cx="3111215" cy="2313940"/>
+            <wp:effectExtent l="0" t="0" r="0" b="0"/>
+            <wp:docPr id="1439470345" name="그림 1"/>
+            <wp:cNvGraphicFramePr>
+              <a:graphicFrameLocks xmlns:a="http://schemas.openxmlformats.org/drawingml/2006/main" noChangeAspect="1"/>
+            </wp:cNvGraphicFramePr>
+            <a:graphic xmlns:a="http://schemas.openxmlformats.org/drawingml/2006/main">
+              <a:graphicData uri="http://schemas.openxmlformats.org/drawingml/2006/picture">
+                <pic:pic xmlns:pic="http://schemas.openxmlformats.org/drawingml/2006/picture">
+                  <pic:nvPicPr>
+                    <pic:cNvPr id="0" name="Picture 1"/>
+                    <pic:cNvPicPr>
+                      <a:picLocks noChangeAspect="1" noChangeArrowheads="1"/>
+                    </pic:cNvPicPr>
+                  </pic:nvPicPr>
+                  <pic:blipFill>
+                    <a:blip r:embed="rId38" cstate="print">
+                      <a:extLst>
+                        <a:ext uri="{28A0092B-C50C-407E-A947-70E740481C1C}">
+                          <a14:useLocalDpi xmlns:a14="http://schemas.microsoft.com/office/drawing/2010/main" val="0"/>
+                        </a:ext>
+                      </a:extLst>
+                    </a:blip>
+                    <a:srcRect/>
+                    <a:stretch>
+                      <a:fillRect/>
+                    </a:stretch>
+                  </pic:blipFill>
+                  <pic:spPr bwMode="auto">
+                    <a:xfrm>
+                      <a:off x="0" y="0"/>
+                      <a:ext cx="3115636" cy="2317228"/>
+                    </a:xfrm>
+                    <a:prstGeom prst="rect">
+                      <a:avLst/>
+                    </a:prstGeom>
+                    <a:noFill/>
+                    <a:ln>
+                      <a:noFill/>
+                    </a:ln>
+                  </pic:spPr>
+                </pic:pic>
+              </a:graphicData>
+            </a:graphic>
+          </wp:inline>
+        </w:drawing>
+      </w:r>
+    </w:p>
+    <w:p>
+      <w:pPr>
+        <w:rPr>
+          <w:rFonts w:hint="eastAsia"/>
+        </w:rPr>
+      </w:pPr>
+      <w:r>
+        <w:t xml:space="preserve">We don’t need to simulate any of the inside of the camera — for the purposes of rendering an image outside the camera, that would be unnecessary complexity. </w:t>
+      </w:r>
+      <w:r>
+        <w:rPr>
+          <w:rFonts w:hint="eastAsia"/>
+        </w:rPr>
+        <w:t>We will</w:t>
+      </w:r>
+      <w:r>
+        <w:t xml:space="preserve"> start rays from an infinitely thin circular “lens”, and send them toward the pixel of interest on the focus plane (</w:t>
+      </w:r>
+      <w:r>
+        <w:rPr>
+          <w:i/>
+          <w:iCs/>
+        </w:rPr>
+        <w:t>focal_length</w:t>
+      </w:r>
+      <w:r>
+        <w:t xml:space="preserve"> away from the lens), where everything on that plane in the 3D world is in perfect focus.</w:t>
+      </w:r>
+    </w:p>
+    <w:p>
+      <w:r>
+        <w:t>In practice, we accomplish this by placing the viewport in this plane. Putting everything together:</w:t>
+      </w:r>
+    </w:p>
+    <w:p/>
+    <w:p>
+      <w:pPr>
+        <w:pStyle w:val="a6"/>
+        <w:numPr>
+          <w:ilvl w:val="0"/>
+          <w:numId w:val="5"/>
+        </w:numPr>
+      </w:pPr>
+      <w:r>
+        <w:lastRenderedPageBreak/>
+        <w:t>The focus plane is orthogonal to the camera view direction.</w:t>
+      </w:r>
+    </w:p>
+    <w:p>
+      <w:pPr>
+        <w:pStyle w:val="a6"/>
+        <w:numPr>
+          <w:ilvl w:val="0"/>
+          <w:numId w:val="5"/>
+        </w:numPr>
+      </w:pPr>
+      <w:r>
+        <w:t>The focus distance is the distance between the camera center and the focus plane.</w:t>
+      </w:r>
+    </w:p>
+    <w:p>
+      <w:pPr>
+        <w:pStyle w:val="a6"/>
+        <w:numPr>
+          <w:ilvl w:val="0"/>
+          <w:numId w:val="5"/>
+        </w:numPr>
+      </w:pPr>
+      <w:r>
+        <w:t>The viewport lies on the focus plane, centered on the camera view direction vector.</w:t>
+      </w:r>
+    </w:p>
+    <w:p>
+      <w:pPr>
+        <w:pStyle w:val="a6"/>
+        <w:numPr>
+          <w:ilvl w:val="0"/>
+          <w:numId w:val="5"/>
+        </w:numPr>
+      </w:pPr>
+      <w:r>
+        <w:t>The grid of pixel locations lies inside the viewport (located in the 3D world).</w:t>
+      </w:r>
+    </w:p>
+    <w:p>
+      <w:pPr>
+        <w:pStyle w:val="a6"/>
+        <w:numPr>
+          <w:ilvl w:val="0"/>
+          <w:numId w:val="5"/>
+        </w:numPr>
+      </w:pPr>
+      <w:r>
+        <w:t>Random image sample locations are chosen from the region around the current pixel location.</w:t>
+      </w:r>
+    </w:p>
+    <w:p>
+      <w:pPr>
+        <w:pStyle w:val="a6"/>
+        <w:numPr>
+          <w:ilvl w:val="0"/>
+          <w:numId w:val="5"/>
+        </w:numPr>
+        <w:rPr>
+          <w:rFonts w:hint="eastAsia"/>
+        </w:rPr>
+      </w:pPr>
+      <w:r>
+        <w:t>The camera fires rays from random points on the lens through the current image sample location.</w:t>
+      </w:r>
+    </w:p>
+    <w:p>
+      <w:pPr>
+        <w:jc w:val="center"/>
+      </w:pPr>
+      <w:r>
+        <w:rPr>
+          <w:noProof/>
+        </w:rPr>
+        <w:drawing>
+          <wp:inline distT="0" distB="0" distL="0" distR="0" wp14:anchorId="4EB8019B" wp14:editId="4E81E2CA">
+            <wp:extent cx="4338978" cy="1979612"/>
+            <wp:effectExtent l="0" t="0" r="4445" b="1905"/>
+            <wp:docPr id="1848844817" name="그림 2"/>
+            <wp:cNvGraphicFramePr>
+              <a:graphicFrameLocks xmlns:a="http://schemas.openxmlformats.org/drawingml/2006/main" noChangeAspect="1"/>
+            </wp:cNvGraphicFramePr>
+            <a:graphic xmlns:a="http://schemas.openxmlformats.org/drawingml/2006/main">
+              <a:graphicData uri="http://schemas.openxmlformats.org/drawingml/2006/picture">
+                <pic:pic xmlns:pic="http://schemas.openxmlformats.org/drawingml/2006/picture">
+                  <pic:nvPicPr>
+                    <pic:cNvPr id="0" name="Picture 3"/>
+                    <pic:cNvPicPr>
+                      <a:picLocks noChangeAspect="1" noChangeArrowheads="1"/>
+                    </pic:cNvPicPr>
+                  </pic:nvPicPr>
+                  <pic:blipFill>
+                    <a:blip r:embed="rId39">
+                      <a:extLst>
+                        <a:ext uri="{28A0092B-C50C-407E-A947-70E740481C1C}">
+                          <a14:useLocalDpi xmlns:a14="http://schemas.microsoft.com/office/drawing/2010/main" val="0"/>
+                        </a:ext>
+                      </a:extLst>
+                    </a:blip>
+                    <a:srcRect/>
+                    <a:stretch>
+                      <a:fillRect/>
+                    </a:stretch>
+                  </pic:blipFill>
+                  <pic:spPr bwMode="auto">
+                    <a:xfrm>
+                      <a:off x="0" y="0"/>
+                      <a:ext cx="4346627" cy="1983102"/>
+                    </a:xfrm>
+                    <a:prstGeom prst="rect">
+                      <a:avLst/>
+                    </a:prstGeom>
+                    <a:noFill/>
+                    <a:ln>
+                      <a:noFill/>
+                    </a:ln>
+                  </pic:spPr>
+                </pic:pic>
+              </a:graphicData>
+            </a:graphic>
+          </wp:inline>
+        </w:drawing>
+      </w:r>
+    </w:p>
+    <w:p>
+      <w:pPr>
+        <w:jc w:val="center"/>
+        <w:rPr>
+          <w:rFonts w:hint="eastAsia"/>
+        </w:rPr>
+      </w:pPr>
+      <w:r>
+        <w:rPr>
+          <w:rFonts w:hint="eastAsia"/>
+        </w:rPr>
+        <w:t>Camera focus plane</w:t>
       </w:r>
     </w:p>
     <w:p/>
     <w:p/>
     <w:p/>
+    <w:p/>
+    <w:p>
+      <w:pPr>
+        <w:rPr>
+          <w:rFonts w:hint="eastAsia"/>
+        </w:rPr>
+      </w:pPr>
+    </w:p>
     <w:sectPr>
       <w:pgSz w:w="11906" w:h="16838"/>
       <w:pgMar w:top="720" w:right="720" w:bottom="720" w:left="720" w:header="851" w:footer="992" w:gutter="0"/>
@@ -5255,6 +5438,95 @@
     </w:lvl>
   </w:abstractNum>
   <w:abstractNum w:abstractNumId="3" w15:restartNumberingAfterBreak="0">
+    <w:nsid w:val="2AE60538"/>
+    <w:multiLevelType w:val="hybridMultilevel"/>
+    <w:tmpl w:val="C7246174"/>
+    <w:lvl w:ilvl="0" w:tplc="09C4F856">
+      <w:start w:val="1"/>
+      <w:numFmt w:val="decimal"/>
+      <w:lvlText w:val="%1."/>
+      <w:lvlJc w:val="left"/>
+      <w:pPr>
+        <w:ind w:left="800" w:hanging="360"/>
+      </w:pPr>
+      <w:rPr>
+        <w:rFonts w:hint="default"/>
+      </w:rPr>
+    </w:lvl>
+    <w:lvl w:ilvl="1" w:tplc="04090019" w:tentative="1">
+      <w:start w:val="1"/>
+      <w:numFmt w:val="upperLetter"/>
+      <w:lvlText w:val="%2."/>
+      <w:lvlJc w:val="left"/>
+      <w:pPr>
+        <w:ind w:left="1320" w:hanging="440"/>
+      </w:pPr>
+    </w:lvl>
+    <w:lvl w:ilvl="2" w:tplc="0409001B" w:tentative="1">
+      <w:start w:val="1"/>
+      <w:numFmt w:val="lowerRoman"/>
+      <w:lvlText w:val="%3."/>
+      <w:lvlJc w:val="right"/>
+      <w:pPr>
+        <w:ind w:left="1760" w:hanging="440"/>
+      </w:pPr>
+    </w:lvl>
+    <w:lvl w:ilvl="3" w:tplc="0409000F" w:tentative="1">
+      <w:start w:val="1"/>
+      <w:numFmt w:val="decimal"/>
+      <w:lvlText w:val="%4."/>
+      <w:lvlJc w:val="left"/>
+      <w:pPr>
+        <w:ind w:left="2200" w:hanging="440"/>
+      </w:pPr>
+    </w:lvl>
+    <w:lvl w:ilvl="4" w:tplc="04090019" w:tentative="1">
+      <w:start w:val="1"/>
+      <w:numFmt w:val="upperLetter"/>
+      <w:lvlText w:val="%5."/>
+      <w:lvlJc w:val="left"/>
+      <w:pPr>
+        <w:ind w:left="2640" w:hanging="440"/>
+      </w:pPr>
+    </w:lvl>
+    <w:lvl w:ilvl="5" w:tplc="0409001B" w:tentative="1">
+      <w:start w:val="1"/>
+      <w:numFmt w:val="lowerRoman"/>
+      <w:lvlText w:val="%6."/>
+      <w:lvlJc w:val="right"/>
+      <w:pPr>
+        <w:ind w:left="3080" w:hanging="440"/>
+      </w:pPr>
+    </w:lvl>
+    <w:lvl w:ilvl="6" w:tplc="0409000F" w:tentative="1">
+      <w:start w:val="1"/>
+      <w:numFmt w:val="decimal"/>
+      <w:lvlText w:val="%7."/>
+      <w:lvlJc w:val="left"/>
+      <w:pPr>
+        <w:ind w:left="3520" w:hanging="440"/>
+      </w:pPr>
+    </w:lvl>
+    <w:lvl w:ilvl="7" w:tplc="04090019" w:tentative="1">
+      <w:start w:val="1"/>
+      <w:numFmt w:val="upperLetter"/>
+      <w:lvlText w:val="%8."/>
+      <w:lvlJc w:val="left"/>
+      <w:pPr>
+        <w:ind w:left="3960" w:hanging="440"/>
+      </w:pPr>
+    </w:lvl>
+    <w:lvl w:ilvl="8" w:tplc="0409001B" w:tentative="1">
+      <w:start w:val="1"/>
+      <w:numFmt w:val="lowerRoman"/>
+      <w:lvlText w:val="%9."/>
+      <w:lvlJc w:val="right"/>
+      <w:pPr>
+        <w:ind w:left="4400" w:hanging="440"/>
+      </w:pPr>
+    </w:lvl>
+  </w:abstractNum>
+  <w:abstractNum w:abstractNumId="4" w15:restartNumberingAfterBreak="0">
     <w:nsid w:val="2D682529"/>
     <w:multiLevelType w:val="multilevel"/>
     <w:tmpl w:val="AF5A8D4C"/>
@@ -5377,6 +5649,9 @@
     <w:abstractNumId w:val="1"/>
   </w:num>
   <w:num w:numId="4" w16cid:durableId="270626225">
+    <w:abstractNumId w:val="4"/>
+  </w:num>
+  <w:num w:numId="5" w16cid:durableId="918946361">
     <w:abstractNumId w:val="3"/>
   </w:num>
 </w:numbering>

</xml_diff>